<commit_message>
Docs: kapi v70 and the GPU compositing service (docs/02 §15: sharing the GPU, the service; docs/03; gpcdemo in docs/04; docs/07 §6: stage 2, NetSurf's layers into it; HANDOFF); .docx exports
(The .pdf exports are not regenerated: LibreOffice cannot load any file in this environment.)

Co-Authored-By: Claude Opus 5.5 <noreply@anthropic.com>
Claude-Session: https://claude.ai/code/session_01UcY36na7Mp1DEYttKiw1pa
</commit_message>
<xml_diff>
--- a/docs/exports/02-KERNEL-INTERNALS.docx
+++ b/docs/exports/02-KERNEL-INTERNALS.docx
@@ -14495,7 +14495,112 @@
         <w:t xml:space="preserve"> </w:t>
       </w:r>
       <w:r>
-        <w:t xml:space="preserve">(§10.2) — for Setup, the first-run wizard.</w:t>
+        <w:t xml:space="preserve">(§10.2) — for Setup, the first-run wizard,</w:t>
+      </w:r>
+      <w:r>
+        <w:t xml:space="preserve"> </w:t>
+      </w:r>
+      <w:r>
+        <w:t xml:space="preserve">v70 =</w:t>
+      </w:r>
+      <w:r>
+        <w:t xml:space="preserve"> </w:t>
+      </w:r>
+      <w:r>
+        <w:rPr>
+          <w:rStyle w:val="VerbatimChar"/>
+        </w:rPr>
+        <w:t xml:space="preserve">gpu_texture_rect</w:t>
+      </w:r>
+      <w:r>
+        <w:t xml:space="preserve"> </w:t>
+      </w:r>
+      <w:r>
+        <w:t xml:space="preserve">— a rectangle of a GPU texture replaced (no whole re-upload), the frame</w:t>
+      </w:r>
+      <w:r>
+        <w:t xml:space="preserve"> </w:t>
+      </w:r>
+      <w:r>
+        <w:t xml:space="preserve">flag</w:t>
+      </w:r>
+      <w:r>
+        <w:t xml:space="preserve"> </w:t>
+      </w:r>
+      <w:r>
+        <w:rPr>
+          <w:rStyle w:val="VerbatimChar"/>
+        </w:rPr>
+        <w:t xml:space="preserve">KAPI_GPU_F_ALPHA</w:t>
+      </w:r>
+      <w:r>
+        <w:t xml:space="preserve"> </w:t>
+      </w:r>
+      <w:r>
+        <w:t xml:space="preserve">(a target that keeps its alpha), the GPU's handles shared fairly by the</w:t>
+      </w:r>
+      <w:r>
+        <w:t xml:space="preserve"> </w:t>
+      </w:r>
+      <w:r>
+        <w:t xml:space="preserve">programs using it at once (</w:t>
+      </w:r>
+      <w:r>
+        <w:rPr>
+          <w:rStyle w:val="VerbatimChar"/>
+        </w:rPr>
+        <w:t xml:space="preserve">KAPI_GPU_MAX_TEXTURES</w:t>
+      </w:r>
+      <w:r>
+        <w:t xml:space="preserve"> </w:t>
+      </w:r>
+      <w:r>
+        <w:t xml:space="preserve">1024 in all,</w:t>
+      </w:r>
+      <w:r>
+        <w:t xml:space="preserve"> </w:t>
+      </w:r>
+      <w:r>
+        <w:rPr>
+          <w:rStyle w:val="VerbatimChar"/>
+        </w:rPr>
+        <w:t xml:space="preserve">KAPI_GPU_MAX_TEXTURES_AS</w:t>
+      </w:r>
+      <w:r>
+        <w:t xml:space="preserve"> </w:t>
+      </w:r>
+      <w:r>
+        <w:t xml:space="preserve">512 a</w:t>
+      </w:r>
+      <w:r>
+        <w:t xml:space="preserve"> </w:t>
+      </w:r>
+      <w:r>
+        <w:t xml:space="preserve">program;</w:t>
+      </w:r>
+      <w:r>
+        <w:t xml:space="preserve"> </w:t>
+      </w:r>
+      <w:r>
+        <w:rPr>
+          <w:rStyle w:val="VerbatimChar"/>
+        </w:rPr>
+        <w:t xml:space="preserve">gpu_vbuf</w:t>
+      </w:r>
+      <w:r>
+        <w:t xml:space="preserve"> </w:t>
+      </w:r>
+      <w:r>
+        <w:t xml:space="preserve">32 in all, 8 a program) — for the GPU compositing service (</w:t>
+      </w:r>
+      <w:r>
+        <w:rPr>
+          <w:rStyle w:val="VerbatimChar"/>
+        </w:rPr>
+        <w:t xml:space="preserve">user/gpucomp</w:t>
+      </w:r>
+      <w:r>
+        <w:t xml:space="preserve">, §15).</w:t>
       </w:r>
     </w:p>
     <w:p>
@@ -22517,7 +22622,7 @@
               <w:t xml:space="preserve"> </w:t>
             </w:r>
             <w:r>
-              <w:t xml:space="preserve">&lt; 0 makes one (≤ 256 in all), ≥ 0 replaces its pixels,</w:t>
+              <w:t xml:space="preserve">&lt; 0 makes one (≤ 256 in all; v70: ≤ 1024 in all, ≤ 512 a program), ≥ 0 replaces its pixels,</w:t>
             </w:r>
             <w:r>
               <w:t xml:space="preserve"> </w:t>
@@ -23375,7 +23480,7 @@
               <w:t xml:space="preserve">gpu_vbuf(bytes)</w:t>
             </w:r>
             <w:r>
-              <w:t xml:space="preserve">: memory the GPU reads too — low, physically contiguous, mapped into the program (the surface arena); up to 8 a program, 64 MB each, freed when it ends → its address, 0 none.</w:t>
+              <w:t xml:space="preserve">: memory the GPU reads too — low, physically contiguous, mapped into the program (the surface arena); up to 8 a program (v70: 32 in all; 8 in all before), 64 MB each, freed when it ends → its address, 0 none.</w:t>
             </w:r>
             <w:r>
               <w:t xml:space="preserve"> </w:t>
@@ -23465,6 +23570,272 @@
             </w:r>
             <w:r>
               <w:t xml:space="preserve">(keep room there) — nothing copied.</w:t>
+            </w:r>
+          </w:p>
+        </w:tc>
+      </w:tr>
+      <w:tr>
+        <w:tc>
+          <w:tcPr/>
+          <w:p>
+            <w:pPr>
+              <w:pStyle w:val="Compact"/>
+            </w:pPr>
+            <w:r>
+              <w:t xml:space="preserve">GPU (v70)</w:t>
+            </w:r>
+          </w:p>
+        </w:tc>
+        <w:tc>
+          <w:tcPr/>
+          <w:p>
+            <w:pPr>
+              <w:pStyle w:val="Compact"/>
+            </w:pPr>
+            <w:r>
+              <w:rPr>
+                <w:rStyle w:val="VerbatimChar"/>
+              </w:rPr>
+              <w:t xml:space="preserve">gpu_texture_rect(handle, x, y, w, h, pixels, stride)</w:t>
+            </w:r>
+            <w:r>
+              <w:t xml:space="preserve">: the rectangle</w:t>
+            </w:r>
+            <w:r>
+              <w:t xml:space="preserve"> </w:t>
+            </w:r>
+            <w:r>
+              <w:rPr>
+                <w:rStyle w:val="VerbatimChar"/>
+              </w:rPr>
+              <w:t xml:space="preserve">x, y, w × h</w:t>
+            </w:r>
+            <w:r>
+              <w:t xml:space="preserve"> </w:t>
+            </w:r>
+            <w:r>
+              <w:t xml:space="preserve">of texture</w:t>
+            </w:r>
+            <w:r>
+              <w:t xml:space="preserve"> </w:t>
+            </w:r>
+            <w:r>
+              <w:rPr>
+                <w:rStyle w:val="VerbatimChar"/>
+              </w:rPr>
+              <w:t xml:space="preserve">handle</w:t>
+            </w:r>
+            <w:r>
+              <w:t xml:space="preserve"> </w:t>
+            </w:r>
+            <w:r>
+              <w:t xml:space="preserve">(the caller's) replaced by</w:t>
+            </w:r>
+            <w:r>
+              <w:t xml:space="preserve"> </w:t>
+            </w:r>
+            <w:r>
+              <w:rPr>
+                <w:rStyle w:val="VerbatimChar"/>
+              </w:rPr>
+              <w:t xml:space="preserve">pixels</w:t>
+            </w:r>
+            <w:r>
+              <w:t xml:space="preserve"> </w:t>
+            </w:r>
+            <w:r>
+              <w:t xml:space="preserve">(0xAARRGGBB,</w:t>
+            </w:r>
+            <w:r>
+              <w:t xml:space="preserve"> </w:t>
+            </w:r>
+            <w:r>
+              <w:rPr>
+                <w:rStyle w:val="VerbatimChar"/>
+              </w:rPr>
+              <w:t xml:space="preserve">stride</w:t>
+            </w:r>
+            <w:r>
+              <w:t xml:space="preserve"> </w:t>
+            </w:r>
+            <w:r>
+              <w:t xml:space="preserve">pixels a row), the rest kept → 0, −1 no GPU, −2 bad arguments (not the caller's handle, the rectangle not inside the texture). The texels are stored where the texture unit reads them for the texture's size (</w:t>
+            </w:r>
+            <w:r>
+              <w:rPr>
+                <w:rStyle w:val="VerbatimChar"/>
+              </w:rPr>
+              <w:t xml:space="preserve">StoreRect</w:t>
+            </w:r>
+            <w:r>
+              <w:t xml:space="preserve">,</w:t>
+            </w:r>
+            <w:r>
+              <w:t xml:space="preserve"> </w:t>
+            </w:r>
+            <w:r>
+              <w:rPr>
+                <w:rStyle w:val="VerbatimChar"/>
+              </w:rPr>
+              <w:t xml:space="preserve">kern/v3d_tiling.h</w:t>
+            </w:r>
+            <w:r>
+              <w:t xml:space="preserve">: a utile row — 4 texels, 16 contiguous bytes in every layout — per offset computed) and only the span of bytes written is cleaned from the CPU caches; it waits for a frame in flight, as</w:t>
+            </w:r>
+            <w:r>
+              <w:t xml:space="preserve"> </w:t>
+            </w:r>
+            <w:r>
+              <w:rPr>
+                <w:rStyle w:val="VerbatimChar"/>
+              </w:rPr>
+              <w:t xml:space="preserve">gpu_texture</w:t>
+            </w:r>
+            <w:r>
+              <w:t xml:space="preserve">.</w:t>
+            </w:r>
+            <w:r>
+              <w:t xml:space="preserve"> </w:t>
+            </w:r>
+            <w:r>
+              <w:rPr>
+                <w:rStyle w:val="VerbatimChar"/>
+              </w:rPr>
+              <w:t xml:space="preserve">KAPI_GPU_F_ALPHA</w:t>
+            </w:r>
+            <w:r>
+              <w:t xml:space="preserve"> </w:t>
+            </w:r>
+            <w:r>
+              <w:t xml:space="preserve">(a frame's flag,</w:t>
+            </w:r>
+            <w:r>
+              <w:t xml:space="preserve"> </w:t>
+            </w:r>
+            <w:r>
+              <w:rPr>
+                <w:rStyle w:val="VerbatimChar"/>
+              </w:rPr>
+              <w:t xml:space="preserve">gpu_render</w:t>
+            </w:r>
+            <w:r>
+              <w:t xml:space="preserve"> </w:t>
+            </w:r>
+            <w:r>
+              <w:t xml:space="preserve">/</w:t>
+            </w:r>
+            <w:r>
+              <w:t xml:space="preserve"> </w:t>
+            </w:r>
+            <w:r>
+              <w:rPr>
+                <w:rStyle w:val="VerbatimChar"/>
+              </w:rPr>
+              <w:t xml:space="preserve">2</w:t>
+            </w:r>
+            <w:r>
+              <w:t xml:space="preserve"> </w:t>
+            </w:r>
+            <w:r>
+              <w:t xml:space="preserve">/</w:t>
+            </w:r>
+            <w:r>
+              <w:t xml:space="preserve"> </w:t>
+            </w:r>
+            <w:r>
+              <w:rPr>
+                <w:rStyle w:val="VerbatimChar"/>
+              </w:rPr>
+              <w:t xml:space="preserve">3</w:t>
+            </w:r>
+            <w:r>
+              <w:t xml:space="preserve">): the target is 0xAARRGGBB premultiplied — its alpha loaded with</w:t>
+            </w:r>
+            <w:r>
+              <w:t xml:space="preserve"> </w:t>
+            </w:r>
+            <w:r>
+              <w:rPr>
+                <w:rStyle w:val="VerbatimChar"/>
+              </w:rPr>
+              <w:t xml:space="preserve">KAPI_GPU_F_KEEP</w:t>
+            </w:r>
+            <w:r>
+              <w:t xml:space="preserve"> </w:t>
+            </w:r>
+            <w:r>
+              <w:t xml:space="preserve">(not forced to 1), blended, written (the colour write mask no longer spares it in the direct mode), stored, and cleared to</w:t>
+            </w:r>
+            <w:r>
+              <w:t xml:space="preserve"> </w:t>
+            </w:r>
+            <w:r>
+              <w:rPr>
+                <w:rStyle w:val="VerbatimChar"/>
+              </w:rPr>
+              <w:t xml:space="preserve">clear</w:t>
+            </w:r>
+            <w:r>
+              <w:t xml:space="preserve">'s top byte; without it nothing changes (0x00RRGGBB: the direct mode leaves the top byte, the copy mode writes 0). Handles:</w:t>
+            </w:r>
+            <w:r>
+              <w:t xml:space="preserve"> </w:t>
+            </w:r>
+            <w:r>
+              <w:rPr>
+                <w:rStyle w:val="VerbatimChar"/>
+              </w:rPr>
+              <w:t xml:space="preserve">gpu_texture</w:t>
+            </w:r>
+            <w:r>
+              <w:t xml:space="preserve"> </w:t>
+            </w:r>
+            <w:r>
+              <w:t xml:space="preserve">gives 1024 in all (256 before), 512 at most a program (−4 past that), so an emulator's texture cache and the browser's layers fit side by side;</w:t>
+            </w:r>
+            <w:r>
+              <w:t xml:space="preserve"> </w:t>
+            </w:r>
+            <w:r>
+              <w:rPr>
+                <w:rStyle w:val="VerbatimChar"/>
+              </w:rPr>
+              <w:t xml:space="preserve">gpu_vbuf</w:t>
+            </w:r>
+            <w:r>
+              <w:t xml:space="preserve"> </w:t>
+            </w:r>
+            <w:r>
+              <w:t xml:space="preserve">32 blocks in all, 8 a program (8 in all before). See §15</w:t>
+            </w:r>
+            <w:r>
+              <w:t xml:space="preserve"> </w:t>
+            </w:r>
+            <w:r>
+              <w:rPr>
+                <w:i/>
+                <w:iCs/>
+              </w:rPr>
+              <w:t xml:space="preserve">Sharing the GPU</w:t>
+            </w:r>
+            <w:r>
+              <w:t xml:space="preserve"> </w:t>
+            </w:r>
+            <w:r>
+              <w:t xml:space="preserve">and</w:t>
+            </w:r>
+            <w:r>
+              <w:t xml:space="preserve"> </w:t>
+            </w:r>
+            <w:r>
+              <w:rPr>
+                <w:i/>
+                <w:iCs/>
+              </w:rPr>
+              <w:t xml:space="preserve">The compositing service</w:t>
+            </w:r>
+            <w:r>
+              <w:t xml:space="preserve">.</w:t>
             </w:r>
           </w:p>
         </w:tc>
@@ -30308,22 +30679,13 @@
         <w:t xml:space="preserve"> </w:t>
       </w:r>
       <w:r>
-        <w:t xml:space="preserve">resolves a dotted-quad or a DNS name (</w:t>
-      </w:r>
-      <w:r>
-        <w:rPr>
-          <w:rStyle w:val="VerbatimChar"/>
-        </w:rPr>
-        <w:t xml:space="preserve">CDNSClient</w:t>
-      </w:r>
-      <w:r>
-        <w:t xml:space="preserve">) and</w:t>
-      </w:r>
-      <w:r>
-        <w:t xml:space="preserve"> </w:t>
-      </w:r>
-      <w:r>
-        <w:t xml:space="preserve">connects (blocking, cooperative);</w:t>
+        <w:t xml:space="preserve">resolves a dotted-quad or a DNS name and connects (blocking,</w:t>
+      </w:r>
+      <w:r>
+        <w:t xml:space="preserve"> </w:t>
+      </w:r>
+      <w:r>
+        <w:t xml:space="preserve">cooperative);</w:t>
       </w:r>
       <w:r>
         <w:t xml:space="preserve"> </w:t>
@@ -30369,7 +30731,46 @@
         <w:t xml:space="preserve"> </w:t>
       </w:r>
       <w:r>
-        <w:t xml:space="preserve">(so a GUI app polls it from its frame loop);</w:t>
+        <w:t xml:space="preserve">(so a</w:t>
+      </w:r>
+      <w:r>
+        <w:t xml:space="preserve"> </w:t>
+      </w:r>
+      <w:r>
+        <w:t xml:space="preserve">GUI app polls it from its frame loop; with</w:t>
+      </w:r>
+      <w:r>
+        <w:t xml:space="preserve"> </w:t>
+      </w:r>
+      <w:r>
+        <w:rPr>
+          <w:rStyle w:val="VerbatimChar"/>
+        </w:rPr>
+        <w:t xml:space="preserve">netcore=1</w:t>
+      </w:r>
+      <w:r>
+        <w:t xml:space="preserve"> </w:t>
+      </w:r>
+      <w:r>
+        <w:t xml:space="preserve">one call gathers the segments that</w:t>
+      </w:r>
+      <w:r>
+        <w:t xml:space="preserve"> </w:t>
+      </w:r>
+      <w:r>
+        <w:t xml:space="preserve">fit in its 32 KB request buffer,</w:t>
+      </w:r>
+      <w:r>
+        <w:t xml:space="preserve"> </w:t>
+      </w:r>
+      <w:r>
+        <w:rPr>
+          <w:rStyle w:val="VerbatimChar"/>
+        </w:rPr>
+        <w:t xml:space="preserve">NET_REQBUF</w:t>
+      </w:r>
+      <w:r>
+        <w:t xml:space="preserve">);</w:t>
       </w:r>
       <w:r>
         <w:t xml:space="preserve"> </w:t>
@@ -30384,13 +30785,151 @@
         <w:t xml:space="preserve"> </w:t>
       </w:r>
       <w:r>
-        <w:t xml:space="preserve">drops</w:t>
-      </w:r>
-      <w:r>
-        <w:t xml:space="preserve"> </w:t>
-      </w:r>
-      <w:r>
-        <w:t xml:space="preserve">it. Each socket records its</w:t>
+        <w:t xml:space="preserve">drops it. A connect</w:t>
+      </w:r>
+      <w:r>
+        <w:t xml:space="preserve"> </w:t>
+      </w:r>
+      <w:r>
+        <w:rPr>
+          <w:b/>
+          <w:bCs/>
+        </w:rPr>
+        <w:t xml:space="preserve">takes its</w:t>
+      </w:r>
+      <w:r>
+        <w:rPr>
+          <w:b/>
+          <w:bCs/>
+        </w:rPr>
+        <w:t xml:space="preserve"> </w:t>
+      </w:r>
+      <w:r>
+        <w:rPr>
+          <w:b/>
+          <w:bCs/>
+        </w:rPr>
+        <w:t xml:space="preserve">slot before it blocks</w:t>
+      </w:r>
+      <w:r>
+        <w:t xml:space="preserve"> </w:t>
+      </w:r>
+      <w:r>
+        <w:t xml:space="preserve">(</w:t>
+      </w:r>
+      <w:r>
+        <w:rPr>
+          <w:rStyle w:val="VerbatimChar"/>
+        </w:rPr>
+        <w:t xml:space="preserve">SLOT_CONNECTING</w:t>
+      </w:r>
+      <w:r>
+        <w:t xml:space="preserve">, invisible to the other calls): the net core's</w:t>
+      </w:r>
+      <w:r>
+        <w:t xml:space="preserve"> </w:t>
+      </w:r>
+      <w:r>
+        <w:t xml:space="preserve">workers run other connects during a DNS lookup or a handshake, and two of them once got the</w:t>
+      </w:r>
+      <w:r>
+        <w:t xml:space="preserve"> </w:t>
+      </w:r>
+      <w:r>
+        <w:t xml:space="preserve">same slot (both fetches then read one connection: NetSurf's style sheets failed).</w:t>
+      </w:r>
+      <w:r>
+        <w:t xml:space="preserve"> </w:t>
+      </w:r>
+      <w:r>
+        <w:rPr>
+          <w:b/>
+          <w:bCs/>
+        </w:rPr>
+        <w:t xml:space="preserve">DNS</w:t>
+      </w:r>
+      <w:r>
+        <w:rPr>
+          <w:b/>
+          <w:bCs/>
+        </w:rPr>
+        <w:t xml:space="preserve"> </w:t>
+      </w:r>
+      <w:r>
+        <w:rPr>
+          <w:b/>
+          <w:bCs/>
+        </w:rPr>
+        <w:t xml:space="preserve">cache</w:t>
+      </w:r>
+      <w:r>
+        <w:t xml:space="preserve">: 32 names kept 5 minutes (</w:t>
+      </w:r>
+      <w:r>
+        <w:rPr>
+          <w:rStyle w:val="VerbatimChar"/>
+        </w:rPr>
+        <w:t xml:space="preserve">ResolveName</w:t>
+      </w:r>
+      <w:r>
+        <w:t xml:space="preserve">, used by</w:t>
+      </w:r>
+      <w:r>
+        <w:t xml:space="preserve"> </w:t>
+      </w:r>
+      <w:r>
+        <w:rPr>
+          <w:rStyle w:val="VerbatimChar"/>
+        </w:rPr>
+        <w:t xml:space="preserve">tcp_connect</w:t>
+      </w:r>
+      <w:r>
+        <w:t xml:space="preserve">,</w:t>
+      </w:r>
+      <w:r>
+        <w:t xml:space="preserve"> </w:t>
+      </w:r>
+      <w:r>
+        <w:rPr>
+          <w:rStyle w:val="VerbatimChar"/>
+        </w:rPr>
+        <w:t xml:space="preserve">net_resolve</w:t>
+      </w:r>
+      <w:r>
+        <w:t xml:space="preserve">,</w:t>
+      </w:r>
+      <w:r>
+        <w:t xml:space="preserve"> </w:t>
+      </w:r>
+      <w:r>
+        <w:rPr>
+          <w:rStyle w:val="VerbatimChar"/>
+        </w:rPr>
+        <w:t xml:space="preserve">net_ping</w:t>
+      </w:r>
+      <w:r>
+        <w:t xml:space="preserve">) in front of Circle's</w:t>
+      </w:r>
+      <w:r>
+        <w:t xml:space="preserve"> </w:t>
+      </w:r>
+      <w:r>
+        <w:rPr>
+          <w:rStyle w:val="VerbatimChar"/>
+        </w:rPr>
+        <w:t xml:space="preserve">CDNSClient</w:t>
+      </w:r>
+      <w:r>
+        <w:t xml:space="preserve"> </w:t>
+      </w:r>
+      <w:r>
+        <w:t xml:space="preserve">-- which answers in milliseconds now (it slept</w:t>
+      </w:r>
+      <w:r>
+        <w:t xml:space="preserve"> </w:t>
+      </w:r>
+      <w:r>
+        <w:t xml:space="preserve">1 s per query: docs/05 §18). Each socket records its</w:t>
       </w:r>
       <w:r>
         <w:t xml:space="preserve"> </w:t>
@@ -35964,7 +36503,22 @@
         <w:t xml:space="preserve"> </w:t>
       </w:r>
       <w:r>
-        <w:t xml:space="preserve">(v53).</w:t>
+        <w:t xml:space="preserve">(v53),</w:t>
+      </w:r>
+      <w:r>
+        <w:t xml:space="preserve"> </w:t>
+      </w:r>
+      <w:r>
+        <w:rPr>
+          <w:rStyle w:val="VerbatimChar"/>
+        </w:rPr>
+        <w:t xml:space="preserve">/bin/gpcdemo</w:t>
+      </w:r>
+      <w:r>
+        <w:t xml:space="preserve"> </w:t>
+      </w:r>
+      <w:r>
+        <w:t xml:space="preserve">(the compositing service over v53 + v70).</w:t>
       </w:r>
     </w:p>
     <w:p>
@@ -38172,7 +38726,7 @@
         <w:t xml:space="preserve">gpu_texture</w:t>
       </w:r>
       <w:r>
-        <w:t xml:space="preserve">, ≤ 256, owned by the program that made them, freed with its</w:t>
+        <w:t xml:space="preserve">, ≤ 1024 — 512 a program — since v70, owned by the program that made them, freed with its</w:t>
       </w:r>
       <w:r>
         <w:t xml:space="preserve"> </w:t>
@@ -38849,16 +39403,607 @@
           <w:b/>
           <w:bCs/>
         </w:rPr>
+        <w:t xml:space="preserve">Sharing the GPU between programs</w:t>
+      </w:r>
+      <w:r>
+        <w:t xml:space="preserve"> </w:t>
+      </w:r>
+      <w:r>
+        <w:t xml:space="preserve">(the GameCube emulator and the browser at once, say). The</w:t>
+      </w:r>
+      <w:r>
+        <w:t xml:space="preserve"> </w:t>
+      </w:r>
+      <w:r>
+        <w:t xml:space="preserve">kernel is not preempted (§5) and every GPU call runs on core 0, so the</w:t>
+      </w:r>
+      <w:r>
+        <w:t xml:space="preserve"> </w:t>
+      </w:r>
+      <w:r>
+        <w:rPr>
+          <w:rStyle w:val="VerbatimChar"/>
+        </w:rPr>
+        <w:t xml:space="preserve">while (s_bBusy) Yield (); s_bBusy = TRUE;</w:t>
+      </w:r>
+      <w:r>
+        <w:t xml:space="preserve"> </w:t>
+      </w:r>
+      <w:r>
+        <w:t xml:space="preserve">that starts each</w:t>
+      </w:r>
+      <w:r>
+        <w:t xml:space="preserve"> </w:t>
+      </w:r>
+      <w:r>
+        <w:rPr>
+          <w:rStyle w:val="VerbatimChar"/>
+        </w:rPr>
+        <w:t xml:space="preserve">gpu_texture</w:t>
+      </w:r>
+      <w:r>
+        <w:t xml:space="preserve"> </w:t>
+      </w:r>
+      <w:r>
+        <w:t xml:space="preserve">/</w:t>
+      </w:r>
+      <w:r>
+        <w:t xml:space="preserve"> </w:t>
+      </w:r>
+      <w:r>
+        <w:rPr>
+          <w:rStyle w:val="VerbatimChar"/>
+        </w:rPr>
+        <w:t xml:space="preserve">gpu_texture_rect</w:t>
+      </w:r>
+      <w:r>
+        <w:t xml:space="preserve"> </w:t>
+      </w:r>
+      <w:r>
+        <w:t xml:space="preserve">/</w:t>
+      </w:r>
+      <w:r>
+        <w:t xml:space="preserve"> </w:t>
+      </w:r>
+      <w:r>
+        <w:rPr>
+          <w:rStyle w:val="VerbatimChar"/>
+        </w:rPr>
+        <w:t xml:space="preserve">gpu_program</w:t>
+      </w:r>
+      <w:r>
+        <w:t xml:space="preserve"> </w:t>
+      </w:r>
+      <w:r>
+        <w:t xml:space="preserve">/</w:t>
+      </w:r>
+      <w:r>
+        <w:t xml:space="preserve"> </w:t>
+      </w:r>
+      <w:r>
+        <w:rPr>
+          <w:rStyle w:val="VerbatimChar"/>
+        </w:rPr>
+        <w:t xml:space="preserve">gpu_render*</w:t>
+      </w:r>
+      <w:r>
+        <w:t xml:space="preserve"> </w:t>
+      </w:r>
+      <w:r>
+        <w:t xml:space="preserve">is atomic:</w:t>
+      </w:r>
+      <w:r>
+        <w:t xml:space="preserve"> </w:t>
+      </w:r>
+      <w:r>
+        <w:rPr>
+          <w:b/>
+          <w:bCs/>
+        </w:rPr>
+        <w:t xml:space="preserve">one GPU job at a time, whole</w:t>
+      </w:r>
+      <w:r>
+        <w:t xml:space="preserve"> </w:t>
+      </w:r>
+      <w:r>
+        <w:t xml:space="preserve">— a frame's lists, its binning and</w:t>
+      </w:r>
+      <w:r>
+        <w:t xml:space="preserve"> </w:t>
+      </w:r>
+      <w:r>
+        <w:t xml:space="preserve">rendering, its target's copy — and another program's call waits (it yields) until that frame is</w:t>
+      </w:r>
+      <w:r>
+        <w:t xml:space="preserve"> </w:t>
+      </w:r>
+      <w:r>
+        <w:t xml:space="preserve">done. Nothing of a frame survives it: the control lists, the vertex buffers,</w:t>
+      </w:r>
+      <w:r>
+        <w:t xml:space="preserve"> </w:t>
+      </w:r>
+      <w:r>
+        <w:rPr>
+          <w:rStyle w:val="VerbatimChar"/>
+        </w:rPr>
+        <w:t xml:space="preserve">s_Target</w:t>
+      </w:r>
+      <w:r>
+        <w:t xml:space="preserve">, the tile</w:t>
+      </w:r>
+      <w:r>
+        <w:t xml:space="preserve"> </w:t>
+      </w:r>
+      <w:r>
+        <w:t xml:space="preserve">memory are rebuilt by each frame (their memory only grows). What a program owns is marked with</w:t>
+      </w:r>
+      <w:r>
+        <w:t xml:space="preserve"> </w:t>
+      </w:r>
+      <w:r>
+        <w:t xml:space="preserve">its address space (textures, programs, vbufs), checked by every call, freed when it ends</w:t>
+      </w:r>
+      <w:r>
+        <w:t xml:space="preserve"> </w:t>
+      </w:r>
+      <w:r>
+        <w:t xml:space="preserve">(</w:t>
+      </w:r>
+      <w:r>
+        <w:rPr>
+          <w:rStyle w:val="VerbatimChar"/>
+        </w:rPr>
+        <w:t xml:space="preserve">V3DReleaseAS</w:t>
+      </w:r>
+      <w:r>
+        <w:t xml:space="preserve">, after the frame in flight). So two programs can use the GPU together; what they</w:t>
+      </w:r>
+      <w:r>
+        <w:t xml:space="preserve"> </w:t>
+      </w:r>
+      <w:r>
+        <w:t xml:space="preserve">compete for is the pools of handles: until v70 one program could hold all 256 textures (gcemu and</w:t>
+      </w:r>
+      <w:r>
+        <w:t xml:space="preserve"> </w:t>
+      </w:r>
+      <w:r>
+        <w:t xml:space="preserve">n64emu keep up to 256) or all 8 vbufs, and the other got −4 / 0 —</w:t>
+      </w:r>
+      <w:r>
+        <w:t xml:space="preserve"> </w:t>
+      </w:r>
+      <w:r>
+        <w:rPr>
+          <w:b/>
+          <w:bCs/>
+        </w:rPr>
+        <w:t xml:space="preserve">v70</w:t>
+      </w:r>
+      <w:r>
+        <w:t xml:space="preserve">: 1024 textures, 512 a</w:t>
+      </w:r>
+      <w:r>
+        <w:t xml:space="preserve"> </w:t>
+      </w:r>
+      <w:r>
+        <w:t xml:space="preserve">program; 32 vbufs, 8 a program. Still shared: the GPU's time (frames are served in the order the</w:t>
+      </w:r>
+      <w:r>
+        <w:t xml:space="preserve"> </w:t>
+      </w:r>
+      <w:r>
+        <w:t xml:space="preserve">scheduler runs the callers: a 14 ms Wind Waker frame delays a composite by up to that much), and</w:t>
+      </w:r>
+      <w:r>
+        <w:t xml:space="preserve"> </w:t>
+      </w:r>
+      <w:r>
+        <w:t xml:space="preserve">its state — a frame that hangs turns the GPU off for everybody until a reboot (</w:t>
+      </w:r>
+      <w:r>
+        <w:rPr>
+          <w:rStyle w:val="VerbatimChar"/>
+        </w:rPr>
+        <w:t xml:space="preserve">s_nState = −1</w:t>
+      </w:r>
+      <w:r>
+        <w:t xml:space="preserve">;</w:t>
+      </w:r>
+      <w:r>
+        <w:t xml:space="preserve"> </w:t>
+      </w:r>
+      <w:r>
+        <w:t xml:space="preserve">the compositing service then goes on with the CPU,</w:t>
+      </w:r>
+      <w:r>
+        <w:t xml:space="preserve"> </w:t>
+      </w:r>
+      <w:r>
+        <w:rPr>
+          <w:rStyle w:val="VerbatimChar"/>
+        </w:rPr>
+        <w:t xml:space="preserve">GPC_LOST</w:t>
+      </w:r>
+      <w:r>
+        <w:t xml:space="preserve">). The GPU's low memory (below 1 GB,</w:t>
+      </w:r>
+      <w:r>
+        <w:t xml:space="preserve"> </w:t>
+      </w:r>
+      <w:r>
+        <w:rPr>
+          <w:rStyle w:val="VerbatimChar"/>
+        </w:rPr>
+        <w:t xml:space="preserve">HEAP_LOW</w:t>
+      </w:r>
+      <w:r>
+        <w:t xml:space="preserve">) is shared with the kernel's other users.</w:t>
+      </w:r>
+    </w:p>
+    <w:p>
+      <w:pPr>
+        <w:pStyle w:val="Compact"/>
+        <w:numPr>
+          <w:ilvl w:val="0"/>
+          <w:numId w:val="1030"/>
+        </w:numPr>
+      </w:pPr>
+      <w:r>
+        <w:rPr>
+          <w:b/>
+          <w:bCs/>
+        </w:rPr>
+        <w:t xml:space="preserve">The compositing service</w:t>
+      </w:r>
+      <w:r>
+        <w:t xml:space="preserve"> </w:t>
+      </w:r>
+      <w:r>
+        <w:t xml:space="preserve">(</w:t>
+      </w:r>
+      <w:r>
+        <w:rPr>
+          <w:rStyle w:val="VerbatimChar"/>
+        </w:rPr>
+        <w:t xml:space="preserve">user/gpucomp/gpucomp.{h,c}</w:t>
+      </w:r>
+      <w:r>
+        <w:t xml:space="preserve">, a user library over v53 + v70; docs/03</w:t>
+      </w:r>
+      <w:r>
+        <w:t xml:space="preserve"> </w:t>
+      </w:r>
+      <w:r>
+        <w:rPr>
+          <w:i/>
+          <w:iCs/>
+        </w:rPr>
+        <w:t xml:space="preserve">GPU compositing</w:t>
+      </w:r>
+      <w:r>
+        <w:t xml:space="preserve">): an app's layers — ARGB premultiplied textures of any size (past 2048 a side</w:t>
+      </w:r>
+      <w:r>
+        <w:t xml:space="preserve"> </w:t>
+      </w:r>
+      <w:r>
+        <w:t xml:space="preserve">kept as tiles of 2048 with a one-texel border of their neighbours, so that bilinear filtering is</w:t>
+      </w:r>
+      <w:r>
+        <w:t xml:space="preserve"> </w:t>
+      </w:r>
+      <w:r>
+        <w:t xml:space="preserve">seamless) — composited into a target (the window's canvas: the direct mode, no copy) with, per</w:t>
+      </w:r>
+      <w:r>
+        <w:t xml:space="preserve"> </w:t>
+      </w:r>
+      <w:r>
+        <w:t xml:space="preserve">layer, a 2D affine matrix, a clip rectangle, an opacity, premultiplied source-over and bilinear</w:t>
+      </w:r>
+      <w:r>
+        <w:t xml:space="preserve"> </w:t>
+      </w:r>
+      <w:r>
+        <w:t xml:space="preserve">(or nearest) filtering; scrolling = the layer's source rectangle moved over its texture. A</w:t>
+      </w:r>
+      <w:r>
+        <w:t xml:space="preserve"> </w:t>
+      </w:r>
+      <w:r>
+        <w:t xml:space="preserve">composite is one</w:t>
+      </w:r>
+      <w:r>
+        <w:t xml:space="preserve"> </w:t>
+      </w:r>
+      <w:r>
+        <w:rPr>
+          <w:rStyle w:val="VerbatimChar"/>
+        </w:rPr>
+        <w:t xml:space="preserve">gpu_render</w:t>
+      </w:r>
+      <w:r>
+        <w:t xml:space="preserve"> </w:t>
+      </w:r>
+      <w:r>
+        <w:t xml:space="preserve">frame (a target past 2048 a side: equal parts, one frame each): per</w:t>
+      </w:r>
+      <w:r>
+        <w:t xml:space="preserve"> </w:t>
+      </w:r>
+      <w:r>
+        <w:t xml:space="preserve">layer and tile, the tile's inner rectangle (within the source rectangle) mapped into the target,</w:t>
+      </w:r>
+      <w:r>
+        <w:t xml:space="preserve"> </w:t>
+      </w:r>
+      <w:r>
+        <w:t xml:space="preserve">clipped there (Sutherland-Hodgman against the clip rectangle and the target: the texture</w:t>
+      </w:r>
+      <w:r>
+        <w:t xml:space="preserve"> </w:t>
+      </w:r>
+      <w:r>
+        <w:t xml:space="preserve">coordinates are affine, interpolated exactly) and drawn as a fan — the kernel's</w:t>
+      </w:r>
+      <w:r>
+        <w:t xml:space="preserve"> </w:t>
+      </w:r>
+      <w:r>
+        <w:rPr>
+          <w:rStyle w:val="VerbatimChar"/>
+        </w:rPr>
+        <w:t xml:space="preserve">FS_TEX</w:t>
+      </w:r>
+      <w:r>
+        <w:t xml:space="preserve"> </w:t>
+      </w:r>
+      <w:r>
+        <w:t xml:space="preserve">(texel × colour, the colour = the opacity), blend</w:t>
+      </w:r>
+      <w:r>
+        <w:t xml:space="preserve"> </w:t>
+      </w:r>
+      <w:r>
+        <w:rPr>
+          <w:rStyle w:val="VerbatimChar"/>
+        </w:rPr>
+        <w:t xml:space="preserve">PREMUL</w:t>
+      </w:r>
+      <w:r>
+        <w:t xml:space="preserve"> </w:t>
+      </w:r>
+      <w:r>
+        <w:t xml:space="preserve">(</w:t>
+      </w:r>
+      <w:r>
+        <w:rPr>
+          <w:rStyle w:val="VerbatimChar"/>
+        </w:rPr>
+        <w:t xml:space="preserve">ONE, ONE_MINUS_SRC_ALPHA</w:t>
+      </w:r>
+      <w:r>
+        <w:t xml:space="preserve">, or none</w:t>
+      </w:r>
+      <w:r>
+        <w:t xml:space="preserve"> </w:t>
+      </w:r>
+      <w:r>
+        <w:t xml:space="preserve">for an opaque layer at full opacity),</w:t>
+      </w:r>
+      <w:r>
+        <w:t xml:space="preserve"> </w:t>
+      </w:r>
+      <w:r>
+        <w:rPr>
+          <w:rStyle w:val="VerbatimChar"/>
+        </w:rPr>
+        <w:t xml:space="preserve">Z_ALWAYS</w:t>
+      </w:r>
+      <w:r>
+        <w:t xml:space="preserve"> </w:t>
+      </w:r>
+      <w:r>
+        <w:t xml:space="preserve">+</w:t>
+      </w:r>
+      <w:r>
+        <w:t xml:space="preserve"> </w:t>
+      </w:r>
+      <w:r>
+        <w:rPr>
+          <w:rStyle w:val="VerbatimChar"/>
+        </w:rPr>
+        <w:t xml:space="preserve">NOZWRITE</w:t>
+      </w:r>
+      <w:r>
+        <w:t xml:space="preserve">, clamped,</w:t>
+      </w:r>
+      <w:r>
+        <w:t xml:space="preserve"> </w:t>
+      </w:r>
+      <w:r>
+        <w:rPr>
+          <w:rStyle w:val="VerbatimChar"/>
+        </w:rPr>
+        <w:t xml:space="preserve">NOMATRIX</w:t>
+      </w:r>
+      <w:r>
+        <w:t xml:space="preserve"> </w:t>
+      </w:r>
+      <w:r>
+        <w:t xml:space="preserve">clip-space</w:t>
+      </w:r>
+      <w:r>
+        <w:t xml:space="preserve"> </w:t>
+      </w:r>
+      <w:r>
+        <w:t xml:space="preserve">vertices on the kernel's viewport (</w:t>
+      </w:r>
+      <w:r>
+        <w:rPr>
+          <w:rStyle w:val="VerbatimChar"/>
+        </w:rPr>
+        <w:t xml:space="preserve">X = x ⌊w / 2⌋ + ⌊w / 2⌋</w:t>
+      </w:r>
+      <w:r>
+        <w:t xml:space="preserve">: the halves are integers in the</w:t>
+      </w:r>
+      <w:r>
+        <w:t xml:space="preserve"> </w:t>
+      </w:r>
+      <w:r>
+        <w:t xml:space="preserve">binning list's scaling). Zero-copy textures are not possible: V3D 4.2's</w:t>
+      </w:r>
+      <w:r>
+        <w:t xml:space="preserve"> </w:t>
+      </w:r>
+      <w:r>
+        <w:rPr>
+          <w:rStyle w:val="VerbatimChar"/>
+        </w:rPr>
+        <w:t xml:space="preserve">TEXTURE_SHADER_STATE</w:t>
+      </w:r>
+      <w:r>
+        <w:t xml:space="preserve"> </w:t>
+      </w:r>
+      <w:r>
+        <w:t xml:space="preserve">has no raster layout for 2D images — the texture unit derives LT / UBLINEAR / UIF from the size</w:t>
+      </w:r>
+      <w:r>
+        <w:t xml:space="preserve"> </w:t>
+      </w:r>
+      <w:r>
+        <w:t xml:space="preserve">(§</w:t>
+      </w:r>
+      <w:r>
+        <w:t xml:space="preserve"> </w:t>
+      </w:r>
+      <w:r>
+        <w:rPr>
+          <w:i/>
+          <w:iCs/>
+        </w:rPr>
+        <w:t xml:space="preserve">Textures</w:t>
+      </w:r>
+      <w:r>
+        <w:t xml:space="preserve"> </w:t>
+      </w:r>
+      <w:r>
+        <w:t xml:space="preserve">above) —, so an upload always stores texels into the tiled layout (hence</w:t>
+      </w:r>
+      <w:r>
+        <w:t xml:space="preserve"> </w:t>
+      </w:r>
+      <w:r>
+        <w:rPr>
+          <w:rStyle w:val="VerbatimChar"/>
+        </w:rPr>
+        <w:t xml:space="preserve">gpu_texture_rect</w:t>
+      </w:r>
+      <w:r>
+        <w:t xml:space="preserve"> </w:t>
+      </w:r>
+      <w:r>
+        <w:t xml:space="preserve">for the damaged parts only); what is zero-copy is the target (the canvas, or a</w:t>
+      </w:r>
+      <w:r>
+        <w:t xml:space="preserve"> </w:t>
+      </w:r>
+      <w:r>
+        <w:rPr>
+          <w:rStyle w:val="VerbatimChar"/>
+        </w:rPr>
+        <w:t xml:space="preserve">gpu_vbuf</w:t>
+      </w:r>
+      <w:r>
+        <w:t xml:space="preserve"> </w:t>
+      </w:r>
+      <w:r>
+        <w:t xml:space="preserve">block). The same API is implemented on the CPU (the fallback: no GPU, an older</w:t>
+      </w:r>
+      <w:r>
+        <w:t xml:space="preserve"> </w:t>
+      </w:r>
+      <w:r>
+        <w:t xml:space="preserve">kernel, the GPU stopped; a texture the GPU refused is drawn by the CPU between two GPU frames</w:t>
+      </w:r>
+      <w:r>
+        <w:t xml:space="preserve"> </w:t>
+      </w:r>
+      <w:r>
+        <w:t xml:space="preserve">that keep the target), checked against the GPU path on the PC (</w:t>
+      </w:r>
+      <w:r>
+        <w:rPr>
+          <w:rStyle w:val="VerbatimChar"/>
+        </w:rPr>
+        <w:t xml:space="preserve">tools/tests/run_gpucomp_test.sh</w:t>
+      </w:r>
+      <w:r>
+        <w:t xml:space="preserve">:</w:t>
+      </w:r>
+      <w:r>
+        <w:t xml:space="preserve"> </w:t>
+      </w:r>
+      <w:r>
+        <w:t xml:space="preserve">a software V3D runs this</w:t>
+      </w:r>
+      <w:r>
+        <w:t xml:space="preserve"> </w:t>
+      </w:r>
+      <w:r>
+        <w:rPr>
+          <w:rStyle w:val="VerbatimChar"/>
+        </w:rPr>
+        <w:t xml:space="preserve">FS_TEX</w:t>
+      </w:r>
+      <w:r>
+        <w:t xml:space="preserve"> </w:t>
+      </w:r>
+      <w:r>
+        <w:t xml:space="preserve">in the QPU simulator) and on the Pi (</w:t>
+      </w:r>
+      <w:r>
+        <w:rPr>
+          <w:rStyle w:val="VerbatimChar"/>
+        </w:rPr>
+        <w:t xml:space="preserve">/bin/gpcdemo test</w:t>
+      </w:r>
+      <w:r>
+        <w:t xml:space="preserve">).</w:t>
+      </w:r>
+    </w:p>
+    <w:p>
+      <w:pPr>
+        <w:pStyle w:val="Compact"/>
+        <w:numPr>
+          <w:ilvl w:val="0"/>
+          <w:numId w:val="1030"/>
+        </w:numPr>
+      </w:pPr>
+      <w:r>
+        <w:rPr>
+          <w:b/>
+          <w:bCs/>
+        </w:rPr>
         <w:t xml:space="preserve">Not yet</w:t>
       </w:r>
       <w:r>
-        <w:t xml:space="preserve">: several frames in flight (the caller waits for its frame), mipmaps, alpha</w:t>
-      </w:r>
-      <w:r>
-        <w:t xml:space="preserve"> </w:t>
-      </w:r>
-      <w:r>
-        <w:t xml:space="preserve">test, shaders chosen by the app.</w:t>
+        <w:t xml:space="preserve">: several frames in flight (the caller waits for its frame), mipmaps, shaders</w:t>
+      </w:r>
+      <w:r>
+        <w:t xml:space="preserve"> </w:t>
+      </w:r>
+      <w:r>
+        <w:t xml:space="preserve">chosen by the app (v61 has them), antialiased polygon edges (the compositor's rotated layers</w:t>
+      </w:r>
+      <w:r>
+        <w:t xml:space="preserve"> </w:t>
+      </w:r>
+      <w:r>
+        <w:t xml:space="preserve">have hard edges: MSAA 4x in the tile buffer would give them).</w:t>
       </w:r>
     </w:p>
     <w:p>
@@ -39253,7 +40398,7 @@
               <w:pStyle w:val="Compact"/>
             </w:pPr>
             <w:r>
-              <w:t xml:space="preserve">69</w:t>
+              <w:t xml:space="preserve">70</w:t>
             </w:r>
           </w:p>
         </w:tc>

</xml_diff>

<commit_message>
Docs: GPU compositing stage 2 (docs/06 §23, docs/07 §6, docs/03, docs/04's NetSurf, HANDOFF); .docx exports
Co-Authored-By: Claude Opus 5.5 <noreply@anthropic.com>
Claude-Session: https://claude.ai/code/session_01UcY36na7Mp1DEYttKiw1pa
</commit_message>
<xml_diff>
--- a/docs/exports/02-KERNEL-INTERNALS.docx
+++ b/docs/exports/02-KERNEL-INTERNALS.docx
@@ -30942,7 +30942,43 @@
         <w:t xml:space="preserve">owner pid</w:t>
       </w:r>
       <w:r>
-        <w:t xml:space="preserve">, and</w:t>
+        <w:t xml:space="preserve">;</w:t>
+      </w:r>
+      <w:r>
+        <w:t xml:space="preserve"> </w:t>
+      </w:r>
+      <w:r>
+        <w:rPr>
+          <w:rStyle w:val="VerbatimChar"/>
+        </w:rPr>
+        <w:t xml:space="preserve">kapi_exit</w:t>
+      </w:r>
+      <w:r>
+        <w:t xml:space="preserve"> </w:t>
+      </w:r>
+      <w:r>
+        <w:t xml:space="preserve">calls</w:t>
+      </w:r>
+      <w:r>
+        <w:t xml:space="preserve"> </w:t>
+      </w:r>
+      <w:r>
+        <w:rPr>
+          <w:rStyle w:val="VerbatimChar"/>
+        </w:rPr>
+        <w:t xml:space="preserve">NetCloseByPid</w:t>
+      </w:r>
+      <w:r>
+        <w:t xml:space="preserve"> </w:t>
+      </w:r>
+      <w:r>
+        <w:t xml:space="preserve">as soon as the app's other threads have ended (2026-09-30: it waited for</w:t>
+      </w:r>
+      <w:r>
+        <w:t xml:space="preserve"> </w:t>
+      </w:r>
+      <w:r>
+        <w:t xml:space="preserve">the janitor's reaping,</w:t>
       </w:r>
       <w:r>
         <w:t xml:space="preserve"> </w:t>
@@ -30954,31 +30990,50 @@
         <w:t xml:space="preserve">AddressSpaceTaskTerminate</w:t>
       </w:r>
       <w:r>
-        <w:t xml:space="preserve"> </w:t>
-      </w:r>
-      <w:r>
-        <w:t xml:space="preserve">calls</w:t>
-      </w:r>
-      <w:r>
-        <w:t xml:space="preserve"> </w:t>
-      </w:r>
-      <w:r>
-        <w:rPr>
-          <w:rStyle w:val="VerbatimChar"/>
-        </w:rPr>
-        <w:t xml:space="preserve">NetCloseByPid</w:t>
-      </w:r>
-      <w:r>
-        <w:t xml:space="preserve"> </w:t>
-      </w:r>
-      <w:r>
-        <w:t xml:space="preserve">so a process that dies without closing does not leak its</w:t>
-      </w:r>
-      <w:r>
-        <w:t xml:space="preserve"> </w:t>
-      </w:r>
-      <w:r>
-        <w:t xml:space="preserve">connections or table slots.</w:t>
+        <w:t xml:space="preserve">, which calls it again and finds none</w:t>
+      </w:r>
+      <w:r>
+        <w:t xml:space="preserve"> </w:t>
+      </w:r>
+      <w:r>
+        <w:t xml:space="preserve">left), so a process that exits or dies without closing does not hold its connections or</w:t>
+      </w:r>
+      <w:r>
+        <w:t xml:space="preserve"> </w:t>
+      </w:r>
+      <w:r>
+        <w:t xml:space="preserve">table slots -- a browser relaunched at once found them still held and its pages waited</w:t>
+      </w:r>
+      <w:r>
+        <w:t xml:space="preserve"> </w:t>
+      </w:r>
+      <w:r>
+        <w:t xml:space="preserve">(10 s). The table has</w:t>
+      </w:r>
+      <w:r>
+        <w:t xml:space="preserve"> </w:t>
+      </w:r>
+      <w:r>
+        <w:rPr>
+          <w:b/>
+          <w:bCs/>
+        </w:rPr>
+        <w:t xml:space="preserve">64 slots</w:t>
+      </w:r>
+      <w:r>
+        <w:t xml:space="preserve"> </w:t>
+      </w:r>
+      <w:r>
+        <w:t xml:space="preserve">(</w:t>
+      </w:r>
+      <w:r>
+        <w:rPr>
+          <w:rStyle w:val="VerbatimChar"/>
+        </w:rPr>
+        <w:t xml:space="preserve">MAX_SOCKETS</w:t>
+      </w:r>
+      <w:r>
+        <w:t xml:space="preserve">; 16 before: a browser keeps a dozen open).</w:t>
       </w:r>
     </w:p>
     <w:p>
@@ -37393,6 +37448,190 @@
       </w:r>
       <w:r>
         <w:t xml:space="preserve">, raster RGBA8, alpha forced to 1) instead of clearing it.</w:t>
+      </w:r>
+      <w:r>
+        <w:t xml:space="preserve"> </w:t>
+      </w:r>
+      <w:r>
+        <w:t xml:space="preserve">The target's load and store packets are built in one place (</w:t>
+      </w:r>
+      <w:r>
+        <w:rPr>
+          <w:rStyle w:val="VerbatimChar"/>
+        </w:rPr>
+        <w:t xml:space="preserve">V3dLoadTarget</w:t>
+      </w:r>
+      <w:r>
+        <w:t xml:space="preserve"> </w:t>
+      </w:r>
+      <w:r>
+        <w:t xml:space="preserve">/</w:t>
+      </w:r>
+      <w:r>
+        <w:t xml:space="preserve"> </w:t>
+      </w:r>
+      <w:r>
+        <w:rPr>
+          <w:rStyle w:val="VerbatimChar"/>
+        </w:rPr>
+        <w:t xml:space="preserve">V3dStoreTarget</w:t>
+      </w:r>
+      <w:r>
+        <w:t xml:space="preserve">,</w:t>
+      </w:r>
+      <w:r>
+        <w:t xml:space="preserve"> </w:t>
+      </w:r>
+      <w:r>
+        <w:rPr>
+          <w:rStyle w:val="VerbatimChar"/>
+        </w:rPr>
+        <w:t xml:space="preserve">kern/v3d_cl.h</w:t>
+      </w:r>
+      <w:r>
+        <w:t xml:space="preserve">).</w:t>
+      </w:r>
+      <w:r>
+        <w:t xml:space="preserve"> </w:t>
+      </w:r>
+      <w:r>
+        <w:rPr>
+          <w:b/>
+          <w:bCs/>
+        </w:rPr>
+        <w:t xml:space="preserve">Fixed (2026-09-30):</w:t>
+      </w:r>
+      <w:r>
+        <w:t xml:space="preserve"> </w:t>
+      </w:r>
+      <w:r>
+        <w:t xml:space="preserve">the load packet's packed</w:t>
+      </w:r>
+      <w:r>
+        <w:t xml:space="preserve"> </w:t>
+      </w:r>
+      <w:r>
+        <w:t xml:space="preserve">bit-fields lacked 3 bits of padding after</w:t>
+      </w:r>
+      <w:r>
+        <w:t xml:space="preserve"> </w:t>
+      </w:r>
+      <w:r>
+        <w:rPr>
+          <w:rStyle w:val="VerbatimChar"/>
+        </w:rPr>
+        <w:t xml:space="preserve">r_b_swap</w:t>
+      </w:r>
+      <w:r>
+        <w:t xml:space="preserve">, so its stride landed at bit 25 instead</w:t>
+      </w:r>
+      <w:r>
+        <w:t xml:space="preserve"> </w:t>
+      </w:r>
+      <w:r>
+        <w:t xml:space="preserve">of 28 and the V3D read it divided by 8 — every frame drawn over the target's pixels (the</w:t>
+      </w:r>
+      <w:r>
+        <w:t xml:space="preserve"> </w:t>
+      </w:r>
+      <w:r>
+        <w:t xml:space="preserve">compositing service without a clear;</w:t>
+      </w:r>
+      <w:r>
+        <w:t xml:space="preserve"> </w:t>
+      </w:r>
+      <w:r>
+        <w:rPr>
+          <w:rStyle w:val="VerbatimChar"/>
+        </w:rPr>
+        <w:t xml:space="preserve">gpcdemo test</w:t>
+      </w:r>
+      <w:r>
+        <w:t xml:space="preserve">'s "over the target's pixels" failed on</w:t>
+      </w:r>
+      <w:r>
+        <w:t xml:space="preserve"> </w:t>
+      </w:r>
+      <w:r>
+        <w:t xml:space="preserve">the Pi) loaded the wrong rows.</w:t>
+      </w:r>
+      <w:r>
+        <w:t xml:space="preserve"> </w:t>
+      </w:r>
+      <w:r>
+        <w:rPr>
+          <w:rStyle w:val="VerbatimChar"/>
+        </w:rPr>
+        <w:t xml:space="preserve">tools/tests/run_v3d_cl_test.sh</w:t>
+      </w:r>
+      <w:r>
+        <w:t xml:space="preserve"> </w:t>
+      </w:r>
+      <w:r>
+        <w:t xml:space="preserve">now checks each field of the</w:t>
+      </w:r>
+      <w:r>
+        <w:t xml:space="preserve"> </w:t>
+      </w:r>
+      <w:r>
+        <w:t xml:space="preserve">load / store packets against Mesa's</w:t>
+      </w:r>
+      <w:r>
+        <w:t xml:space="preserve"> </w:t>
+      </w:r>
+      <w:r>
+        <w:rPr>
+          <w:rStyle w:val="VerbatimChar"/>
+        </w:rPr>
+        <w:t xml:space="preserve">v3d_packet.xml</w:t>
+      </w:r>
+      <w:r>
+        <w:t xml:space="preserve"> </w:t>
+      </w:r>
+      <w:r>
+        <w:t xml:space="preserve">positions, and the PC's software V3D</w:t>
+      </w:r>
+      <w:r>
+        <w:t xml:space="preserve"> </w:t>
+      </w:r>
+      <w:r>
+        <w:t xml:space="preserve">(</w:t>
+      </w:r>
+      <w:r>
+        <w:rPr>
+          <w:rStyle w:val="VerbatimChar"/>
+        </w:rPr>
+        <w:t xml:space="preserve">tools/tests/gpucomp/hostkapi.cpp</w:t>
+      </w:r>
+      <w:r>
+        <w:t xml:space="preserve">) decodes the kernel's own packets for the target's stride</w:t>
+      </w:r>
+      <w:r>
+        <w:t xml:space="preserve"> </w:t>
+      </w:r>
+      <w:r>
+        <w:t xml:space="preserve">(it re-implemented the frame and could not see the packets;</w:t>
+      </w:r>
+      <w:r>
+        <w:t xml:space="preserve"> </w:t>
+      </w:r>
+      <w:r>
+        <w:rPr>
+          <w:rStyle w:val="VerbatimChar"/>
+        </w:rPr>
+        <w:t xml:space="preserve">gpcdemo test</w:t>
+      </w:r>
+      <w:r>
+        <w:t xml:space="preserve"> </w:t>
+      </w:r>
+      <w:r>
+        <w:t xml:space="preserve">also drew over a</w:t>
+      </w:r>
+      <w:r>
+        <w:t xml:space="preserve"> </w:t>
+      </w:r>
+      <w:r>
+        <w:t xml:space="preserve">single colour, which hid wrong rows — it draws over a pattern now).</w:t>
       </w:r>
     </w:p>
     <w:p>

</xml_diff>

<commit_message>
Jet: address-bar search via jet.ini [search] engine; media queries follow the window
Text typed in the address bar that does not look like an address goes to
jet.ini's [search] engine (default https://duckduckgo.com/?q=), the words
escaped and put in place of %s or appended. Resizing the window updates
the media (width/height) and restyles, so @media and matchMedia follow.
Tests: uatest.sh (search), jstest.sh css-mqresize.

Co-Authored-By: Claude Opus 5.5 <noreply@anthropic.com>
Claude-Session: https://claude.ai/code/session_01UcY36na7Mp1DEYttKiw1pa
</commit_message>
<xml_diff>
--- a/docs/exports/02-KERNEL-INTERNALS.docx
+++ b/docs/exports/02-KERNEL-INTERNALS.docx
@@ -364,6 +364,40 @@
       </w:hyperlink>
     </w:p>
     <w:p>
+      <w:pPr>
+        <w:pStyle w:val="Compact"/>
+        <w:numPr>
+          <w:ilvl w:val="0"/>
+          <w:numId w:val="1001"/>
+        </w:numPr>
+      </w:pPr>
+      <w:hyperlink w:anchor="Xf861c8e521de19b85a9fa568838296e214f81a0">
+        <w:r>
+          <w:rPr>
+            <w:rStyle w:val="Hyperlink"/>
+          </w:rPr>
+          <w:t xml:space="preserve">The GPU (V3D)</w:t>
+        </w:r>
+      </w:hyperlink>
+    </w:p>
+    <w:p>
+      <w:pPr>
+        <w:pStyle w:val="Compact"/>
+        <w:numPr>
+          <w:ilvl w:val="0"/>
+          <w:numId w:val="1001"/>
+        </w:numPr>
+      </w:pPr>
+      <w:hyperlink w:anchor="Xa7f002f42b8b233630f11dbad8c3740c73af4cd">
+        <w:r>
+          <w:rPr>
+            <w:rStyle w:val="Hyperlink"/>
+          </w:rPr>
+          <w:t xml:space="preserve">The RAM: volume</w:t>
+        </w:r>
+      </w:hyperlink>
+    </w:p>
+    <w:p>
       <w:r>
         <w:pict>
           <v:rect style="width:0;height:1.5pt" o:hralign="center" o:hrstd="t" o:hr="t"/>
@@ -1704,6 +1738,67 @@
           <w:b/>
           <w:bCs/>
         </w:rPr>
+        <w:t xml:space="preserve">RAM:</w:t>
+      </w:r>
+      <w:r>
+        <w:t xml:space="preserve">:</w:t>
+      </w:r>
+      <w:r>
+        <w:t xml:space="preserve"> </w:t>
+      </w:r>
+      <w:r>
+        <w:rPr>
+          <w:rStyle w:val="VerbatimChar"/>
+        </w:rPr>
+        <w:t xml:space="preserve">RamFsInit()</w:t>
+      </w:r>
+      <w:r>
+        <w:t xml:space="preserve"> </w:t>
+      </w:r>
+      <w:r>
+        <w:t xml:space="preserve">— the RAM volume, its size from</w:t>
+      </w:r>
+      <w:r>
+        <w:t xml:space="preserve"> </w:t>
+      </w:r>
+      <w:r>
+        <w:rPr>
+          <w:rStyle w:val="VerbatimChar"/>
+        </w:rPr>
+        <w:t xml:space="preserve">system.ini</w:t>
+      </w:r>
+      <w:r>
+        <w:t xml:space="preserve">'s</w:t>
+      </w:r>
+      <w:r>
+        <w:t xml:space="preserve"> </w:t>
+      </w:r>
+      <w:r>
+        <w:rPr>
+          <w:rStyle w:val="VerbatimChar"/>
+        </w:rPr>
+        <w:t xml:space="preserve">ramfs=</w:t>
+      </w:r>
+      <w:r>
+        <w:t xml:space="preserve"> </w:t>
+      </w:r>
+      <w:r>
+        <w:t xml:space="preserve">(§16).</w:t>
+      </w:r>
+    </w:p>
+    <w:p>
+      <w:pPr>
+        <w:pStyle w:val="Compact"/>
+        <w:numPr>
+          <w:ilvl w:val="0"/>
+          <w:numId w:val="1002"/>
+        </w:numPr>
+      </w:pPr>
+      <w:r>
+        <w:rPr>
+          <w:b/>
+          <w:bCs/>
+        </w:rPr>
         <w:t xml:space="preserve">USB</w:t>
       </w:r>
       <w:r>
@@ -2422,7 +2517,110 @@
         <w:t xml:space="preserve">USB MIDI</w:t>
       </w:r>
       <w:r>
-        <w:t xml:space="preserve">), also after a hot plug.</w:t>
+        <w:t xml:space="preserve">), also after a hot plug. It takes</w:t>
+      </w:r>
+      <w:r>
+        <w:t xml:space="preserve"> </w:t>
+      </w:r>
+      <w:r>
+        <w:rPr>
+          <w:b/>
+          <w:bCs/>
+        </w:rPr>
+        <w:t xml:space="preserve">every</w:t>
+      </w:r>
+      <w:r>
+        <w:t xml:space="preserve"> </w:t>
+      </w:r>
+      <w:r>
+        <w:t xml:space="preserve">USB keyboard (</w:t>
+      </w:r>
+      <w:r>
+        <w:rPr>
+          <w:rStyle w:val="VerbatimChar"/>
+        </w:rPr>
+        <w:t xml:space="preserve">ukbd1..4</w:t>
+      </w:r>
+      <w:r>
+        <w:t xml:space="preserve">, each with the layout snapshot), not only</w:t>
+      </w:r>
+      <w:r>
+        <w:t xml:space="preserve"> </w:t>
+      </w:r>
+      <w:r>
+        <w:rPr>
+          <w:rStyle w:val="VerbatimChar"/>
+        </w:rPr>
+        <w:t xml:space="preserve">ukbd1</w:t>
+      </w:r>
+      <w:r>
+        <w:t xml:space="preserve">: a wireless</w:t>
+      </w:r>
+      <w:r>
+        <w:t xml:space="preserve"> </w:t>
+      </w:r>
+      <w:r>
+        <w:t xml:space="preserve">mouse's receiver (Logitech's nano receiver, e.g. the M187's) has a boot-keyboard</w:t>
+      </w:r>
+      <w:r>
+        <w:t xml:space="preserve"> </w:t>
+      </w:r>
+      <w:r>
+        <w:t xml:space="preserve">interface of its own, which may enumerate first and take</w:t>
+      </w:r>
+      <w:r>
+        <w:t xml:space="preserve"> </w:t>
+      </w:r>
+      <w:r>
+        <w:rPr>
+          <w:rStyle w:val="VerbatimChar"/>
+        </w:rPr>
+        <w:t xml:space="preserve">ukbd1</w:t>
+      </w:r>
+      <w:r>
+        <w:t xml:space="preserve"> </w:t>
+      </w:r>
+      <w:r>
+        <w:t xml:space="preserve">— the real keyboard,</w:t>
+      </w:r>
+      <w:r>
+        <w:t xml:space="preserve"> </w:t>
+      </w:r>
+      <w:r>
+        <w:rPr>
+          <w:rStyle w:val="VerbatimChar"/>
+        </w:rPr>
+        <w:t xml:space="preserve">ukbd2</w:t>
+      </w:r>
+      <w:r>
+        <w:t xml:space="preserve">, was then ignored. Each keyboard's raw report is kept and the window manager gets</w:t>
+      </w:r>
+      <w:r>
+        <w:t xml:space="preserve"> </w:t>
+      </w:r>
+      <w:r>
+        <w:t xml:space="preserve">them merged (modifiers ORed, held keys joined), so one keyboard's empty report does not</w:t>
+      </w:r>
+      <w:r>
+        <w:t xml:space="preserve"> </w:t>
+      </w:r>
+      <w:r>
+        <w:t xml:space="preserve">release the keys held on another. The mouse is still</w:t>
+      </w:r>
+      <w:r>
+        <w:t xml:space="preserve"> </w:t>
+      </w:r>
+      <w:r>
+        <w:rPr>
+          <w:rStyle w:val="VerbatimChar"/>
+        </w:rPr>
+        <w:t xml:space="preserve">mouse1</w:t>
+      </w:r>
+      <w:r>
+        <w:t xml:space="preserve"> </w:t>
+      </w:r>
+      <w:r>
+        <w:t xml:space="preserve">only.</w:t>
       </w:r>
     </w:p>
     <w:p>
@@ -13303,7 +13501,7 @@
         <w:rPr>
           <w:rStyle w:val="VerbatimChar"/>
         </w:rPr>
-        <w:t xml:space="preserve">KAPI_ABI_VERSION = 69</w:t>
+        <w:t xml:space="preserve">KAPI_ABI_VERSION = 71</w:t>
       </w:r>
       <w:r>
         <w:t xml:space="preserve">. The</w:t>
@@ -15003,7 +15201,185 @@
         <w:t xml:space="preserve">user/gpucomp</w:t>
       </w:r>
       <w:r>
-        <w:t xml:space="preserve">, §15).</w:t>
+        <w:t xml:space="preserve">, §15),</w:t>
+      </w:r>
+      <w:r>
+        <w:t xml:space="preserve"> </w:t>
+      </w:r>
+      <w:r>
+        <w:t xml:space="preserve">v71 =</w:t>
+      </w:r>
+      <w:r>
+        <w:t xml:space="preserve"> </w:t>
+      </w:r>
+      <w:r>
+        <w:rPr>
+          <w:rStyle w:val="VerbatimChar"/>
+        </w:rPr>
+        <w:t xml:space="preserve">vol_info</w:t>
+      </w:r>
+      <w:r>
+        <w:t xml:space="preserve"> </w:t>
+      </w:r>
+      <w:r>
+        <w:t xml:space="preserve">— a volume's size, used and free bytes, type (</w:t>
+      </w:r>
+      <w:r>
+        <w:rPr>
+          <w:rStyle w:val="VerbatimChar"/>
+        </w:rPr>
+        <w:t xml:space="preserve">struct kapi_vol_info</w:t>
+      </w:r>
+      <w:r>
+        <w:t xml:space="preserve">,</w:t>
+      </w:r>
+      <w:r>
+        <w:t xml:space="preserve"> </w:t>
+      </w:r>
+      <w:r>
+        <w:rPr>
+          <w:rStyle w:val="VerbatimChar"/>
+        </w:rPr>
+        <w:t xml:space="preserve">KAPI_VOL_RAM</w:t>
+      </w:r>
+      <w:r>
+        <w:t xml:space="preserve">);</w:t>
+      </w:r>
+      <w:r>
+        <w:t xml:space="preserve"> </w:t>
+      </w:r>
+      <w:r>
+        <w:t xml:space="preserve">and the</w:t>
+      </w:r>
+      <w:r>
+        <w:t xml:space="preserve"> </w:t>
+      </w:r>
+      <w:r>
+        <w:rPr>
+          <w:b/>
+          <w:bCs/>
+        </w:rPr>
+        <w:t xml:space="preserve">RAM: volume</w:t>
+      </w:r>
+      <w:r>
+        <w:t xml:space="preserve"> </w:t>
+      </w:r>
+      <w:r>
+        <w:t xml:space="preserve">(§16): the file calls (</w:t>
+      </w:r>
+      <w:r>
+        <w:rPr>
+          <w:rStyle w:val="VerbatimChar"/>
+        </w:rPr>
+        <w:t xml:space="preserve">open</w:t>
+      </w:r>
+      <w:r>
+        <w:t xml:space="preserve"> </w:t>
+      </w:r>
+      <w:r>
+        <w:t xml:space="preserve">…</w:t>
+      </w:r>
+      <w:r>
+        <w:t xml:space="preserve"> </w:t>
+      </w:r>
+      <w:r>
+        <w:rPr>
+          <w:rStyle w:val="VerbatimChar"/>
+        </w:rPr>
+        <w:t xml:space="preserve">rename</w:t>
+      </w:r>
+      <w:r>
+        <w:t xml:space="preserve">,</w:t>
+      </w:r>
+      <w:r>
+        <w:t xml:space="preserve"> </w:t>
+      </w:r>
+      <w:r>
+        <w:rPr>
+          <w:rStyle w:val="VerbatimChar"/>
+        </w:rPr>
+        <w:t xml:space="preserve">save_file</w:t>
+      </w:r>
+      <w:r>
+        <w:t xml:space="preserve">,</w:t>
+      </w:r>
+      <w:r>
+        <w:t xml:space="preserve"> </w:t>
+      </w:r>
+      <w:r>
+        <w:rPr>
+          <w:rStyle w:val="VerbatimChar"/>
+        </w:rPr>
+        <w:t xml:space="preserve">file_in</w:t>
+      </w:r>
+      <w:r>
+        <w:t xml:space="preserve"> </w:t>
+      </w:r>
+      <w:r>
+        <w:t xml:space="preserve">/</w:t>
+      </w:r>
+      <w:r>
+        <w:t xml:space="preserve"> </w:t>
+      </w:r>
+      <w:r>
+        <w:rPr>
+          <w:rStyle w:val="VerbatimChar"/>
+        </w:rPr>
+        <w:t xml:space="preserve">file_out</w:t>
+      </w:r>
+      <w:r>
+        <w:t xml:space="preserve">,</w:t>
+      </w:r>
+      <w:r>
+        <w:t xml:space="preserve"> </w:t>
+      </w:r>
+      <w:r>
+        <w:rPr>
+          <w:rStyle w:val="VerbatimChar"/>
+        </w:rPr>
+        <w:t xml:space="preserve">chdir</w:t>
+      </w:r>
+      <w:r>
+        <w:t xml:space="preserve">,</w:t>
+      </w:r>
+      <w:r>
+        <w:t xml:space="preserve"> </w:t>
+      </w:r>
+      <w:r>
+        <w:rPr>
+          <w:rStyle w:val="VerbatimChar"/>
+        </w:rPr>
+        <w:t xml:space="preserve">seek</w:t>
+      </w:r>
+      <w:r>
+        <w:t xml:space="preserve">,</w:t>
+      </w:r>
+      <w:r>
+        <w:t xml:space="preserve"> </w:t>
+      </w:r>
+      <w:r>
+        <w:rPr>
+          <w:rStyle w:val="VerbatimChar"/>
+        </w:rPr>
+        <w:t xml:space="preserve">fsize64</w:t>
+      </w:r>
+      <w:r>
+        <w:t xml:space="preserve">) reach a file system in memory on</w:t>
+      </w:r>
+      <w:r>
+        <w:t xml:space="preserve"> </w:t>
+      </w:r>
+      <w:r>
+        <w:rPr>
+          <w:rStyle w:val="VerbatimChar"/>
+        </w:rPr>
+        <w:t xml:space="preserve">RAM:</w:t>
+      </w:r>
+      <w:r>
+        <w:t xml:space="preserve"> </w:t>
+      </w:r>
+      <w:r>
+        <w:t xml:space="preserve">paths — no new call for that.</w:t>
       </w:r>
     </w:p>
     <w:p>
@@ -16545,7 +16921,159 @@
               <w:t xml:space="preserve"> </w:t>
             </w:r>
             <w:r>
-              <w:t xml:space="preserve">would otherwise rename inside the source volume).</w:t>
+              <w:t xml:space="preserve">would otherwise rename inside the source volume). All of these (and the streams,</w:t>
+            </w:r>
+            <w:r>
+              <w:t xml:space="preserve"> </w:t>
+            </w:r>
+            <w:r>
+              <w:rPr>
+                <w:rStyle w:val="VerbatimChar"/>
+              </w:rPr>
+              <w:t xml:space="preserve">seek</w:t>
+            </w:r>
+            <w:r>
+              <w:t xml:space="preserve">,</w:t>
+            </w:r>
+            <w:r>
+              <w:t xml:space="preserve"> </w:t>
+            </w:r>
+            <w:r>
+              <w:rPr>
+                <w:rStyle w:val="VerbatimChar"/>
+              </w:rPr>
+              <w:t xml:space="preserve">fsize64</w:t>
+            </w:r>
+            <w:r>
+              <w:t xml:space="preserve">,</w:t>
+            </w:r>
+            <w:r>
+              <w:t xml:space="preserve"> </w:t>
+            </w:r>
+            <w:r>
+              <w:rPr>
+                <w:rStyle w:val="VerbatimChar"/>
+              </w:rPr>
+              <w:t xml:space="preserve">chdir</w:t>
+            </w:r>
+            <w:r>
+              <w:t xml:space="preserve">) work on</w:t>
+            </w:r>
+            <w:r>
+              <w:t xml:space="preserve"> </w:t>
+            </w:r>
+            <w:r>
+              <w:rPr>
+                <w:rStyle w:val="VerbatimChar"/>
+                <w:b/>
+                <w:bCs/>
+              </w:rPr>
+              <w:t xml:space="preserve">RAM:</w:t>
+            </w:r>
+            <w:r>
+              <w:t xml:space="preserve"> </w:t>
+            </w:r>
+            <w:r>
+              <w:t xml:space="preserve">paths too (v71, §16): the path is resolved first (</w:t>
+            </w:r>
+            <w:r>
+              <w:rPr>
+                <w:rStyle w:val="VerbatimChar"/>
+              </w:rPr>
+              <w:t xml:space="preserve">ResolvePath</w:t>
+            </w:r>
+            <w:r>
+              <w:t xml:space="preserve">: relative to a current folder on</w:t>
+            </w:r>
+            <w:r>
+              <w:t xml:space="preserve"> </w:t>
+            </w:r>
+            <w:r>
+              <w:rPr>
+                <w:rStyle w:val="VerbatimChar"/>
+              </w:rPr>
+              <w:t xml:space="preserve">RAM:</w:t>
+            </w:r>
+            <w:r>
+              <w:t xml:space="preserve"> </w:t>
+            </w:r>
+            <w:r>
+              <w:t xml:space="preserve">as well), then a</w:t>
+            </w:r>
+            <w:r>
+              <w:t xml:space="preserve"> </w:t>
+            </w:r>
+            <w:r>
+              <w:rPr>
+                <w:rStyle w:val="VerbatimChar"/>
+              </w:rPr>
+              <w:t xml:space="preserve">RAM:</w:t>
+            </w:r>
+            <w:r>
+              <w:t xml:space="preserve"> </w:t>
+            </w:r>
+            <w:r>
+              <w:t xml:space="preserve">path goes to</w:t>
+            </w:r>
+            <w:r>
+              <w:t xml:space="preserve"> </w:t>
+            </w:r>
+            <w:r>
+              <w:rPr>
+                <w:rStyle w:val="VerbatimChar"/>
+              </w:rPr>
+              <w:t xml:space="preserve">sys/ramfs.cpp</w:t>
+            </w:r>
+            <w:r>
+              <w:t xml:space="preserve">, a provider's (</w:t>
+            </w:r>
+            <w:r>
+              <w:rPr>
+                <w:rStyle w:val="VerbatimChar"/>
+              </w:rPr>
+              <w:t xml:space="preserve">FTP:</w:t>
+            </w:r>
+            <w:r>
+              <w:t xml:space="preserve">) to</w:t>
+            </w:r>
+            <w:r>
+              <w:t xml:space="preserve"> </w:t>
+            </w:r>
+            <w:r>
+              <w:rPr>
+                <w:rStyle w:val="VerbatimChar"/>
+              </w:rPr>
+              <w:t xml:space="preserve">sys/vfs.cpp</w:t>
+            </w:r>
+            <w:r>
+              <w:t xml:space="preserve">, the rest to FatFs; a handle is told apart by its address (the RAM volume's handle tables, then the provider's, else a FatFs</w:t>
+            </w:r>
+            <w:r>
+              <w:t xml:space="preserve"> </w:t>
+            </w:r>
+            <w:r>
+              <w:rPr>
+                <w:rStyle w:val="VerbatimChar"/>
+              </w:rPr>
+              <w:t xml:space="preserve">FIL</w:t>
+            </w:r>
+            <w:r>
+              <w:t xml:space="preserve"> </w:t>
+            </w:r>
+            <w:r>
+              <w:t xml:space="preserve">/</w:t>
+            </w:r>
+            <w:r>
+              <w:t xml:space="preserve"> </w:t>
+            </w:r>
+            <w:r>
+              <w:rPr>
+                <w:rStyle w:val="VerbatimChar"/>
+              </w:rPr>
+              <w:t xml:space="preserve">DIR</w:t>
+            </w:r>
+            <w:r>
+              <w:t xml:space="preserve">).</w:t>
             </w:r>
           </w:p>
         </w:tc>
@@ -16814,7 +17342,24 @@
               <w:t xml:space="preserve"> </w:t>
             </w:r>
             <w:r>
-              <w:t xml:space="preserve">root, anything else to the current directory. The four SD volumes share one FatFs lock slot (</w:t>
+              <w:t xml:space="preserve">root, anything else to the current directory.</w:t>
+            </w:r>
+            <w:r>
+              <w:t xml:space="preserve"> </w:t>
+            </w:r>
+            <w:r>
+              <w:rPr>
+                <w:rStyle w:val="VerbatimChar"/>
+                <w:b/>
+                <w:bCs/>
+              </w:rPr>
+              <w:t xml:space="preserve">RAM:</w:t>
+            </w:r>
+            <w:r>
+              <w:t xml:space="preserve"> </w:t>
+            </w:r>
+            <w:r>
+              <w:t xml:space="preserve">(v71) is the RAM volume (§16), not a FatFs one. The four SD volumes share one FatFs lock slot (</w:t>
             </w:r>
             <w:r>
               <w:rPr>
@@ -21023,7 +21568,270 @@
               <w:t xml:space="preserve">cat</w:t>
             </w:r>
             <w:r>
-              <w:t xml:space="preserve">, redirections) still go to FatFs only.</w:t>
+              <w:t xml:space="preserve">, redirections) go to FatFs (and to the RAM volume on</w:t>
+            </w:r>
+            <w:r>
+              <w:t xml:space="preserve"> </w:t>
+            </w:r>
+            <w:r>
+              <w:rPr>
+                <w:rStyle w:val="VerbatimChar"/>
+              </w:rPr>
+              <w:t xml:space="preserve">RAM:</w:t>
+            </w:r>
+            <w:r>
+              <w:t xml:space="preserve">, §16), not to a provider.</w:t>
+            </w:r>
+          </w:p>
+        </w:tc>
+      </w:tr>
+      <w:tr>
+        <w:tc>
+          <w:tcPr/>
+          <w:p>
+            <w:pPr>
+              <w:pStyle w:val="Compact"/>
+            </w:pPr>
+            <w:r>
+              <w:t xml:space="preserve">Volumes' room, RAM: (v71)</w:t>
+            </w:r>
+          </w:p>
+        </w:tc>
+        <w:tc>
+          <w:tcPr/>
+          <w:p>
+            <w:pPr>
+              <w:pStyle w:val="Compact"/>
+            </w:pPr>
+            <w:r>
+              <w:rPr>
+                <w:rStyle w:val="VerbatimChar"/>
+              </w:rPr>
+              <w:t xml:space="preserve">vol_info(path, out)</w:t>
+            </w:r>
+            <w:r>
+              <w:t xml:space="preserve"> </w:t>
+            </w:r>
+            <w:r>
+              <w:t xml:space="preserve">→ 0 and</w:t>
+            </w:r>
+            <w:r>
+              <w:t xml:space="preserve"> </w:t>
+            </w:r>
+            <w:r>
+              <w:rPr>
+                <w:rStyle w:val="VerbatimChar"/>
+              </w:rPr>
+              <w:t xml:space="preserve">struct kapi_vol_info { total, free, used; files, dirs; flags; type[12] }</w:t>
+            </w:r>
+            <w:r>
+              <w:t xml:space="preserve"> </w:t>
+            </w:r>
+            <w:r>
+              <w:t xml:space="preserve">for the volume of</w:t>
+            </w:r>
+            <w:r>
+              <w:t xml:space="preserve"> </w:t>
+            </w:r>
+            <w:r>
+              <w:rPr>
+                <w:rStyle w:val="VerbatimChar"/>
+              </w:rPr>
+              <w:t xml:space="preserve">path</w:t>
+            </w:r>
+            <w:r>
+              <w:t xml:space="preserve"> </w:t>
+            </w:r>
+            <w:r>
+              <w:t xml:space="preserve">(</w:t>
+            </w:r>
+            <w:r>
+              <w:rPr>
+                <w:rStyle w:val="VerbatimChar"/>
+              </w:rPr>
+              <w:t xml:space="preserve">"SD:"</w:t>
+            </w:r>
+            <w:r>
+              <w:t xml:space="preserve">,</w:t>
+            </w:r>
+            <w:r>
+              <w:t xml:space="preserve"> </w:t>
+            </w:r>
+            <w:r>
+              <w:rPr>
+                <w:rStyle w:val="VerbatimChar"/>
+              </w:rPr>
+              <w:t xml:space="preserve">"SD1:/roms"</w:t>
+            </w:r>
+            <w:r>
+              <w:t xml:space="preserve">,</w:t>
+            </w:r>
+            <w:r>
+              <w:t xml:space="preserve"> </w:t>
+            </w:r>
+            <w:r>
+              <w:rPr>
+                <w:rStyle w:val="VerbatimChar"/>
+              </w:rPr>
+              <w:t xml:space="preserve">"RAM:"</w:t>
+            </w:r>
+            <w:r>
+              <w:t xml:space="preserve">, a relative path: the current folder's), −1 no such volume. A FatFs volume:</w:t>
+            </w:r>
+            <w:r>
+              <w:t xml:space="preserve"> </w:t>
+            </w:r>
+            <w:r>
+              <w:rPr>
+                <w:rStyle w:val="VerbatimChar"/>
+              </w:rPr>
+              <w:t xml:space="preserve">f_getfree</w:t>
+            </w:r>
+            <w:r>
+              <w:t xml:space="preserve"> </w:t>
+            </w:r>
+            <w:r>
+              <w:t xml:space="preserve">(its free clusters — FSINFO on FAT32, else counted once by FatFs: the first call on a big card can take a moment),</w:t>
+            </w:r>
+            <w:r>
+              <w:t xml:space="preserve"> </w:t>
+            </w:r>
+            <w:r>
+              <w:rPr>
+                <w:rStyle w:val="VerbatimChar"/>
+              </w:rPr>
+              <w:t xml:space="preserve">type</w:t>
+            </w:r>
+            <w:r>
+              <w:t xml:space="preserve"> </w:t>
+            </w:r>
+            <w:r>
+              <w:rPr>
+                <w:rStyle w:val="VerbatimChar"/>
+              </w:rPr>
+              <w:t xml:space="preserve">FAT12</w:t>
+            </w:r>
+            <w:r>
+              <w:t xml:space="preserve">/</w:t>
+            </w:r>
+            <w:r>
+              <w:rPr>
+                <w:rStyle w:val="VerbatimChar"/>
+              </w:rPr>
+              <w:t xml:space="preserve">FAT16</w:t>
+            </w:r>
+            <w:r>
+              <w:t xml:space="preserve">/</w:t>
+            </w:r>
+            <w:r>
+              <w:rPr>
+                <w:rStyle w:val="VerbatimChar"/>
+              </w:rPr>
+              <w:t xml:space="preserve">FAT32</w:t>
+            </w:r>
+            <w:r>
+              <w:t xml:space="preserve">/</w:t>
+            </w:r>
+            <w:r>
+              <w:rPr>
+                <w:rStyle w:val="VerbatimChar"/>
+              </w:rPr>
+              <w:t xml:space="preserve">exFAT</w:t>
+            </w:r>
+            <w:r>
+              <w:t xml:space="preserve">.</w:t>
+            </w:r>
+            <w:r>
+              <w:t xml:space="preserve"> </w:t>
+            </w:r>
+            <w:r>
+              <w:rPr>
+                <w:rStyle w:val="VerbatimChar"/>
+                <w:b/>
+                <w:bCs/>
+              </w:rPr>
+              <w:t xml:space="preserve">RAM:</w:t>
+            </w:r>
+            <w:r>
+              <w:t xml:space="preserve"> </w:t>
+            </w:r>
+            <w:r>
+              <w:t xml:space="preserve">(§16): its size, the pages its files take, what can still be written (also bounded by the free page memory less the reserve), its files and folders,</w:t>
+            </w:r>
+            <w:r>
+              <w:t xml:space="preserve"> </w:t>
+            </w:r>
+            <w:r>
+              <w:rPr>
+                <w:rStyle w:val="VerbatimChar"/>
+              </w:rPr>
+              <w:t xml:space="preserve">flags</w:t>
+            </w:r>
+            <w:r>
+              <w:t xml:space="preserve"> </w:t>
+            </w:r>
+            <w:r>
+              <w:rPr>
+                <w:rStyle w:val="VerbatimChar"/>
+              </w:rPr>
+              <w:t xml:space="preserve">KAPI_VOL_RAM</w:t>
+            </w:r>
+            <w:r>
+              <w:t xml:space="preserve"> </w:t>
+            </w:r>
+            <w:r>
+              <w:t xml:space="preserve">(lost at a restart),</w:t>
+            </w:r>
+            <w:r>
+              <w:t xml:space="preserve"> </w:t>
+            </w:r>
+            <w:r>
+              <w:rPr>
+                <w:rStyle w:val="VerbatimChar"/>
+              </w:rPr>
+              <w:t xml:space="preserve">type</w:t>
+            </w:r>
+            <w:r>
+              <w:t xml:space="preserve"> </w:t>
+            </w:r>
+            <w:r>
+              <w:rPr>
+                <w:rStyle w:val="VerbatimChar"/>
+              </w:rPr>
+              <w:t xml:space="preserve">RAM</w:t>
+            </w:r>
+            <w:r>
+              <w:t xml:space="preserve">.</w:t>
+            </w:r>
+            <w:r>
+              <w:t xml:space="preserve"> </w:t>
+            </w:r>
+            <w:r>
+              <w:rPr>
+                <w:rStyle w:val="VerbatimChar"/>
+              </w:rPr>
+              <w:t xml:space="preserve">/bin/df</w:t>
+            </w:r>
+            <w:r>
+              <w:t xml:space="preserve"> </w:t>
+            </w:r>
+            <w:r>
+              <w:t xml:space="preserve">prints it;</w:t>
+            </w:r>
+            <w:r>
+              <w:t xml:space="preserve"> </w:t>
+            </w:r>
+            <w:r>
+              <w:rPr>
+                <w:rStyle w:val="VerbatimChar"/>
+              </w:rPr>
+              <w:t xml:space="preserve">/bin/ramtest</w:t>
+            </w:r>
+            <w:r>
+              <w:t xml:space="preserve"> </w:t>
+            </w:r>
+            <w:r>
+              <w:t xml:space="preserve">uses it to check that the memory comes back.</w:t>
             </w:r>
           </w:p>
         </w:tc>
@@ -31570,7 +32378,7 @@
         <w:t xml:space="preserve"> </w:t>
       </w:r>
       <w:r>
-        <w:t xml:space="preserve">floor is</w:t>
+        <w:t xml:space="preserve">floor stays</w:t>
       </w:r>
       <w:r>
         <w:t xml:space="preserve"> </w:t>
@@ -31580,25 +32388,25 @@
           <w:b/>
           <w:bCs/>
         </w:rPr>
-        <w:t xml:space="preserve">200 ms</w:t>
-      </w:r>
-      <w:r>
-        <w:t xml:space="preserve"> </w:t>
-      </w:r>
-      <w:r>
-        <w:t xml:space="preserve">(Linux's; was 1 s): RTO = SRTT + max (200 ms, 4 RTTVAR), Karn's algorithm</w:t>
-      </w:r>
-      <w:r>
-        <w:t xml:space="preserve"> </w:t>
-      </w:r>
-      <w:r>
-        <w:t xml:space="preserve">also after a fast retransmit; a data connection is given up after 8 timeouts (≥ 51 s), a SYN</w:t>
-      </w:r>
-      <w:r>
-        <w:t xml:space="preserve"> </w:t>
-      </w:r>
-      <w:r>
-        <w:t xml:space="preserve">after 6 (63 s).</w:t>
+        <w:t xml:space="preserve">1 s</w:t>
+      </w:r>
+      <w:r>
+        <w:t xml:space="preserve"> </w:t>
+      </w:r>
+      <w:r>
+        <w:t xml:space="preserve">(200 ms was tried and undone: spurious timeouts over Wi-Fi to Windows</w:t>
+      </w:r>
+      <w:r>
+        <w:t xml:space="preserve"> </w:t>
+      </w:r>
+      <w:r>
+        <w:t xml:space="preserve">collapsed the remote desktop's throughput), Karn's algorithm also after a fast retransmit; a</w:t>
+      </w:r>
+      <w:r>
+        <w:t xml:space="preserve"> </w:t>
+      </w:r>
+      <w:r>
+        <w:t xml:space="preserve">connection is given up after 6 timeouts (63 s).</w:t>
       </w:r>
       <w:r>
         <w:t xml:space="preserve"> </w:t>
@@ -40896,7 +41704,1777 @@
       </w:r>
     </w:p>
     <w:bookmarkEnd w:id="104"/>
-    <w:bookmarkStart w:id="105" w:name="annex--useful-constants"/>
+    <w:bookmarkStart w:id="109" w:name="Xa7f002f42b8b233630f11dbad8c3740c73af4cd"/>
+    <w:p>
+      <w:pPr>
+        <w:pStyle w:val="Heading2"/>
+      </w:pPr>
+      <w:r>
+        <w:t xml:space="preserve">16. The RAM: volume</w:t>
+      </w:r>
+    </w:p>
+    <w:p>
+      <w:pPr>
+        <w:pStyle w:val="FirstParagraph"/>
+      </w:pPr>
+      <w:r>
+        <w:t xml:space="preserve">Source:</w:t>
+      </w:r>
+      <w:r>
+        <w:t xml:space="preserve"> </w:t>
+      </w:r>
+      <w:hyperlink r:id="rId105">
+        <w:r>
+          <w:rPr>
+            <w:rStyle w:val="VerbatimChar"/>
+          </w:rPr>
+          <w:t xml:space="preserve">kernel/sys/ramfs.cpp</w:t>
+        </w:r>
+      </w:hyperlink>
+      <w:r>
+        <w:t xml:space="preserve">,</w:t>
+      </w:r>
+      <w:r>
+        <w:t xml:space="preserve"> </w:t>
+      </w:r>
+      <w:hyperlink r:id="rId106">
+        <w:r>
+          <w:rPr>
+            <w:rStyle w:val="VerbatimChar"/>
+          </w:rPr>
+          <w:t xml:space="preserve">kern/ramfs.h</w:t>
+        </w:r>
+      </w:hyperlink>
+      <w:r>
+        <w:t xml:space="preserve">; the stream:</w:t>
+      </w:r>
+      <w:r>
+        <w:t xml:space="preserve"> </w:t>
+      </w:r>
+      <w:r>
+        <w:rPr>
+          <w:rStyle w:val="VerbatimChar"/>
+        </w:rPr>
+        <w:t xml:space="preserve">CRamStream</w:t>
+      </w:r>
+      <w:r>
+        <w:t xml:space="preserve"> </w:t>
+      </w:r>
+      <w:r>
+        <w:t xml:space="preserve">(</w:t>
+      </w:r>
+      <w:hyperlink r:id="rId68">
+        <w:r>
+          <w:rPr>
+            <w:rStyle w:val="VerbatimChar"/>
+          </w:rPr>
+          <w:t xml:space="preserve">sys/stream.cpp</w:t>
+        </w:r>
+      </w:hyperlink>
+      <w:r>
+        <w:t xml:space="preserve">); the kapi side:</w:t>
+      </w:r>
+      <w:r>
+        <w:t xml:space="preserve"> </w:t>
+      </w:r>
+      <w:hyperlink r:id="rId62">
+        <w:r>
+          <w:rPr>
+            <w:rStyle w:val="VerbatimChar"/>
+          </w:rPr>
+          <w:t xml:space="preserve">sys/kapi.cpp</w:t>
+        </w:r>
+      </w:hyperlink>
+      <w:r>
+        <w:t xml:space="preserve">;</w:t>
+      </w:r>
+      <w:r>
+        <w:t xml:space="preserve"> </w:t>
+      </w:r>
+      <w:r>
+        <w:t xml:space="preserve">host test</w:t>
+      </w:r>
+      <w:r>
+        <w:t xml:space="preserve"> </w:t>
+      </w:r>
+      <w:hyperlink r:id="rId107">
+        <w:r>
+          <w:rPr>
+            <w:rStyle w:val="VerbatimChar"/>
+          </w:rPr>
+          <w:t xml:space="preserve">tools/tests/run_ramfs_test.sh</w:t>
+        </w:r>
+      </w:hyperlink>
+      <w:r>
+        <w:t xml:space="preserve">; Pi test</w:t>
+      </w:r>
+      <w:r>
+        <w:t xml:space="preserve"> </w:t>
+      </w:r>
+      <w:hyperlink r:id="rId108">
+        <w:r>
+          <w:rPr>
+            <w:rStyle w:val="VerbatimChar"/>
+          </w:rPr>
+          <w:t xml:space="preserve">user/bin/ramtest.c</w:t>
+        </w:r>
+      </w:hyperlink>
+      <w:r>
+        <w:t xml:space="preserve">.</w:t>
+      </w:r>
+    </w:p>
+    <w:p>
+      <w:pPr>
+        <w:pStyle w:val="BodyText"/>
+      </w:pPr>
+      <w:r>
+        <w:rPr>
+          <w:rStyle w:val="VerbatimChar"/>
+          <w:b/>
+          <w:bCs/>
+        </w:rPr>
+        <w:t xml:space="preserve">RAM:</w:t>
+      </w:r>
+      <w:r>
+        <w:t xml:space="preserve"> </w:t>
+      </w:r>
+      <w:r>
+        <w:t xml:space="preserve">is a volume in memory, reached by the</w:t>
+      </w:r>
+      <w:r>
+        <w:t xml:space="preserve"> </w:t>
+      </w:r>
+      <w:r>
+        <w:rPr>
+          <w:b/>
+          <w:bCs/>
+        </w:rPr>
+        <w:t xml:space="preserve">same file calls</w:t>
+      </w:r>
+      <w:r>
+        <w:t xml:space="preserve"> </w:t>
+      </w:r>
+      <w:r>
+        <w:t xml:space="preserve">as the card:</w:t>
+      </w:r>
+      <w:r>
+        <w:t xml:space="preserve"> </w:t>
+      </w:r>
+      <w:r>
+        <w:rPr>
+          <w:rStyle w:val="VerbatimChar"/>
+        </w:rPr>
+        <w:t xml:space="preserve">open</w:t>
+      </w:r>
+      <w:r>
+        <w:t xml:space="preserve"> </w:t>
+      </w:r>
+      <w:r>
+        <w:t xml:space="preserve">/</w:t>
+      </w:r>
+      <w:r>
+        <w:t xml:space="preserve"> </w:t>
+      </w:r>
+      <w:r>
+        <w:rPr>
+          <w:rStyle w:val="VerbatimChar"/>
+        </w:rPr>
+        <w:t xml:space="preserve">read</w:t>
+      </w:r>
+      <w:r>
+        <w:t xml:space="preserve"> </w:t>
+      </w:r>
+      <w:r>
+        <w:t xml:space="preserve">/</w:t>
+      </w:r>
+      <w:r>
+        <w:t xml:space="preserve"> </w:t>
+      </w:r>
+      <w:r>
+        <w:rPr>
+          <w:rStyle w:val="VerbatimChar"/>
+        </w:rPr>
+        <w:t xml:space="preserve">fsize</w:t>
+      </w:r>
+      <w:r>
+        <w:t xml:space="preserve"> </w:t>
+      </w:r>
+      <w:r>
+        <w:t xml:space="preserve">/</w:t>
+      </w:r>
+      <w:r>
+        <w:t xml:space="preserve"> </w:t>
+      </w:r>
+      <w:r>
+        <w:rPr>
+          <w:rStyle w:val="VerbatimChar"/>
+        </w:rPr>
+        <w:t xml:space="preserve">fsize64</w:t>
+      </w:r>
+      <w:r>
+        <w:t xml:space="preserve"> </w:t>
+      </w:r>
+      <w:r>
+        <w:t xml:space="preserve">/</w:t>
+      </w:r>
+      <w:r>
+        <w:t xml:space="preserve"> </w:t>
+      </w:r>
+      <w:r>
+        <w:rPr>
+          <w:rStyle w:val="VerbatimChar"/>
+        </w:rPr>
+        <w:t xml:space="preserve">seek</w:t>
+      </w:r>
+      <w:r>
+        <w:t xml:space="preserve"> </w:t>
+      </w:r>
+      <w:r>
+        <w:t xml:space="preserve">/</w:t>
+      </w:r>
+      <w:r>
+        <w:t xml:space="preserve"> </w:t>
+      </w:r>
+      <w:r>
+        <w:rPr>
+          <w:rStyle w:val="VerbatimChar"/>
+        </w:rPr>
+        <w:t xml:space="preserve">close</w:t>
+      </w:r>
+      <w:r>
+        <w:t xml:space="preserve">,</w:t>
+      </w:r>
+      <w:r>
+        <w:t xml:space="preserve"> </w:t>
+      </w:r>
+      <w:r>
+        <w:rPr>
+          <w:rStyle w:val="VerbatimChar"/>
+        </w:rPr>
+        <w:t xml:space="preserve">save_file</w:t>
+      </w:r>
+      <w:r>
+        <w:t xml:space="preserve">,</w:t>
+      </w:r>
+      <w:r>
+        <w:t xml:space="preserve"> </w:t>
+      </w:r>
+      <w:r>
+        <w:rPr>
+          <w:rStyle w:val="VerbatimChar"/>
+        </w:rPr>
+        <w:t xml:space="preserve">file_in</w:t>
+      </w:r>
+      <w:r>
+        <w:t xml:space="preserve"> </w:t>
+      </w:r>
+      <w:r>
+        <w:t xml:space="preserve">/</w:t>
+      </w:r>
+      <w:r>
+        <w:t xml:space="preserve"> </w:t>
+      </w:r>
+      <w:r>
+        <w:rPr>
+          <w:rStyle w:val="VerbatimChar"/>
+        </w:rPr>
+        <w:t xml:space="preserve">file_out</w:t>
+      </w:r>
+      <w:r>
+        <w:t xml:space="preserve"> </w:t>
+      </w:r>
+      <w:r>
+        <w:t xml:space="preserve">(streams, appending</w:t>
+      </w:r>
+      <w:r>
+        <w:t xml:space="preserve"> </w:t>
+      </w:r>
+      <w:r>
+        <w:t xml:space="preserve">too:</w:t>
+      </w:r>
+      <w:r>
+        <w:t xml:space="preserve"> </w:t>
+      </w:r>
+      <w:r>
+        <w:rPr>
+          <w:rStyle w:val="VerbatimChar"/>
+        </w:rPr>
+        <w:t xml:space="preserve">cp</w:t>
+      </w:r>
+      <w:r>
+        <w:t xml:space="preserve">,</w:t>
+      </w:r>
+      <w:r>
+        <w:t xml:space="preserve"> </w:t>
+      </w:r>
+      <w:r>
+        <w:rPr>
+          <w:rStyle w:val="VerbatimChar"/>
+        </w:rPr>
+        <w:t xml:space="preserve">cat</w:t>
+      </w:r>
+      <w:r>
+        <w:t xml:space="preserve">, the shell's redirections),</w:t>
+      </w:r>
+      <w:r>
+        <w:t xml:space="preserve"> </w:t>
+      </w:r>
+      <w:r>
+        <w:rPr>
+          <w:rStyle w:val="VerbatimChar"/>
+        </w:rPr>
+        <w:t xml:space="preserve">opendir</w:t>
+      </w:r>
+      <w:r>
+        <w:t xml:space="preserve"> </w:t>
+      </w:r>
+      <w:r>
+        <w:t xml:space="preserve">/</w:t>
+      </w:r>
+      <w:r>
+        <w:t xml:space="preserve"> </w:t>
+      </w:r>
+      <w:r>
+        <w:rPr>
+          <w:rStyle w:val="VerbatimChar"/>
+        </w:rPr>
+        <w:t xml:space="preserve">readdir</w:t>
+      </w:r>
+      <w:r>
+        <w:t xml:space="preserve"> </w:t>
+      </w:r>
+      <w:r>
+        <w:t xml:space="preserve">/</w:t>
+      </w:r>
+      <w:r>
+        <w:t xml:space="preserve"> </w:t>
+      </w:r>
+      <w:r>
+        <w:rPr>
+          <w:rStyle w:val="VerbatimChar"/>
+        </w:rPr>
+        <w:t xml:space="preserve">closedir</w:t>
+      </w:r>
+      <w:r>
+        <w:t xml:space="preserve">,</w:t>
+      </w:r>
+      <w:r>
+        <w:t xml:space="preserve"> </w:t>
+      </w:r>
+      <w:r>
+        <w:rPr>
+          <w:rStyle w:val="VerbatimChar"/>
+        </w:rPr>
+        <w:t xml:space="preserve">mkdir</w:t>
+      </w:r>
+      <w:r>
+        <w:t xml:space="preserve">,</w:t>
+      </w:r>
+      <w:r>
+        <w:t xml:space="preserve"> </w:t>
+      </w:r>
+      <w:r>
+        <w:rPr>
+          <w:rStyle w:val="VerbatimChar"/>
+        </w:rPr>
+        <w:t xml:space="preserve">remove</w:t>
+      </w:r>
+      <w:r>
+        <w:t xml:space="preserve">,</w:t>
+      </w:r>
+      <w:r>
+        <w:t xml:space="preserve"> </w:t>
+      </w:r>
+      <w:r>
+        <w:rPr>
+          <w:rStyle w:val="VerbatimChar"/>
+        </w:rPr>
+        <w:t xml:space="preserve">rename</w:t>
+      </w:r>
+      <w:r>
+        <w:t xml:space="preserve"> </w:t>
+      </w:r>
+      <w:r>
+        <w:t xml:space="preserve">(within</w:t>
+      </w:r>
+      <w:r>
+        <w:t xml:space="preserve"> </w:t>
+      </w:r>
+      <w:r>
+        <w:rPr>
+          <w:rStyle w:val="VerbatimChar"/>
+        </w:rPr>
+        <w:t xml:space="preserve">RAM:</w:t>
+      </w:r>
+      <w:r>
+        <w:t xml:space="preserve">; across volumes −1, the caller copies then removes, as between</w:t>
+      </w:r>
+      <w:r>
+        <w:t xml:space="preserve"> </w:t>
+      </w:r>
+      <w:r>
+        <w:rPr>
+          <w:rStyle w:val="VerbatimChar"/>
+        </w:rPr>
+        <w:t xml:space="preserve">SD:</w:t>
+      </w:r>
+      <w:r>
+        <w:t xml:space="preserve"> </w:t>
+      </w:r>
+      <w:r>
+        <w:t xml:space="preserve">and</w:t>
+      </w:r>
+      <w:r>
+        <w:t xml:space="preserve"> </w:t>
+      </w:r>
+      <w:r>
+        <w:rPr>
+          <w:rStyle w:val="VerbatimChar"/>
+        </w:rPr>
+        <w:t xml:space="preserve">SD1:</w:t>
+      </w:r>
+      <w:r>
+        <w:t xml:space="preserve">),</w:t>
+      </w:r>
+      <w:r>
+        <w:t xml:space="preserve"> </w:t>
+      </w:r>
+      <w:r>
+        <w:rPr>
+          <w:rStyle w:val="VerbatimChar"/>
+        </w:rPr>
+        <w:t xml:space="preserve">chdir</w:t>
+      </w:r>
+      <w:r>
+        <w:t xml:space="preserve"> </w:t>
+      </w:r>
+      <w:r>
+        <w:t xml:space="preserve">(</w:t>
+      </w:r>
+      <w:r>
+        <w:rPr>
+          <w:rStyle w:val="VerbatimChar"/>
+        </w:rPr>
+        <w:t xml:space="preserve">cd RAM:/x</w:t>
+      </w:r>
+      <w:r>
+        <w:t xml:space="preserve">, relative paths there), and</w:t>
+      </w:r>
+      <w:r>
+        <w:t xml:space="preserve"> </w:t>
+      </w:r>
+      <w:r>
+        <w:rPr>
+          <w:rStyle w:val="VerbatimChar"/>
+        </w:rPr>
+        <w:t xml:space="preserve">vol_info</w:t>
+      </w:r>
+      <w:r>
+        <w:t xml:space="preserve"> </w:t>
+      </w:r>
+      <w:r>
+        <w:t xml:space="preserve">(v71). newlib's</w:t>
+      </w:r>
+      <w:r>
+        <w:t xml:space="preserve"> </w:t>
+      </w:r>
+      <w:r>
+        <w:rPr>
+          <w:rStyle w:val="VerbatimChar"/>
+        </w:rPr>
+        <w:t xml:space="preserve">fopen</w:t>
+      </w:r>
+      <w:r>
+        <w:t xml:space="preserve"> </w:t>
+      </w:r>
+      <w:r>
+        <w:t xml:space="preserve">/</w:t>
+      </w:r>
+      <w:r>
+        <w:t xml:space="preserve"> </w:t>
+      </w:r>
+      <w:r>
+        <w:rPr>
+          <w:rStyle w:val="VerbatimChar"/>
+        </w:rPr>
+        <w:t xml:space="preserve">fread</w:t>
+      </w:r>
+      <w:r>
+        <w:t xml:space="preserve"> </w:t>
+      </w:r>
+      <w:r>
+        <w:t xml:space="preserve">/</w:t>
+      </w:r>
+      <w:r>
+        <w:t xml:space="preserve"> </w:t>
+      </w:r>
+      <w:r>
+        <w:rPr>
+          <w:rStyle w:val="VerbatimChar"/>
+        </w:rPr>
+        <w:t xml:space="preserve">fwrite</w:t>
+      </w:r>
+      <w:r>
+        <w:t xml:space="preserve"> </w:t>
+      </w:r>
+      <w:r>
+        <w:t xml:space="preserve">/</w:t>
+      </w:r>
+      <w:r>
+        <w:t xml:space="preserve"> </w:t>
+      </w:r>
+      <w:r>
+        <w:rPr>
+          <w:rStyle w:val="VerbatimChar"/>
+        </w:rPr>
+        <w:t xml:space="preserve">remove</w:t>
+      </w:r>
+      <w:r>
+        <w:t xml:space="preserve"> </w:t>
+      </w:r>
+      <w:r>
+        <w:t xml:space="preserve">and NetSurf's</w:t>
+      </w:r>
+      <w:r>
+        <w:t xml:space="preserve"> </w:t>
+      </w:r>
+      <w:r>
+        <w:rPr>
+          <w:rStyle w:val="VerbatimChar"/>
+        </w:rPr>
+        <w:t xml:space="preserve">opendir</w:t>
+      </w:r>
+      <w:r>
+        <w:t xml:space="preserve"> </w:t>
+      </w:r>
+      <w:r>
+        <w:t xml:space="preserve">sit on these, so a program needs nothing new</w:t>
+      </w:r>
+      <w:r>
+        <w:t xml:space="preserve"> </w:t>
+      </w:r>
+      <w:r>
+        <w:t xml:space="preserve">to use it. Its files live</w:t>
+      </w:r>
+      <w:r>
+        <w:t xml:space="preserve"> </w:t>
+      </w:r>
+      <w:r>
+        <w:rPr>
+          <w:b/>
+          <w:bCs/>
+        </w:rPr>
+        <w:t xml:space="preserve">until the Pi restarts</w:t>
+      </w:r>
+      <w:r>
+        <w:t xml:space="preserve">: never written anywhere, not tied to any app (an</w:t>
+      </w:r>
+      <w:r>
+        <w:t xml:space="preserve"> </w:t>
+      </w:r>
+      <w:r>
+        <w:t xml:space="preserve">app that ends leaves its files; its open handles are closed,</w:t>
+      </w:r>
+      <w:r>
+        <w:t xml:space="preserve"> </w:t>
+      </w:r>
+      <w:r>
+        <w:rPr>
+          <w:rStyle w:val="VerbatimChar"/>
+        </w:rPr>
+        <w:t xml:space="preserve">RamFsOnProcessGone</w:t>
+      </w:r>
+      <w:r>
+        <w:t xml:space="preserve"> </w:t>
+      </w:r>
+      <w:r>
+        <w:t xml:space="preserve">from</w:t>
+      </w:r>
+      <w:r>
+        <w:t xml:space="preserve"> </w:t>
+      </w:r>
+      <w:r>
+        <w:rPr>
+          <w:rStyle w:val="VerbatimChar"/>
+        </w:rPr>
+        <w:t xml:space="preserve">IpcOnProcessGone</w:t>
+      </w:r>
+      <w:r>
+        <w:t xml:space="preserve">). Programs cannot be started from it (</w:t>
+      </w:r>
+      <w:r>
+        <w:rPr>
+          <w:rStyle w:val="VerbatimChar"/>
+        </w:rPr>
+        <w:t xml:space="preserve">exec</w:t>
+      </w:r>
+      <w:r>
+        <w:t xml:space="preserve">,</w:t>
+      </w:r>
+      <w:r>
+        <w:t xml:space="preserve"> </w:t>
+      </w:r>
+      <w:r>
+        <w:rPr>
+          <w:rStyle w:val="VerbatimChar"/>
+        </w:rPr>
+        <w:t xml:space="preserve">spawn</w:t>
+      </w:r>
+      <w:r>
+        <w:t xml:space="preserve">: the card only). Jet</w:t>
+      </w:r>
+      <w:r>
+        <w:t xml:space="preserve"> </w:t>
+      </w:r>
+      <w:r>
+        <w:t xml:space="preserve">Browser keeps its disk cache and its JS code cache there (</w:t>
+      </w:r>
+      <w:r>
+        <w:rPr>
+          <w:rStyle w:val="VerbatimChar"/>
+        </w:rPr>
+        <w:t xml:space="preserve">RAM:/jet/cache</w:t>
+      </w:r>
+      <w:r>
+        <w:t xml:space="preserve">,</w:t>
+      </w:r>
+      <w:r>
+        <w:t xml:space="preserve"> </w:t>
+      </w:r>
+      <w:r>
+        <w:rPr>
+          <w:rStyle w:val="VerbatimChar"/>
+        </w:rPr>
+        <w:t xml:space="preserve">RAM:/jet/jscache</w:t>
+      </w:r>
+      <w:r>
+        <w:t xml:space="preserve">,</w:t>
+      </w:r>
+      <w:r>
+        <w:t xml:space="preserve"> </w:t>
+      </w:r>
+      <w:r>
+        <w:t xml:space="preserve">docs/06 §33): no browsing data on the card, and no SD write freezing core 0.</w:t>
+      </w:r>
+    </w:p>
+    <w:p>
+      <w:pPr>
+        <w:pStyle w:val="BodyText"/>
+      </w:pPr>
+      <w:r>
+        <w:rPr>
+          <w:b/>
+          <w:bCs/>
+        </w:rPr>
+        <w:t xml:space="preserve">The tree.</w:t>
+      </w:r>
+      <w:r>
+        <w:t xml:space="preserve"> </w:t>
+      </w:r>
+      <w:r>
+        <w:t xml:space="preserve">Folders and files are</w:t>
+      </w:r>
+      <w:r>
+        <w:t xml:space="preserve"> </w:t>
+      </w:r>
+      <w:r>
+        <w:rPr>
+          <w:rStyle w:val="VerbatimChar"/>
+        </w:rPr>
+        <w:t xml:space="preserve">TNode</w:t>
+      </w:r>
+      <w:r>
+        <w:t xml:space="preserve"> </w:t>
+      </w:r>
+      <w:r>
+        <w:t xml:space="preserve">records on the kernel heap — one size, so a freed one is</w:t>
+      </w:r>
+      <w:r>
+        <w:t xml:space="preserve"> </w:t>
+      </w:r>
+      <w:r>
+        <w:t xml:space="preserve">reused as is (Circle's heap keeps freed blocks by size, it never merges them): a name of up to</w:t>
+      </w:r>
+      <w:r>
+        <w:t xml:space="preserve"> </w:t>
+      </w:r>
+      <w:r>
+        <w:t xml:space="preserve">127 characters (</w:t>
+      </w:r>
+      <w:r>
+        <w:rPr>
+          <w:b/>
+          <w:bCs/>
+        </w:rPr>
+        <w:t xml:space="preserve">case-insensitive, case kept</w:t>
+      </w:r>
+      <w:r>
+        <w:t xml:space="preserve">, as on the card's FAT), the parent, the children (a</w:t>
+      </w:r>
+      <w:r>
+        <w:t xml:space="preserve"> </w:t>
+      </w:r>
+      <w:r>
+        <w:t xml:space="preserve">list in creation order:</w:t>
+      </w:r>
+      <w:r>
+        <w:t xml:space="preserve"> </w:t>
+      </w:r>
+      <w:r>
+        <w:rPr>
+          <w:rStyle w:val="VerbatimChar"/>
+        </w:rPr>
+        <w:t xml:space="preserve">readdir</w:t>
+      </w:r>
+      <w:r>
+        <w:t xml:space="preserve">'s order), the open count (</w:t>
+      </w:r>
+      <w:r>
+        <w:rPr>
+          <w:rStyle w:val="VerbatimChar"/>
+        </w:rPr>
+        <w:t xml:space="preserve">nRefs</w:t>
+      </w:r>
+      <w:r>
+        <w:t xml:space="preserve">). A file removed while open</w:t>
+      </w:r>
+      <w:r>
+        <w:t xml:space="preserve"> </w:t>
+      </w:r>
+      <w:r>
+        <w:t xml:space="preserve">leaves its folder at once and is freed at its last close (it can still be read to its end); a</w:t>
+      </w:r>
+      <w:r>
+        <w:t xml:space="preserve"> </w:t>
+      </w:r>
+      <w:r>
+        <w:t xml:space="preserve">folder must be empty to be removed; a folder cannot be moved into itself;</w:t>
+      </w:r>
+      <w:r>
+        <w:t xml:space="preserve"> </w:t>
+      </w:r>
+      <w:r>
+        <w:rPr>
+          <w:rStyle w:val="VerbatimChar"/>
+        </w:rPr>
+        <w:t xml:space="preserve">rename</w:t>
+      </w:r>
+      <w:r>
+        <w:t xml:space="preserve"> </w:t>
+      </w:r>
+      <w:r>
+        <w:t xml:space="preserve">onto an existing</w:t>
+      </w:r>
+      <w:r>
+        <w:t xml:space="preserve"> </w:t>
+      </w:r>
+      <w:r>
+        <w:t xml:space="preserve">name fails (as FatFs). Lookups walk the path's names (a folder's children one by one: fine for the</w:t>
+      </w:r>
+      <w:r>
+        <w:t xml:space="preserve"> </w:t>
+      </w:r>
+      <w:r>
+        <w:t xml:space="preserve">few thousand files of a cache).</w:t>
+      </w:r>
+    </w:p>
+    <w:p>
+      <w:pPr>
+        <w:pStyle w:val="BodyText"/>
+      </w:pPr>
+      <w:r>
+        <w:rPr>
+          <w:b/>
+          <w:bCs/>
+        </w:rPr>
+        <w:t xml:space="preserve">The bytes</w:t>
+      </w:r>
+      <w:r>
+        <w:t xml:space="preserve"> </w:t>
+      </w:r>
+      <w:r>
+        <w:t xml:space="preserve">are in</w:t>
+      </w:r>
+      <w:r>
+        <w:t xml:space="preserve"> </w:t>
+      </w:r>
+      <w:r>
+        <w:rPr>
+          <w:b/>
+          <w:bCs/>
+        </w:rPr>
+        <w:t xml:space="preserve">64 KB pages of the page allocator</w:t>
+      </w:r>
+      <w:r>
+        <w:t xml:space="preserve"> </w:t>
+      </w:r>
+      <w:r>
+        <w:t xml:space="preserve">(</w:t>
+      </w:r>
+      <w:r>
+        <w:rPr>
+          <w:rStyle w:val="VerbatimChar"/>
+        </w:rPr>
+        <w:t xml:space="preserve">palloc_high</w:t>
+      </w:r>
+      <w:r>
+        <w:t xml:space="preserve">: the apps' pool, the high</w:t>
+      </w:r>
+      <w:r>
+        <w:t xml:space="preserve"> </w:t>
+      </w:r>
+      <w:r>
+        <w:t xml:space="preserve">zone; without one — a 1 GB Pi — the low pager), never in the kernel's BSS (the 2 MB image limit) nor</w:t>
+      </w:r>
+      <w:r>
+        <w:t xml:space="preserve"> </w:t>
+      </w:r>
+      <w:r>
+        <w:t xml:space="preserve">in the heap. A file is a list of</w:t>
+      </w:r>
+      <w:r>
+        <w:t xml:space="preserve"> </w:t>
+      </w:r>
+      <w:r>
+        <w:rPr>
+          <w:b/>
+          <w:bCs/>
+        </w:rPr>
+        <w:t xml:space="preserve">extents</w:t>
+      </w:r>
+      <w:r>
+        <w:t xml:space="preserve">: a whole page, or a</w:t>
+      </w:r>
+      <w:r>
+        <w:t xml:space="preserve"> </w:t>
+      </w:r>
+      <w:r>
+        <w:rPr>
+          <w:b/>
+          <w:bCs/>
+        </w:rPr>
+        <w:t xml:space="preserve">chunk</w:t>
+      </w:r>
+      <w:r>
+        <w:t xml:space="preserve"> </w:t>
+      </w:r>
+      <w:r>
+        <w:t xml:space="preserve">of 256 B … 32 KB (8 sizes,</w:t>
+      </w:r>
+      <w:r>
+        <w:t xml:space="preserve"> </w:t>
+      </w:r>
+      <w:r>
+        <w:t xml:space="preserve">powers of two) of a page cut into chunks of one size (</w:t>
+      </w:r>
+      <w:r>
+        <w:rPr>
+          <w:rStyle w:val="VerbatimChar"/>
+        </w:rPr>
+        <w:t xml:space="preserve">TSlab</w:t>
+      </w:r>
+      <w:r>
+        <w:t xml:space="preserve">: the page, a bitmap of its chunks;</w:t>
+      </w:r>
+      <w:r>
+        <w:t xml:space="preserve"> </w:t>
+      </w:r>
+      <w:r>
+        <w:t xml:space="preserve">each size keeps the pages that have a free chunk). Every extent but the last is full. A file</w:t>
+      </w:r>
+      <w:r>
+        <w:t xml:space="preserve"> </w:t>
+      </w:r>
+      <w:r>
+        <w:t xml:space="preserve">written whole (</w:t>
+      </w:r>
+      <w:r>
+        <w:rPr>
+          <w:rStyle w:val="VerbatimChar"/>
+        </w:rPr>
+        <w:t xml:space="preserve">save_file</w:t>
+      </w:r>
+      <w:r>
+        <w:t xml:space="preserve">) is cut exactly: whole pages, then the rest in falling powers of two</w:t>
+      </w:r>
+      <w:r>
+        <w:t xml:space="preserve"> </w:t>
+      </w:r>
+      <w:r>
+        <w:t xml:space="preserve">(40 KB + 100 B → 32 KB, 8 KB, 256 B: under 256 B lost a file). A stream writes whole pages; at its</w:t>
+      </w:r>
+      <w:r>
+        <w:t xml:space="preserve"> </w:t>
+      </w:r>
+      <w:r>
+        <w:t xml:space="preserve">close its</w:t>
+      </w:r>
+      <w:r>
+        <w:t xml:space="preserve"> </w:t>
+      </w:r>
+      <w:r>
+        <w:rPr>
+          <w:b/>
+          <w:bCs/>
+        </w:rPr>
+        <w:t xml:space="preserve">tail</w:t>
+      </w:r>
+      <w:r>
+        <w:t xml:space="preserve"> </w:t>
+      </w:r>
+      <w:r>
+        <w:t xml:space="preserve">(the chunks after its last whole page, and that page) is cut again exactly</w:t>
+      </w:r>
+      <w:r>
+        <w:t xml:space="preserve"> </w:t>
+      </w:r>
+      <w:r>
+        <w:t xml:space="preserve">(</w:t>
+      </w:r>
+      <w:r>
+        <w:rPr>
+          <w:rStyle w:val="VerbatimChar"/>
+        </w:rPr>
+        <w:t xml:space="preserve">Trim</w:t>
+      </w:r>
+      <w:r>
+        <w:t xml:space="preserve">) — a log appended a line at a time stays compact. The extent list itself is in a chunk (a</w:t>
+      </w:r>
+      <w:r>
+        <w:t xml:space="preserve"> </w:t>
+      </w:r>
+      <w:r>
+        <w:t xml:space="preserve">page holds ~2700 extents: 170 MB; a file is limited to</w:t>
+      </w:r>
+      <w:r>
+        <w:t xml:space="preserve"> </w:t>
+      </w:r>
+      <w:r>
+        <w:rPr>
+          <w:rStyle w:val="VerbatimChar"/>
+        </w:rPr>
+        <w:t xml:space="preserve">RAMFS_FILE_MAX</w:t>
+      </w:r>
+      <w:r>
+        <w:t xml:space="preserve">, 128 MB, and to the</w:t>
+      </w:r>
+      <w:r>
+        <w:t xml:space="preserve"> </w:t>
+      </w:r>
+      <w:r>
+        <w:t xml:space="preserve">volume). A chunk freed gives its page back as soon as nothing else in it is used: removing a file</w:t>
+      </w:r>
+      <w:r>
+        <w:t xml:space="preserve"> </w:t>
+      </w:r>
+      <w:r>
+        <w:t xml:space="preserve">returns its memory (</w:t>
+      </w:r>
+      <w:r>
+        <w:rPr>
+          <w:rStyle w:val="VerbatimChar"/>
+        </w:rPr>
+        <w:t xml:space="preserve">vol_info</w:t>
+      </w:r>
+      <w:r>
+        <w:t xml:space="preserve"> </w:t>
+      </w:r>
+      <w:r>
+        <w:t xml:space="preserve">shows it,</w:t>
+      </w:r>
+      <w:r>
+        <w:t xml:space="preserve"> </w:t>
+      </w:r>
+      <w:r>
+        <w:rPr>
+          <w:rStyle w:val="VerbatimChar"/>
+        </w:rPr>
+        <w:t xml:space="preserve">ramtest</w:t>
+      </w:r>
+      <w:r>
+        <w:t xml:space="preserve"> </w:t>
+      </w:r>
+      <w:r>
+        <w:t xml:space="preserve">checks it).</w:t>
+      </w:r>
+    </w:p>
+    <w:p>
+      <w:pPr>
+        <w:pStyle w:val="BodyText"/>
+      </w:pPr>
+      <w:r>
+        <w:rPr>
+          <w:b/>
+          <w:bCs/>
+        </w:rPr>
+        <w:t xml:space="preserve">Limits</w:t>
+      </w:r>
+      <w:r>
+        <w:t xml:space="preserve"> </w:t>
+      </w:r>
+      <w:r>
+        <w:t xml:space="preserve">(</w:t>
+      </w:r>
+      <w:r>
+        <w:rPr>
+          <w:rStyle w:val="VerbatimChar"/>
+        </w:rPr>
+        <w:t xml:space="preserve">kern/ramfs.h</w:t>
+      </w:r>
+      <w:r>
+        <w:t xml:space="preserve">):</w:t>
+      </w:r>
+    </w:p>
+    <w:tbl>
+      <w:tblPr>
+        <w:tblStyle w:val="Table"/>
+        <w:tblW w:type="auto" w:w="0"/>
+        <w:tblLook w:firstRow="1" w:lastRow="0" w:firstColumn="0" w:lastColumn="0" w:noHBand="0" w:noVBand="0" w:val="0020"/>
+      </w:tblPr>
+      <w:tblGrid>
+        <w:gridCol w:w="3960"/>
+        <w:gridCol w:w="3960"/>
+      </w:tblGrid>
+      <w:tr>
+        <w:trPr>
+          <w:tblHeader w:val="on"/>
+        </w:trPr>
+        <w:tc>
+          <w:tcPr/>
+          <w:p>
+            <w:pPr>
+              <w:pStyle w:val="Compact"/>
+            </w:pPr>
+          </w:p>
+        </w:tc>
+        <w:tc>
+          <w:tcPr/>
+          <w:p>
+            <w:pPr>
+              <w:pStyle w:val="Compact"/>
+            </w:pPr>
+          </w:p>
+        </w:tc>
+      </w:tr>
+      <w:tr>
+        <w:tc>
+          <w:tcPr/>
+          <w:p>
+            <w:pPr>
+              <w:pStyle w:val="Compact"/>
+            </w:pPr>
+            <w:r>
+              <w:t xml:space="preserve">The volume's size</w:t>
+            </w:r>
+          </w:p>
+        </w:tc>
+        <w:tc>
+          <w:tcPr/>
+          <w:p>
+            <w:pPr>
+              <w:pStyle w:val="Compact"/>
+            </w:pPr>
+            <w:r>
+              <w:rPr>
+                <w:rStyle w:val="VerbatimChar"/>
+              </w:rPr>
+              <w:t xml:space="preserve">SD:/etc/system.ini</w:t>
+            </w:r>
+            <w:r>
+              <w:t xml:space="preserve"> </w:t>
+            </w:r>
+            <w:r>
+              <w:rPr>
+                <w:rStyle w:val="VerbatimChar"/>
+                <w:b/>
+                <w:bCs/>
+              </w:rPr>
+              <w:t xml:space="preserve">ramfs=</w:t>
+            </w:r>
+            <w:r>
+              <w:t xml:space="preserve">: megabytes (</w:t>
+            </w:r>
+            <w:r>
+              <w:rPr>
+                <w:rStyle w:val="VerbatimChar"/>
+              </w:rPr>
+              <w:t xml:space="preserve">ramfs=64</w:t>
+            </w:r>
+            <w:r>
+              <w:t xml:space="preserve">) or a share of the page memory free at boot (</w:t>
+            </w:r>
+            <w:r>
+              <w:rPr>
+                <w:rStyle w:val="VerbatimChar"/>
+              </w:rPr>
+              <w:t xml:space="preserve">ramfs=10%</w:t>
+            </w:r>
+            <w:r>
+              <w:t xml:space="preserve">, at most 90 %);</w:t>
+            </w:r>
+            <w:r>
+              <w:t xml:space="preserve"> </w:t>
+            </w:r>
+            <w:r>
+              <w:rPr>
+                <w:rStyle w:val="VerbatimChar"/>
+              </w:rPr>
+              <w:t xml:space="preserve">ramfs=0</w:t>
+            </w:r>
+            <w:r>
+              <w:t xml:space="preserve"> </w:t>
+            </w:r>
+            <w:r>
+              <w:t xml:space="preserve">(or under 1 MB): no</w:t>
+            </w:r>
+            <w:r>
+              <w:t xml:space="preserve"> </w:t>
+            </w:r>
+            <w:r>
+              <w:rPr>
+                <w:rStyle w:val="VerbatimChar"/>
+              </w:rPr>
+              <w:t xml:space="preserve">RAM:</w:t>
+            </w:r>
+            <w:r>
+              <w:t xml:space="preserve"> </w:t>
+            </w:r>
+            <w:r>
+              <w:t xml:space="preserve">volume (</w:t>
+            </w:r>
+            <w:r>
+              <w:rPr>
+                <w:rStyle w:val="VerbatimChar"/>
+              </w:rPr>
+              <w:t xml:space="preserve">vol_info</w:t>
+            </w:r>
+            <w:r>
+              <w:t xml:space="preserve"> </w:t>
+            </w:r>
+            <w:r>
+              <w:t xml:space="preserve">−1, its paths fail).</w:t>
+            </w:r>
+            <w:r>
+              <w:t xml:space="preserve"> </w:t>
+            </w:r>
+            <w:r>
+              <w:rPr>
+                <w:b/>
+                <w:bCs/>
+              </w:rPr>
+              <w:t xml:space="preserve">Default</w:t>
+            </w:r>
+            <w:r>
+              <w:t xml:space="preserve"> </w:t>
+            </w:r>
+            <w:r>
+              <w:t xml:space="preserve">(no line):</w:t>
+            </w:r>
+            <w:r>
+              <w:t xml:space="preserve"> </w:t>
+            </w:r>
+            <w:r>
+              <w:rPr>
+                <w:b/>
+                <w:bCs/>
+              </w:rPr>
+              <w:t xml:space="preserve">128 MB, at most a quarter</w:t>
+            </w:r>
+            <w:r>
+              <w:t xml:space="preserve"> </w:t>
+            </w:r>
+            <w:r>
+              <w:t xml:space="preserve">of the free page memory (a 1 GB Pi: ~60 MB). Never more than the free memory less the reserve. Read at boot (a restart applies a change).</w:t>
+            </w:r>
+          </w:p>
+        </w:tc>
+      </w:tr>
+      <w:tr>
+        <w:tc>
+          <w:tcPr/>
+          <w:p>
+            <w:pPr>
+              <w:pStyle w:val="Compact"/>
+            </w:pPr>
+            <w:r>
+              <w:t xml:space="preserve">The reserve</w:t>
+            </w:r>
+          </w:p>
+        </w:tc>
+        <w:tc>
+          <w:tcPr/>
+          <w:p>
+            <w:pPr>
+              <w:pStyle w:val="Compact"/>
+            </w:pPr>
+            <w:r>
+              <w:rPr>
+                <w:rStyle w:val="VerbatimChar"/>
+              </w:rPr>
+              <w:t xml:space="preserve">RAMFS_RESERVE</w:t>
+            </w:r>
+            <w:r>
+              <w:t xml:space="preserve"> </w:t>
+            </w:r>
+            <w:r>
+              <w:t xml:space="preserve">= 32 MB of page memory always left to the apps: a write that would go below it fails (the volume is then "full" before its size).</w:t>
+            </w:r>
+          </w:p>
+        </w:tc>
+      </w:tr>
+      <w:tr>
+        <w:tc>
+          <w:tcPr/>
+          <w:p>
+            <w:pPr>
+              <w:pStyle w:val="Compact"/>
+            </w:pPr>
+            <w:r>
+              <w:t xml:space="preserve">Files and folders</w:t>
+            </w:r>
+          </w:p>
+        </w:tc>
+        <w:tc>
+          <w:tcPr/>
+          <w:p>
+            <w:pPr>
+              <w:pStyle w:val="Compact"/>
+            </w:pPr>
+            <w:r>
+              <w:rPr>
+                <w:rStyle w:val="VerbatimChar"/>
+              </w:rPr>
+              <w:t xml:space="preserve">RAMFS_MAX_NODES</w:t>
+            </w:r>
+            <w:r>
+              <w:t xml:space="preserve"> </w:t>
+            </w:r>
+            <w:r>
+              <w:t xml:space="preserve">= 16384 (their records: ~250 bytes of heap each); a new record also needs 8 MB of heap never handed out (Circle panics when its heap runs out).</w:t>
+            </w:r>
+          </w:p>
+        </w:tc>
+      </w:tr>
+      <w:tr>
+        <w:tc>
+          <w:tcPr/>
+          <w:p>
+            <w:pPr>
+              <w:pStyle w:val="Compact"/>
+            </w:pPr>
+            <w:r>
+              <w:t xml:space="preserve">A file</w:t>
+            </w:r>
+          </w:p>
+        </w:tc>
+        <w:tc>
+          <w:tcPr/>
+          <w:p>
+            <w:pPr>
+              <w:pStyle w:val="Compact"/>
+            </w:pPr>
+            <w:r>
+              <w:rPr>
+                <w:rStyle w:val="VerbatimChar"/>
+              </w:rPr>
+              <w:t xml:space="preserve">RAMFS_FILE_MAX</w:t>
+            </w:r>
+            <w:r>
+              <w:t xml:space="preserve"> </w:t>
+            </w:r>
+            <w:r>
+              <w:t xml:space="preserve">= 128 MB (and the volume's room).</w:t>
+            </w:r>
+          </w:p>
+        </w:tc>
+      </w:tr>
+      <w:tr>
+        <w:tc>
+          <w:tcPr/>
+          <w:p>
+            <w:pPr>
+              <w:pStyle w:val="Compact"/>
+            </w:pPr>
+            <w:r>
+              <w:t xml:space="preserve">Open handles</w:t>
+            </w:r>
+          </w:p>
+        </w:tc>
+        <w:tc>
+          <w:tcPr/>
+          <w:p>
+            <w:pPr>
+              <w:pStyle w:val="Compact"/>
+            </w:pPr>
+            <w:r>
+              <w:t xml:space="preserve">256 files, 64 folder listings (on the heap); streams are not counted.</w:t>
+            </w:r>
+          </w:p>
+        </w:tc>
+      </w:tr>
+    </w:tbl>
+    <w:p>
+      <w:pPr>
+        <w:pStyle w:val="BodyText"/>
+      </w:pPr>
+      <w:r>
+        <w:t xml:space="preserve">A full volume:</w:t>
+      </w:r>
+      <w:r>
+        <w:t xml:space="preserve"> </w:t>
+      </w:r>
+      <w:r>
+        <w:rPr>
+          <w:rStyle w:val="VerbatimChar"/>
+        </w:rPr>
+        <w:t xml:space="preserve">save_file</w:t>
+      </w:r>
+      <w:r>
+        <w:t xml:space="preserve"> </w:t>
+      </w:r>
+      <w:r>
+        <w:t xml:space="preserve">fails (−1) and</w:t>
+      </w:r>
+      <w:r>
+        <w:t xml:space="preserve"> </w:t>
+      </w:r>
+      <w:r>
+        <w:rPr>
+          <w:b/>
+          <w:bCs/>
+        </w:rPr>
+        <w:t xml:space="preserve">leaves no half file</w:t>
+      </w:r>
+      <w:r>
+        <w:t xml:space="preserve"> </w:t>
+      </w:r>
+      <w:r>
+        <w:t xml:space="preserve">(a file that cannot fit is</w:t>
+      </w:r>
+      <w:r>
+        <w:t xml:space="preserve"> </w:t>
+      </w:r>
+      <w:r>
+        <w:t xml:space="preserve">removed — the old content was already replaced); a stream's</w:t>
+      </w:r>
+      <w:r>
+        <w:t xml:space="preserve"> </w:t>
+      </w:r>
+      <w:r>
+        <w:rPr>
+          <w:rStyle w:val="VerbatimChar"/>
+        </w:rPr>
+        <w:t xml:space="preserve">write</w:t>
+      </w:r>
+      <w:r>
+        <w:t xml:space="preserve"> </w:t>
+      </w:r>
+      <w:r>
+        <w:t xml:space="preserve">answers the bytes it could</w:t>
+      </w:r>
+      <w:r>
+        <w:t xml:space="preserve"> </w:t>
+      </w:r>
+      <w:r>
+        <w:t xml:space="preserve">store (−1 for none). The boot log says the size:</w:t>
+      </w:r>
+      <w:r>
+        <w:t xml:space="preserve"> </w:t>
+      </w:r>
+      <w:r>
+        <w:rPr>
+          <w:rStyle w:val="VerbatimChar"/>
+        </w:rPr>
+        <w:t xml:space="preserve">ramfs: RAM: volume, up to 128 MB (2900 MB of page memory free)</w:t>
+      </w:r>
+      <w:r>
+        <w:t xml:space="preserve">.</w:t>
+      </w:r>
+    </w:p>
+    <w:p>
+      <w:pPr>
+        <w:pStyle w:val="BodyText"/>
+      </w:pPr>
+      <w:r>
+        <w:rPr>
+          <w:b/>
+          <w:bCs/>
+        </w:rPr>
+        <w:t xml:space="preserve">Locking.</w:t>
+      </w:r>
+      <w:r>
+        <w:t xml:space="preserve"> </w:t>
+      </w:r>
+      <w:r>
+        <w:t xml:space="preserve">One re-entrant</w:t>
+      </w:r>
+      <w:r>
+        <w:t xml:space="preserve"> </w:t>
+      </w:r>
+      <w:r>
+        <w:rPr>
+          <w:b/>
+          <w:bCs/>
+        </w:rPr>
+        <w:t xml:space="preserve">sleeping lock</w:t>
+      </w:r>
+      <w:r>
+        <w:t xml:space="preserve"> </w:t>
+      </w:r>
+      <w:r>
+        <w:t xml:space="preserve">for the volume (an atomic owner, its waiters</w:t>
+      </w:r>
+      <w:r>
+        <w:t xml:space="preserve"> </w:t>
+      </w:r>
+      <w:r>
+        <w:rPr>
+          <w:rStyle w:val="VerbatimChar"/>
+        </w:rPr>
+        <w:t xml:space="preserve">Yield</w:t>
+      </w:r>
+      <w:r>
+        <w:t xml:space="preserve"> </w:t>
+      </w:r>
+      <w:r>
+        <w:t xml:space="preserve">— as the FatFs volume lock, §5); nothing yields while holding it. A big read or write is cut into</w:t>
+      </w:r>
+      <w:r>
+        <w:t xml:space="preserve"> </w:t>
+      </w:r>
+      <w:r>
+        <w:rPr>
+          <w:b/>
+          <w:bCs/>
+        </w:rPr>
+        <w:t xml:space="preserve">1 MB slices</w:t>
+      </w:r>
+      <w:r>
+        <w:t xml:space="preserve"> </w:t>
+      </w:r>
+      <w:r>
+        <w:t xml:space="preserve">(</w:t>
+      </w:r>
+      <w:r>
+        <w:rPr>
+          <w:rStyle w:val="VerbatimChar"/>
+        </w:rPr>
+        <w:t xml:space="preserve">RAMFS_SLICE</w:t>
+      </w:r>
+      <w:r>
+        <w:t xml:space="preserve">) with a</w:t>
+      </w:r>
+      <w:r>
+        <w:t xml:space="preserve"> </w:t>
+      </w:r>
+      <w:r>
+        <w:rPr>
+          <w:rStyle w:val="VerbatimChar"/>
+        </w:rPr>
+        <w:t xml:space="preserve">Yield</w:t>
+      </w:r>
+      <w:r>
+        <w:t xml:space="preserve"> </w:t>
+      </w:r>
+      <w:r>
+        <w:t xml:space="preserve">between them, the lock free meanwhile — a 16 MB copy</w:t>
+      </w:r>
+      <w:r>
+        <w:t xml:space="preserve"> </w:t>
+      </w:r>
+      <w:r>
+        <w:t xml:space="preserve">does not hold the other tasks (the kernel is not preempted, §5). A</w:t>
+      </w:r>
+      <w:r>
+        <w:t xml:space="preserve"> </w:t>
+      </w:r>
+      <w:r>
+        <w:rPr>
+          <w:rStyle w:val="VerbatimChar"/>
+        </w:rPr>
+        <w:t xml:space="preserve">save_file</w:t>
+      </w:r>
+      <w:r>
+        <w:t xml:space="preserve"> </w:t>
+      </w:r>
+      <w:r>
+        <w:t xml:space="preserve">in progress is in a</w:t>
+      </w:r>
+      <w:r>
+        <w:t xml:space="preserve"> </w:t>
+      </w:r>
+      <w:r>
+        <w:rPr>
+          <w:b/>
+          <w:bCs/>
+        </w:rPr>
+        <w:t xml:space="preserve">no-kill</w:t>
+      </w:r>
+      <w:r>
+        <w:t xml:space="preserve"> </w:t>
+      </w:r>
+      <w:r>
+        <w:t xml:space="preserve">section (</w:t>
+      </w:r>
+      <w:r>
+        <w:rPr>
+          <w:rStyle w:val="VerbatimChar"/>
+        </w:rPr>
+        <w:t xml:space="preserve">EnterNoKill</w:t>
+      </w:r>
+      <w:r>
+        <w:t xml:space="preserve">): killed between two slices, the task ends once the file is</w:t>
+      </w:r>
+      <w:r>
+        <w:t xml:space="preserve"> </w:t>
+      </w:r>
+      <w:r>
+        <w:t xml:space="preserve">complete or removed. The file calls run on core 0's tasks (and core 3's with</w:t>
+      </w:r>
+      <w:r>
+        <w:t xml:space="preserve"> </w:t>
+      </w:r>
+      <w:r>
+        <w:rPr>
+          <w:rStyle w:val="VerbatimChar"/>
+        </w:rPr>
+        <w:t xml:space="preserve">netcore=1</w:t>
+      </w:r>
+      <w:r>
+        <w:t xml:space="preserve">); an app</w:t>
+      </w:r>
+      <w:r>
+        <w:t xml:space="preserve"> </w:t>
+      </w:r>
+      <w:r>
+        <w:t xml:space="preserve">core never calls the kernel (§14). Opening a file / listing a folder walks the tree under the lock.</w:t>
+      </w:r>
+    </w:p>
+    <w:p>
+      <w:pPr>
+        <w:pStyle w:val="BodyText"/>
+      </w:pPr>
+      <w:r>
+        <w:rPr>
+          <w:b/>
+          <w:bCs/>
+        </w:rPr>
+        <w:t xml:space="preserve">Speed</w:t>
+      </w:r>
+      <w:r>
+        <w:t xml:space="preserve"> </w:t>
+      </w:r>
+      <w:r>
+        <w:t xml:space="preserve">(no card): a</w:t>
+      </w:r>
+      <w:r>
+        <w:t xml:space="preserve"> </w:t>
+      </w:r>
+      <w:r>
+        <w:rPr>
+          <w:rStyle w:val="VerbatimChar"/>
+        </w:rPr>
+        <w:t xml:space="preserve">save_file</w:t>
+      </w:r>
+      <w:r>
+        <w:t xml:space="preserve"> </w:t>
+      </w:r>
+      <w:r>
+        <w:t xml:space="preserve">or a</w:t>
+      </w:r>
+      <w:r>
+        <w:t xml:space="preserve"> </w:t>
+      </w:r>
+      <w:r>
+        <w:rPr>
+          <w:rStyle w:val="VerbatimChar"/>
+        </w:rPr>
+        <w:t xml:space="preserve">read</w:t>
+      </w:r>
+      <w:r>
+        <w:t xml:space="preserve"> </w:t>
+      </w:r>
+      <w:r>
+        <w:t xml:space="preserve">is a</w:t>
+      </w:r>
+      <w:r>
+        <w:t xml:space="preserve"> </w:t>
+      </w:r>
+      <w:r>
+        <w:rPr>
+          <w:rStyle w:val="VerbatimChar"/>
+        </w:rPr>
+        <w:t xml:space="preserve">memcpy</w:t>
+      </w:r>
+      <w:r>
+        <w:t xml:space="preserve"> </w:t>
+      </w:r>
+      <w:r>
+        <w:t xml:space="preserve">into / from the pages (GBs a second),</w:t>
+      </w:r>
+      <w:r>
+        <w:t xml:space="preserve"> </w:t>
+      </w:r>
+      <w:r>
+        <w:t xml:space="preserve">plus the yields between the slices;</w:t>
+      </w:r>
+      <w:r>
+        <w:t xml:space="preserve"> </w:t>
+      </w:r>
+      <w:r>
+        <w:rPr>
+          <w:rStyle w:val="VerbatimChar"/>
+        </w:rPr>
+        <w:t xml:space="preserve">ramtest</w:t>
+      </w:r>
+      <w:r>
+        <w:t xml:space="preserve"> </w:t>
+      </w:r>
+      <w:r>
+        <w:t xml:space="preserve">prints the time of a 16 MB file on the Pi.</w:t>
+      </w:r>
+    </w:p>
+    <w:p>
+      <w:pPr>
+        <w:pStyle w:val="BodyText"/>
+      </w:pPr>
+      <w:r>
+        <w:rPr>
+          <w:b/>
+          <w:bCs/>
+        </w:rPr>
+        <w:t xml:space="preserve">Tests.</w:t>
+      </w:r>
+      <w:r>
+        <w:t xml:space="preserve"> </w:t>
+      </w:r>
+      <w:r>
+        <w:t xml:space="preserve">On the PC:</w:t>
+      </w:r>
+      <w:r>
+        <w:t xml:space="preserve"> </w:t>
+      </w:r>
+      <w:r>
+        <w:rPr>
+          <w:rStyle w:val="VerbatimChar"/>
+        </w:rPr>
+        <w:t xml:space="preserve">sh tools/tests/run_ramfs_test.sh</w:t>
+      </w:r>
+      <w:r>
+        <w:t xml:space="preserve"> </w:t>
+      </w:r>
+      <w:r>
+        <w:t xml:space="preserve">—</w:t>
+      </w:r>
+      <w:r>
+        <w:t xml:space="preserve"> </w:t>
+      </w:r>
+      <w:r>
+        <w:rPr>
+          <w:rStyle w:val="VerbatimChar"/>
+        </w:rPr>
+        <w:t xml:space="preserve">sys/ramfs.cpp</w:t>
+      </w:r>
+      <w:r>
+        <w:t xml:space="preserve"> </w:t>
+      </w:r>
+      <w:r>
+        <w:t xml:space="preserve">built with</w:t>
+      </w:r>
+      <w:r>
+        <w:t xml:space="preserve"> </w:t>
+      </w:r>
+      <w:r>
+        <w:rPr>
+          <w:rStyle w:val="VerbatimChar"/>
+        </w:rPr>
+        <w:t xml:space="preserve">RAMFS_HOST_TEST</w:t>
+      </w:r>
+      <w:r>
+        <w:t xml:space="preserve"> </w:t>
+      </w:r>
+      <w:r>
+        <w:t xml:space="preserve">(the pages from the PC's allocator, no scheduler: its few platform calls are at</w:t>
+      </w:r>
+      <w:r>
+        <w:t xml:space="preserve"> </w:t>
+      </w:r>
+      <w:r>
+        <w:t xml:space="preserve">the top of the file) under AddressSanitizer: thousands of random operations (saves, streams written /</w:t>
+      </w:r>
+      <w:r>
+        <w:t xml:space="preserve"> </w:t>
+      </w:r>
+      <w:r>
+        <w:t xml:space="preserve">appended / truncated, reads whole / in pieces / after a seek, listings, mkdir, remove, rename across</w:t>
+      </w:r>
+      <w:r>
+        <w:t xml:space="preserve"> </w:t>
+      </w:r>
+      <w:r>
+        <w:t xml:space="preserve">folders) checked against a model, for 5 seeds; then the edges: the names (case, 127 / 128</w:t>
+      </w:r>
+      <w:r>
+        <w:t xml:space="preserve"> </w:t>
+      </w:r>
+      <w:r>
+        <w:t xml:space="preserve">characters), a folder not empty, a folder into itself, a file removed while open, a dead process's</w:t>
+      </w:r>
+      <w:r>
+        <w:t xml:space="preserve"> </w:t>
+      </w:r>
+      <w:r>
+        <w:t xml:space="preserve">handles, small files taking their size rounded to 256 B, a streamed file's tail fitted, a log</w:t>
+      </w:r>
+      <w:r>
+        <w:t xml:space="preserve"> </w:t>
+      </w:r>
+      <w:r>
+        <w:t xml:space="preserve">appended 300 times, the volume filled (a save that does not fit leaves no half file, the room back</w:t>
+      </w:r>
+      <w:r>
+        <w:t xml:space="preserve"> </w:t>
+      </w:r>
+      <w:r>
+        <w:t xml:space="preserve">after the removes), and every page given back at the end. On the Pi:</w:t>
+      </w:r>
+      <w:r>
+        <w:t xml:space="preserve"> </w:t>
+      </w:r>
+      <w:r>
+        <w:rPr>
+          <w:rStyle w:val="VerbatimChar"/>
+        </w:rPr>
+        <w:t xml:space="preserve">/bin/ramtest</w:t>
+      </w:r>
+      <w:r>
+        <w:t xml:space="preserve"> </w:t>
+      </w:r>
+      <w:r>
+        <w:t xml:space="preserve">(</w:t>
+      </w:r>
+      <w:r>
+        <w:rPr>
+          <w:rStyle w:val="VerbatimChar"/>
+        </w:rPr>
+        <w:t xml:space="preserve">ramtest full</w:t>
+      </w:r>
+      <w:r>
+        <w:t xml:space="preserve"> </w:t>
+      </w:r>
+      <w:r>
+        <w:t xml:space="preserve">also fills the volume).</w:t>
+      </w:r>
+    </w:p>
+    <w:p>
+      <w:r>
+        <w:pict>
+          <v:rect style="width:0;height:1.5pt" o:hralign="center" o:hrstd="t" o:hr="t"/>
+        </w:pict>
+      </w:r>
+    </w:p>
+    <w:bookmarkEnd w:id="109"/>
+    <w:bookmarkStart w:id="110" w:name="annex--useful-constants"/>
     <w:p>
       <w:pPr>
         <w:pStyle w:val="Heading2"/>
@@ -41280,7 +43858,7 @@
               <w:pStyle w:val="Compact"/>
             </w:pPr>
             <w:r>
-              <w:t xml:space="preserve">70</w:t>
+              <w:t xml:space="preserve">71</w:t>
             </w:r>
           </w:p>
         </w:tc>
@@ -41307,7 +43885,13 @@
               <w:rPr>
                 <w:rStyle w:val="VerbatimChar"/>
               </w:rPr>
-              <w:t xml:space="preserve">USER_HEAP_BASE</w:t>
+              <w:t xml:space="preserve">RAM:</w:t>
+            </w:r>
+            <w:r>
+              <w:t xml:space="preserve"> </w:t>
+            </w:r>
+            <w:r>
+              <w:t xml:space="preserve">volume</w:t>
             </w:r>
           </w:p>
         </w:tc>
@@ -41318,7 +43902,28 @@
               <w:pStyle w:val="Compact"/>
             </w:pPr>
             <w:r>
-              <w:t xml:space="preserve">10 GB</w:t>
+              <w:t xml:space="preserve">128 MB by default (≤ ¼ of the free page memory;</w:t>
+            </w:r>
+            <w:r>
+              <w:t xml:space="preserve"> </w:t>
+            </w:r>
+            <w:r>
+              <w:rPr>
+                <w:rStyle w:val="VerbatimChar"/>
+              </w:rPr>
+              <w:t xml:space="preserve">system.ini</w:t>
+            </w:r>
+            <w:r>
+              <w:t xml:space="preserve"> </w:t>
+            </w:r>
+            <w:r>
+              <w:rPr>
+                <w:rStyle w:val="VerbatimChar"/>
+              </w:rPr>
+              <w:t xml:space="preserve">ramfs=</w:t>
+            </w:r>
+            <w:r>
+              <w:t xml:space="preserve">), 32 MB reserve, 16384 files + folders, 128 MB a file</w:t>
             </w:r>
           </w:p>
         </w:tc>
@@ -41329,7 +43934,7 @@
               <w:pStyle w:val="Compact"/>
             </w:pPr>
             <w:r>
-              <w:t xml:space="preserve">layout.h</w:t>
+              <w:t xml:space="preserve">ramfs.h</w:t>
             </w:r>
           </w:p>
         </w:tc>
@@ -41345,7 +43950,7 @@
               <w:rPr>
                 <w:rStyle w:val="VerbatimChar"/>
               </w:rPr>
-              <w:t xml:space="preserve">MAX_TASKS</w:t>
+              <w:t xml:space="preserve">USER_HEAP_BASE</w:t>
             </w:r>
           </w:p>
         </w:tc>
@@ -41356,7 +43961,7 @@
               <w:pStyle w:val="Compact"/>
             </w:pPr>
             <w:r>
-              <w:t xml:space="preserve">40</w:t>
+              <w:t xml:space="preserve">10 GB</w:t>
             </w:r>
           </w:p>
         </w:tc>
@@ -41367,7 +43972,7 @@
               <w:pStyle w:val="Compact"/>
             </w:pPr>
             <w:r>
-              <w:t xml:space="preserve">sysconfig.h</w:t>
+              <w:t xml:space="preserve">layout.h</w:t>
             </w:r>
           </w:p>
         </w:tc>
@@ -41383,7 +43988,7 @@
               <w:rPr>
                 <w:rStyle w:val="VerbatimChar"/>
               </w:rPr>
-              <w:t xml:space="preserve">ASID</w:t>
+              <w:t xml:space="preserve">MAX_TASKS</w:t>
             </w:r>
           </w:p>
         </w:tc>
@@ -41394,7 +43999,7 @@
               <w:pStyle w:val="Compact"/>
             </w:pPr>
             <w:r>
-              <w:t xml:space="preserve">8 bits (1..255; 0 = kernel)</w:t>
+              <w:t xml:space="preserve">40</w:t>
             </w:r>
           </w:p>
         </w:tc>
@@ -41405,7 +44010,7 @@
               <w:pStyle w:val="Compact"/>
             </w:pPr>
             <w:r>
-              <w:t xml:space="preserve">layout.h</w:t>
+              <w:t xml:space="preserve">sysconfig.h</w:t>
             </w:r>
           </w:p>
         </w:tc>
@@ -41418,7 +44023,10 @@
               <w:pStyle w:val="Compact"/>
             </w:pPr>
             <w:r>
-              <w:t xml:space="preserve">Kernel stack of an app task</w:t>
+              <w:rPr>
+                <w:rStyle w:val="VerbatimChar"/>
+              </w:rPr>
+              <w:t xml:space="preserve">ASID</w:t>
             </w:r>
           </w:p>
         </w:tc>
@@ -41429,7 +44037,7 @@
               <w:pStyle w:val="Compact"/>
             </w:pPr>
             <w:r>
-              <w:t xml:space="preserve">256 KB</w:t>
+              <w:t xml:space="preserve">8 bits (1..255; 0 = kernel)</w:t>
             </w:r>
           </w:p>
         </w:tc>
@@ -41440,7 +44048,7 @@
               <w:pStyle w:val="Compact"/>
             </w:pPr>
             <w:r>
-              <w:t xml:space="preserve">kernel.cpp</w:t>
+              <w:t xml:space="preserve">layout.h</w:t>
             </w:r>
           </w:p>
         </w:tc>
@@ -41453,7 +44061,7 @@
               <w:pStyle w:val="Compact"/>
             </w:pPr>
             <w:r>
-              <w:t xml:space="preserve">Screen resolution</w:t>
+              <w:t xml:space="preserve">Kernel stack of an app task</w:t>
             </w:r>
           </w:p>
         </w:tc>
@@ -41464,52 +44072,7 @@
               <w:pStyle w:val="Compact"/>
             </w:pPr>
             <w:r>
-              <w:t xml:space="preserve">1024×768 by default (</w:t>
-            </w:r>
-            <w:r>
-              <w:rPr>
-                <w:rStyle w:val="VerbatimChar"/>
-              </w:rPr>
-              <w:t xml:space="preserve">cmdline.txt</w:t>
-            </w:r>
-            <w:r>
-              <w:t xml:space="preserve"> </w:t>
-            </w:r>
-            <w:r>
-              <w:rPr>
-                <w:rStyle w:val="VerbatimChar"/>
-              </w:rPr>
-              <w:t xml:space="preserve">width=</w:t>
-            </w:r>
-            <w:r>
-              <w:t xml:space="preserve"> </w:t>
-            </w:r>
-            <w:r>
-              <w:t xml:space="preserve">/</w:t>
-            </w:r>
-            <w:r>
-              <w:t xml:space="preserve"> </w:t>
-            </w:r>
-            <w:r>
-              <w:rPr>
-                <w:rStyle w:val="VerbatimChar"/>
-              </w:rPr>
-              <w:t xml:space="preserve">height=</w:t>
-            </w:r>
-            <w:r>
-              <w:t xml:space="preserve">; changed while running:</w:t>
-            </w:r>
-            <w:r>
-              <w:t xml:space="preserve"> </w:t>
-            </w:r>
-            <w:r>
-              <w:rPr>
-                <w:rStyle w:val="VerbatimChar"/>
-              </w:rPr>
-              <w:t xml:space="preserve">screen_set</w:t>
-            </w:r>
-            <w:r>
-              <w:t xml:space="preserve">, v66)</w:t>
+              <w:t xml:space="preserve">256 KB</w:t>
             </w:r>
           </w:p>
         </w:tc>
@@ -41520,7 +44083,7 @@
               <w:pStyle w:val="Compact"/>
             </w:pPr>
             <w:r>
-              <w:t xml:space="preserve">window.h / cmdline.txt</w:t>
+              <w:t xml:space="preserve">kernel.cpp</w:t>
             </w:r>
           </w:p>
         </w:tc>
@@ -41533,10 +44096,7 @@
               <w:pStyle w:val="Compact"/>
             </w:pPr>
             <w:r>
-              <w:rPr>
-                <w:rStyle w:val="VerbatimChar"/>
-              </w:rPr>
-              <w:t xml:space="preserve">GIMAGE_TRANSPARENT</w:t>
+              <w:t xml:space="preserve">Screen resolution</w:t>
             </w:r>
           </w:p>
         </w:tc>
@@ -41547,10 +44107,52 @@
               <w:pStyle w:val="Compact"/>
             </w:pPr>
             <w:r>
-              <w:rPr>
-                <w:rStyle w:val="VerbatimChar"/>
-              </w:rPr>
-              <w:t xml:space="preserve">0xFF00FF</w:t>
+              <w:t xml:space="preserve">1024×768 by default (</w:t>
+            </w:r>
+            <w:r>
+              <w:rPr>
+                <w:rStyle w:val="VerbatimChar"/>
+              </w:rPr>
+              <w:t xml:space="preserve">cmdline.txt</w:t>
+            </w:r>
+            <w:r>
+              <w:t xml:space="preserve"> </w:t>
+            </w:r>
+            <w:r>
+              <w:rPr>
+                <w:rStyle w:val="VerbatimChar"/>
+              </w:rPr>
+              <w:t xml:space="preserve">width=</w:t>
+            </w:r>
+            <w:r>
+              <w:t xml:space="preserve"> </w:t>
+            </w:r>
+            <w:r>
+              <w:t xml:space="preserve">/</w:t>
+            </w:r>
+            <w:r>
+              <w:t xml:space="preserve"> </w:t>
+            </w:r>
+            <w:r>
+              <w:rPr>
+                <w:rStyle w:val="VerbatimChar"/>
+              </w:rPr>
+              <w:t xml:space="preserve">height=</w:t>
+            </w:r>
+            <w:r>
+              <w:t xml:space="preserve">; changed while running:</w:t>
+            </w:r>
+            <w:r>
+              <w:t xml:space="preserve"> </w:t>
+            </w:r>
+            <w:r>
+              <w:rPr>
+                <w:rStyle w:val="VerbatimChar"/>
+              </w:rPr>
+              <w:t xml:space="preserve">screen_set</w:t>
+            </w:r>
+            <w:r>
+              <w:t xml:space="preserve">, v66)</w:t>
             </w:r>
           </w:p>
         </w:tc>
@@ -41561,13 +44163,54 @@
               <w:pStyle w:val="Compact"/>
             </w:pPr>
             <w:r>
+              <w:t xml:space="preserve">window.h / cmdline.txt</w:t>
+            </w:r>
+          </w:p>
+        </w:tc>
+      </w:tr>
+      <w:tr>
+        <w:tc>
+          <w:tcPr/>
+          <w:p>
+            <w:pPr>
+              <w:pStyle w:val="Compact"/>
+            </w:pPr>
+            <w:r>
+              <w:rPr>
+                <w:rStyle w:val="VerbatimChar"/>
+              </w:rPr>
+              <w:t xml:space="preserve">GIMAGE_TRANSPARENT</w:t>
+            </w:r>
+          </w:p>
+        </w:tc>
+        <w:tc>
+          <w:tcPr/>
+          <w:p>
+            <w:pPr>
+              <w:pStyle w:val="Compact"/>
+            </w:pPr>
+            <w:r>
+              <w:rPr>
+                <w:rStyle w:val="VerbatimChar"/>
+              </w:rPr>
+              <w:t xml:space="preserve">0xFF00FF</w:t>
+            </w:r>
+          </w:p>
+        </w:tc>
+        <w:tc>
+          <w:tcPr/>
+          <w:p>
+            <w:pPr>
+              <w:pStyle w:val="Compact"/>
+            </w:pPr>
+            <w:r>
               <w:t xml:space="preserve">gimage.h</w:t>
             </w:r>
           </w:p>
         </w:tc>
       </w:tr>
     </w:tbl>
-    <w:bookmarkEnd w:id="105"/>
+    <w:bookmarkEnd w:id="110"/>
     <w:sectPr>
       <w:footerReference r:id="rId9" w:type="default"/>
       <w:footnotePr>

</xml_diff>

<commit_message>
Jet: accented letters, capitals and the euro typed in fields and the address bar; no skins folder any more
The keys Onyx delivers are characters (layout applied, Latin-1, 0x80 the
euro): onyx_key_to_ucs4 maps them, as fbtk's keymaps dropped all but
unshifted ASCII (and '-', '=', '0' went to the zoom). The address field
holds Latin-1 and opens / copies UTF-8. Windows: WM_CHAR mapped the same.
The mouse cursor is built into the kernel; sdcard/skins and the Jet dist's
skins removed (unused), wk_button_skin dropped, render.py draws a flat
frame without them. Tests: jstest js-accents, uatest accented search.

Co-Authored-By: Claude Opus 5.5 <noreply@anthropic.com>
Claude-Session: https://claude.ai/code/session_01UcY36na7Mp1DEYttKiw1pa
</commit_message>
<xml_diff>
--- a/docs/exports/02-KERNEL-INTERNALS.docx
+++ b/docs/exports/02-KERNEL-INTERNALS.docx
@@ -705,7 +705,7 @@
               <w:pStyle w:val="Compact"/>
             </w:pPr>
             <w:r>
-              <w:t xml:space="preserve">GUI: rendering, compositor, widgets, skins, dialogs (</w:t>
+              <w:t xml:space="preserve">GUI: rendering, compositor, widgets, dialogs (</w:t>
             </w:r>
             <w:r>
               <w:rPr>
@@ -1674,16 +1674,19 @@
         <w:t xml:space="preserve"> </w:t>
       </w:r>
       <w:r>
-        <w:t xml:space="preserve">in §8). Loading the skins from</w:t>
-      </w:r>
-      <w:r>
-        <w:t xml:space="preserve"> </w:t>
-      </w:r>
-      <w:r>
-        <w:rPr>
-          <w:rStyle w:val="VerbatimChar"/>
-        </w:rPr>
-        <w:t xml:space="preserve">SD:skins/</w:t>
+        <w:t xml:space="preserve">in §8). The theme from</w:t>
+      </w:r>
+      <w:r>
+        <w:t xml:space="preserve"> </w:t>
+      </w:r>
+      <w:r>
+        <w:rPr>
+          <w:rStyle w:val="VerbatimChar"/>
+        </w:rPr>
+        <w:t xml:space="preserve">SD:/etc/theme.txt</w:t>
+      </w:r>
+      <w:r>
+        <w:t xml:space="preserve">; the mouse cursor is built in</w:t>
       </w:r>
       <w:r>
         <w:t xml:space="preserve"> </w:t>
@@ -1695,34 +1698,40 @@
         <w:rPr>
           <w:rStyle w:val="VerbatimChar"/>
         </w:rPr>
-        <w:t xml:space="preserve">wings.bmp</w:t>
-      </w:r>
-      <w:r>
-        <w:t xml:space="preserve">, the cursor</w:t>
-      </w:r>
-      <w:r>
-        <w:t xml:space="preserve"> </w:t>
-      </w:r>
-      <w:r>
-        <w:rPr>
-          <w:rStyle w:val="VerbatimChar"/>
-        </w:rPr>
-        <w:t xml:space="preserve">mousecur.bin</w:t>
-      </w:r>
-      <w:r>
-        <w:t xml:space="preserve">,</w:t>
-      </w:r>
-      <w:r>
-        <w:t xml:space="preserve"> </w:t>
-      </w:r>
-      <w:r>
-        <w:rPr>
-          <w:rStyle w:val="VerbatimChar"/>
-        </w:rPr>
-        <w:t xml:space="preserve">theme.txt</w:t>
-      </w:r>
-      <w:r>
-        <w:t xml:space="preserve">).</w:t>
+        <w:t xml:space="preserve">BuiltinCursor</w:t>
+      </w:r>
+      <w:r>
+        <w:t xml:space="preserve">, the 12×19 arrow that was</w:t>
+      </w:r>
+      <w:r>
+        <w:t xml:space="preserve"> </w:t>
+      </w:r>
+      <w:r>
+        <w:rPr>
+          <w:rStyle w:val="VerbatimChar"/>
+        </w:rPr>
+        <w:t xml:space="preserve">SD:skins/mousecur.bin</w:t>
+      </w:r>
+      <w:r>
+        <w:t xml:space="preserve"> </w:t>
+      </w:r>
+      <w:r>
+        <w:t xml:space="preserve">— the card has no</w:t>
+      </w:r>
+      <w:r>
+        <w:t xml:space="preserve"> </w:t>
+      </w:r>
+      <w:r>
+        <w:rPr>
+          <w:rStyle w:val="VerbatimChar"/>
+        </w:rPr>
+        <w:t xml:space="preserve">skins/</w:t>
+      </w:r>
+      <w:r>
+        <w:t xml:space="preserve"> </w:t>
+      </w:r>
+      <w:r>
+        <w:t xml:space="preserve">folder any more: the window chrome is drawn user-side).</w:t>
       </w:r>
     </w:p>
     <w:p>

</xml_diff>

<commit_message>
The shared clipboard: clipd (a service: the last 10 copies of any format, a cursor, a notification at each copy), clipboard.h over IPC (its functions kept; images, several formats), the widget at the bottom right above the dock (the dock's button); every app rebuilt and staged; tested on the PC (run_clipboard_test.sh: the simulator gets in-process mailboxes); docs 02 / 03 / 04, README, HANDOFF
Co-Authored-By: Claude Opus 5.5 <noreply@anthropic.com>
Claude-Session: https://claude.ai/code/session_012k6pqyonBBqCtDQrtttmUW
</commit_message>
<xml_diff>
--- a/docs/exports/02-KERNEL-INTERNALS.docx
+++ b/docs/exports/02-KERNEL-INTERNALS.docx
@@ -19591,7 +19591,71 @@
               <w:t xml:space="preserve">\n</w:t>
             </w:r>
             <w:r>
-              <w:t xml:space="preserve">-separated); the serial bumps on every set.</w:t>
+              <w:t xml:space="preserve">-separated); the serial bumps on every set. Since the shared clipboard (2026-10-01: the service</w:t>
+            </w:r>
+            <w:r>
+              <w:t xml:space="preserve"> </w:t>
+            </w:r>
+            <w:r>
+              <w:rPr>
+                <w:rStyle w:val="VerbatimChar"/>
+              </w:rPr>
+              <w:t xml:space="preserve">clipd</w:t>
+            </w:r>
+            <w:r>
+              <w:t xml:space="preserve">,</w:t>
+            </w:r>
+            <w:r>
+              <w:t xml:space="preserve"> </w:t>
+            </w:r>
+            <w:r>
+              <w:rPr>
+                <w:rStyle w:val="VerbatimChar"/>
+              </w:rPr>
+              <w:t xml:space="preserve">user/clipboard.h</w:t>
+            </w:r>
+            <w:r>
+              <w:t xml:space="preserve">,</w:t>
+            </w:r>
+            <w:r>
+              <w:t xml:space="preserve"> </w:t>
+            </w:r>
+            <w:r>
+              <w:rPr>
+                <w:rStyle w:val="VerbatimChar"/>
+              </w:rPr>
+              <w:t xml:space="preserve">docs/clipboard/README.md</w:t>
+            </w:r>
+            <w:r>
+              <w:t xml:space="preserve">) it is only a</w:t>
+            </w:r>
+            <w:r>
+              <w:t xml:space="preserve"> </w:t>
+            </w:r>
+            <w:r>
+              <w:rPr>
+                <w:b/>
+                <w:bCs/>
+              </w:rPr>
+              <w:t xml:space="preserve">fallback</w:t>
+            </w:r>
+            <w:r>
+              <w:t xml:space="preserve">:</w:t>
+            </w:r>
+            <w:r>
+              <w:t xml:space="preserve"> </w:t>
+            </w:r>
+            <w:r>
+              <w:rPr>
+                <w:rStyle w:val="VerbatimChar"/>
+              </w:rPr>
+              <w:t xml:space="preserve">clipboard.h</w:t>
+            </w:r>
+            <w:r>
+              <w:t xml:space="preserve"> </w:t>
+            </w:r>
+            <w:r>
+              <w:t xml:space="preserve">writes the kernel's copy too, and reads it when clipd cannot be reached; the history (10 items, any format) is clipd's, in its own memory.</w:t>
             </w:r>
           </w:p>
         </w:tc>

</xml_diff>

<commit_message>
Web on the Pi (roadmap step 1): kotonstudio.com over HTTPS, new windows, scrolling, typing; the heap corruption in Skia's glyph painting found and cured (skmallocsize.c; heapcheck.c the tool), patch 0015 (the IPC monitor thread reads on the connection's queue; a kmsg line per request), the address field emptied on a click, the title made plain; el0: a killed program's backtrace in kmsg; ftpd: uploads written as they arrive (no 32 MB limit); docs 08 'Step 3', 04, 02, 03, HANDOFF; packages published
Co-Authored-By: Claude Opus 5.5 <noreply@anthropic.com>
</commit_message>
<xml_diff>
--- a/docs/exports/02-KERNEL-INTERNALS.docx
+++ b/docs/exports/02-KERNEL-INTERNALS.docx
@@ -14752,7 +14752,67 @@
         <w:t xml:space="preserve">el0: &lt;name&gt; (pid N) killed: …</w:t>
       </w:r>
       <w:r>
-        <w:t xml:space="preserve">, a desktop notice (</w:t>
+        <w:t xml:space="preserve">, then (2026-10-03)</w:t>
+      </w:r>
+      <w:r>
+        <w:t xml:space="preserve"> </w:t>
+      </w:r>
+      <w:r>
+        <w:rPr>
+          <w:rStyle w:val="VerbatimChar"/>
+        </w:rPr>
+        <w:t xml:space="preserve">el0: &lt;name&gt; backtrace: &lt;lr&gt; &lt;lr&gt; …</w:t>
+      </w:r>
+      <w:r>
+        <w:t xml:space="preserve"> </w:t>
+      </w:r>
+      <w:r>
+        <w:t xml:space="preserve">— up to 16</w:t>
+      </w:r>
+      <w:r>
+        <w:t xml:space="preserve"> </w:t>
+      </w:r>
+      <w:r>
+        <w:t xml:space="preserve">return addresses read along the frame-pointer chain (x29 → {next x29, lr},</w:t>
+      </w:r>
+      <w:r>
+        <w:t xml:space="preserve"> </w:t>
+      </w:r>
+      <w:r>
+        <w:rPr>
+          <w:rStyle w:val="VerbatimChar"/>
+        </w:rPr>
+        <w:t xml:space="preserve">UAccessCopy</w:t>
+      </w:r>
+      <w:r>
+        <w:t xml:space="preserve">, the chain</w:t>
+      </w:r>
+      <w:r>
+        <w:t xml:space="preserve"> </w:t>
+      </w:r>
+      <w:r>
+        <w:t xml:space="preserve">must climb), the callers to give to</w:t>
+      </w:r>
+      <w:r>
+        <w:t xml:space="preserve"> </w:t>
+      </w:r>
+      <w:r>
+        <w:rPr>
+          <w:rStyle w:val="VerbatimChar"/>
+        </w:rPr>
+        <w:t xml:space="preserve">addr2line</w:t>
+      </w:r>
+      <w:r>
+        <w:t xml:space="preserve"> </w:t>
+      </w:r>
+      <w:r>
+        <w:t xml:space="preserve">(a program built with frame pointers: the POSIX</w:t>
+      </w:r>
+      <w:r>
+        <w:t xml:space="preserve"> </w:t>
+      </w:r>
+      <w:r>
+        <w:t xml:space="preserve">ports and WebKit are) —, a desktop notice (</w:t>
       </w:r>
       <w:r>
         <w:rPr>
@@ -14773,13 +14833,7 @@
         <w:t xml:space="preserve">kapi_exit(-11)</w:t>
       </w:r>
       <w:r>
-        <w:t xml:space="preserve">. SError still</w:t>
-      </w:r>
-      <w:r>
-        <w:t xml:space="preserve"> </w:t>
-      </w:r>
-      <w:r>
-        <w:t xml:space="preserve">goes to</w:t>
+        <w:t xml:space="preserve">. SError still goes to</w:t>
       </w:r>
       <w:r>
         <w:t xml:space="preserve"> </w:t>

</xml_diff>

<commit_message>
Web 1.0.2: drop-down lists, the system clipboard, find in the page (^F), the right button's menu (Save Link / Image / Page As), downloads into SD:/Downloads with the Downloads window (its own process: progress, Cancel) and the status bar; WebKit patch 0016 (the popup proxy, the clipboard callbacks, WKPageDownloadURLOnyx, curl's download progress); Mail draws its HTML messages with Web as an applet (web --applet, webview.cpp; wtk applets for other hosts); kapi v78: PROT_EXEC for anonymous memory (a JIT's), memtest / posixtest exec checks; libonyxposix: a pipe given as a child's stdin / stdout keeps working once the parent closed its end; docs 02, 03, 04, 08, HANDOFF, exports
Co-Authored-By: Claude Opus 5.5 <noreply@anthropic.com>
</commit_message>
<xml_diff>
--- a/docs/exports/02-KERNEL-INTERNALS.docx
+++ b/docs/exports/02-KERNEL-INTERNALS.docx
@@ -14041,7 +14041,22 @@
         <w:t xml:space="preserve">code_alloc</w:t>
       </w:r>
       <w:r>
-        <w:t xml:space="preserve">)</w:t>
+        <w:t xml:space="preserve">, and v78</w:t>
+      </w:r>
+      <w:r>
+        <w:t xml:space="preserve"> </w:t>
+      </w:r>
+      <w:r>
+        <w:rPr>
+          <w:rStyle w:val="VerbatimChar"/>
+        </w:rPr>
+        <w:t xml:space="preserve">PROT_EXEC</w:t>
+      </w:r>
+      <w:r>
+        <w:t xml:space="preserve"> </w:t>
+      </w:r>
+      <w:r>
+        <w:t xml:space="preserve">regions)</w:t>
       </w:r>
       <w:r>
         <w:t xml:space="preserve"> </w:t>
@@ -14053,7 +14068,13 @@
         <w:t xml:space="preserve">UXN = 0, PXN = 1</w:t>
       </w:r>
       <w:r>
-        <w:t xml:space="preserve">, everything else</w:t>
+        <w:t xml:space="preserve">, everything</w:t>
+      </w:r>
+      <w:r>
+        <w:t xml:space="preserve"> </w:t>
+      </w:r>
+      <w:r>
+        <w:t xml:space="preserve">else</w:t>
       </w:r>
       <w:r>
         <w:t xml:space="preserve"> </w:t>
@@ -21709,7 +21730,7 @@
     </w:p>
     <w:bookmarkEnd w:id="74"/>
     <w:bookmarkEnd w:id="75"/>
-    <w:bookmarkStart w:id="88" w:name="X277d88280f3f4acecd0386230c1d60a44106d3c"/>
+    <w:bookmarkStart w:id="89" w:name="X277d88280f3f4acecd0386230c1d60a44106d3c"/>
     <w:p>
       <w:pPr>
         <w:pStyle w:val="Heading2"/>
@@ -25233,6 +25254,86 @@
           <w:iCs/>
         </w:rPr>
         <w:t xml:space="preserve">v77: program images</w:t>
+      </w:r>
+      <w:r>
+        <w:t xml:space="preserve"> </w:t>
+      </w:r>
+      <w:r>
+        <w:t xml:space="preserve">below),</w:t>
+      </w:r>
+      <w:r>
+        <w:t xml:space="preserve"> </w:t>
+      </w:r>
+      <w:r>
+        <w:t xml:space="preserve">v78 =</w:t>
+      </w:r>
+      <w:r>
+        <w:t xml:space="preserve"> </w:t>
+      </w:r>
+      <w:r>
+        <w:rPr>
+          <w:b/>
+          <w:bCs/>
+        </w:rPr>
+        <w:t xml:space="preserve">executable memory for a JIT</w:t>
+      </w:r>
+      <w:r>
+        <w:t xml:space="preserve"> </w:t>
+      </w:r>
+      <w:r>
+        <w:t xml:space="preserve">(WebKit roadmap step 3, docs/08):</w:t>
+      </w:r>
+      <w:r>
+        <w:t xml:space="preserve"> </w:t>
+      </w:r>
+      <w:r>
+        <w:rPr>
+          <w:rStyle w:val="VerbatimChar"/>
+        </w:rPr>
+        <w:t xml:space="preserve">vm_map</w:t>
+      </w:r>
+      <w:r>
+        <w:t xml:space="preserve"> </w:t>
+      </w:r>
+      <w:r>
+        <w:t xml:space="preserve">and</w:t>
+      </w:r>
+      <w:r>
+        <w:t xml:space="preserve"> </w:t>
+      </w:r>
+      <w:r>
+        <w:rPr>
+          <w:rStyle w:val="VerbatimChar"/>
+        </w:rPr>
+        <w:t xml:space="preserve">vm_protect</w:t>
+      </w:r>
+      <w:r>
+        <w:t xml:space="preserve"> </w:t>
+      </w:r>
+      <w:r>
+        <w:t xml:space="preserve">accept</w:t>
+      </w:r>
+      <w:r>
+        <w:t xml:space="preserve"> </w:t>
+      </w:r>
+      <w:r>
+        <w:rPr>
+          <w:rStyle w:val="VerbatimChar"/>
+        </w:rPr>
+        <w:t xml:space="preserve">KAPI_PROT_EXEC</w:t>
+      </w:r>
+      <w:r>
+        <w:t xml:space="preserve"> </w:t>
+      </w:r>
+      <w:r>
+        <w:t xml:space="preserve">for anonymous regions; no new entry (</w:t>
+      </w:r>
+      <w:r>
+        <w:rPr>
+          <w:i/>
+          <w:iCs/>
+        </w:rPr>
+        <w:t xml:space="preserve">v78: PROT_EXEC</w:t>
       </w:r>
       <w:r>
         <w:t xml:space="preserve"> </w:t>
@@ -37491,10 +37592,10 @@
               <w:t xml:space="preserve">KAPI_PROT_NONE/READ/WRITE</w:t>
             </w:r>
             <w:r>
-              <w:t xml:space="preserve"> </w:t>
-            </w:r>
-            <w:r>
-              <w:t xml:space="preserve">(</w:t>
+              <w:t xml:space="preserve">, v78</w:t>
+            </w:r>
+            <w:r>
+              <w:t xml:space="preserve"> </w:t>
             </w:r>
             <w:r>
               <w:rPr>
@@ -37503,7 +37604,10 @@
               <w:t xml:space="preserve">EXEC</w:t>
             </w:r>
             <w:r>
-              <w:t xml:space="preserve">:</w:t>
+              <w:t xml:space="preserve"> </w:t>
+            </w:r>
+            <w:r>
+              <w:t xml:space="preserve">(executable at EL0: a JIT; before v78:</w:t>
             </w:r>
             <w:r>
               <w:t xml:space="preserve"> </w:t>
@@ -37730,6 +37834,21 @@
             </w:r>
             <w:r>
               <w:t xml:space="preserve">(</w:t>
+            </w:r>
+            <w:r>
+              <w:rPr>
+                <w:rStyle w:val="VerbatimChar"/>
+              </w:rPr>
+              <w:t xml:space="preserve">EXEC</w:t>
+            </w:r>
+            <w:r>
+              <w:t xml:space="preserve"> </w:t>
+            </w:r>
+            <w:r>
+              <w:t xml:space="preserve">over an SHM region; before v78: any</w:t>
+            </w:r>
+            <w:r>
+              <w:t xml:space="preserve"> </w:t>
             </w:r>
             <w:r>
               <w:rPr>
@@ -48746,104 +48865,14 @@
         <w:t xml:space="preserve">(§7).</w:t>
       </w:r>
     </w:p>
+    <w:bookmarkEnd w:id="87"/>
+    <w:bookmarkStart w:id="88" w:name="v78-prot_exec"/>
     <w:p>
       <w:pPr>
-        <w:pStyle w:val="BlockText"/>
+        <w:pStyle w:val="Heading3"/>
       </w:pPr>
       <w:r>
-        <w:rPr>
-          <w:b/>
-          <w:bCs/>
-        </w:rPr>
-        <w:t xml:space="preserve">Historical note.</w:t>
-      </w:r>
-      <w:r>
-        <w:t xml:space="preserve"> </w:t>
-      </w:r>
-      <w:r>
-        <w:rPr>
-          <w:rStyle w:val="VerbatimChar"/>
-        </w:rPr>
-        <w:t xml:space="preserve">ARCHITECTURE.md</w:t>
-      </w:r>
-      <w:r>
-        <w:t xml:space="preserve"> </w:t>
-      </w:r>
-      <w:r>
-        <w:t xml:space="preserve">§11 describes an earlier approach where the build</w:t>
-      </w:r>
-      <w:r>
-        <w:t xml:space="preserve"> </w:t>
-      </w:r>
-      <w:r>
-        <w:t xml:space="preserve">emitted a</w:t>
-      </w:r>
-      <w:r>
-        <w:t xml:space="preserve"> </w:t>
-      </w:r>
-      <w:r>
-        <w:rPr>
-          <w:rStyle w:val="VerbatimChar"/>
-        </w:rPr>
-        <w:t xml:space="preserve">user/kernel_syms.ld</w:t>
-      </w:r>
-      <w:r>
-        <w:t xml:space="preserve"> </w:t>
-      </w:r>
-      <w:r>
-        <w:t xml:space="preserve">(</w:t>
-      </w:r>
-      <w:r>
-        <w:rPr>
-          <w:rStyle w:val="VerbatimChar"/>
-        </w:rPr>
-        <w:t xml:space="preserve">kapi_x = 0xADDR;</w:t>
-      </w:r>
-      <w:r>
-        <w:t xml:space="preserve">) and the apps were linked against</w:t>
-      </w:r>
-      <w:r>
-        <w:t xml:space="preserve"> </w:t>
-      </w:r>
-      <w:r>
-        <w:t xml:space="preserve">those addresses. This approach is</w:t>
-      </w:r>
-      <w:r>
-        <w:t xml:space="preserve"> </w:t>
-      </w:r>
-      <w:r>
-        <w:rPr>
-          <w:b/>
-          <w:bCs/>
-        </w:rPr>
-        <w:t xml:space="preserve">no longer used</w:t>
-      </w:r>
-      <w:r>
-        <w:t xml:space="preserve">: the fixed-address table replaced</w:t>
-      </w:r>
-      <w:r>
-        <w:t xml:space="preserve"> </w:t>
-      </w:r>
-      <w:r>
-        <w:t xml:space="preserve">it. The apps no longer depend on the kernel build.</w:t>
-      </w:r>
-    </w:p>
-    <w:p>
-      <w:r>
-        <w:pict>
-          <v:rect style="width:0;height:1.5pt" o:hralign="center" o:hrstd="t" o:hr="t"/>
-        </w:pict>
-      </w:r>
-    </w:p>
-    <w:bookmarkEnd w:id="87"/>
-    <w:bookmarkEnd w:id="88"/>
-    <w:bookmarkStart w:id="95" w:name="X0388453af32aee5299c424f16ffba6153d0b61c"/>
-    <w:p>
-      <w:pPr>
-        <w:pStyle w:val="Heading2"/>
-      </w:pPr>
-      <w:r>
-        <w:t xml:space="preserve">9. Stream / stdio subsystem</w:t>
+        <w:t xml:space="preserve">v78: PROT_EXEC</w:t>
       </w:r>
     </w:p>
     <w:p>
@@ -48851,12 +48880,647 @@
         <w:pStyle w:val="FirstParagraph"/>
       </w:pPr>
       <w:r>
+        <w:t xml:space="preserve">A JIT's memory, as on Unix:</w:t>
+      </w:r>
+      <w:r>
+        <w:t xml:space="preserve"> </w:t>
+      </w:r>
+      <w:r>
+        <w:rPr>
+          <w:rStyle w:val="VerbatimChar"/>
+        </w:rPr>
+        <w:t xml:space="preserve">vm_map (addr, len, READ | WRITE | EXEC, flags)</w:t>
+      </w:r>
+      <w:r>
+        <w:t xml:space="preserve"> </w:t>
+      </w:r>
+      <w:r>
+        <w:t xml:space="preserve">gives a</w:t>
+      </w:r>
+      <w:r>
+        <w:t xml:space="preserve"> </w:t>
+      </w:r>
+      <w:r>
+        <w:rPr>
+          <w:b/>
+          <w:bCs/>
+        </w:rPr>
+        <w:t xml:space="preserve">lazy</w:t>
+      </w:r>
+      <w:r>
+        <w:t xml:space="preserve"> </w:t>
+      </w:r>
+      <w:r>
+        <w:t xml:space="preserve">anonymous region whose pages are mapped</w:t>
+      </w:r>
+      <w:r>
+        <w:t xml:space="preserve"> </w:t>
+      </w:r>
+      <w:r>
+        <w:rPr>
+          <w:rStyle w:val="VerbatimChar"/>
+        </w:rPr>
+        <w:t xml:space="preserve">UXN = 0</w:t>
+      </w:r>
+      <w:r>
+        <w:t xml:space="preserve"> </w:t>
+      </w:r>
+      <w:r>
+        <w:t xml:space="preserve">(executable at EL0;</w:t>
+      </w:r>
+      <w:r>
+        <w:t xml:space="preserve"> </w:t>
+      </w:r>
+      <w:r>
+        <w:rPr>
+          <w:rStyle w:val="VerbatimChar"/>
+        </w:rPr>
+        <w:t xml:space="preserve">PXN</w:t>
+      </w:r>
+      <w:r>
+        <w:t xml:space="preserve"> </w:t>
+      </w:r>
+      <w:r>
+        <w:t xml:space="preserve">stays 1: the kernel</w:t>
+      </w:r>
+      <w:r>
+        <w:t xml:space="preserve"> </w:t>
+      </w:r>
+      <w:r>
+        <w:t xml:space="preserve">never runs an app's code), and</w:t>
+      </w:r>
+      <w:r>
+        <w:t xml:space="preserve"> </w:t>
+      </w:r>
+      <w:r>
+        <w:rPr>
+          <w:rStyle w:val="VerbatimChar"/>
+        </w:rPr>
+        <w:t xml:space="preserve">vm_protect</w:t>
+      </w:r>
+      <w:r>
+        <w:t xml:space="preserve"> </w:t>
+      </w:r>
+      <w:r>
+        <w:t xml:space="preserve">sets or takes away</w:t>
+      </w:r>
+      <w:r>
+        <w:t xml:space="preserve"> </w:t>
+      </w:r>
+      <w:r>
+        <w:rPr>
+          <w:rStyle w:val="VerbatimChar"/>
+        </w:rPr>
+        <w:t xml:space="preserve">EXEC</w:t>
+      </w:r>
+      <w:r>
+        <w:t xml:space="preserve"> </w:t>
+      </w:r>
+      <w:r>
+        <w:t xml:space="preserve">on anonymous regions — so a</w:t>
+      </w:r>
+      <w:r>
+        <w:t xml:space="preserve"> </w:t>
+      </w:r>
+      <w:r>
+        <w:t xml:space="preserve">JIT may keep its code</w:t>
+      </w:r>
+      <w:r>
+        <w:t xml:space="preserve"> </w:t>
+      </w:r>
+      <w:r>
+        <w:rPr>
+          <w:rStyle w:val="VerbatimChar"/>
+        </w:rPr>
+        <w:t xml:space="preserve">RWX</w:t>
+      </w:r>
+      <w:r>
+        <w:t xml:space="preserve"> </w:t>
+      </w:r>
+      <w:r>
+        <w:t xml:space="preserve">(JavaScriptCore's default on Linux) or switch</w:t>
+      </w:r>
+      <w:r>
+        <w:t xml:space="preserve"> </w:t>
+      </w:r>
+      <w:r>
+        <w:rPr>
+          <w:rStyle w:val="VerbatimChar"/>
+        </w:rPr>
+        <w:t xml:space="preserve">RW</w:t>
+      </w:r>
+      <w:r>
+        <w:t xml:space="preserve"> </w:t>
+      </w:r>
+      <w:r>
+        <w:t xml:space="preserve">/</w:t>
+      </w:r>
+      <w:r>
+        <w:t xml:space="preserve"> </w:t>
+      </w:r>
+      <w:r>
+        <w:rPr>
+          <w:rStyle w:val="VerbatimChar"/>
+        </w:rPr>
+        <w:t xml:space="preserve">RX</w:t>
+      </w:r>
+      <w:r>
+        <w:t xml:space="preserve"> </w:t>
+      </w:r>
+      <w:r>
+        <w:t xml:space="preserve">(W^X). A</w:t>
+      </w:r>
+      <w:r>
+        <w:t xml:space="preserve"> </w:t>
+      </w:r>
+      <w:r>
+        <w:t xml:space="preserve">shared object's pages never run:</w:t>
+      </w:r>
+      <w:r>
+        <w:t xml:space="preserve"> </w:t>
+      </w:r>
+      <w:r>
+        <w:rPr>
+          <w:rStyle w:val="VerbatimChar"/>
+        </w:rPr>
+        <w:t xml:space="preserve">shm_map</w:t>
+      </w:r>
+      <w:r>
+        <w:t xml:space="preserve"> </w:t>
+      </w:r>
+      <w:r>
+        <w:t xml:space="preserve">with</w:t>
+      </w:r>
+      <w:r>
+        <w:t xml:space="preserve"> </w:t>
+      </w:r>
+      <w:r>
+        <w:rPr>
+          <w:rStyle w:val="VerbatimChar"/>
+        </w:rPr>
+        <w:t xml:space="preserve">EXEC</w:t>
+      </w:r>
+      <w:r>
+        <w:t xml:space="preserve">, or</w:t>
+      </w:r>
+      <w:r>
+        <w:t xml:space="preserve"> </w:t>
+      </w:r>
+      <w:r>
+        <w:rPr>
+          <w:rStyle w:val="VerbatimChar"/>
+        </w:rPr>
+        <w:t xml:space="preserve">vm_protect</w:t>
+      </w:r>
+      <w:r>
+        <w:t xml:space="preserve"> </w:t>
+      </w:r>
+      <w:r>
+        <w:t xml:space="preserve">adding it over an SHM</w:t>
+      </w:r>
+      <w:r>
+        <w:t xml:space="preserve"> </w:t>
+      </w:r>
+      <w:r>
+        <w:t xml:space="preserve">region →</w:t>
+      </w:r>
+      <w:r>
+        <w:t xml:space="preserve"> </w:t>
+      </w:r>
+      <w:r>
+        <w:rPr>
+          <w:rStyle w:val="VerbatimChar"/>
+        </w:rPr>
+        <w:t xml:space="preserve">-KAPI_ENOTSUP</w:t>
+      </w:r>
+      <w:r>
+        <w:t xml:space="preserve">.</w:t>
+      </w:r>
+      <w:r>
+        <w:t xml:space="preserve"> </w:t>
+      </w:r>
+      <w:r>
+        <w:rPr>
+          <w:rStyle w:val="VerbatimChar"/>
+        </w:rPr>
+        <w:t xml:space="preserve">kernel/sys/vm.cpp</w:t>
+      </w:r>
+      <w:r>
+        <w:t xml:space="preserve">: a region's protection becomes its PTE's AP</w:t>
+      </w:r>
+      <w:r>
+        <w:t xml:space="preserve"> </w:t>
+      </w:r>
+      <w:r>
+        <w:rPr>
+          <w:b/>
+          <w:bCs/>
+        </w:rPr>
+        <w:t xml:space="preserve">and</w:t>
+      </w:r>
+      <w:r>
+        <w:t xml:space="preserve"> </w:t>
+      </w:r>
+      <w:r>
+        <w:t xml:space="preserve">UXN bits (</w:t>
+      </w:r>
+      <w:r>
+        <w:rPr>
+          <w:rStyle w:val="VerbatimChar"/>
+        </w:rPr>
+        <w:t xml:space="preserve">PteProt</w:t>
+      </w:r>
+      <w:r>
+        <w:t xml:space="preserve">) wherever pages are filled, adopted, settled or reprotected. An instruction</w:t>
+      </w:r>
+      <w:r>
+        <w:t xml:space="preserve"> </w:t>
+      </w:r>
+      <w:r>
+        <w:t xml:space="preserve">abort in a region not filled yet is paged in where the region is executable (</w:t>
+      </w:r>
+      <w:r>
+        <w:rPr>
+          <w:rStyle w:val="VerbatimChar"/>
+        </w:rPr>
+        <w:t xml:space="preserve">el0.cpp</w:t>
+      </w:r>
+      <w:r>
+        <w:t xml:space="preserve"> </w:t>
+      </w:r>
+      <w:r>
+        <w:rPr>
+          <w:rStyle w:val="VerbatimChar"/>
+        </w:rPr>
+        <w:t xml:space="preserve">PageFault</w:t>
+      </w:r>
+      <w:r>
+        <w:t xml:space="preserve">,</w:t>
+      </w:r>
+      <w:r>
+        <w:t xml:space="preserve"> </w:t>
+      </w:r>
+      <w:r>
+        <w:rPr>
+          <w:rStyle w:val="VerbatimChar"/>
+        </w:rPr>
+        <w:t xml:space="preserve">VmProtAt</w:t>
+      </w:r>
+      <w:r>
+        <w:t xml:space="preserve">; an app core asks core 0 as for a data abort, the retried fetch then faults</w:t>
+      </w:r>
+      <w:r>
+        <w:t xml:space="preserve"> </w:t>
+      </w:r>
+      <w:r>
+        <w:t xml:space="preserve">if the region does not allow it). The program writes its code, then makes the caches coherent over</w:t>
+      </w:r>
+      <w:r>
+        <w:t xml:space="preserve"> </w:t>
+      </w:r>
+      <w:r>
+        <w:t xml:space="preserve">it from EL0 (</w:t>
+      </w:r>
+      <w:r>
+        <w:rPr>
+          <w:rStyle w:val="VerbatimChar"/>
+        </w:rPr>
+        <w:t xml:space="preserve">DC CVAU</w:t>
+      </w:r>
+      <w:r>
+        <w:t xml:space="preserve">,</w:t>
+      </w:r>
+      <w:r>
+        <w:t xml:space="preserve"> </w:t>
+      </w:r>
+      <w:r>
+        <w:rPr>
+          <w:rStyle w:val="VerbatimChar"/>
+        </w:rPr>
+        <w:t xml:space="preserve">DSB ISH</w:t>
+      </w:r>
+      <w:r>
+        <w:t xml:space="preserve">,</w:t>
+      </w:r>
+      <w:r>
+        <w:t xml:space="preserve"> </w:t>
+      </w:r>
+      <w:r>
+        <w:rPr>
+          <w:rStyle w:val="VerbatimChar"/>
+        </w:rPr>
+        <w:t xml:space="preserve">IC IVAU</w:t>
+      </w:r>
+      <w:r>
+        <w:t xml:space="preserve">,</w:t>
+      </w:r>
+      <w:r>
+        <w:t xml:space="preserve"> </w:t>
+      </w:r>
+      <w:r>
+        <w:rPr>
+          <w:rStyle w:val="VerbatimChar"/>
+        </w:rPr>
+        <w:t xml:space="preserve">DSB ISH</w:t>
+      </w:r>
+      <w:r>
+        <w:t xml:space="preserve">,</w:t>
+      </w:r>
+      <w:r>
+        <w:t xml:space="preserve"> </w:t>
+      </w:r>
+      <w:r>
+        <w:rPr>
+          <w:rStyle w:val="VerbatimChar"/>
+        </w:rPr>
+        <w:t xml:space="preserve">ISB</w:t>
+      </w:r>
+      <w:r>
+        <w:t xml:space="preserve">: SCTLR_EL1.UCI / UCT,</w:t>
+      </w:r>
+      <w:r>
+        <w:t xml:space="preserve"> </w:t>
+      </w:r>
+      <w:r>
+        <w:rPr>
+          <w:rStyle w:val="VerbatimChar"/>
+        </w:rPr>
+        <w:t xml:space="preserve">el0.cpp</w:t>
+      </w:r>
+      <w:r>
+        <w:t xml:space="preserve">;</w:t>
+      </w:r>
+      <w:r>
+        <w:t xml:space="preserve"> </w:t>
+      </w:r>
+      <w:r>
+        <w:t xml:space="preserve">libgcc's</w:t>
+      </w:r>
+      <w:r>
+        <w:t xml:space="preserve"> </w:t>
+      </w:r>
+      <w:r>
+        <w:rPr>
+          <w:rStyle w:val="VerbatimChar"/>
+        </w:rPr>
+        <w:t xml:space="preserve">__builtin___clear_cache</w:t>
+      </w:r>
+      <w:r>
+        <w:t xml:space="preserve"> </w:t>
+      </w:r>
+      <w:r>
+        <w:t xml:space="preserve">does it).</w:t>
+      </w:r>
+      <w:r>
+        <w:t xml:space="preserve"> </w:t>
+      </w:r>
+      <w:r>
+        <w:rPr>
+          <w:rStyle w:val="VerbatimChar"/>
+        </w:rPr>
+        <w:t xml:space="preserve">code_alloc</w:t>
+      </w:r>
+      <w:r>
+        <w:t xml:space="preserve"> </w:t>
+      </w:r>
+      <w:r>
+        <w:t xml:space="preserve">(v58: an eager region in the code arena)</w:t>
+      </w:r>
+      <w:r>
+        <w:t xml:space="preserve"> </w:t>
+      </w:r>
+      <w:r>
+        <w:t xml:space="preserve">stays for the GameCube emulator. Before v78</w:t>
+      </w:r>
+      <w:r>
+        <w:t xml:space="preserve"> </w:t>
+      </w:r>
+      <w:r>
+        <w:rPr>
+          <w:rStyle w:val="VerbatimChar"/>
+        </w:rPr>
+        <w:t xml:space="preserve">EXEC</w:t>
+      </w:r>
+      <w:r>
+        <w:t xml:space="preserve"> </w:t>
+      </w:r>
+      <w:r>
+        <w:t xml:space="preserve">was</w:t>
+      </w:r>
+      <w:r>
+        <w:t xml:space="preserve"> </w:t>
+      </w:r>
+      <w:r>
+        <w:rPr>
+          <w:rStyle w:val="VerbatimChar"/>
+        </w:rPr>
+        <w:t xml:space="preserve">-KAPI_ENOTSUP</w:t>
+      </w:r>
+      <w:r>
+        <w:t xml:space="preserve"> </w:t>
+      </w:r>
+      <w:r>
+        <w:t xml:space="preserve">everywhere; libonyxposix's</w:t>
+      </w:r>
+      <w:r>
+        <w:t xml:space="preserve"> </w:t>
+      </w:r>
+      <w:r>
+        <w:rPr>
+          <w:rStyle w:val="VerbatimChar"/>
+        </w:rPr>
+        <w:t xml:space="preserve">mmap</w:t>
+      </w:r>
+      <w:r>
+        <w:t xml:space="preserve"> </w:t>
+      </w:r>
+      <w:r>
+        <w:t xml:space="preserve">/</w:t>
+      </w:r>
+      <w:r>
+        <w:t xml:space="preserve"> </w:t>
+      </w:r>
+      <w:r>
+        <w:rPr>
+          <w:rStyle w:val="VerbatimChar"/>
+        </w:rPr>
+        <w:t xml:space="preserve">mprotect</w:t>
+      </w:r>
+      <w:r>
+        <w:t xml:space="preserve"> </w:t>
+      </w:r>
+      <w:r>
+        <w:t xml:space="preserve">pass the kernel's answer on. Tests:</w:t>
+      </w:r>
+      <w:r>
+        <w:t xml:space="preserve"> </w:t>
+      </w:r>
+      <w:r>
+        <w:rPr>
+          <w:rStyle w:val="VerbatimChar"/>
+        </w:rPr>
+        <w:t xml:space="preserve">memtest</w:t>
+      </w:r>
+      <w:r>
+        <w:t xml:space="preserve"> </w:t>
+      </w:r>
+      <w:r>
+        <w:t xml:space="preserve">(code written, run, made</w:t>
+      </w:r>
+      <w:r>
+        <w:t xml:space="preserve"> </w:t>
+      </w:r>
+      <w:r>
+        <w:rPr>
+          <w:rStyle w:val="VerbatimChar"/>
+        </w:rPr>
+        <w:t xml:space="preserve">RX</w:t>
+      </w:r>
+      <w:r>
+        <w:t xml:space="preserve">,</w:t>
+      </w:r>
+      <w:r>
+        <w:t xml:space="preserve"> </w:t>
+      </w:r>
+      <w:r>
+        <w:t xml:space="preserve">rewritten),</w:t>
+      </w:r>
+      <w:r>
+        <w:t xml:space="preserve"> </w:t>
+      </w:r>
+      <w:r>
+        <w:rPr>
+          <w:rStyle w:val="VerbatimChar"/>
+        </w:rPr>
+        <w:t xml:space="preserve">posixtest</w:t>
+      </w:r>
+      <w:r>
+        <w:t xml:space="preserve"> </w:t>
+      </w:r>
+      <w:r>
+        <w:t xml:space="preserve">(</w:t>
+      </w:r>
+      <w:r>
+        <w:rPr>
+          <w:rStyle w:val="VerbatimChar"/>
+        </w:rPr>
+        <w:t xml:space="preserve">mmap PROT_EXEC</w:t>
+      </w:r>
+      <w:r>
+        <w:t xml:space="preserve">).</w:t>
+      </w:r>
+    </w:p>
+    <w:p>
+      <w:pPr>
+        <w:pStyle w:val="BlockText"/>
+      </w:pPr>
+      <w:r>
+        <w:rPr>
+          <w:b/>
+          <w:bCs/>
+        </w:rPr>
+        <w:t xml:space="preserve">Historical note.</w:t>
+      </w:r>
+      <w:r>
+        <w:t xml:space="preserve"> </w:t>
+      </w:r>
+      <w:r>
+        <w:rPr>
+          <w:rStyle w:val="VerbatimChar"/>
+        </w:rPr>
+        <w:t xml:space="preserve">ARCHITECTURE.md</w:t>
+      </w:r>
+      <w:r>
+        <w:t xml:space="preserve"> </w:t>
+      </w:r>
+      <w:r>
+        <w:t xml:space="preserve">§11 describes an earlier approach where the build</w:t>
+      </w:r>
+      <w:r>
+        <w:t xml:space="preserve"> </w:t>
+      </w:r>
+      <w:r>
+        <w:t xml:space="preserve">emitted a</w:t>
+      </w:r>
+      <w:r>
+        <w:t xml:space="preserve"> </w:t>
+      </w:r>
+      <w:r>
+        <w:rPr>
+          <w:rStyle w:val="VerbatimChar"/>
+        </w:rPr>
+        <w:t xml:space="preserve">user/kernel_syms.ld</w:t>
+      </w:r>
+      <w:r>
+        <w:t xml:space="preserve"> </w:t>
+      </w:r>
+      <w:r>
+        <w:t xml:space="preserve">(</w:t>
+      </w:r>
+      <w:r>
+        <w:rPr>
+          <w:rStyle w:val="VerbatimChar"/>
+        </w:rPr>
+        <w:t xml:space="preserve">kapi_x = 0xADDR;</w:t>
+      </w:r>
+      <w:r>
+        <w:t xml:space="preserve">) and the apps were linked against</w:t>
+      </w:r>
+      <w:r>
+        <w:t xml:space="preserve"> </w:t>
+      </w:r>
+      <w:r>
+        <w:t xml:space="preserve">those addresses. This approach is</w:t>
+      </w:r>
+      <w:r>
+        <w:t xml:space="preserve"> </w:t>
+      </w:r>
+      <w:r>
+        <w:rPr>
+          <w:b/>
+          <w:bCs/>
+        </w:rPr>
+        <w:t xml:space="preserve">no longer used</w:t>
+      </w:r>
+      <w:r>
+        <w:t xml:space="preserve">: the fixed-address table replaced</w:t>
+      </w:r>
+      <w:r>
+        <w:t xml:space="preserve"> </w:t>
+      </w:r>
+      <w:r>
+        <w:t xml:space="preserve">it. The apps no longer depend on the kernel build.</w:t>
+      </w:r>
+    </w:p>
+    <w:p>
+      <w:r>
+        <w:pict>
+          <v:rect style="width:0;height:1.5pt" o:hralign="center" o:hrstd="t" o:hr="t"/>
+        </w:pict>
+      </w:r>
+    </w:p>
+    <w:bookmarkEnd w:id="88"/>
+    <w:bookmarkEnd w:id="89"/>
+    <w:bookmarkStart w:id="96" w:name="X0388453af32aee5299c424f16ffba6153d0b61c"/>
+    <w:p>
+      <w:pPr>
+        <w:pStyle w:val="Heading2"/>
+      </w:pPr>
+      <w:r>
+        <w:t xml:space="preserve">9. Stream / stdio subsystem</w:t>
+      </w:r>
+    </w:p>
+    <w:p>
+      <w:pPr>
+        <w:pStyle w:val="FirstParagraph"/>
+      </w:pPr>
+      <w:r>
         <w:t xml:space="preserve">Source:</w:t>
       </w:r>
       <w:r>
         <w:t xml:space="preserve"> </w:t>
       </w:r>
-      <w:hyperlink r:id="rId89">
+      <w:hyperlink r:id="rId90">
         <w:r>
           <w:rPr>
             <w:rStyle w:val="VerbatimChar"/>
@@ -48870,7 +49534,7 @@
       <w:r>
         <w:t xml:space="preserve"> </w:t>
       </w:r>
-      <w:hyperlink r:id="rId90">
+      <w:hyperlink r:id="rId91">
         <w:r>
           <w:rPr>
             <w:rStyle w:val="VerbatimChar"/>
@@ -48912,7 +49576,7 @@
         <w:t xml:space="preserve">communication possible.</w:t>
       </w:r>
     </w:p>
-    <w:bookmarkStart w:id="91" w:name="object-model"/>
+    <w:bookmarkStart w:id="92" w:name="object-model"/>
     <w:p>
       <w:pPr>
         <w:pStyle w:val="Heading3"/>
@@ -49442,8 +50106,8 @@
         <w:t xml:space="preserve">2=append.</w:t>
       </w:r>
     </w:p>
-    <w:bookmarkEnd w:id="91"/>
-    <w:bookmarkStart w:id="94" w:name="processes-and-stdio"/>
+    <w:bookmarkEnd w:id="92"/>
+    <w:bookmarkStart w:id="95" w:name="processes-and-stdio"/>
     <w:p>
       <w:pPr>
         <w:pStyle w:val="Heading3"/>
@@ -49744,7 +50408,7 @@
       <w:r>
         <w:t xml:space="preserve"> </w:t>
       </w:r>
-      <w:hyperlink r:id="rId92">
+      <w:hyperlink r:id="rId93">
         <w:r>
           <w:rPr>
             <w:rStyle w:val="Hyperlink"/>
@@ -49761,7 +50425,7 @@
       <w:r>
         <w:t xml:space="preserve"> </w:t>
       </w:r>
-      <w:hyperlink r:id="rId93">
+      <w:hyperlink r:id="rId94">
         <w:r>
           <w:rPr>
             <w:rStyle w:val="Hyperlink"/>
@@ -49780,9 +50444,9 @@
         </w:pict>
       </w:r>
     </w:p>
-    <w:bookmarkEnd w:id="94"/>
     <w:bookmarkEnd w:id="95"/>
-    <w:bookmarkStart w:id="101" w:name="X10f951303a3d0a8705d0a81fe10314bb6a2b0a6"/>
+    <w:bookmarkEnd w:id="96"/>
+    <w:bookmarkStart w:id="102" w:name="X10f951303a3d0a8705d0a81fe10314bb6a2b0a6"/>
     <w:p>
       <w:pPr>
         <w:pStyle w:val="Heading2"/>
@@ -49841,7 +50505,7 @@
         <w:t xml:space="preserve">.</w:t>
       </w:r>
     </w:p>
-    <w:bookmarkStart w:id="96" w:name="Xe3f01c5ed286023176949c9775dce5e3838ffd1"/>
+    <w:bookmarkStart w:id="97" w:name="Xe3f01c5ed286023176949c9775dce5e3838ffd1"/>
     <w:p>
       <w:pPr>
         <w:pStyle w:val="Heading3"/>
@@ -50236,8 +50900,8 @@
         <w:t xml:space="preserve">(24 bpp uncompressed, BGR→RGB, handles top-down/bottom-up).</w:t>
       </w:r>
     </w:p>
-    <w:bookmarkEnd w:id="96"/>
-    <w:bookmarkStart w:id="97" w:name="X1859393a8c4bed58a127080085004380601403d"/>
+    <w:bookmarkEnd w:id="97"/>
+    <w:bookmarkStart w:id="98" w:name="X1859393a8c4bed58a127080085004380601403d"/>
     <w:p>
       <w:pPr>
         <w:pStyle w:val="Heading3"/>
@@ -52324,8 +52988,8 @@
         <w:t xml:space="preserve">the see-through windows' clicks, the work area, a canvas growing, the workspaces).</w:t>
       </w:r>
     </w:p>
-    <w:bookmarkEnd w:id="97"/>
-    <w:bookmarkStart w:id="98" w:name="Xe463e9388c9d5d5a717f5346252214435818497"/>
+    <w:bookmarkEnd w:id="98"/>
+    <w:bookmarkStart w:id="99" w:name="Xe463e9388c9d5d5a717f5346252214435818497"/>
     <w:p>
       <w:pPr>
         <w:pStyle w:val="Heading3"/>
@@ -52947,8 +53611,8 @@
         <w:t xml:space="preserve">dialog, otherwise to the app's keyboard handler.</w:t>
       </w:r>
     </w:p>
-    <w:bookmarkEnd w:id="98"/>
-    <w:bookmarkStart w:id="99" w:name="X24691d09f8e27f776afb60dd70127328157f6db"/>
+    <w:bookmarkEnd w:id="99"/>
+    <w:bookmarkStart w:id="100" w:name="X24691d09f8e27f776afb60dd70127328157f6db"/>
     <w:p>
       <w:pPr>
         <w:pStyle w:val="Heading3"/>
@@ -53362,8 +54026,8 @@
         <w:t xml:space="preserve">case). The agenda widget reads it to choose its ink.</w:t>
       </w:r>
     </w:p>
-    <w:bookmarkEnd w:id="99"/>
-    <w:bookmarkStart w:id="100" w:name="X200f8f15df38f42e5aa69d22a02b60b447a05e0"/>
+    <w:bookmarkEnd w:id="100"/>
+    <w:bookmarkStart w:id="101" w:name="X200f8f15df38f42e5aa69d22a02b60b447a05e0"/>
     <w:p>
       <w:pPr>
         <w:pStyle w:val="Heading3"/>
@@ -53468,9 +54132,9 @@
         </w:pict>
       </w:r>
     </w:p>
-    <w:bookmarkEnd w:id="100"/>
     <w:bookmarkEnd w:id="101"/>
-    <w:bookmarkStart w:id="105" w:name="X39e469d88a0d3c41ac3b8087ce6a04a805edad1"/>
+    <w:bookmarkEnd w:id="102"/>
+    <w:bookmarkStart w:id="106" w:name="X39e469d88a0d3c41ac3b8087ce6a04a805edad1"/>
     <w:p>
       <w:pPr>
         <w:pStyle w:val="Heading2"/>
@@ -53515,7 +54179,7 @@
       <w:r>
         <w:t xml:space="preserve"> </w:t>
       </w:r>
-      <w:hyperlink r:id="rId102">
+      <w:hyperlink r:id="rId103">
         <w:r>
           <w:rPr>
             <w:rStyle w:val="VerbatimChar"/>
@@ -53532,7 +54196,7 @@
       <w:r>
         <w:t xml:space="preserve"> </w:t>
       </w:r>
-      <w:hyperlink r:id="rId103">
+      <w:hyperlink r:id="rId104">
         <w:r>
           <w:rPr>
             <w:rStyle w:val="VerbatimChar"/>
@@ -53594,7 +54258,7 @@
       <w:r>
         <w:t xml:space="preserve"> </w:t>
       </w:r>
-      <w:hyperlink r:id="rId104">
+      <w:hyperlink r:id="rId105">
         <w:r>
           <w:rPr>
             <w:rStyle w:val="VerbatimChar"/>
@@ -55985,8 +56649,8 @@
         </w:pict>
       </w:r>
     </w:p>
-    <w:bookmarkEnd w:id="105"/>
-    <w:bookmarkStart w:id="109" w:name="Xb96593a02e959a86ae343ca4fa42e9defb57306"/>
+    <w:bookmarkEnd w:id="106"/>
+    <w:bookmarkStart w:id="110" w:name="Xb96593a02e959a86ae343ca4fa42e9defb57306"/>
     <w:p>
       <w:pPr>
         <w:pStyle w:val="Heading2"/>
@@ -56005,7 +56669,7 @@
       <w:r>
         <w:t xml:space="preserve"> </w:t>
       </w:r>
-      <w:hyperlink r:id="rId106">
+      <w:hyperlink r:id="rId107">
         <w:r>
           <w:rPr>
             <w:rStyle w:val="VerbatimChar"/>
@@ -56019,7 +56683,7 @@
       <w:r>
         <w:t xml:space="preserve"> </w:t>
       </w:r>
-      <w:hyperlink r:id="rId107">
+      <w:hyperlink r:id="rId108">
         <w:r>
           <w:rPr>
             <w:rStyle w:val="VerbatimChar"/>
@@ -56070,7 +56734,7 @@
       <w:r>
         <w:t xml:space="preserve"> </w:t>
       </w:r>
-      <w:hyperlink r:id="rId108">
+      <w:hyperlink r:id="rId109">
         <w:r>
           <w:rPr>
             <w:rStyle w:val="Hyperlink"/>
@@ -57608,8 +58272,8 @@
         <w:t xml:space="preserve">(above).</w:t>
       </w:r>
     </w:p>
-    <w:bookmarkEnd w:id="109"/>
-    <w:bookmarkStart w:id="115" w:name="Xfa019e876c205b51820d387dd2b0ef1f0c66c95"/>
+    <w:bookmarkEnd w:id="110"/>
+    <w:bookmarkStart w:id="116" w:name="Xfa019e876c205b51820d387dd2b0ef1f0c66c95"/>
     <w:p>
       <w:pPr>
         <w:pStyle w:val="Heading2"/>
@@ -57628,7 +58292,7 @@
       <w:r>
         <w:t xml:space="preserve"> </w:t>
       </w:r>
-      <w:hyperlink r:id="rId110">
+      <w:hyperlink r:id="rId111">
         <w:r>
           <w:rPr>
             <w:rStyle w:val="VerbatimChar"/>
@@ -57642,7 +58306,7 @@
       <w:r>
         <w:t xml:space="preserve"> </w:t>
       </w:r>
-      <w:hyperlink r:id="rId111">
+      <w:hyperlink r:id="rId112">
         <w:r>
           <w:rPr>
             <w:rStyle w:val="VerbatimChar"/>
@@ -57984,7 +58648,7 @@
         <w:t xml:space="preserve">contend for the framebuffer.</w:t>
       </w:r>
     </w:p>
-    <w:bookmarkStart w:id="114" w:name="the-crash-record-lastcrashtxt"/>
+    <w:bookmarkStart w:id="115" w:name="the-crash-record-lastcrashtxt"/>
     <w:p>
       <w:pPr>
         <w:pStyle w:val="Heading3"/>
@@ -58012,7 +58676,7 @@
       <w:r>
         <w:t xml:space="preserve"> </w:t>
       </w:r>
-      <w:hyperlink r:id="rId112">
+      <w:hyperlink r:id="rId113">
         <w:r>
           <w:rPr>
             <w:rStyle w:val="VerbatimChar"/>
@@ -58026,7 +58690,7 @@
       <w:r>
         <w:t xml:space="preserve"> </w:t>
       </w:r>
-      <w:hyperlink r:id="rId113">
+      <w:hyperlink r:id="rId114">
         <w:r>
           <w:rPr>
             <w:rStyle w:val="VerbatimChar"/>
@@ -59628,9 +60292,9 @@
         </w:pict>
       </w:r>
     </w:p>
-    <w:bookmarkEnd w:id="114"/>
     <w:bookmarkEnd w:id="115"/>
-    <w:bookmarkStart w:id="120" w:name="X0df50f13635c1fcb933e538121f0d903fe1ec80"/>
+    <w:bookmarkEnd w:id="116"/>
+    <w:bookmarkStart w:id="121" w:name="X0df50f13635c1fcb933e538121f0d903fe1ec80"/>
     <w:p>
       <w:pPr>
         <w:pStyle w:val="Heading2"/>
@@ -59649,7 +60313,7 @@
       <w:r>
         <w:t xml:space="preserve"> </w:t>
       </w:r>
-      <w:hyperlink r:id="rId116">
+      <w:hyperlink r:id="rId117">
         <w:r>
           <w:rPr>
             <w:rStyle w:val="VerbatimChar"/>
@@ -59663,7 +60327,7 @@
       <w:r>
         <w:t xml:space="preserve"> </w:t>
       </w:r>
-      <w:hyperlink r:id="rId117">
+      <w:hyperlink r:id="rId118">
         <w:r>
           <w:rPr>
             <w:rStyle w:val="VerbatimChar"/>
@@ -59677,7 +60341,7 @@
       <w:r>
         <w:t xml:space="preserve"> </w:t>
       </w:r>
-      <w:hyperlink r:id="rId118">
+      <w:hyperlink r:id="rId119">
         <w:r>
           <w:rPr>
             <w:rStyle w:val="VerbatimChar"/>
@@ -59691,7 +60355,7 @@
       <w:r>
         <w:t xml:space="preserve"> </w:t>
       </w:r>
-      <w:hyperlink r:id="rId119">
+      <w:hyperlink r:id="rId120">
         <w:r>
           <w:rPr>
             <w:rStyle w:val="VerbatimChar"/>
@@ -61602,8 +62266,8 @@
         <w:t xml:space="preserve">), with its malloc, files and saves.</w:t>
       </w:r>
     </w:p>
-    <w:bookmarkEnd w:id="120"/>
-    <w:bookmarkStart w:id="125" w:name="Xf861c8e521de19b85a9fa568838296e214f81a0"/>
+    <w:bookmarkEnd w:id="121"/>
+    <w:bookmarkStart w:id="126" w:name="Xf861c8e521de19b85a9fa568838296e214f81a0"/>
     <w:p>
       <w:pPr>
         <w:pStyle w:val="Heading2"/>
@@ -61622,7 +62286,7 @@
       <w:r>
         <w:t xml:space="preserve"> </w:t>
       </w:r>
-      <w:hyperlink r:id="rId121">
+      <w:hyperlink r:id="rId122">
         <w:r>
           <w:rPr>
             <w:rStyle w:val="VerbatimChar"/>
@@ -61636,7 +62300,7 @@
       <w:r>
         <w:t xml:space="preserve"> </w:t>
       </w:r>
-      <w:hyperlink r:id="rId122">
+      <w:hyperlink r:id="rId123">
         <w:r>
           <w:rPr>
             <w:rStyle w:val="VerbatimChar"/>
@@ -62805,7 +63469,7 @@
       <w:r>
         <w:t xml:space="preserve"> </w:t>
       </w:r>
-      <w:hyperlink r:id="rId123">
+      <w:hyperlink r:id="rId124">
         <w:r>
           <w:rPr>
             <w:rStyle w:val="VerbatimChar"/>
@@ -64187,7 +64851,7 @@
       <w:r>
         <w:t xml:space="preserve"> </w:t>
       </w:r>
-      <w:hyperlink r:id="rId124">
+      <w:hyperlink r:id="rId125">
         <w:r>
           <w:rPr>
             <w:rStyle w:val="VerbatimChar"/>
@@ -65447,8 +66111,8 @@
         </w:pict>
       </w:r>
     </w:p>
-    <w:bookmarkEnd w:id="125"/>
-    <w:bookmarkStart w:id="130" w:name="Xa7f002f42b8b233630f11dbad8c3740c73af4cd"/>
+    <w:bookmarkEnd w:id="126"/>
+    <w:bookmarkStart w:id="131" w:name="Xa7f002f42b8b233630f11dbad8c3740c73af4cd"/>
     <w:p>
       <w:pPr>
         <w:pStyle w:val="Heading2"/>
@@ -65467,7 +66131,7 @@
       <w:r>
         <w:t xml:space="preserve"> </w:t>
       </w:r>
-      <w:hyperlink r:id="rId126">
+      <w:hyperlink r:id="rId127">
         <w:r>
           <w:rPr>
             <w:rStyle w:val="VerbatimChar"/>
@@ -65481,7 +66145,7 @@
       <w:r>
         <w:t xml:space="preserve"> </w:t>
       </w:r>
-      <w:hyperlink r:id="rId127">
+      <w:hyperlink r:id="rId128">
         <w:r>
           <w:rPr>
             <w:rStyle w:val="VerbatimChar"/>
@@ -65507,7 +66171,7 @@
       <w:r>
         <w:t xml:space="preserve">(</w:t>
       </w:r>
-      <w:hyperlink r:id="rId89">
+      <w:hyperlink r:id="rId90">
         <w:r>
           <w:rPr>
             <w:rStyle w:val="VerbatimChar"/>
@@ -65541,7 +66205,7 @@
       <w:r>
         <w:t xml:space="preserve"> </w:t>
       </w:r>
-      <w:hyperlink r:id="rId128">
+      <w:hyperlink r:id="rId129">
         <w:r>
           <w:rPr>
             <w:rStyle w:val="VerbatimChar"/>
@@ -65555,7 +66219,7 @@
       <w:r>
         <w:t xml:space="preserve"> </w:t>
       </w:r>
-      <w:hyperlink r:id="rId129">
+      <w:hyperlink r:id="rId130">
         <w:r>
           <w:rPr>
             <w:rStyle w:val="VerbatimChar"/>
@@ -67549,8 +68213,8 @@
         </w:pict>
       </w:r>
     </w:p>
-    <w:bookmarkEnd w:id="130"/>
-    <w:bookmarkStart w:id="131" w:name="annex--useful-constants"/>
+    <w:bookmarkEnd w:id="131"/>
+    <w:bookmarkStart w:id="132" w:name="annex--useful-constants"/>
     <w:p>
       <w:pPr>
         <w:pStyle w:val="Heading2"/>
@@ -68457,7 +69121,7 @@
         </w:tc>
       </w:tr>
     </w:tbl>
-    <w:bookmarkEnd w:id="131"/>
+    <w:bookmarkEnd w:id="132"/>
     <w:sectPr>
       <w:footerReference r:id="rId9" w:type="default"/>
       <w:footnotePr>

</xml_diff>

<commit_message>
preload /boot and the Control Panel's Preload applet: `preload /boot` (the last line of /etc/autostart) loads the programs SD:/etc/preload.ini lists (user/preloadini.h); preloadconf (user/Apps/preloadconf) edits the list -- the apps and the /bin tools to add, each program's size and state, a change done at once (image_preload / image_unload); docs 02, 04, the screenshot, exports
Co-Authored-By: Claude Opus 5.5 <noreply@anthropic.com>
</commit_message>
<xml_diff>
--- a/docs/exports/02-KERNEL-INTERNALS.docx
+++ b/docs/exports/02-KERNEL-INTERNALS.docx
@@ -48766,7 +48766,67 @@
         <w:t xml:space="preserve">/bin/preload</w:t>
       </w:r>
       <w:r>
+        <w:t xml:space="preserve"> </w:t>
+      </w:r>
+      <w:r>
+        <w:t xml:space="preserve">(</w:t>
+      </w:r>
+      <w:r>
+        <w:rPr>
+          <w:rStyle w:val="VerbatimChar"/>
+        </w:rPr>
+        <w:t xml:space="preserve">preload /boot</w:t>
+      </w:r>
+      <w:r>
+        <w:t xml:space="preserve">, the last line of</w:t>
+      </w:r>
+      <w:r>
+        <w:t xml:space="preserve"> </w:t>
+      </w:r>
+      <w:r>
+        <w:rPr>
+          <w:rStyle w:val="VerbatimChar"/>
+        </w:rPr>
+        <w:t xml:space="preserve">/etc/autostart</w:t>
+      </w:r>
+      <w:r>
+        <w:t xml:space="preserve">: the list of</w:t>
+      </w:r>
+      <w:r>
+        <w:t xml:space="preserve"> </w:t>
+      </w:r>
+      <w:r>
+        <w:rPr>
+          <w:rStyle w:val="VerbatimChar"/>
+        </w:rPr>
+        <w:t xml:space="preserve">SD:/etc/preload.ini</w:t>
+      </w:r>
+      <w:r>
         <w:t xml:space="preserve">,</w:t>
+      </w:r>
+      <w:r>
+        <w:t xml:space="preserve"> </w:t>
+      </w:r>
+      <w:r>
+        <w:rPr>
+          <w:rStyle w:val="VerbatimChar"/>
+        </w:rPr>
+        <w:t xml:space="preserve">user/preloadini.h</w:t>
+      </w:r>
+      <w:r>
+        <w:t xml:space="preserve">, edited by the Control Panel's Preload applet,</w:t>
+      </w:r>
+      <w:r>
+        <w:t xml:space="preserve"> </w:t>
+      </w:r>
+      <w:r>
+        <w:rPr>
+          <w:rStyle w:val="VerbatimChar"/>
+        </w:rPr>
+        <w:t xml:space="preserve">user/Apps/preloadconf</w:t>
+      </w:r>
+      <w:r>
+        <w:t xml:space="preserve">),</w:t>
       </w:r>
       <w:r>
         <w:t xml:space="preserve"> </w:t>

</xml_diff>

<commit_message>
Docs: the exports regenerated (the network's fast path and its loss fix, uname, tcpbench, Web's video and phone user agent)
Co-Authored-By: Claude Opus 5.5 <noreply@anthropic.com>
</commit_message>
<xml_diff>
--- a/docs/exports/02-KERNEL-INTERNALS.docx
+++ b/docs/exports/02-KERNEL-INTERNALS.docx
@@ -4089,22 +4089,7 @@
         <w:t xml:space="preserve"> </w:t>
       </w:r>
       <w:r>
-        <w:t xml:space="preserve">return 0).</w:t>
-      </w:r>
-      <w:r>
-        <w:t xml:space="preserve"> </w:t>
-      </w:r>
-      <w:r>
-        <w:rPr>
-          <w:rStyle w:val="VerbatimChar"/>
-        </w:rPr>
-        <w:t xml:space="preserve">memmon</w:t>
-      </w:r>
-      <w:r>
-        <w:t xml:space="preserve"> </w:t>
-      </w:r>
-      <w:r>
-        <w:t xml:space="preserve">then shows an app pool of 0</w:t>
+        <w:t xml:space="preserve">return 0). the Task Manager's Memory tab then shows an app pool of 0</w:t>
       </w:r>
       <w:r>
         <w:t xml:space="preserve"> </w:t>
@@ -21730,7 +21715,7 @@
     </w:p>
     <w:bookmarkEnd w:id="74"/>
     <w:bookmarkEnd w:id="75"/>
-    <w:bookmarkStart w:id="89" w:name="X277d88280f3f4acecd0386230c1d60a44106d3c"/>
+    <w:bookmarkStart w:id="90" w:name="X277d88280f3f4acecd0386230c1d60a44106d3c"/>
     <w:p>
       <w:pPr>
         <w:pStyle w:val="Heading2"/>
@@ -25334,6 +25319,68 @@
           <w:iCs/>
         </w:rPr>
         <w:t xml:space="preserve">v78: PROT_EXEC</w:t>
+      </w:r>
+      <w:r>
+        <w:t xml:space="preserve"> </w:t>
+      </w:r>
+      <w:r>
+        <w:t xml:space="preserve">below),</w:t>
+      </w:r>
+      <w:r>
+        <w:t xml:space="preserve"> </w:t>
+      </w:r>
+      <w:r>
+        <w:t xml:space="preserve">v79 =</w:t>
+      </w:r>
+      <w:r>
+        <w:t xml:space="preserve"> </w:t>
+      </w:r>
+      <w:r>
+        <w:rPr>
+          <w:b/>
+          <w:bCs/>
+        </w:rPr>
+        <w:t xml:space="preserve">what the kernel is</w:t>
+      </w:r>
+      <w:r>
+        <w:t xml:space="preserve">:</w:t>
+      </w:r>
+      <w:r>
+        <w:t xml:space="preserve"> </w:t>
+      </w:r>
+      <w:r>
+        <w:rPr>
+          <w:rStyle w:val="VerbatimChar"/>
+        </w:rPr>
+        <w:t xml:space="preserve">kernel_info</w:t>
+      </w:r>
+      <w:r>
+        <w:t xml:space="preserve"> </w:t>
+      </w:r>
+      <w:r>
+        <w:t xml:space="preserve">(slot 256), for</w:t>
+      </w:r>
+      <w:r>
+        <w:t xml:space="preserve"> </w:t>
+      </w:r>
+      <w:r>
+        <w:rPr>
+          <w:rStyle w:val="VerbatimChar"/>
+        </w:rPr>
+        <w:t xml:space="preserve">/bin/uname</w:t>
+      </w:r>
+      <w:r>
+        <w:t xml:space="preserve"> </w:t>
+      </w:r>
+      <w:r>
+        <w:t xml:space="preserve">(</w:t>
+      </w:r>
+      <w:r>
+        <w:rPr>
+          <w:i/>
+          <w:iCs/>
+        </w:rPr>
+        <w:t xml:space="preserve">v79: kernel_info</w:t>
       </w:r>
       <w:r>
         <w:t xml:space="preserve"> </w:t>
@@ -30212,7 +30259,116 @@
               <w:t xml:space="preserve">CInputTask</w:t>
             </w:r>
             <w:r>
-              <w:t xml:space="preserve">).</w:t>
+              <w:t xml:space="preserve">). A</w:t>
+            </w:r>
+            <w:r>
+              <w:t xml:space="preserve"> </w:t>
+            </w:r>
+            <w:r>
+              <w:rPr>
+                <w:b/>
+                <w:bCs/>
+              </w:rPr>
+              <w:t xml:space="preserve">blocking</w:t>
+            </w:r>
+            <w:r>
+              <w:t xml:space="preserve"> </w:t>
+            </w:r>
+            <w:r>
+              <w:rPr>
+                <w:rStyle w:val="VerbatimChar"/>
+              </w:rPr>
+              <w:t xml:space="preserve">mailbox_recv</w:t>
+            </w:r>
+            <w:r>
+              <w:t xml:space="preserve"> </w:t>
+            </w:r>
+            <w:r>
+              <w:t xml:space="preserve">sleeps until a message lands (</w:t>
+            </w:r>
+            <w:r>
+              <w:rPr>
+                <w:rStyle w:val="VerbatimChar"/>
+              </w:rPr>
+              <w:t xml:space="preserve">IoWait</w:t>
+            </w:r>
+            <w:r>
+              <w:t xml:space="preserve"> </w:t>
+            </w:r>
+            <w:r>
+              <w:t xml:space="preserve">on the I/O generation;</w:t>
+            </w:r>
+            <w:r>
+              <w:t xml:space="preserve"> </w:t>
+            </w:r>
+            <w:r>
+              <w:rPr>
+                <w:rStyle w:val="VerbatimChar"/>
+              </w:rPr>
+              <w:t xml:space="preserve">CMailbox::Push</w:t>
+            </w:r>
+            <w:r>
+              <w:t xml:space="preserve"> </w:t>
+            </w:r>
+            <w:r>
+              <w:t xml:space="preserve">calls</w:t>
+            </w:r>
+            <w:r>
+              <w:t xml:space="preserve"> </w:t>
+            </w:r>
+            <w:r>
+              <w:rPr>
+                <w:rStyle w:val="VerbatimChar"/>
+              </w:rPr>
+              <w:t xml:space="preserve">IoWake</w:t>
+            </w:r>
+            <w:r>
+              <w:t xml:space="preserve">) — until 2026-10-03 it was a loop of</w:t>
+            </w:r>
+            <w:r>
+              <w:t xml:space="preserve"> </w:t>
+            </w:r>
+            <w:r>
+              <w:rPr>
+                <w:rStyle w:val="VerbatimChar"/>
+              </w:rPr>
+              <w:t xml:space="preserve">Yield</w:t>
+            </w:r>
+            <w:r>
+              <w:t xml:space="preserve">, the receiver ready for ever:</w:t>
+            </w:r>
+            <w:r>
+              <w:t xml:space="preserve"> </w:t>
+            </w:r>
+            <w:r>
+              <w:rPr>
+                <w:rStyle w:val="VerbatimChar"/>
+              </w:rPr>
+              <w:t xml:space="preserve">clipd</w:t>
+            </w:r>
+            <w:r>
+              <w:t xml:space="preserve">, the one service that waits this way, took most of core 0 (</w:t>
+            </w:r>
+            <w:r>
+              <w:rPr>
+                <w:rStyle w:val="VerbatimChar"/>
+              </w:rPr>
+              <w:t xml:space="preserve">ps</w:t>
+            </w:r>
+            <w:r>
+              <w:t xml:space="preserve">: state</w:t>
+            </w:r>
+            <w:r>
+              <w:t xml:space="preserve"> </w:t>
+            </w:r>
+            <w:r>
+              <w:rPr>
+                <w:rStyle w:val="VerbatimChar"/>
+              </w:rPr>
+              <w:t xml:space="preserve">R</w:t>
+            </w:r>
+            <w:r>
+              <w:t xml:space="preserve">, no system call).</w:t>
             </w:r>
           </w:p>
         </w:tc>
@@ -44863,13 +45019,59 @@
         <w:t xml:space="preserve"> </w:t>
       </w:r>
       <w:r>
-        <w:t xml:space="preserve">worker after each call on a slot) and bumps a generation word when one changed; a 100 Hz tick hook</w:t>
-      </w:r>
-      <w:r>
-        <w:t xml:space="preserve"> </w:t>
-      </w:r>
-      <w:r>
-        <w:t xml:space="preserve">on core 0 (</w:t>
+        <w:t xml:space="preserve">worker after each call on a slot) and bumps a generation word when one changed, then sends core 0</w:t>
+      </w:r>
+      <w:r>
+        <w:t xml:space="preserve"> </w:t>
+      </w:r>
+      <w:r>
+        <w:t xml:space="preserve">an</w:t>
+      </w:r>
+      <w:r>
+        <w:t xml:space="preserve"> </w:t>
+      </w:r>
+      <w:r>
+        <w:rPr>
+          <w:b/>
+          <w:bCs/>
+        </w:rPr>
+        <w:t xml:space="preserve">inter-core interrupt</w:t>
+      </w:r>
+      <w:r>
+        <w:t xml:space="preserve"> </w:t>
+      </w:r>
+      <w:r>
+        <w:t xml:space="preserve">(</w:t>
+      </w:r>
+      <w:r>
+        <w:rPr>
+          <w:rStyle w:val="VerbatimChar"/>
+        </w:rPr>
+        <w:t xml:space="preserve">IPI_NET_READY</w:t>
+      </w:r>
+      <w:r>
+        <w:t xml:space="preserve">, one at a time: a flag core 0 clears before it reads</w:t>
+      </w:r>
+      <w:r>
+        <w:t xml:space="preserve"> </w:t>
+      </w:r>
+      <w:r>
+        <w:t xml:space="preserve">the generation); core 0's handler (</w:t>
+      </w:r>
+      <w:r>
+        <w:rPr>
+          <w:rStyle w:val="VerbatimChar"/>
+        </w:rPr>
+        <w:t xml:space="preserve">NetReadyIPI</w:t>
+      </w:r>
+      <w:r>
+        <w:t xml:space="preserve"> </w:t>
+      </w:r>
+      <w:r>
+        <w:t xml:space="preserve">→</w:t>
+      </w:r>
+      <w:r>
+        <w:t xml:space="preserve"> </w:t>
       </w:r>
       <w:r>
         <w:rPr>
@@ -44878,10 +45080,28 @@
         <w:t xml:space="preserve">NetPollTick</w:t>
       </w:r>
       <w:r>
-        <w:t xml:space="preserve">,</w:t>
-      </w:r>
-      <w:r>
-        <w:t xml:space="preserve"> </w:t>
+        <w:t xml:space="preserve">) turns that into</w:t>
+      </w:r>
+      <w:r>
+        <w:t xml:space="preserve"> </w:t>
+      </w:r>
+      <w:r>
+        <w:rPr>
+          <w:rStyle w:val="VerbatimChar"/>
+        </w:rPr>
+        <w:t xml:space="preserve">IoWake</w:t>
+      </w:r>
+      <w:r>
+        <w:t xml:space="preserve"> </w:t>
+      </w:r>
+      <w:r>
+        <w:t xml:space="preserve">at once.</w:t>
+      </w:r>
+      <w:r>
+        <w:t xml:space="preserve"> </w:t>
+      </w:r>
+      <w:r>
+        <w:t xml:space="preserve">The 100 Hz tick hook (</w:t>
       </w:r>
       <w:r>
         <w:rPr>
@@ -44890,25 +45110,64 @@
         <w:t xml:space="preserve">IoWaitAddTickHook</w:t>
       </w:r>
       <w:r>
-        <w:t xml:space="preserve">) turns that into</w:t>
-      </w:r>
-      <w:r>
-        <w:t xml:space="preserve"> </w:t>
-      </w:r>
-      <w:r>
-        <w:rPr>
-          <w:rStyle w:val="VerbatimChar"/>
-        </w:rPr>
-        <w:t xml:space="preserve">IoWake</w:t>
-      </w:r>
-      <w:r>
-        <w:t xml:space="preserve">: a wake ≤ 10 ms after the</w:t>
-      </w:r>
-      <w:r>
-        <w:t xml:space="preserve"> </w:t>
-      </w:r>
-      <w:r>
-        <w:t xml:space="preserve">change, a waiter's sleep capped at 100 ms anyway. With</w:t>
+        <w:t xml:space="preserve">) remains as the fallback; a waiter's sleep is capped at</w:t>
+      </w:r>
+      <w:r>
+        <w:t xml:space="preserve"> </w:t>
+      </w:r>
+      <w:r>
+        <w:t xml:space="preserve">100 ms anyway. (Before the IPI the tick alone did it: every blocking</w:t>
+      </w:r>
+      <w:r>
+        <w:t xml:space="preserve"> </w:t>
+      </w:r>
+      <w:r>
+        <w:rPr>
+          <w:rStyle w:val="VerbatimChar"/>
+        </w:rPr>
+        <w:t xml:space="preserve">recv</w:t>
+      </w:r>
+      <w:r>
+        <w:t xml:space="preserve"> </w:t>
+      </w:r>
+      <w:r>
+        <w:t xml:space="preserve">/</w:t>
+      </w:r>
+      <w:r>
+        <w:t xml:space="preserve"> </w:t>
+      </w:r>
+      <w:r>
+        <w:rPr>
+          <w:rStyle w:val="VerbatimChar"/>
+        </w:rPr>
+        <w:t xml:space="preserve">send</w:t>
+      </w:r>
+      <w:r>
+        <w:t xml:space="preserve"> </w:t>
+      </w:r>
+      <w:r>
+        <w:t xml:space="preserve">/</w:t>
+      </w:r>
+      <w:r>
+        <w:t xml:space="preserve"> </w:t>
+      </w:r>
+      <w:r>
+        <w:rPr>
+          <w:rStyle w:val="VerbatimChar"/>
+        </w:rPr>
+        <w:t xml:space="preserve">poll</w:t>
+      </w:r>
+      <w:r>
+        <w:t xml:space="preserve"> </w:t>
+      </w:r>
+      <w:r>
+        <w:t xml:space="preserve">waited</w:t>
+      </w:r>
+      <w:r>
+        <w:t xml:space="preserve"> </w:t>
+      </w:r>
+      <w:r>
+        <w:t xml:space="preserve">up to 10 ms a turn — an echo's round trip was 10 ms on the LAN.) With</w:t>
       </w:r>
       <w:r>
         <w:t xml:space="preserve"> </w:t>
@@ -49470,6 +49729,421 @@
         <w:t xml:space="preserve">).</w:t>
       </w:r>
     </w:p>
+    <w:bookmarkEnd w:id="88"/>
+    <w:bookmarkStart w:id="89" w:name="v79-kernel_info"/>
+    <w:p>
+      <w:pPr>
+        <w:pStyle w:val="Heading3"/>
+      </w:pPr>
+      <w:r>
+        <w:t xml:space="preserve">v79: kernel_info</w:t>
+      </w:r>
+    </w:p>
+    <w:tbl>
+      <w:tblPr>
+        <w:tblStyle w:val="Table"/>
+        <w:tblW w:type="auto" w:w="0"/>
+        <w:tblLook w:firstRow="1" w:lastRow="0" w:firstColumn="0" w:lastColumn="0" w:noHBand="0" w:noVBand="0" w:val="0020"/>
+      </w:tblPr>
+      <w:tblGrid>
+        <w:gridCol w:w="2640"/>
+        <w:gridCol w:w="2640"/>
+        <w:gridCol w:w="2640"/>
+      </w:tblGrid>
+      <w:tr>
+        <w:trPr>
+          <w:tblHeader w:val="on"/>
+        </w:trPr>
+        <w:tc>
+          <w:tcPr/>
+          <w:p>
+            <w:pPr>
+              <w:pStyle w:val="Compact"/>
+            </w:pPr>
+            <w:r>
+              <w:t xml:space="preserve">Slot</w:t>
+            </w:r>
+          </w:p>
+        </w:tc>
+        <w:tc>
+          <w:tcPr/>
+          <w:p>
+            <w:pPr>
+              <w:pStyle w:val="Compact"/>
+            </w:pPr>
+            <w:r>
+              <w:t xml:space="preserve">Entry</w:t>
+            </w:r>
+          </w:p>
+        </w:tc>
+        <w:tc>
+          <w:tcPr/>
+          <w:p>
+            <w:pPr>
+              <w:pStyle w:val="Compact"/>
+            </w:pPr>
+            <w:r>
+              <w:t xml:space="preserve">What it does</w:t>
+            </w:r>
+          </w:p>
+        </w:tc>
+      </w:tr>
+      <w:tr>
+        <w:tc>
+          <w:tcPr/>
+          <w:p>
+            <w:pPr>
+              <w:pStyle w:val="Compact"/>
+            </w:pPr>
+            <w:r>
+              <w:t xml:space="preserve">256</w:t>
+            </w:r>
+          </w:p>
+        </w:tc>
+        <w:tc>
+          <w:tcPr/>
+          <w:p>
+            <w:pPr>
+              <w:pStyle w:val="Compact"/>
+            </w:pPr>
+            <w:r>
+              <w:rPr>
+                <w:rStyle w:val="VerbatimChar"/>
+              </w:rPr>
+              <w:t xml:space="preserve">kernel_info (buf, cap)</w:t>
+            </w:r>
+          </w:p>
+        </w:tc>
+        <w:tc>
+          <w:tcPr/>
+          <w:p>
+            <w:pPr>
+              <w:pStyle w:val="Compact"/>
+            </w:pPr>
+            <w:r>
+              <w:t xml:space="preserve">what the running kernel is, as</w:t>
+            </w:r>
+            <w:r>
+              <w:t xml:space="preserve"> </w:t>
+            </w:r>
+            <w:r>
+              <w:rPr>
+                <w:rStyle w:val="VerbatimChar"/>
+              </w:rPr>
+              <w:t xml:space="preserve">key value</w:t>
+            </w:r>
+            <w:r>
+              <w:t xml:space="preserve"> </w:t>
+            </w:r>
+            <w:r>
+              <w:t xml:space="preserve">lines:</w:t>
+            </w:r>
+            <w:r>
+              <w:t xml:space="preserve"> </w:t>
+            </w:r>
+            <w:r>
+              <w:rPr>
+                <w:rStyle w:val="VerbatimChar"/>
+              </w:rPr>
+              <w:t xml:space="preserve">name</w:t>
+            </w:r>
+            <w:r>
+              <w:t xml:space="preserve"> </w:t>
+            </w:r>
+            <w:r>
+              <w:t xml:space="preserve">(Onyx),</w:t>
+            </w:r>
+            <w:r>
+              <w:t xml:space="preserve"> </w:t>
+            </w:r>
+            <w:r>
+              <w:rPr>
+                <w:rStyle w:val="VerbatimChar"/>
+              </w:rPr>
+              <w:t xml:space="preserve">abi</w:t>
+            </w:r>
+            <w:r>
+              <w:t xml:space="preserve"> </w:t>
+            </w:r>
+            <w:r>
+              <w:t xml:space="preserve">(</w:t>
+            </w:r>
+            <w:r>
+              <w:rPr>
+                <w:rStyle w:val="VerbatimChar"/>
+              </w:rPr>
+              <w:t xml:space="preserve">KAPI_ABI_VERSION</w:t>
+            </w:r>
+            <w:r>
+              <w:t xml:space="preserve">),</w:t>
+            </w:r>
+            <w:r>
+              <w:t xml:space="preserve"> </w:t>
+            </w:r>
+            <w:r>
+              <w:rPr>
+                <w:rStyle w:val="VerbatimChar"/>
+              </w:rPr>
+              <w:t xml:space="preserve">built</w:t>
+            </w:r>
+            <w:r>
+              <w:t xml:space="preserve"> </w:t>
+            </w:r>
+            <w:r>
+              <w:t xml:space="preserve">(the date and time of the image's link),</w:t>
+            </w:r>
+            <w:r>
+              <w:t xml:space="preserve"> </w:t>
+            </w:r>
+            <w:r>
+              <w:rPr>
+                <w:rStyle w:val="VerbatimChar"/>
+              </w:rPr>
+              <w:t xml:space="preserve">rev</w:t>
+            </w:r>
+            <w:r>
+              <w:t xml:space="preserve"> </w:t>
+            </w:r>
+            <w:r>
+              <w:t xml:space="preserve">(the source's git revision;</w:t>
+            </w:r>
+            <w:r>
+              <w:t xml:space="preserve"> </w:t>
+            </w:r>
+            <w:r>
+              <w:rPr>
+                <w:rStyle w:val="VerbatimChar"/>
+              </w:rPr>
+              <w:t xml:space="preserve">+</w:t>
+            </w:r>
+            <w:r>
+              <w:t xml:space="preserve">: built from changed sources),</w:t>
+            </w:r>
+            <w:r>
+              <w:t xml:space="preserve"> </w:t>
+            </w:r>
+            <w:r>
+              <w:rPr>
+                <w:rStyle w:val="VerbatimChar"/>
+              </w:rPr>
+              <w:t xml:space="preserve">machine</w:t>
+            </w:r>
+            <w:r>
+              <w:t xml:space="preserve"> </w:t>
+            </w:r>
+            <w:r>
+              <w:t xml:space="preserve">(aarch64),</w:t>
+            </w:r>
+            <w:r>
+              <w:t xml:space="preserve"> </w:t>
+            </w:r>
+            <w:r>
+              <w:rPr>
+                <w:rStyle w:val="VerbatimChar"/>
+              </w:rPr>
+              <w:t xml:space="preserve">model</w:t>
+            </w:r>
+            <w:r>
+              <w:t xml:space="preserve"> </w:t>
+            </w:r>
+            <w:r>
+              <w:t xml:space="preserve">(the board's name),</w:t>
+            </w:r>
+            <w:r>
+              <w:t xml:space="preserve"> </w:t>
+            </w:r>
+            <w:r>
+              <w:rPr>
+                <w:rStyle w:val="VerbatimChar"/>
+              </w:rPr>
+              <w:t xml:space="preserve">ram</w:t>
+            </w:r>
+            <w:r>
+              <w:t xml:space="preserve"> </w:t>
+            </w:r>
+            <w:r>
+              <w:t xml:space="preserve">(MB). Up to</w:t>
+            </w:r>
+            <w:r>
+              <w:t xml:space="preserve"> </w:t>
+            </w:r>
+            <w:r>
+              <w:rPr>
+                <w:rStyle w:val="VerbatimChar"/>
+              </w:rPr>
+              <w:t xml:space="preserve">cap</w:t>
+            </w:r>
+            <w:r>
+              <w:t xml:space="preserve"> </w:t>
+            </w:r>
+            <w:r>
+              <w:t xml:space="preserve">− 1 bytes and a NUL → the text's whole length;</w:t>
+            </w:r>
+            <w:r>
+              <w:t xml:space="preserve"> </w:t>
+            </w:r>
+            <w:r>
+              <w:rPr>
+                <w:rStyle w:val="VerbatimChar"/>
+              </w:rPr>
+              <w:t xml:space="preserve">EFAULT</w:t>
+            </w:r>
+            <w:r>
+              <w:t xml:space="preserve">. Keys may be added: a reader looks its keys up.</w:t>
+            </w:r>
+          </w:p>
+        </w:tc>
+      </w:tr>
+    </w:tbl>
+    <w:p>
+      <w:pPr>
+        <w:pStyle w:val="BodyText"/>
+      </w:pPr>
+      <w:r>
+        <w:t xml:space="preserve">The date and the revision are</w:t>
+      </w:r>
+      <w:r>
+        <w:t xml:space="preserve"> </w:t>
+      </w:r>
+      <w:r>
+        <w:rPr>
+          <w:rStyle w:val="VerbatimChar"/>
+        </w:rPr>
+        <w:t xml:space="preserve">kernel/buildstamp.cpp</w:t>
+      </w:r>
+      <w:r>
+        <w:t xml:space="preserve">'s, an object that depends on every other</w:t>
+      </w:r>
+      <w:r>
+        <w:t xml:space="preserve"> </w:t>
+      </w:r>
+      <w:r>
+        <w:t xml:space="preserve">object and library of the kernel (</w:t>
+      </w:r>
+      <w:r>
+        <w:rPr>
+          <w:rStyle w:val="VerbatimChar"/>
+        </w:rPr>
+        <w:t xml:space="preserve">kernel/Makefile</w:t>
+      </w:r>
+      <w:r>
+        <w:t xml:space="preserve">): it is compiled again at each link, so the</w:t>
+      </w:r>
+      <w:r>
+        <w:t xml:space="preserve"> </w:t>
+      </w:r>
+      <w:r>
+        <w:t xml:space="preserve">stamp is the image's —</w:t>
+      </w:r>
+      <w:r>
+        <w:t xml:space="preserve"> </w:t>
+      </w:r>
+      <w:r>
+        <w:rPr>
+          <w:rStyle w:val="VerbatimChar"/>
+        </w:rPr>
+        <w:t xml:space="preserve">__DATE__</w:t>
+      </w:r>
+      <w:r>
+        <w:t xml:space="preserve"> </w:t>
+      </w:r>
+      <w:r>
+        <w:t xml:space="preserve">in a file says when that file was last compiled. The boot log's</w:t>
+      </w:r>
+      <w:r>
+        <w:t xml:space="preserve"> </w:t>
+      </w:r>
+      <w:r>
+        <w:rPr>
+          <w:rStyle w:val="VerbatimChar"/>
+        </w:rPr>
+        <w:t xml:space="preserve">Built on …</w:t>
+      </w:r>
+      <w:r>
+        <w:t xml:space="preserve"> </w:t>
+      </w:r>
+      <w:r>
+        <w:t xml:space="preserve">line prints the same. User:</w:t>
+      </w:r>
+      <w:r>
+        <w:t xml:space="preserve"> </w:t>
+      </w:r>
+      <w:r>
+        <w:rPr>
+          <w:rStyle w:val="VerbatimChar"/>
+        </w:rPr>
+        <w:t xml:space="preserve">/bin/uname</w:t>
+      </w:r>
+      <w:r>
+        <w:t xml:space="preserve"> </w:t>
+      </w:r>
+      <w:r>
+        <w:t xml:space="preserve">(docs/04 §8) — a kernel copied to the card</w:t>
+      </w:r>
+      <w:r>
+        <w:t xml:space="preserve"> </w:t>
+      </w:r>
+      <w:r>
+        <w:t xml:space="preserve">by hand is told from the package's (</w:t>
+      </w:r>
+      <w:r>
+        <w:rPr>
+          <w:rStyle w:val="VerbatimChar"/>
+        </w:rPr>
+        <w:t xml:space="preserve">uname -v</w:t>
+      </w:r>
+      <w:r>
+        <w:t xml:space="preserve"> </w:t>
+      </w:r>
+      <w:r>
+        <w:t xml:space="preserve">against</w:t>
+      </w:r>
+      <w:r>
+        <w:t xml:space="preserve"> </w:t>
+      </w:r>
+      <w:r>
+        <w:rPr>
+          <w:rStyle w:val="VerbatimChar"/>
+        </w:rPr>
+        <w:t xml:space="preserve">uname -p</w:t>
+      </w:r>
+      <w:r>
+        <w:t xml:space="preserve">).</w:t>
+      </w:r>
+      <w:r>
+        <w:t xml:space="preserve"> </w:t>
+      </w:r>
+      <w:r>
+        <w:rPr>
+          <w:rStyle w:val="VerbatimChar"/>
+        </w:rPr>
+        <w:t xml:space="preserve">user/kapi.h</w:t>
+      </w:r>
+      <w:r>
+        <w:t xml:space="preserve">'s wrapper</w:t>
+      </w:r>
+      <w:r>
+        <w:t xml:space="preserve"> </w:t>
+      </w:r>
+      <w:r>
+        <w:t xml:space="preserve">returns</w:t>
+      </w:r>
+      <w:r>
+        <w:t xml:space="preserve"> </w:t>
+      </w:r>
+      <w:r>
+        <w:rPr>
+          <w:rStyle w:val="VerbatimChar"/>
+        </w:rPr>
+        <w:t xml:space="preserve">-KAPI_ENOSYS</w:t>
+      </w:r>
+      <w:r>
+        <w:t xml:space="preserve"> </w:t>
+      </w:r>
+      <w:r>
+        <w:t xml:space="preserve">and an empty text on an older kernel.</w:t>
+      </w:r>
+    </w:p>
     <w:p>
       <w:pPr>
         <w:pStyle w:val="BlockText"/>
@@ -49559,9 +50233,9 @@
         </w:pict>
       </w:r>
     </w:p>
-    <w:bookmarkEnd w:id="88"/>
     <w:bookmarkEnd w:id="89"/>
-    <w:bookmarkStart w:id="96" w:name="X0388453af32aee5299c424f16ffba6153d0b61c"/>
+    <w:bookmarkEnd w:id="90"/>
+    <w:bookmarkStart w:id="97" w:name="X0388453af32aee5299c424f16ffba6153d0b61c"/>
     <w:p>
       <w:pPr>
         <w:pStyle w:val="Heading2"/>
@@ -49580,7 +50254,7 @@
       <w:r>
         <w:t xml:space="preserve"> </w:t>
       </w:r>
-      <w:hyperlink r:id="rId90">
+      <w:hyperlink r:id="rId91">
         <w:r>
           <w:rPr>
             <w:rStyle w:val="VerbatimChar"/>
@@ -49594,7 +50268,7 @@
       <w:r>
         <w:t xml:space="preserve"> </w:t>
       </w:r>
-      <w:hyperlink r:id="rId91">
+      <w:hyperlink r:id="rId92">
         <w:r>
           <w:rPr>
             <w:rStyle w:val="VerbatimChar"/>
@@ -49636,7 +50310,7 @@
         <w:t xml:space="preserve">communication possible.</w:t>
       </w:r>
     </w:p>
-    <w:bookmarkStart w:id="92" w:name="object-model"/>
+    <w:bookmarkStart w:id="93" w:name="object-model"/>
     <w:p>
       <w:pPr>
         <w:pStyle w:val="Heading3"/>
@@ -50166,8 +50840,8 @@
         <w:t xml:space="preserve">2=append.</w:t>
       </w:r>
     </w:p>
-    <w:bookmarkEnd w:id="92"/>
-    <w:bookmarkStart w:id="95" w:name="processes-and-stdio"/>
+    <w:bookmarkEnd w:id="93"/>
+    <w:bookmarkStart w:id="96" w:name="processes-and-stdio"/>
     <w:p>
       <w:pPr>
         <w:pStyle w:val="Heading3"/>
@@ -50468,7 +51142,7 @@
       <w:r>
         <w:t xml:space="preserve"> </w:t>
       </w:r>
-      <w:hyperlink r:id="rId93">
+      <w:hyperlink r:id="rId94">
         <w:r>
           <w:rPr>
             <w:rStyle w:val="Hyperlink"/>
@@ -50485,7 +51159,7 @@
       <w:r>
         <w:t xml:space="preserve"> </w:t>
       </w:r>
-      <w:hyperlink r:id="rId94">
+      <w:hyperlink r:id="rId95">
         <w:r>
           <w:rPr>
             <w:rStyle w:val="Hyperlink"/>
@@ -50504,9 +51178,9 @@
         </w:pict>
       </w:r>
     </w:p>
-    <w:bookmarkEnd w:id="95"/>
     <w:bookmarkEnd w:id="96"/>
-    <w:bookmarkStart w:id="102" w:name="X10f951303a3d0a8705d0a81fe10314bb6a2b0a6"/>
+    <w:bookmarkEnd w:id="97"/>
+    <w:bookmarkStart w:id="103" w:name="X10f951303a3d0a8705d0a81fe10314bb6a2b0a6"/>
     <w:p>
       <w:pPr>
         <w:pStyle w:val="Heading2"/>
@@ -50565,7 +51239,7 @@
         <w:t xml:space="preserve">.</w:t>
       </w:r>
     </w:p>
-    <w:bookmarkStart w:id="97" w:name="Xe3f01c5ed286023176949c9775dce5e3838ffd1"/>
+    <w:bookmarkStart w:id="98" w:name="Xe3f01c5ed286023176949c9775dce5e3838ffd1"/>
     <w:p>
       <w:pPr>
         <w:pStyle w:val="Heading3"/>
@@ -50960,8 +51634,8 @@
         <w:t xml:space="preserve">(24 bpp uncompressed, BGR→RGB, handles top-down/bottom-up).</w:t>
       </w:r>
     </w:p>
-    <w:bookmarkEnd w:id="97"/>
-    <w:bookmarkStart w:id="98" w:name="X1859393a8c4bed58a127080085004380601403d"/>
+    <w:bookmarkEnd w:id="98"/>
+    <w:bookmarkStart w:id="99" w:name="X1859393a8c4bed58a127080085004380601403d"/>
     <w:p>
       <w:pPr>
         <w:pStyle w:val="Heading3"/>
@@ -53048,8 +53722,8 @@
         <w:t xml:space="preserve">the see-through windows' clicks, the work area, a canvas growing, the workspaces).</w:t>
       </w:r>
     </w:p>
-    <w:bookmarkEnd w:id="98"/>
-    <w:bookmarkStart w:id="99" w:name="Xe463e9388c9d5d5a717f5346252214435818497"/>
+    <w:bookmarkEnd w:id="99"/>
+    <w:bookmarkStart w:id="100" w:name="Xe463e9388c9d5d5a717f5346252214435818497"/>
     <w:p>
       <w:pPr>
         <w:pStyle w:val="Heading3"/>
@@ -53671,8 +54345,8 @@
         <w:t xml:space="preserve">dialog, otherwise to the app's keyboard handler.</w:t>
       </w:r>
     </w:p>
-    <w:bookmarkEnd w:id="99"/>
-    <w:bookmarkStart w:id="100" w:name="X24691d09f8e27f776afb60dd70127328157f6db"/>
+    <w:bookmarkEnd w:id="100"/>
+    <w:bookmarkStart w:id="101" w:name="X24691d09f8e27f776afb60dd70127328157f6db"/>
     <w:p>
       <w:pPr>
         <w:pStyle w:val="Heading3"/>
@@ -54086,8 +54760,8 @@
         <w:t xml:space="preserve">case). The agenda widget reads it to choose its ink.</w:t>
       </w:r>
     </w:p>
-    <w:bookmarkEnd w:id="100"/>
-    <w:bookmarkStart w:id="101" w:name="X200f8f15df38f42e5aa69d22a02b60b447a05e0"/>
+    <w:bookmarkEnd w:id="101"/>
+    <w:bookmarkStart w:id="102" w:name="X200f8f15df38f42e5aa69d22a02b60b447a05e0"/>
     <w:p>
       <w:pPr>
         <w:pStyle w:val="Heading3"/>
@@ -54192,9 +54866,9 @@
         </w:pict>
       </w:r>
     </w:p>
-    <w:bookmarkEnd w:id="101"/>
     <w:bookmarkEnd w:id="102"/>
-    <w:bookmarkStart w:id="106" w:name="X39e469d88a0d3c41ac3b8087ce6a04a805edad1"/>
+    <w:bookmarkEnd w:id="103"/>
+    <w:bookmarkStart w:id="107" w:name="X39e469d88a0d3c41ac3b8087ce6a04a805edad1"/>
     <w:p>
       <w:pPr>
         <w:pStyle w:val="Heading2"/>
@@ -54239,7 +54913,7 @@
       <w:r>
         <w:t xml:space="preserve"> </w:t>
       </w:r>
-      <w:hyperlink r:id="rId103">
+      <w:hyperlink r:id="rId104">
         <w:r>
           <w:rPr>
             <w:rStyle w:val="VerbatimChar"/>
@@ -54256,7 +54930,7 @@
       <w:r>
         <w:t xml:space="preserve"> </w:t>
       </w:r>
-      <w:hyperlink r:id="rId104">
+      <w:hyperlink r:id="rId105">
         <w:r>
           <w:rPr>
             <w:rStyle w:val="VerbatimChar"/>
@@ -54318,7 +54992,7 @@
       <w:r>
         <w:t xml:space="preserve"> </w:t>
       </w:r>
-      <w:hyperlink r:id="rId105">
+      <w:hyperlink r:id="rId106">
         <w:r>
           <w:rPr>
             <w:rStyle w:val="VerbatimChar"/>
@@ -54896,7 +55570,46 @@
         <w:t xml:space="preserve"> </w:t>
       </w:r>
       <w:r>
-        <w:t xml:space="preserve">bumps a generation word when one changed; core 0's 100 Hz tick hook (</w:t>
+        <w:t xml:space="preserve">bumps a generation word when one changed, then interrupts core 0 (</w:t>
+      </w:r>
+      <w:r>
+        <w:rPr>
+          <w:rStyle w:val="VerbatimChar"/>
+        </w:rPr>
+        <w:t xml:space="preserve">IPI_NET_READY</w:t>
+      </w:r>
+      <w:r>
+        <w:t xml:space="preserve">,</w:t>
+      </w:r>
+      <w:r>
+        <w:t xml:space="preserve"> </w:t>
+      </w:r>
+      <w:r>
+        <w:rPr>
+          <w:rStyle w:val="VerbatimChar"/>
+        </w:rPr>
+        <w:t xml:space="preserve">COnyxCores::IPIHandler</w:t>
+      </w:r>
+      <w:r>
+        <w:t xml:space="preserve"> </w:t>
+      </w:r>
+      <w:r>
+        <w:t xml:space="preserve">→</w:t>
+      </w:r>
+      <w:r>
+        <w:t xml:space="preserve"> </w:t>
+      </w:r>
+      <w:r>
+        <w:rPr>
+          <w:rStyle w:val="VerbatimChar"/>
+        </w:rPr>
+        <w:t xml:space="preserve">NetReadyIPI</w:t>
+      </w:r>
+      <w:r>
+        <w:t xml:space="preserve">; the 100 Hz tick hook</w:t>
+      </w:r>
+      <w:r>
+        <w:t xml:space="preserve"> </w:t>
       </w:r>
       <w:r>
         <w:rPr>
@@ -54905,13 +55618,10 @@
         <w:t xml:space="preserve">NetPollTick</w:t>
       </w:r>
       <w:r>
-        <w:t xml:space="preserve">) turns it</w:t>
-      </w:r>
-      <w:r>
-        <w:t xml:space="preserve"> </w:t>
-      </w:r>
-      <w:r>
-        <w:t xml:space="preserve">into</w:t>
+        <w:t xml:space="preserve"> </w:t>
+      </w:r>
+      <w:r>
+        <w:t xml:space="preserve">as the fallback):</w:t>
       </w:r>
       <w:r>
         <w:t xml:space="preserve"> </w:t>
@@ -54954,46 +55664,133 @@
           <w:b/>
           <w:bCs/>
         </w:rPr>
-        <w:t xml:space="preserve">A process that dies</w:t>
-      </w:r>
-      <w:r>
-        <w:t xml:space="preserve"> </w:t>
-      </w:r>
-      <w:r>
-        <w:t xml:space="preserve">(in a request, or with sockets open):</w:t>
-      </w:r>
-      <w:r>
-        <w:t xml:space="preserve"> </w:t>
-      </w:r>
-      <w:r>
-        <w:rPr>
-          <w:rStyle w:val="VerbatimChar"/>
-        </w:rPr>
-        <w:t xml:space="preserve">NetCloseByPid</w:t>
-      </w:r>
-      <w:r>
-        <w:t xml:space="preserve"> </w:t>
-      </w:r>
-      <w:r>
-        <w:t xml:space="preserve">(its</w:t>
-      </w:r>
-      <w:r>
-        <w:t xml:space="preserve"> </w:t>
-      </w:r>
-      <w:r>
-        <w:t xml:space="preserve">teardown, IRQs masked: nothing waits) drops its posted requests, orphans the running</w:t>
-      </w:r>
-      <w:r>
-        <w:t xml:space="preserve"> </w:t>
-      </w:r>
-      <w:r>
-        <w:t xml:space="preserve">ones (the worker then closes what they opened), and queues its pid in a ring that the</w:t>
-      </w:r>
-      <w:r>
-        <w:t xml:space="preserve"> </w:t>
-      </w:r>
-      <w:r>
-        <w:t xml:space="preserve">net core's main loop reads to close its sockets.</w:t>
+        <w:t xml:space="preserve">The Wi-Fi driver</w:t>
+      </w:r>
+      <w:r>
+        <w:t xml:space="preserve"> </w:t>
+      </w:r>
+      <w:r>
+        <w:t xml:space="preserve">is polled on this core instead of waiting for its SDIO interrupt, its</w:t>
+      </w:r>
+      <w:r>
+        <w:t xml:space="preserve"> </w:t>
+      </w:r>
+      <w:r>
+        <w:t xml:space="preserve">scans cover both bands and probe for the networks of</w:t>
+      </w:r>
+      <w:r>
+        <w:t xml:space="preserve"> </w:t>
+      </w:r>
+      <w:r>
+        <w:rPr>
+          <w:rStyle w:val="VerbatimChar"/>
+        </w:rPr>
+        <w:t xml:space="preserve">wpa_supplicant.conf</w:t>
+      </w:r>
+      <w:r>
+        <w:t xml:space="preserve"> </w:t>
+      </w:r>
+      <w:r>
+        <w:t xml:space="preserve">by name, 5 GHz</w:t>
+      </w:r>
+      <w:r>
+        <w:t xml:space="preserve"> </w:t>
+      </w:r>
+      <w:r>
+        <w:t xml:space="preserve">is preferred, a frame is one SDIO command on a 50 MHz bus (</w:t>
+      </w:r>
+      <w:r>
+        <w:rPr>
+          <w:rStyle w:val="VerbatimChar"/>
+        </w:rPr>
+        <w:t xml:space="preserve">onyx_wlfast = 31</w:t>
+      </w:r>
+      <w:r>
+        <w:t xml:space="preserve">), the frames</w:t>
+      </w:r>
+      <w:r>
+        <w:t xml:space="preserve"> </w:t>
+      </w:r>
+      <w:r>
+        <w:t xml:space="preserve">sent are not aggregated (</w:t>
+      </w:r>
+      <w:r>
+        <w:rPr>
+          <w:rStyle w:val="VerbatimChar"/>
+        </w:rPr>
+        <w:t xml:space="preserve">onyx_wl_ampdu_tx = 0</w:t>
+      </w:r>
+      <w:r>
+        <w:t xml:space="preserve">: aggregated, half of what the Pi sent during a</w:t>
+      </w:r>
+      <w:r>
+        <w:t xml:space="preserve"> </w:t>
+      </w:r>
+      <w:r>
+        <w:t xml:space="preserve">download was lost — the remote desktop froze) but sent in bursts (</w:t>
+      </w:r>
+      <w:r>
+        <w:rPr>
+          <w:rStyle w:val="VerbatimChar"/>
+        </w:rPr>
+        <w:t xml:space="preserve">onyx_wl_frameburst = 1</w:t>
+      </w:r>
+      <w:r>
+        <w:t xml:space="preserve">), and TCP scales its window and delays its</w:t>
+      </w:r>
+      <w:r>
+        <w:t xml:space="preserve"> </w:t>
+      </w:r>
+      <w:r>
+        <w:t xml:space="preserve">acknowledgements (</w:t>
+      </w:r>
+      <w:r>
+        <w:rPr>
+          <w:rStyle w:val="VerbatimChar"/>
+        </w:rPr>
+        <w:t xml:space="preserve">onyx_tcp_ws = 3</w:t>
+      </w:r>
+      <w:r>
+        <w:t xml:space="preserve">,</w:t>
+      </w:r>
+      <w:r>
+        <w:t xml:space="preserve"> </w:t>
+      </w:r>
+      <w:r>
+        <w:rPr>
+          <w:rStyle w:val="VerbatimChar"/>
+        </w:rPr>
+        <w:t xml:space="preserve">onyx_tcp_ackn = 8</w:t>
+      </w:r>
+      <w:r>
+        <w:t xml:space="preserve">) (</w:t>
+      </w:r>
+      <w:r>
+        <w:rPr>
+          <w:rStyle w:val="VerbatimChar"/>
+        </w:rPr>
+        <w:t xml:space="preserve">NetWlanOptions</w:t>
+      </w:r>
+      <w:r>
+        <w:t xml:space="preserve">,</w:t>
+      </w:r>
+      <w:r>
+        <w:t xml:space="preserve"> </w:t>
+      </w:r>
+      <w:r>
+        <w:rPr>
+          <w:rStyle w:val="VerbatimChar"/>
+        </w:rPr>
+        <w:t xml:space="preserve">NetWlanNames</w:t>
+      </w:r>
+      <w:r>
+        <w:t xml:space="preserve">;</w:t>
+      </w:r>
+      <w:r>
+        <w:t xml:space="preserve"> </w:t>
+      </w:r>
+      <w:r>
+        <w:t xml:space="preserve">our Circle fork, docs/05 §26 and §27).</w:t>
       </w:r>
     </w:p>
     <w:p>
@@ -55009,43 +55806,317 @@
           <w:b/>
           <w:bCs/>
         </w:rPr>
-        <w:t xml:space="preserve">Notices.</w:t>
-      </w:r>
-      <w:r>
-        <w:t xml:space="preserve"> </w:t>
-      </w:r>
-      <w:r>
-        <w:rPr>
-          <w:rStyle w:val="VerbatimChar"/>
-        </w:rPr>
-        <w:t xml:space="preserve">IpcNotify</w:t>
-      </w:r>
-      <w:r>
-        <w:t xml:space="preserve"> </w:t>
-      </w:r>
-      <w:r>
-        <w:t xml:space="preserve">is core 0's: the bring-up leaves its "Connected" notice to</w:t>
-      </w:r>
-      <w:r>
-        <w:t xml:space="preserve"> </w:t>
-      </w:r>
-      <w:r>
-        <w:rPr>
-          <w:rStyle w:val="VerbatimChar"/>
-        </w:rPr>
-        <w:t xml:space="preserve">NetCoreNotify</w:t>
-      </w:r>
-      <w:r>
-        <w:t xml:space="preserve">, and the kernel's main task delivers it (</w:t>
-      </w:r>
-      <w:r>
-        <w:rPr>
-          <w:rStyle w:val="VerbatimChar"/>
-        </w:rPr>
-        <w:t xml:space="preserve">NetCorePoll</w:t>
-      </w:r>
-      <w:r>
-        <w:t xml:space="preserve">, every 250 ms).</w:t>
+        <w:t xml:space="preserve">A trial.</w:t>
+      </w:r>
+      <w:r>
+        <w:t xml:space="preserve"> </w:t>
+      </w:r>
+      <w:r>
+        <w:t xml:space="preserve">A Pi is often reachable by its Wi-Fi only: a driver change that keeps the Wi-Fi</w:t>
+      </w:r>
+      <w:r>
+        <w:t xml:space="preserve"> </w:t>
+      </w:r>
+      <w:r>
+        <w:t xml:space="preserve">from coming up cannot be taken back from the PC.</w:t>
+      </w:r>
+      <w:r>
+        <w:t xml:space="preserve"> </w:t>
+      </w:r>
+      <w:r>
+        <w:rPr>
+          <w:rStyle w:val="VerbatimChar"/>
+        </w:rPr>
+        <w:t xml:space="preserve">SD:/etc/net-trial.txt</w:t>
+      </w:r>
+      <w:r>
+        <w:t xml:space="preserve"> </w:t>
+      </w:r>
+      <w:r>
+        <w:t xml:space="preserve">holds</w:t>
+      </w:r>
+      <w:r>
+        <w:t xml:space="preserve"> </w:t>
+      </w:r>
+      <w:r>
+        <w:rPr>
+          <w:rStyle w:val="VerbatimChar"/>
+        </w:rPr>
+        <w:t xml:space="preserve">name=value</w:t>
+      </w:r>
+      <w:r>
+        <w:t xml:space="preserve"> </w:t>
+      </w:r>
+      <w:r>
+        <w:t xml:space="preserve">words —</w:t>
+      </w:r>
+      <w:r>
+        <w:t xml:space="preserve"> </w:t>
+      </w:r>
+      <w:r>
+        <w:rPr>
+          <w:rStyle w:val="VerbatimChar"/>
+        </w:rPr>
+        <w:t xml:space="preserve">wlfast=</w:t>
+      </w:r>
+      <w:r>
+        <w:t xml:space="preserve"> </w:t>
+      </w:r>
+      <w:r>
+        <w:t xml:space="preserve">(the driver's fast path bits),</w:t>
+      </w:r>
+      <w:r>
+        <w:t xml:space="preserve"> </w:t>
+      </w:r>
+      <w:r>
+        <w:rPr>
+          <w:rStyle w:val="VerbatimChar"/>
+        </w:rPr>
+        <w:t xml:space="preserve">tcpws=</w:t>
+      </w:r>
+      <w:r>
+        <w:t xml:space="preserve">,</w:t>
+      </w:r>
+      <w:r>
+        <w:t xml:space="preserve"> </w:t>
+      </w:r>
+      <w:r>
+        <w:rPr>
+          <w:rStyle w:val="VerbatimChar"/>
+        </w:rPr>
+        <w:t xml:space="preserve">tcpwin=</w:t>
+      </w:r>
+      <w:r>
+        <w:t xml:space="preserve">,</w:t>
+      </w:r>
+      <w:r>
+        <w:t xml:space="preserve"> </w:t>
+      </w:r>
+      <w:r>
+        <w:rPr>
+          <w:rStyle w:val="VerbatimChar"/>
+        </w:rPr>
+        <w:t xml:space="preserve">ackn=</w:t>
+      </w:r>
+      <w:r>
+        <w:t xml:space="preserve">,</w:t>
+      </w:r>
+      <w:r>
+        <w:t xml:space="preserve"> </w:t>
+      </w:r>
+      <w:r>
+        <w:rPr>
+          <w:rStyle w:val="VerbatimChar"/>
+        </w:rPr>
+        <w:t xml:space="preserve">ampdutx=</w:t>
+      </w:r>
+      <w:r>
+        <w:t xml:space="preserve">,</w:t>
+      </w:r>
+      <w:r>
+        <w:t xml:space="preserve"> </w:t>
+      </w:r>
+      <w:r>
+        <w:rPr>
+          <w:rStyle w:val="VerbatimChar"/>
+        </w:rPr>
+        <w:t xml:space="preserve">ampdurx=</w:t>
+      </w:r>
+      <w:r>
+        <w:t xml:space="preserve">,</w:t>
+      </w:r>
+      <w:r>
+        <w:t xml:space="preserve"> </w:t>
+      </w:r>
+      <w:r>
+        <w:rPr>
+          <w:rStyle w:val="VerbatimChar"/>
+        </w:rPr>
+        <w:t xml:space="preserve">bawsize=</w:t>
+      </w:r>
+      <w:r>
+        <w:t xml:space="preserve">,</w:t>
+      </w:r>
+      <w:r>
+        <w:t xml:space="preserve"> </w:t>
+      </w:r>
+      <w:r>
+        <w:rPr>
+          <w:rStyle w:val="VerbatimChar"/>
+        </w:rPr>
+        <w:t xml:space="preserve">rxbawsize=</w:t>
+      </w:r>
+      <w:r>
+        <w:t xml:space="preserve">,</w:t>
+      </w:r>
+      <w:r>
+        <w:t xml:space="preserve"> </w:t>
+      </w:r>
+      <w:r>
+        <w:rPr>
+          <w:rStyle w:val="VerbatimChar"/>
+        </w:rPr>
+        <w:t xml:space="preserve">ampdurts=</w:t>
+      </w:r>
+      <w:r>
+        <w:t xml:space="preserve">,</w:t>
+      </w:r>
+      <w:r>
+        <w:t xml:space="preserve"> </w:t>
+      </w:r>
+      <w:r>
+        <w:rPr>
+          <w:rStyle w:val="VerbatimChar"/>
+        </w:rPr>
+        <w:t xml:space="preserve">bw5=</w:t>
+      </w:r>
+      <w:r>
+        <w:t xml:space="preserve">,</w:t>
+      </w:r>
+      <w:r>
+        <w:t xml:space="preserve"> </w:t>
+      </w:r>
+      <w:r>
+        <w:rPr>
+          <w:rStyle w:val="VerbatimChar"/>
+        </w:rPr>
+        <w:t xml:space="preserve">frameburst=</w:t>
+      </w:r>
+      <w:r>
+        <w:t xml:space="preserve">,</w:t>
+      </w:r>
+      <w:r>
+        <w:t xml:space="preserve"> </w:t>
+      </w:r>
+      <w:r>
+        <w:rPr>
+          <w:rStyle w:val="VerbatimChar"/>
+        </w:rPr>
+        <w:t xml:space="preserve">netstat=1</w:t>
+      </w:r>
+      <w:r>
+        <w:t xml:space="preserve"> </w:t>
+      </w:r>
+      <w:r>
+        <w:t xml:space="preserve">(the statistics, the</w:t>
+      </w:r>
+      <w:r>
+        <w:t xml:space="preserve"> </w:t>
+      </w:r>
+      <w:r>
+        <w:t xml:space="preserve">firmware's counters, TCP's timeouts in the log),</w:t>
+      </w:r>
+      <w:r>
+        <w:t xml:space="preserve"> </w:t>
+      </w:r>
+      <w:r>
+        <w:rPr>
+          <w:rStyle w:val="VerbatimChar"/>
+        </w:rPr>
+        <w:t xml:space="preserve">secs=</w:t>
+      </w:r>
+      <w:r>
+        <w:t xml:space="preserve"> </w:t>
+      </w:r>
+      <w:r>
+        <w:t xml:space="preserve">(default 180) —; the bring-up reads it,</w:t>
+      </w:r>
+      <w:r>
+        <w:t xml:space="preserve"> </w:t>
+      </w:r>
+      <w:r>
+        <w:rPr>
+          <w:b/>
+          <w:bCs/>
+        </w:rPr>
+        <w:t xml:space="preserve">deletes it</w:t>
+      </w:r>
+      <w:r>
+        <w:t xml:space="preserve">, applies it for this boot (</w:t>
+      </w:r>
+      <w:r>
+        <w:rPr>
+          <w:rStyle w:val="VerbatimChar"/>
+        </w:rPr>
+        <w:t xml:space="preserve">NetTrialLoad</w:t>
+      </w:r>
+      <w:r>
+        <w:t xml:space="preserve">), and</w:t>
+      </w:r>
+      <w:r>
+        <w:t xml:space="preserve"> </w:t>
+      </w:r>
+      <w:r>
+        <w:t xml:space="preserve">core 0's main task restarts the Pi after</w:t>
+      </w:r>
+      <w:r>
+        <w:t xml:space="preserve"> </w:t>
+      </w:r>
+      <w:r>
+        <w:rPr>
+          <w:rStyle w:val="VerbatimChar"/>
+        </w:rPr>
+        <w:t xml:space="preserve">secs</w:t>
+      </w:r>
+      <w:r>
+        <w:t xml:space="preserve"> </w:t>
+      </w:r>
+      <w:r>
+        <w:t xml:space="preserve">(</w:t>
+      </w:r>
+      <w:r>
+        <w:rPr>
+          <w:rStyle w:val="VerbatimChar"/>
+        </w:rPr>
+        <w:t xml:space="preserve">NetTrialPoll</w:t>
+      </w:r>
+      <w:r>
+        <w:t xml:space="preserve">) unless</w:t>
+      </w:r>
+      <w:r>
+        <w:t xml:space="preserve"> </w:t>
+      </w:r>
+      <w:r>
+        <w:rPr>
+          <w:rStyle w:val="VerbatimChar"/>
+        </w:rPr>
+        <w:t xml:space="preserve">SD:/etc/net-trial.keep</w:t>
+      </w:r>
+      <w:r>
+        <w:t xml:space="preserve"> </w:t>
+      </w:r>
+      <w:r>
+        <w:t xml:space="preserve">exists by then: the next boot is without the trial. Before the</w:t>
+      </w:r>
+      <w:r>
+        <w:t xml:space="preserve"> </w:t>
+      </w:r>
+      <w:r>
+        <w:t xml:space="preserve">restart the kernel log's tail (24 KB) is written to</w:t>
+      </w:r>
+      <w:r>
+        <w:t xml:space="preserve"> </w:t>
+      </w:r>
+      <w:r>
+        <w:rPr>
+          <w:rStyle w:val="VerbatimChar"/>
+        </w:rPr>
+        <w:t xml:space="preserve">SD:/etc/net-trial.log</w:t>
+      </w:r>
+      <w:r>
+        <w:t xml:space="preserve">: what the driver</w:t>
+      </w:r>
+      <w:r>
+        <w:t xml:space="preserve"> </w:t>
+      </w:r>
+      <w:r>
+        <w:t xml:space="preserve">said during a trial that cut the network is read after it. A new switch is</w:t>
+      </w:r>
+      <w:r>
+        <w:t xml:space="preserve"> </w:t>
+      </w:r>
+      <w:r>
+        <w:t xml:space="preserve">added there, tried, and only then made the default.</w:t>
       </w:r>
     </w:p>
     <w:p>
@@ -55057,6 +56128,163 @@
         </w:numPr>
       </w:pPr>
       <w:r>
+        <w:rPr>
+          <w:rStyle w:val="VerbatimChar"/>
+          <w:b/>
+          <w:bCs/>
+        </w:rPr>
+        <w:t xml:space="preserve">netstat=1</w:t>
+      </w:r>
+      <w:r>
+        <w:t xml:space="preserve"> </w:t>
+      </w:r>
+      <w:r>
+        <w:t xml:space="preserve">(</w:t>
+      </w:r>
+      <w:r>
+        <w:rPr>
+          <w:rStyle w:val="VerbatimChar"/>
+        </w:rPr>
+        <w:t xml:space="preserve">cmdline.txt</w:t>
+      </w:r>
+      <w:r>
+        <w:t xml:space="preserve">): every 5 s the log says the net core's pace (</w:t>
+      </w:r>
+      <w:r>
+        <w:rPr>
+          <w:rStyle w:val="VerbatimChar"/>
+        </w:rPr>
+        <w:t xml:space="preserve">net: core 3: N rounds/s, … us a round</w:t>
+      </w:r>
+      <w:r>
+        <w:t xml:space="preserve"> </w:t>
+      </w:r>
+      <w:r>
+        <w:t xml:space="preserve">— the stack's tasks all wait by yielding, so a round is the unit of</w:t>
+      </w:r>
+      <w:r>
+        <w:t xml:space="preserve"> </w:t>
+      </w:r>
+      <w:r>
+        <w:t xml:space="preserve">every wait: ~13 µs) and the driver's (frames a second, a frame's read time, the link's rate).</w:t>
+      </w:r>
+    </w:p>
+    <w:p>
+      <w:pPr>
+        <w:pStyle w:val="Compact"/>
+        <w:numPr>
+          <w:ilvl w:val="1"/>
+          <w:numId w:val="1027"/>
+        </w:numPr>
+      </w:pPr>
+      <w:r>
+        <w:rPr>
+          <w:b/>
+          <w:bCs/>
+        </w:rPr>
+        <w:t xml:space="preserve">A process that dies</w:t>
+      </w:r>
+      <w:r>
+        <w:t xml:space="preserve"> </w:t>
+      </w:r>
+      <w:r>
+        <w:t xml:space="preserve">(in a request, or with sockets open):</w:t>
+      </w:r>
+      <w:r>
+        <w:t xml:space="preserve"> </w:t>
+      </w:r>
+      <w:r>
+        <w:rPr>
+          <w:rStyle w:val="VerbatimChar"/>
+        </w:rPr>
+        <w:t xml:space="preserve">NetCloseByPid</w:t>
+      </w:r>
+      <w:r>
+        <w:t xml:space="preserve"> </w:t>
+      </w:r>
+      <w:r>
+        <w:t xml:space="preserve">(its</w:t>
+      </w:r>
+      <w:r>
+        <w:t xml:space="preserve"> </w:t>
+      </w:r>
+      <w:r>
+        <w:t xml:space="preserve">teardown, IRQs masked: nothing waits) drops its posted requests, orphans the running</w:t>
+      </w:r>
+      <w:r>
+        <w:t xml:space="preserve"> </w:t>
+      </w:r>
+      <w:r>
+        <w:t xml:space="preserve">ones (the worker then closes what they opened), and queues its pid in a ring that the</w:t>
+      </w:r>
+      <w:r>
+        <w:t xml:space="preserve"> </w:t>
+      </w:r>
+      <w:r>
+        <w:t xml:space="preserve">net core's main loop reads to close its sockets.</w:t>
+      </w:r>
+    </w:p>
+    <w:p>
+      <w:pPr>
+        <w:pStyle w:val="Compact"/>
+        <w:numPr>
+          <w:ilvl w:val="1"/>
+          <w:numId w:val="1027"/>
+        </w:numPr>
+      </w:pPr>
+      <w:r>
+        <w:rPr>
+          <w:b/>
+          <w:bCs/>
+        </w:rPr>
+        <w:t xml:space="preserve">Notices.</w:t>
+      </w:r>
+      <w:r>
+        <w:t xml:space="preserve"> </w:t>
+      </w:r>
+      <w:r>
+        <w:rPr>
+          <w:rStyle w:val="VerbatimChar"/>
+        </w:rPr>
+        <w:t xml:space="preserve">IpcNotify</w:t>
+      </w:r>
+      <w:r>
+        <w:t xml:space="preserve"> </w:t>
+      </w:r>
+      <w:r>
+        <w:t xml:space="preserve">is core 0's: the bring-up leaves its "Connected" notice to</w:t>
+      </w:r>
+      <w:r>
+        <w:t xml:space="preserve"> </w:t>
+      </w:r>
+      <w:r>
+        <w:rPr>
+          <w:rStyle w:val="VerbatimChar"/>
+        </w:rPr>
+        <w:t xml:space="preserve">NetCoreNotify</w:t>
+      </w:r>
+      <w:r>
+        <w:t xml:space="preserve">, and the kernel's main task delivers it (</w:t>
+      </w:r>
+      <w:r>
+        <w:rPr>
+          <w:rStyle w:val="VerbatimChar"/>
+        </w:rPr>
+        <w:t xml:space="preserve">NetCorePoll</w:t>
+      </w:r>
+      <w:r>
+        <w:t xml:space="preserve">, every 250 ms).</w:t>
+      </w:r>
+    </w:p>
+    <w:p>
+      <w:pPr>
+        <w:pStyle w:val="Compact"/>
+        <w:numPr>
+          <w:ilvl w:val="1"/>
+          <w:numId w:val="1027"/>
+        </w:numPr>
+      </w:pPr>
+      <w:r>
         <w:t xml:space="preserve">Core 3 is then no longer an app core (§14).</w:t>
       </w:r>
     </w:p>
@@ -56709,8 +57937,8 @@
         </w:pict>
       </w:r>
     </w:p>
-    <w:bookmarkEnd w:id="106"/>
-    <w:bookmarkStart w:id="110" w:name="Xb96593a02e959a86ae343ca4fa42e9defb57306"/>
+    <w:bookmarkEnd w:id="107"/>
+    <w:bookmarkStart w:id="111" w:name="Xb96593a02e959a86ae343ca4fa42e9defb57306"/>
     <w:p>
       <w:pPr>
         <w:pStyle w:val="Heading2"/>
@@ -56729,7 +57957,7 @@
       <w:r>
         <w:t xml:space="preserve"> </w:t>
       </w:r>
-      <w:hyperlink r:id="rId107">
+      <w:hyperlink r:id="rId108">
         <w:r>
           <w:rPr>
             <w:rStyle w:val="VerbatimChar"/>
@@ -56743,7 +57971,7 @@
       <w:r>
         <w:t xml:space="preserve"> </w:t>
       </w:r>
-      <w:hyperlink r:id="rId108">
+      <w:hyperlink r:id="rId109">
         <w:r>
           <w:rPr>
             <w:rStyle w:val="VerbatimChar"/>
@@ -56794,7 +58022,7 @@
       <w:r>
         <w:t xml:space="preserve"> </w:t>
       </w:r>
-      <w:hyperlink r:id="rId109">
+      <w:hyperlink r:id="rId110">
         <w:r>
           <w:rPr>
             <w:rStyle w:val="Hyperlink"/>
@@ -58332,8 +59560,8 @@
         <w:t xml:space="preserve">(above).</w:t>
       </w:r>
     </w:p>
-    <w:bookmarkEnd w:id="110"/>
-    <w:bookmarkStart w:id="116" w:name="Xfa019e876c205b51820d387dd2b0ef1f0c66c95"/>
+    <w:bookmarkEnd w:id="111"/>
+    <w:bookmarkStart w:id="117" w:name="Xfa019e876c205b51820d387dd2b0ef1f0c66c95"/>
     <w:p>
       <w:pPr>
         <w:pStyle w:val="Heading2"/>
@@ -58352,7 +59580,7 @@
       <w:r>
         <w:t xml:space="preserve"> </w:t>
       </w:r>
-      <w:hyperlink r:id="rId111">
+      <w:hyperlink r:id="rId112">
         <w:r>
           <w:rPr>
             <w:rStyle w:val="VerbatimChar"/>
@@ -58366,7 +59594,7 @@
       <w:r>
         <w:t xml:space="preserve"> </w:t>
       </w:r>
-      <w:hyperlink r:id="rId112">
+      <w:hyperlink r:id="rId113">
         <w:r>
           <w:rPr>
             <w:rStyle w:val="VerbatimChar"/>
@@ -58708,7 +59936,7 @@
         <w:t xml:space="preserve">contend for the framebuffer.</w:t>
       </w:r>
     </w:p>
-    <w:bookmarkStart w:id="115" w:name="the-crash-record-lastcrashtxt"/>
+    <w:bookmarkStart w:id="116" w:name="the-crash-record-lastcrashtxt"/>
     <w:p>
       <w:pPr>
         <w:pStyle w:val="Heading3"/>
@@ -58736,7 +59964,7 @@
       <w:r>
         <w:t xml:space="preserve"> </w:t>
       </w:r>
-      <w:hyperlink r:id="rId113">
+      <w:hyperlink r:id="rId114">
         <w:r>
           <w:rPr>
             <w:rStyle w:val="VerbatimChar"/>
@@ -58750,7 +59978,7 @@
       <w:r>
         <w:t xml:space="preserve"> </w:t>
       </w:r>
-      <w:hyperlink r:id="rId114">
+      <w:hyperlink r:id="rId115">
         <w:r>
           <w:rPr>
             <w:rStyle w:val="VerbatimChar"/>
@@ -60352,9 +61580,9 @@
         </w:pict>
       </w:r>
     </w:p>
-    <w:bookmarkEnd w:id="115"/>
     <w:bookmarkEnd w:id="116"/>
-    <w:bookmarkStart w:id="121" w:name="X0df50f13635c1fcb933e538121f0d903fe1ec80"/>
+    <w:bookmarkEnd w:id="117"/>
+    <w:bookmarkStart w:id="122" w:name="X0df50f13635c1fcb933e538121f0d903fe1ec80"/>
     <w:p>
       <w:pPr>
         <w:pStyle w:val="Heading2"/>
@@ -60373,7 +61601,7 @@
       <w:r>
         <w:t xml:space="preserve"> </w:t>
       </w:r>
-      <w:hyperlink r:id="rId117">
+      <w:hyperlink r:id="rId118">
         <w:r>
           <w:rPr>
             <w:rStyle w:val="VerbatimChar"/>
@@ -60387,7 +61615,7 @@
       <w:r>
         <w:t xml:space="preserve"> </w:t>
       </w:r>
-      <w:hyperlink r:id="rId118">
+      <w:hyperlink r:id="rId119">
         <w:r>
           <w:rPr>
             <w:rStyle w:val="VerbatimChar"/>
@@ -60401,7 +61629,7 @@
       <w:r>
         <w:t xml:space="preserve"> </w:t>
       </w:r>
-      <w:hyperlink r:id="rId119">
+      <w:hyperlink r:id="rId120">
         <w:r>
           <w:rPr>
             <w:rStyle w:val="VerbatimChar"/>
@@ -60415,7 +61643,7 @@
       <w:r>
         <w:t xml:space="preserve"> </w:t>
       </w:r>
-      <w:hyperlink r:id="rId120">
+      <w:hyperlink r:id="rId121">
         <w:r>
           <w:rPr>
             <w:rStyle w:val="VerbatimChar"/>
@@ -62326,8 +63554,8 @@
         <w:t xml:space="preserve">), with its malloc, files and saves.</w:t>
       </w:r>
     </w:p>
-    <w:bookmarkEnd w:id="121"/>
-    <w:bookmarkStart w:id="126" w:name="Xf861c8e521de19b85a9fa568838296e214f81a0"/>
+    <w:bookmarkEnd w:id="122"/>
+    <w:bookmarkStart w:id="127" w:name="Xf861c8e521de19b85a9fa568838296e214f81a0"/>
     <w:p>
       <w:pPr>
         <w:pStyle w:val="Heading2"/>
@@ -62346,7 +63574,7 @@
       <w:r>
         <w:t xml:space="preserve"> </w:t>
       </w:r>
-      <w:hyperlink r:id="rId122">
+      <w:hyperlink r:id="rId123">
         <w:r>
           <w:rPr>
             <w:rStyle w:val="VerbatimChar"/>
@@ -62360,7 +63588,7 @@
       <w:r>
         <w:t xml:space="preserve"> </w:t>
       </w:r>
-      <w:hyperlink r:id="rId123">
+      <w:hyperlink r:id="rId124">
         <w:r>
           <w:rPr>
             <w:rStyle w:val="VerbatimChar"/>
@@ -63529,7 +64757,7 @@
       <w:r>
         <w:t xml:space="preserve"> </w:t>
       </w:r>
-      <w:hyperlink r:id="rId124">
+      <w:hyperlink r:id="rId125">
         <w:r>
           <w:rPr>
             <w:rStyle w:val="VerbatimChar"/>
@@ -64911,7 +66139,7 @@
       <w:r>
         <w:t xml:space="preserve"> </w:t>
       </w:r>
-      <w:hyperlink r:id="rId125">
+      <w:hyperlink r:id="rId126">
         <w:r>
           <w:rPr>
             <w:rStyle w:val="VerbatimChar"/>
@@ -66171,8 +67399,8 @@
         </w:pict>
       </w:r>
     </w:p>
-    <w:bookmarkEnd w:id="126"/>
-    <w:bookmarkStart w:id="131" w:name="Xa7f002f42b8b233630f11dbad8c3740c73af4cd"/>
+    <w:bookmarkEnd w:id="127"/>
+    <w:bookmarkStart w:id="132" w:name="Xa7f002f42b8b233630f11dbad8c3740c73af4cd"/>
     <w:p>
       <w:pPr>
         <w:pStyle w:val="Heading2"/>
@@ -66191,7 +67419,7 @@
       <w:r>
         <w:t xml:space="preserve"> </w:t>
       </w:r>
-      <w:hyperlink r:id="rId127">
+      <w:hyperlink r:id="rId128">
         <w:r>
           <w:rPr>
             <w:rStyle w:val="VerbatimChar"/>
@@ -66205,7 +67433,7 @@
       <w:r>
         <w:t xml:space="preserve"> </w:t>
       </w:r>
-      <w:hyperlink r:id="rId128">
+      <w:hyperlink r:id="rId129">
         <w:r>
           <w:rPr>
             <w:rStyle w:val="VerbatimChar"/>
@@ -66231,7 +67459,7 @@
       <w:r>
         <w:t xml:space="preserve">(</w:t>
       </w:r>
-      <w:hyperlink r:id="rId90">
+      <w:hyperlink r:id="rId91">
         <w:r>
           <w:rPr>
             <w:rStyle w:val="VerbatimChar"/>
@@ -66265,7 +67493,7 @@
       <w:r>
         <w:t xml:space="preserve"> </w:t>
       </w:r>
-      <w:hyperlink r:id="rId129">
+      <w:hyperlink r:id="rId130">
         <w:r>
           <w:rPr>
             <w:rStyle w:val="VerbatimChar"/>
@@ -66279,7 +67507,7 @@
       <w:r>
         <w:t xml:space="preserve"> </w:t>
       </w:r>
-      <w:hyperlink r:id="rId130">
+      <w:hyperlink r:id="rId131">
         <w:r>
           <w:rPr>
             <w:rStyle w:val="VerbatimChar"/>
@@ -68273,8 +69501,8 @@
         </w:pict>
       </w:r>
     </w:p>
-    <w:bookmarkEnd w:id="131"/>
-    <w:bookmarkStart w:id="132" w:name="annex--useful-constants"/>
+    <w:bookmarkEnd w:id="132"/>
+    <w:bookmarkStart w:id="133" w:name="annex--useful-constants"/>
     <w:p>
       <w:pPr>
         <w:pStyle w:val="Heading2"/>
@@ -69181,7 +70409,7 @@
         </w:tc>
       </w:tr>
     </w:tbl>
-    <w:bookmarkEnd w:id="132"/>
+    <w:bookmarkEnd w:id="133"/>
     <w:sectPr>
       <w:footerReference r:id="rId9" w:type="default"/>
       <w:footnotePr>

</xml_diff>

<commit_message>
Task Manager: the Processor and Network tabs; kapi v80 cpu_stats / net_stats (the cores' busy time, the bytes by process)
- cpu_stats (slot 257): each core's role, busy microseconds and owner. A core with a scheduler counts
  the time its tasks ran, the idle task apart (CScheduler::Yield); core 1 the time it renders sound; an
  app core the time its jobs ran. The network core polls: it reads 100 %.
- net_stats (slot 258): the payload bytes a process's sockets received and sent (pid 0: all), counted
  on core 0 where the calls return (NetTcpSend/Recv, NetSockSend/Recv).
- taskman: a panel a core (what it does, its load now and over the last minute); the network's rates
  and totals, the last minute drawn, the apps that use it. Grey on an older kernel.

Co-Authored-By: Claude Opus 5.5 <noreply@anthropic.com>
</commit_message>
<xml_diff>
--- a/docs/exports/02-KERNEL-INTERNALS.docx
+++ b/docs/exports/02-KERNEL-INTERNALS.docx
@@ -21715,7 +21715,7 @@
     </w:p>
     <w:bookmarkEnd w:id="74"/>
     <w:bookmarkEnd w:id="75"/>
-    <w:bookmarkStart w:id="90" w:name="X277d88280f3f4acecd0386230c1d60a44106d3c"/>
+    <w:bookmarkStart w:id="91" w:name="X277d88280f3f4acecd0386230c1d60a44106d3c"/>
     <w:p>
       <w:pPr>
         <w:pStyle w:val="Heading2"/>
@@ -25381,6 +25381,71 @@
           <w:iCs/>
         </w:rPr>
         <w:t xml:space="preserve">v79: kernel_info</w:t>
+      </w:r>
+      <w:r>
+        <w:t xml:space="preserve"> </w:t>
+      </w:r>
+      <w:r>
+        <w:t xml:space="preserve">below),</w:t>
+      </w:r>
+      <w:r>
+        <w:t xml:space="preserve"> </w:t>
+      </w:r>
+      <w:r>
+        <w:t xml:space="preserve">v80 =</w:t>
+      </w:r>
+      <w:r>
+        <w:t xml:space="preserve"> </w:t>
+      </w:r>
+      <w:r>
+        <w:rPr>
+          <w:b/>
+          <w:bCs/>
+        </w:rPr>
+        <w:t xml:space="preserve">the cores' load and the network's bytes by process</w:t>
+      </w:r>
+      <w:r>
+        <w:t xml:space="preserve">:</w:t>
+      </w:r>
+      <w:r>
+        <w:t xml:space="preserve"> </w:t>
+      </w:r>
+      <w:r>
+        <w:rPr>
+          <w:rStyle w:val="VerbatimChar"/>
+        </w:rPr>
+        <w:t xml:space="preserve">cpu_stats</w:t>
+      </w:r>
+      <w:r>
+        <w:t xml:space="preserve">,</w:t>
+      </w:r>
+      <w:r>
+        <w:t xml:space="preserve"> </w:t>
+      </w:r>
+      <w:r>
+        <w:rPr>
+          <w:rStyle w:val="VerbatimChar"/>
+        </w:rPr>
+        <w:t xml:space="preserve">net_stats</w:t>
+      </w:r>
+      <w:r>
+        <w:t xml:space="preserve"> </w:t>
+      </w:r>
+      <w:r>
+        <w:t xml:space="preserve">(slots 257,</w:t>
+      </w:r>
+      <w:r>
+        <w:t xml:space="preserve"> </w:t>
+      </w:r>
+      <w:r>
+        <w:t xml:space="preserve">258), for the Task Manager's Processor and Network tabs (</w:t>
+      </w:r>
+      <w:r>
+        <w:rPr>
+          <w:i/>
+          <w:iCs/>
+        </w:rPr>
+        <w:t xml:space="preserve">v80: cpu_stats, net_stats</w:t>
       </w:r>
       <w:r>
         <w:t xml:space="preserve"> </w:t>
@@ -49730,13 +49795,13 @@
       </w:r>
     </w:p>
     <w:bookmarkEnd w:id="88"/>
-    <w:bookmarkStart w:id="89" w:name="v79-kernel_info"/>
+    <w:bookmarkStart w:id="89" w:name="v80-cpu_stats-net_stats"/>
     <w:p>
       <w:pPr>
         <w:pStyle w:val="Heading3"/>
       </w:pPr>
       <w:r>
-        <w:t xml:space="preserve">v79: kernel_info</w:t>
+        <w:t xml:space="preserve">v80: cpu_stats, net_stats</w:t>
       </w:r>
     </w:p>
     <w:tbl>
@@ -49796,7 +49861,7 @@
               <w:pStyle w:val="Compact"/>
             </w:pPr>
             <w:r>
-              <w:t xml:space="preserve">256</w:t>
+              <w:t xml:space="preserve">257</w:t>
             </w:r>
           </w:p>
         </w:tc>
@@ -49810,7 +49875,7 @@
               <w:rPr>
                 <w:rStyle w:val="VerbatimChar"/>
               </w:rPr>
-              <w:t xml:space="preserve">kernel_info (buf, cap)</w:t>
+              <w:t xml:space="preserve">cpu_stats (out)</w:t>
             </w:r>
           </w:p>
         </w:tc>
@@ -49821,46 +49886,82 @@
               <w:pStyle w:val="Compact"/>
             </w:pPr>
             <w:r>
-              <w:t xml:space="preserve">what the running kernel is, as</w:t>
-            </w:r>
-            <w:r>
-              <w:t xml:space="preserve"> </w:t>
-            </w:r>
-            <w:r>
-              <w:rPr>
-                <w:rStyle w:val="VerbatimChar"/>
-              </w:rPr>
-              <w:t xml:space="preserve">key value</w:t>
-            </w:r>
-            <w:r>
-              <w:t xml:space="preserve"> </w:t>
-            </w:r>
-            <w:r>
-              <w:t xml:space="preserve">lines:</w:t>
-            </w:r>
-            <w:r>
-              <w:t xml:space="preserve"> </w:t>
-            </w:r>
-            <w:r>
-              <w:rPr>
-                <w:rStyle w:val="VerbatimChar"/>
-              </w:rPr>
-              <w:t xml:space="preserve">name</w:t>
-            </w:r>
-            <w:r>
-              <w:t xml:space="preserve"> </w:t>
-            </w:r>
-            <w:r>
-              <w:t xml:space="preserve">(Onyx),</w:t>
-            </w:r>
-            <w:r>
-              <w:t xml:space="preserve"> </w:t>
-            </w:r>
-            <w:r>
-              <w:rPr>
-                <w:rStyle w:val="VerbatimChar"/>
-              </w:rPr>
-              <w:t xml:space="preserve">abi</w:t>
+              <w:rPr>
+                <w:rStyle w:val="VerbatimChar"/>
+              </w:rPr>
+              <w:t xml:space="preserve">struct kapi_cpu_stats</w:t>
+            </w:r>
+            <w:r>
+              <w:t xml:space="preserve"> </w:t>
+            </w:r>
+            <w:r>
+              <w:t xml:space="preserve">(144 bytes):</w:t>
+            </w:r>
+            <w:r>
+              <w:t xml:space="preserve"> </w:t>
+            </w:r>
+            <w:r>
+              <w:rPr>
+                <w:rStyle w:val="VerbatimChar"/>
+              </w:rPr>
+              <w:t xml:space="preserve">now_us</w:t>
+            </w:r>
+            <w:r>
+              <w:t xml:space="preserve"> </w:t>
+            </w:r>
+            <w:r>
+              <w:t xml:space="preserve">(the clock of the read),</w:t>
+            </w:r>
+            <w:r>
+              <w:t xml:space="preserve"> </w:t>
+            </w:r>
+            <w:r>
+              <w:rPr>
+                <w:rStyle w:val="VerbatimChar"/>
+              </w:rPr>
+              <w:t xml:space="preserve">cores</w:t>
+            </w:r>
+            <w:r>
+              <w:t xml:space="preserve">, then a</w:t>
+            </w:r>
+            <w:r>
+              <w:t xml:space="preserve"> </w:t>
+            </w:r>
+            <w:r>
+              <w:rPr>
+                <w:rStyle w:val="VerbatimChar"/>
+              </w:rPr>
+              <w:t xml:space="preserve">kapi_cpu_core</w:t>
+            </w:r>
+            <w:r>
+              <w:t xml:space="preserve"> </w:t>
+            </w:r>
+            <w:r>
+              <w:t xml:space="preserve">a core —</w:t>
+            </w:r>
+            <w:r>
+              <w:t xml:space="preserve"> </w:t>
+            </w:r>
+            <w:r>
+              <w:rPr>
+                <w:rStyle w:val="VerbatimChar"/>
+              </w:rPr>
+              <w:t xml:space="preserve">busy_us</w:t>
+            </w:r>
+            <w:r>
+              <w:t xml:space="preserve"> </w:t>
+            </w:r>
+            <w:r>
+              <w:t xml:space="preserve">(the microseconds it was busy since the boot),</w:t>
+            </w:r>
+            <w:r>
+              <w:t xml:space="preserve"> </w:t>
+            </w:r>
+            <w:r>
+              <w:rPr>
+                <w:rStyle w:val="VerbatimChar"/>
+              </w:rPr>
+              <w:t xml:space="preserve">role</w:t>
             </w:r>
             <w:r>
               <w:t xml:space="preserve"> </w:t>
@@ -49872,124 +49973,234 @@
               <w:rPr>
                 <w:rStyle w:val="VerbatimChar"/>
               </w:rPr>
-              <w:t xml:space="preserve">KAPI_ABI_VERSION</w:t>
-            </w:r>
-            <w:r>
-              <w:t xml:space="preserve">),</w:t>
-            </w:r>
-            <w:r>
-              <w:t xml:space="preserve"> </w:t>
-            </w:r>
-            <w:r>
-              <w:rPr>
-                <w:rStyle w:val="VerbatimChar"/>
-              </w:rPr>
-              <w:t xml:space="preserve">built</w:t>
-            </w:r>
-            <w:r>
-              <w:t xml:space="preserve"> </w:t>
-            </w:r>
-            <w:r>
-              <w:t xml:space="preserve">(the date and time of the image's link),</w:t>
-            </w:r>
-            <w:r>
-              <w:t xml:space="preserve"> </w:t>
-            </w:r>
-            <w:r>
-              <w:rPr>
-                <w:rStyle w:val="VerbatimChar"/>
-              </w:rPr>
-              <w:t xml:space="preserve">rev</w:t>
-            </w:r>
-            <w:r>
-              <w:t xml:space="preserve"> </w:t>
-            </w:r>
-            <w:r>
-              <w:t xml:space="preserve">(the source's git revision;</w:t>
-            </w:r>
-            <w:r>
-              <w:t xml:space="preserve"> </w:t>
-            </w:r>
-            <w:r>
-              <w:rPr>
-                <w:rStyle w:val="VerbatimChar"/>
-              </w:rPr>
-              <w:t xml:space="preserve">+</w:t>
-            </w:r>
-            <w:r>
-              <w:t xml:space="preserve">: built from changed sources),</w:t>
-            </w:r>
-            <w:r>
-              <w:t xml:space="preserve"> </w:t>
-            </w:r>
-            <w:r>
-              <w:rPr>
-                <w:rStyle w:val="VerbatimChar"/>
-              </w:rPr>
-              <w:t xml:space="preserve">machine</w:t>
-            </w:r>
-            <w:r>
-              <w:t xml:space="preserve"> </w:t>
-            </w:r>
-            <w:r>
-              <w:t xml:space="preserve">(aarch64),</w:t>
-            </w:r>
-            <w:r>
-              <w:t xml:space="preserve"> </w:t>
-            </w:r>
-            <w:r>
-              <w:rPr>
-                <w:rStyle w:val="VerbatimChar"/>
-              </w:rPr>
-              <w:t xml:space="preserve">model</w:t>
-            </w:r>
-            <w:r>
-              <w:t xml:space="preserve"> </w:t>
-            </w:r>
-            <w:r>
-              <w:t xml:space="preserve">(the board's name),</w:t>
-            </w:r>
-            <w:r>
-              <w:t xml:space="preserve"> </w:t>
-            </w:r>
-            <w:r>
-              <w:rPr>
-                <w:rStyle w:val="VerbatimChar"/>
-              </w:rPr>
-              <w:t xml:space="preserve">ram</w:t>
-            </w:r>
-            <w:r>
-              <w:t xml:space="preserve"> </w:t>
-            </w:r>
-            <w:r>
-              <w:t xml:space="preserve">(MB). Up to</w:t>
-            </w:r>
-            <w:r>
-              <w:t xml:space="preserve"> </w:t>
-            </w:r>
-            <w:r>
-              <w:rPr>
-                <w:rStyle w:val="VerbatimChar"/>
-              </w:rPr>
-              <w:t xml:space="preserve">cap</w:t>
-            </w:r>
-            <w:r>
-              <w:t xml:space="preserve"> </w:t>
-            </w:r>
-            <w:r>
-              <w:t xml:space="preserve">− 1 bytes and a NUL → the text's whole length;</w:t>
-            </w:r>
-            <w:r>
-              <w:t xml:space="preserve"> </w:t>
-            </w:r>
-            <w:r>
-              <w:rPr>
-                <w:rStyle w:val="VerbatimChar"/>
-              </w:rPr>
-              <w:t xml:space="preserve">EFAULT</w:t>
-            </w:r>
-            <w:r>
-              <w:t xml:space="preserve">. Keys may be added: a reader looks its keys up.</w:t>
+              <w:t xml:space="preserve">KAPI_CORE_SYSTEM</w:t>
+            </w:r>
+            <w:r>
+              <w:t xml:space="preserve"> </w:t>
+            </w:r>
+            <w:r>
+              <w:t xml:space="preserve">0,</w:t>
+            </w:r>
+            <w:r>
+              <w:t xml:space="preserve"> </w:t>
+            </w:r>
+            <w:r>
+              <w:rPr>
+                <w:rStyle w:val="VerbatimChar"/>
+              </w:rPr>
+              <w:t xml:space="preserve">KAPI_CORE_SOUND</w:t>
+            </w:r>
+            <w:r>
+              <w:t xml:space="preserve"> </w:t>
+            </w:r>
+            <w:r>
+              <w:t xml:space="preserve">1,</w:t>
+            </w:r>
+            <w:r>
+              <w:t xml:space="preserve"> </w:t>
+            </w:r>
+            <w:r>
+              <w:rPr>
+                <w:rStyle w:val="VerbatimChar"/>
+              </w:rPr>
+              <w:t xml:space="preserve">KAPI_CORE_APP</w:t>
+            </w:r>
+            <w:r>
+              <w:t xml:space="preserve"> </w:t>
+            </w:r>
+            <w:r>
+              <w:t xml:space="preserve">2,</w:t>
+            </w:r>
+            <w:r>
+              <w:t xml:space="preserve"> </w:t>
+            </w:r>
+            <w:r>
+              <w:rPr>
+                <w:rStyle w:val="VerbatimChar"/>
+              </w:rPr>
+              <w:t xml:space="preserve">KAPI_CORE_NETWORK</w:t>
+            </w:r>
+            <w:r>
+              <w:t xml:space="preserve"> </w:t>
+            </w:r>
+            <w:r>
+              <w:t xml:space="preserve">3),</w:t>
+            </w:r>
+            <w:r>
+              <w:t xml:space="preserve"> </w:t>
+            </w:r>
+            <w:r>
+              <w:rPr>
+                <w:rStyle w:val="VerbatimChar"/>
+              </w:rPr>
+              <w:t xml:space="preserve">pid</w:t>
+            </w:r>
+            <w:r>
+              <w:t xml:space="preserve"> </w:t>
+            </w:r>
+            <w:r>
+              <w:t xml:space="preserve">(an app core's owner, 0 when free) → 0 /</w:t>
+            </w:r>
+            <w:r>
+              <w:t xml:space="preserve"> </w:t>
+            </w:r>
+            <w:r>
+              <w:rPr>
+                <w:rStyle w:val="VerbatimChar"/>
+              </w:rPr>
+              <w:t xml:space="preserve">-EFAULT</w:t>
+            </w:r>
+            <w:r>
+              <w:t xml:space="preserve">. Two reads make a load:</w:t>
+            </w:r>
+            <w:r>
+              <w:t xml:space="preserve"> </w:t>
+            </w:r>
+            <w:r>
+              <w:rPr>
+                <w:rStyle w:val="VerbatimChar"/>
+              </w:rPr>
+              <w:t xml:space="preserve">(busy_us' - busy_us) / (now_us' - now_us)</w:t>
+            </w:r>
+            <w:r>
+              <w:t xml:space="preserve">.</w:t>
+            </w:r>
+          </w:p>
+        </w:tc>
+      </w:tr>
+      <w:tr>
+        <w:tc>
+          <w:tcPr/>
+          <w:p>
+            <w:pPr>
+              <w:pStyle w:val="Compact"/>
+            </w:pPr>
+            <w:r>
+              <w:t xml:space="preserve">258</w:t>
+            </w:r>
+          </w:p>
+        </w:tc>
+        <w:tc>
+          <w:tcPr/>
+          <w:p>
+            <w:pPr>
+              <w:pStyle w:val="Compact"/>
+            </w:pPr>
+            <w:r>
+              <w:rPr>
+                <w:rStyle w:val="VerbatimChar"/>
+              </w:rPr>
+              <w:t xml:space="preserve">net_stats (pid, out)</w:t>
+            </w:r>
+          </w:p>
+        </w:tc>
+        <w:tc>
+          <w:tcPr/>
+          <w:p>
+            <w:pPr>
+              <w:pStyle w:val="Compact"/>
+            </w:pPr>
+            <w:r>
+              <w:rPr>
+                <w:rStyle w:val="VerbatimChar"/>
+              </w:rPr>
+              <w:t xml:space="preserve">struct kapi_net_stats</w:t>
+            </w:r>
+            <w:r>
+              <w:t xml:space="preserve"> </w:t>
+            </w:r>
+            <w:r>
+              <w:t xml:space="preserve">(24 bytes): the payload bytes</w:t>
+            </w:r>
+            <w:r>
+              <w:t xml:space="preserve"> </w:t>
+            </w:r>
+            <w:r>
+              <w:rPr>
+                <w:rStyle w:val="VerbatimChar"/>
+              </w:rPr>
+              <w:t xml:space="preserve">pid</w:t>
+            </w:r>
+            <w:r>
+              <w:t xml:space="preserve">'s sockets received and sent (</w:t>
+            </w:r>
+            <w:r>
+              <w:rPr>
+                <w:rStyle w:val="VerbatimChar"/>
+              </w:rPr>
+              <w:t xml:space="preserve">rx_bytes</w:t>
+            </w:r>
+            <w:r>
+              <w:t xml:space="preserve">,</w:t>
+            </w:r>
+            <w:r>
+              <w:t xml:space="preserve"> </w:t>
+            </w:r>
+            <w:r>
+              <w:rPr>
+                <w:rStyle w:val="VerbatimChar"/>
+              </w:rPr>
+              <w:t xml:space="preserve">tx_bytes</w:t>
+            </w:r>
+            <w:r>
+              <w:t xml:space="preserve">: TCP and UDP, the old</w:t>
+            </w:r>
+            <w:r>
+              <w:t xml:space="preserve"> </w:t>
+            </w:r>
+            <w:r>
+              <w:rPr>
+                <w:rStyle w:val="VerbatimChar"/>
+              </w:rPr>
+              <w:t xml:space="preserve">tcp_*</w:t>
+            </w:r>
+            <w:r>
+              <w:t xml:space="preserve"> </w:t>
+            </w:r>
+            <w:r>
+              <w:t xml:space="preserve">calls and the BSD sockets) since it started, its</w:t>
+            </w:r>
+            <w:r>
+              <w:t xml:space="preserve"> </w:t>
+            </w:r>
+            <w:r>
+              <w:rPr>
+                <w:rStyle w:val="VerbatimChar"/>
+              </w:rPr>
+              <w:t xml:space="preserve">sockets</w:t>
+            </w:r>
+            <w:r>
+              <w:t xml:space="preserve"> </w:t>
+            </w:r>
+            <w:r>
+              <w:t xml:space="preserve">open now;</w:t>
+            </w:r>
+            <w:r>
+              <w:t xml:space="preserve"> </w:t>
+            </w:r>
+            <w:r>
+              <w:rPr>
+                <w:rStyle w:val="VerbatimChar"/>
+              </w:rPr>
+              <w:t xml:space="preserve">pid</w:t>
+            </w:r>
+            <w:r>
+              <w:t xml:space="preserve"> </w:t>
+            </w:r>
+            <w:r>
+              <w:t xml:space="preserve">0: every process's since the boot → 0 /</w:t>
+            </w:r>
+            <w:r>
+              <w:t xml:space="preserve"> </w:t>
+            </w:r>
+            <w:r>
+              <w:rPr>
+                <w:rStyle w:val="VerbatimChar"/>
+              </w:rPr>
+              <w:t xml:space="preserve">-EFAULT</w:t>
+            </w:r>
+            <w:r>
+              <w:t xml:space="preserve">. A process that used no socket: zeros.</w:t>
             </w:r>
           </w:p>
         </w:tc>
@@ -50000,6 +50211,616 @@
         <w:pStyle w:val="BodyText"/>
       </w:pPr>
       <w:r>
+        <w:t xml:space="preserve">What "busy" is, core by core. A core with a</w:t>
+      </w:r>
+      <w:r>
+        <w:t xml:space="preserve"> </w:t>
+      </w:r>
+      <w:r>
+        <w:rPr>
+          <w:b/>
+          <w:bCs/>
+        </w:rPr>
+        <w:t xml:space="preserve">scheduler</w:t>
+      </w:r>
+      <w:r>
+        <w:t xml:space="preserve"> </w:t>
+      </w:r>
+      <w:r>
+        <w:t xml:space="preserve">— core 0, and core 3 with</w:t>
+      </w:r>
+      <w:r>
+        <w:t xml:space="preserve"> </w:t>
+      </w:r>
+      <w:r>
+        <w:rPr>
+          <w:rStyle w:val="VerbatimChar"/>
+        </w:rPr>
+        <w:t xml:space="preserve">netcore=1</w:t>
+      </w:r>
+      <w:r>
+        <w:t xml:space="preserve"> </w:t>
+      </w:r>
+      <w:r>
+        <w:t xml:space="preserve">—</w:t>
+      </w:r>
+      <w:r>
+        <w:t xml:space="preserve"> </w:t>
+      </w:r>
+      <w:r>
+        <w:t xml:space="preserve">counts the time its tasks ran, the idle task apart:</w:t>
+      </w:r>
+      <w:r>
+        <w:t xml:space="preserve"> </w:t>
+      </w:r>
+      <w:r>
+        <w:rPr>
+          <w:rStyle w:val="VerbatimChar"/>
+        </w:rPr>
+        <w:t xml:space="preserve">CScheduler::Yield</w:t>
+      </w:r>
+      <w:r>
+        <w:t xml:space="preserve"> </w:t>
+      </w:r>
+      <w:r>
+        <w:t xml:space="preserve">adds what the leaving task</w:t>
+      </w:r>
+      <w:r>
+        <w:t xml:space="preserve"> </w:t>
+      </w:r>
+      <w:r>
+        <w:t xml:space="preserve">ran (</w:t>
+      </w:r>
+      <w:r>
+        <w:rPr>
+          <w:rStyle w:val="VerbatimChar"/>
+        </w:rPr>
+        <w:t xml:space="preserve">m_nBusyUs</w:t>
+      </w:r>
+      <w:r>
+        <w:t xml:space="preserve">;</w:t>
+      </w:r>
+      <w:r>
+        <w:t xml:space="preserve"> </w:t>
+      </w:r>
+      <w:r>
+        <w:rPr>
+          <w:rStyle w:val="VerbatimChar"/>
+        </w:rPr>
+        <w:t xml:space="preserve">GetBusyUs</w:t>
+      </w:r>
+      <w:r>
+        <w:t xml:space="preserve"> </w:t>
+      </w:r>
+      <w:r>
+        <w:t xml:space="preserve">adds the running task's time so far, so a read from another core is</w:t>
+      </w:r>
+      <w:r>
+        <w:t xml:space="preserve"> </w:t>
+      </w:r>
+      <w:r>
+        <w:t xml:space="preserve">live). Core 0's idle task sleeps in</w:t>
+      </w:r>
+      <w:r>
+        <w:t xml:space="preserve"> </w:t>
+      </w:r>
+      <w:r>
+        <w:rPr>
+          <w:rStyle w:val="VerbatimChar"/>
+        </w:rPr>
+        <w:t xml:space="preserve">wfi</w:t>
+      </w:r>
+      <w:r>
+        <w:t xml:space="preserve">, so its figure is the machine's real load; the interrupt</w:t>
+      </w:r>
+      <w:r>
+        <w:t xml:space="preserve"> </w:t>
+      </w:r>
+      <w:r>
+        <w:t xml:space="preserve">handlers that wake it are counted as idle. The</w:t>
+      </w:r>
+      <w:r>
+        <w:t xml:space="preserve"> </w:t>
+      </w:r>
+      <w:r>
+        <w:rPr>
+          <w:b/>
+          <w:bCs/>
+        </w:rPr>
+        <w:t xml:space="preserve">network core</w:t>
+      </w:r>
+      <w:r>
+        <w:t xml:space="preserve">'s tasks all wait by yielding (it</w:t>
+      </w:r>
+      <w:r>
+        <w:t xml:space="preserve"> </w:t>
+      </w:r>
+      <w:r>
+        <w:t xml:space="preserve">polls the Wi-Fi chip): it never idles and reads 100 % — that is what the core does, not a fault.</w:t>
+      </w:r>
+      <w:r>
+        <w:t xml:space="preserve"> </w:t>
+      </w:r>
+      <w:r>
+        <w:rPr>
+          <w:b/>
+          <w:bCs/>
+        </w:rPr>
+        <w:t xml:space="preserve">Core 1</w:t>
+      </w:r>
+      <w:r>
+        <w:t xml:space="preserve"> </w:t>
+      </w:r>
+      <w:r>
+        <w:t xml:space="preserve">counts the time it renders sound (</w:t>
+      </w:r>
+      <w:r>
+        <w:rPr>
+          <w:rStyle w:val="VerbatimChar"/>
+        </w:rPr>
+        <w:t xml:space="preserve">sys/sound.cpp</w:t>
+      </w:r>
+      <w:r>
+        <w:t xml:space="preserve">, around</w:t>
+      </w:r>
+      <w:r>
+        <w:t xml:space="preserve"> </w:t>
+      </w:r>
+      <w:r>
+        <w:rPr>
+          <w:rStyle w:val="VerbatimChar"/>
+        </w:rPr>
+        <w:t xml:space="preserve">Render</w:t>
+      </w:r>
+      <w:r>
+        <w:t xml:space="preserve">); an</w:t>
+      </w:r>
+      <w:r>
+        <w:t xml:space="preserve"> </w:t>
+      </w:r>
+      <w:r>
+        <w:rPr>
+          <w:b/>
+          <w:bCs/>
+        </w:rPr>
+        <w:t xml:space="preserve">app core</w:t>
+      </w:r>
+      <w:r>
+        <w:t xml:space="preserve"> </w:t>
+      </w:r>
+      <w:r>
+        <w:t xml:space="preserve">the</w:t>
+      </w:r>
+      <w:r>
+        <w:t xml:space="preserve"> </w:t>
+      </w:r>
+      <w:r>
+        <w:t xml:space="preserve">time its jobs ran, from the entry at EL0 to the job's end or drop (</w:t>
+      </w:r>
+      <w:r>
+        <w:rPr>
+          <w:rStyle w:val="VerbatimChar"/>
+        </w:rPr>
+        <w:t xml:space="preserve">sys/appcore.cpp</w:t>
+      </w:r>
+      <w:r>
+        <w:t xml:space="preserve">; a job that</w:t>
+      </w:r>
+      <w:r>
+        <w:t xml:space="preserve"> </w:t>
+      </w:r>
+      <w:r>
+        <w:t xml:space="preserve">waits in</w:t>
+      </w:r>
+      <w:r>
+        <w:t xml:space="preserve"> </w:t>
+      </w:r>
+      <w:r>
+        <w:rPr>
+          <w:rStyle w:val="VerbatimChar"/>
+        </w:rPr>
+        <w:t xml:space="preserve">wfe</w:t>
+      </w:r>
+      <w:r>
+        <w:t xml:space="preserve"> </w:t>
+      </w:r>
+      <w:r>
+        <w:t xml:space="preserve">still counts).</w:t>
+      </w:r>
+    </w:p>
+    <w:p>
+      <w:pPr>
+        <w:pStyle w:val="BodyText"/>
+      </w:pPr>
+      <w:r>
+        <w:t xml:space="preserve">The network's bytes are counted where the calls return, on core 0 (</w:t>
+      </w:r>
+      <w:r>
+        <w:rPr>
+          <w:rStyle w:val="VerbatimChar"/>
+        </w:rPr>
+        <w:t xml:space="preserve">NetTcpSend</w:t>
+      </w:r>
+      <w:r>
+        <w:t xml:space="preserve"> </w:t>
+      </w:r>
+      <w:r>
+        <w:t xml:space="preserve">/</w:t>
+      </w:r>
+      <w:r>
+        <w:t xml:space="preserve"> </w:t>
+      </w:r>
+      <w:r>
+        <w:rPr>
+          <w:rStyle w:val="VerbatimChar"/>
+        </w:rPr>
+        <w:t xml:space="preserve">NetTcpRecv</w:t>
+      </w:r>
+      <w:r>
+        <w:t xml:space="preserve">,</w:t>
+      </w:r>
+      <w:r>
+        <w:t xml:space="preserve"> </w:t>
+      </w:r>
+      <w:r>
+        <w:rPr>
+          <w:rStyle w:val="VerbatimChar"/>
+        </w:rPr>
+        <w:t xml:space="preserve">NetSockSend</w:t>
+      </w:r>
+      <w:r>
+        <w:t xml:space="preserve"> </w:t>
+      </w:r>
+      <w:r>
+        <w:t xml:space="preserve">/</w:t>
+      </w:r>
+      <w:r>
+        <w:t xml:space="preserve"> </w:t>
+      </w:r>
+      <w:r>
+        <w:rPr>
+          <w:rStyle w:val="VerbatimChar"/>
+        </w:rPr>
+        <w:t xml:space="preserve">NetSockRecv</w:t>
+      </w:r>
+      <w:r>
+        <w:t xml:space="preserve"> </w:t>
+      </w:r>
+      <w:r>
+        <w:t xml:space="preserve">in</w:t>
+      </w:r>
+      <w:r>
+        <w:t xml:space="preserve"> </w:t>
+      </w:r>
+      <w:r>
+        <w:rPr>
+          <w:rStyle w:val="VerbatimChar"/>
+        </w:rPr>
+        <w:t xml:space="preserve">sys/net.cpp</w:t>
+      </w:r>
+      <w:r>
+        <w:t xml:space="preserve">: a process's tasks all run there, so the table needs</w:t>
+      </w:r>
+      <w:r>
+        <w:t xml:space="preserve"> </w:t>
+      </w:r>
+      <w:r>
+        <w:t xml:space="preserve">no lock): one line a process (64 at most; beyond, the totals only), freed when the process ends</w:t>
+      </w:r>
+      <w:r>
+        <w:t xml:space="preserve"> </w:t>
+      </w:r>
+      <w:r>
+        <w:t xml:space="preserve">(</w:t>
+      </w:r>
+      <w:r>
+        <w:rPr>
+          <w:rStyle w:val="VerbatimChar"/>
+        </w:rPr>
+        <w:t xml:space="preserve">NetCloseByPid</w:t>
+      </w:r>
+      <w:r>
+        <w:t xml:space="preserve">). A byte read with</w:t>
+      </w:r>
+      <w:r>
+        <w:t xml:space="preserve"> </w:t>
+      </w:r>
+      <w:r>
+        <w:rPr>
+          <w:rStyle w:val="VerbatimChar"/>
+        </w:rPr>
+        <w:t xml:space="preserve">MSG_PEEK</w:t>
+      </w:r>
+      <w:r>
+        <w:t xml:space="preserve"> </w:t>
+      </w:r>
+      <w:r>
+        <w:t xml:space="preserve">is counted when it is really read. They are the</w:t>
+      </w:r>
+      <w:r>
+        <w:t xml:space="preserve"> </w:t>
+      </w:r>
+      <w:r>
+        <w:t xml:space="preserve">sockets' payload, not the frames on the air: no header, no retransmission, nothing of the kernel's</w:t>
+      </w:r>
+      <w:r>
+        <w:t xml:space="preserve"> </w:t>
+      </w:r>
+      <w:r>
+        <w:t xml:space="preserve">own traffic (DHCP, DNS, NTP).</w:t>
+      </w:r>
+    </w:p>
+    <w:bookmarkEnd w:id="89"/>
+    <w:bookmarkStart w:id="90" w:name="v79-kernel_info"/>
+    <w:p>
+      <w:pPr>
+        <w:pStyle w:val="Heading3"/>
+      </w:pPr>
+      <w:r>
+        <w:t xml:space="preserve">v79: kernel_info</w:t>
+      </w:r>
+    </w:p>
+    <w:tbl>
+      <w:tblPr>
+        <w:tblStyle w:val="Table"/>
+        <w:tblW w:type="auto" w:w="0"/>
+        <w:tblLook w:firstRow="1" w:lastRow="0" w:firstColumn="0" w:lastColumn="0" w:noHBand="0" w:noVBand="0" w:val="0020"/>
+      </w:tblPr>
+      <w:tblGrid>
+        <w:gridCol w:w="2640"/>
+        <w:gridCol w:w="2640"/>
+        <w:gridCol w:w="2640"/>
+      </w:tblGrid>
+      <w:tr>
+        <w:trPr>
+          <w:tblHeader w:val="on"/>
+        </w:trPr>
+        <w:tc>
+          <w:tcPr/>
+          <w:p>
+            <w:pPr>
+              <w:pStyle w:val="Compact"/>
+            </w:pPr>
+            <w:r>
+              <w:t xml:space="preserve">Slot</w:t>
+            </w:r>
+          </w:p>
+        </w:tc>
+        <w:tc>
+          <w:tcPr/>
+          <w:p>
+            <w:pPr>
+              <w:pStyle w:val="Compact"/>
+            </w:pPr>
+            <w:r>
+              <w:t xml:space="preserve">Entry</w:t>
+            </w:r>
+          </w:p>
+        </w:tc>
+        <w:tc>
+          <w:tcPr/>
+          <w:p>
+            <w:pPr>
+              <w:pStyle w:val="Compact"/>
+            </w:pPr>
+            <w:r>
+              <w:t xml:space="preserve">What it does</w:t>
+            </w:r>
+          </w:p>
+        </w:tc>
+      </w:tr>
+      <w:tr>
+        <w:tc>
+          <w:tcPr/>
+          <w:p>
+            <w:pPr>
+              <w:pStyle w:val="Compact"/>
+            </w:pPr>
+            <w:r>
+              <w:t xml:space="preserve">256</w:t>
+            </w:r>
+          </w:p>
+        </w:tc>
+        <w:tc>
+          <w:tcPr/>
+          <w:p>
+            <w:pPr>
+              <w:pStyle w:val="Compact"/>
+            </w:pPr>
+            <w:r>
+              <w:rPr>
+                <w:rStyle w:val="VerbatimChar"/>
+              </w:rPr>
+              <w:t xml:space="preserve">kernel_info (buf, cap)</w:t>
+            </w:r>
+          </w:p>
+        </w:tc>
+        <w:tc>
+          <w:tcPr/>
+          <w:p>
+            <w:pPr>
+              <w:pStyle w:val="Compact"/>
+            </w:pPr>
+            <w:r>
+              <w:t xml:space="preserve">what the running kernel is, as</w:t>
+            </w:r>
+            <w:r>
+              <w:t xml:space="preserve"> </w:t>
+            </w:r>
+            <w:r>
+              <w:rPr>
+                <w:rStyle w:val="VerbatimChar"/>
+              </w:rPr>
+              <w:t xml:space="preserve">key value</w:t>
+            </w:r>
+            <w:r>
+              <w:t xml:space="preserve"> </w:t>
+            </w:r>
+            <w:r>
+              <w:t xml:space="preserve">lines:</w:t>
+            </w:r>
+            <w:r>
+              <w:t xml:space="preserve"> </w:t>
+            </w:r>
+            <w:r>
+              <w:rPr>
+                <w:rStyle w:val="VerbatimChar"/>
+              </w:rPr>
+              <w:t xml:space="preserve">name</w:t>
+            </w:r>
+            <w:r>
+              <w:t xml:space="preserve"> </w:t>
+            </w:r>
+            <w:r>
+              <w:t xml:space="preserve">(Onyx),</w:t>
+            </w:r>
+            <w:r>
+              <w:t xml:space="preserve"> </w:t>
+            </w:r>
+            <w:r>
+              <w:rPr>
+                <w:rStyle w:val="VerbatimChar"/>
+              </w:rPr>
+              <w:t xml:space="preserve">abi</w:t>
+            </w:r>
+            <w:r>
+              <w:t xml:space="preserve"> </w:t>
+            </w:r>
+            <w:r>
+              <w:t xml:space="preserve">(</w:t>
+            </w:r>
+            <w:r>
+              <w:rPr>
+                <w:rStyle w:val="VerbatimChar"/>
+              </w:rPr>
+              <w:t xml:space="preserve">KAPI_ABI_VERSION</w:t>
+            </w:r>
+            <w:r>
+              <w:t xml:space="preserve">),</w:t>
+            </w:r>
+            <w:r>
+              <w:t xml:space="preserve"> </w:t>
+            </w:r>
+            <w:r>
+              <w:rPr>
+                <w:rStyle w:val="VerbatimChar"/>
+              </w:rPr>
+              <w:t xml:space="preserve">built</w:t>
+            </w:r>
+            <w:r>
+              <w:t xml:space="preserve"> </w:t>
+            </w:r>
+            <w:r>
+              <w:t xml:space="preserve">(the date and time of the image's link),</w:t>
+            </w:r>
+            <w:r>
+              <w:t xml:space="preserve"> </w:t>
+            </w:r>
+            <w:r>
+              <w:rPr>
+                <w:rStyle w:val="VerbatimChar"/>
+              </w:rPr>
+              <w:t xml:space="preserve">rev</w:t>
+            </w:r>
+            <w:r>
+              <w:t xml:space="preserve"> </w:t>
+            </w:r>
+            <w:r>
+              <w:t xml:space="preserve">(the source's git revision;</w:t>
+            </w:r>
+            <w:r>
+              <w:t xml:space="preserve"> </w:t>
+            </w:r>
+            <w:r>
+              <w:rPr>
+                <w:rStyle w:val="VerbatimChar"/>
+              </w:rPr>
+              <w:t xml:space="preserve">+</w:t>
+            </w:r>
+            <w:r>
+              <w:t xml:space="preserve">: built from changed sources),</w:t>
+            </w:r>
+            <w:r>
+              <w:t xml:space="preserve"> </w:t>
+            </w:r>
+            <w:r>
+              <w:rPr>
+                <w:rStyle w:val="VerbatimChar"/>
+              </w:rPr>
+              <w:t xml:space="preserve">machine</w:t>
+            </w:r>
+            <w:r>
+              <w:t xml:space="preserve"> </w:t>
+            </w:r>
+            <w:r>
+              <w:t xml:space="preserve">(aarch64),</w:t>
+            </w:r>
+            <w:r>
+              <w:t xml:space="preserve"> </w:t>
+            </w:r>
+            <w:r>
+              <w:rPr>
+                <w:rStyle w:val="VerbatimChar"/>
+              </w:rPr>
+              <w:t xml:space="preserve">model</w:t>
+            </w:r>
+            <w:r>
+              <w:t xml:space="preserve"> </w:t>
+            </w:r>
+            <w:r>
+              <w:t xml:space="preserve">(the board's name),</w:t>
+            </w:r>
+            <w:r>
+              <w:t xml:space="preserve"> </w:t>
+            </w:r>
+            <w:r>
+              <w:rPr>
+                <w:rStyle w:val="VerbatimChar"/>
+              </w:rPr>
+              <w:t xml:space="preserve">ram</w:t>
+            </w:r>
+            <w:r>
+              <w:t xml:space="preserve"> </w:t>
+            </w:r>
+            <w:r>
+              <w:t xml:space="preserve">(MB). Up to</w:t>
+            </w:r>
+            <w:r>
+              <w:t xml:space="preserve"> </w:t>
+            </w:r>
+            <w:r>
+              <w:rPr>
+                <w:rStyle w:val="VerbatimChar"/>
+              </w:rPr>
+              <w:t xml:space="preserve">cap</w:t>
+            </w:r>
+            <w:r>
+              <w:t xml:space="preserve"> </w:t>
+            </w:r>
+            <w:r>
+              <w:t xml:space="preserve">− 1 bytes and a NUL → the text's whole length;</w:t>
+            </w:r>
+            <w:r>
+              <w:t xml:space="preserve"> </w:t>
+            </w:r>
+            <w:r>
+              <w:rPr>
+                <w:rStyle w:val="VerbatimChar"/>
+              </w:rPr>
+              <w:t xml:space="preserve">EFAULT</w:t>
+            </w:r>
+            <w:r>
+              <w:t xml:space="preserve">. Keys may be added: a reader looks its keys up.</w:t>
+            </w:r>
+          </w:p>
+        </w:tc>
+      </w:tr>
+    </w:tbl>
+    <w:p>
+      <w:pPr>
+        <w:pStyle w:val="BodyText"/>
+      </w:pPr>
+      <w:r>
         <w:t xml:space="preserve">The date and the revision are</w:t>
       </w:r>
       <w:r>
@@ -50233,9 +51054,9 @@
         </w:pict>
       </w:r>
     </w:p>
-    <w:bookmarkEnd w:id="89"/>
     <w:bookmarkEnd w:id="90"/>
-    <w:bookmarkStart w:id="97" w:name="X0388453af32aee5299c424f16ffba6153d0b61c"/>
+    <w:bookmarkEnd w:id="91"/>
+    <w:bookmarkStart w:id="98" w:name="X0388453af32aee5299c424f16ffba6153d0b61c"/>
     <w:p>
       <w:pPr>
         <w:pStyle w:val="Heading2"/>
@@ -50254,7 +51075,7 @@
       <w:r>
         <w:t xml:space="preserve"> </w:t>
       </w:r>
-      <w:hyperlink r:id="rId91">
+      <w:hyperlink r:id="rId92">
         <w:r>
           <w:rPr>
             <w:rStyle w:val="VerbatimChar"/>
@@ -50268,7 +51089,7 @@
       <w:r>
         <w:t xml:space="preserve"> </w:t>
       </w:r>
-      <w:hyperlink r:id="rId92">
+      <w:hyperlink r:id="rId93">
         <w:r>
           <w:rPr>
             <w:rStyle w:val="VerbatimChar"/>
@@ -50310,7 +51131,7 @@
         <w:t xml:space="preserve">communication possible.</w:t>
       </w:r>
     </w:p>
-    <w:bookmarkStart w:id="93" w:name="object-model"/>
+    <w:bookmarkStart w:id="94" w:name="object-model"/>
     <w:p>
       <w:pPr>
         <w:pStyle w:val="Heading3"/>
@@ -50840,8 +51661,8 @@
         <w:t xml:space="preserve">2=append.</w:t>
       </w:r>
     </w:p>
-    <w:bookmarkEnd w:id="93"/>
-    <w:bookmarkStart w:id="96" w:name="processes-and-stdio"/>
+    <w:bookmarkEnd w:id="94"/>
+    <w:bookmarkStart w:id="97" w:name="processes-and-stdio"/>
     <w:p>
       <w:pPr>
         <w:pStyle w:val="Heading3"/>
@@ -51142,7 +51963,7 @@
       <w:r>
         <w:t xml:space="preserve"> </w:t>
       </w:r>
-      <w:hyperlink r:id="rId94">
+      <w:hyperlink r:id="rId95">
         <w:r>
           <w:rPr>
             <w:rStyle w:val="Hyperlink"/>
@@ -51159,7 +51980,7 @@
       <w:r>
         <w:t xml:space="preserve"> </w:t>
       </w:r>
-      <w:hyperlink r:id="rId95">
+      <w:hyperlink r:id="rId96">
         <w:r>
           <w:rPr>
             <w:rStyle w:val="Hyperlink"/>
@@ -51178,9 +51999,9 @@
         </w:pict>
       </w:r>
     </w:p>
-    <w:bookmarkEnd w:id="96"/>
     <w:bookmarkEnd w:id="97"/>
-    <w:bookmarkStart w:id="103" w:name="X10f951303a3d0a8705d0a81fe10314bb6a2b0a6"/>
+    <w:bookmarkEnd w:id="98"/>
+    <w:bookmarkStart w:id="104" w:name="X10f951303a3d0a8705d0a81fe10314bb6a2b0a6"/>
     <w:p>
       <w:pPr>
         <w:pStyle w:val="Heading2"/>
@@ -51239,7 +52060,7 @@
         <w:t xml:space="preserve">.</w:t>
       </w:r>
     </w:p>
-    <w:bookmarkStart w:id="98" w:name="Xe3f01c5ed286023176949c9775dce5e3838ffd1"/>
+    <w:bookmarkStart w:id="99" w:name="Xe3f01c5ed286023176949c9775dce5e3838ffd1"/>
     <w:p>
       <w:pPr>
         <w:pStyle w:val="Heading3"/>
@@ -51634,8 +52455,8 @@
         <w:t xml:space="preserve">(24 bpp uncompressed, BGR→RGB, handles top-down/bottom-up).</w:t>
       </w:r>
     </w:p>
-    <w:bookmarkEnd w:id="98"/>
-    <w:bookmarkStart w:id="99" w:name="X1859393a8c4bed58a127080085004380601403d"/>
+    <w:bookmarkEnd w:id="99"/>
+    <w:bookmarkStart w:id="100" w:name="X1859393a8c4bed58a127080085004380601403d"/>
     <w:p>
       <w:pPr>
         <w:pStyle w:val="Heading3"/>
@@ -53722,8 +54543,8 @@
         <w:t xml:space="preserve">the see-through windows' clicks, the work area, a canvas growing, the workspaces).</w:t>
       </w:r>
     </w:p>
-    <w:bookmarkEnd w:id="99"/>
-    <w:bookmarkStart w:id="100" w:name="Xe463e9388c9d5d5a717f5346252214435818497"/>
+    <w:bookmarkEnd w:id="100"/>
+    <w:bookmarkStart w:id="101" w:name="Xe463e9388c9d5d5a717f5346252214435818497"/>
     <w:p>
       <w:pPr>
         <w:pStyle w:val="Heading3"/>
@@ -54345,8 +55166,8 @@
         <w:t xml:space="preserve">dialog, otherwise to the app's keyboard handler.</w:t>
       </w:r>
     </w:p>
-    <w:bookmarkEnd w:id="100"/>
-    <w:bookmarkStart w:id="101" w:name="X24691d09f8e27f776afb60dd70127328157f6db"/>
+    <w:bookmarkEnd w:id="101"/>
+    <w:bookmarkStart w:id="102" w:name="X24691d09f8e27f776afb60dd70127328157f6db"/>
     <w:p>
       <w:pPr>
         <w:pStyle w:val="Heading3"/>
@@ -54760,8 +55581,8 @@
         <w:t xml:space="preserve">case). The agenda widget reads it to choose its ink.</w:t>
       </w:r>
     </w:p>
-    <w:bookmarkEnd w:id="101"/>
-    <w:bookmarkStart w:id="102" w:name="X200f8f15df38f42e5aa69d22a02b60b447a05e0"/>
+    <w:bookmarkEnd w:id="102"/>
+    <w:bookmarkStart w:id="103" w:name="X200f8f15df38f42e5aa69d22a02b60b447a05e0"/>
     <w:p>
       <w:pPr>
         <w:pStyle w:val="Heading3"/>
@@ -54866,9 +55687,9 @@
         </w:pict>
       </w:r>
     </w:p>
-    <w:bookmarkEnd w:id="102"/>
     <w:bookmarkEnd w:id="103"/>
-    <w:bookmarkStart w:id="107" w:name="X39e469d88a0d3c41ac3b8087ce6a04a805edad1"/>
+    <w:bookmarkEnd w:id="104"/>
+    <w:bookmarkStart w:id="108" w:name="X39e469d88a0d3c41ac3b8087ce6a04a805edad1"/>
     <w:p>
       <w:pPr>
         <w:pStyle w:val="Heading2"/>
@@ -54913,7 +55734,7 @@
       <w:r>
         <w:t xml:space="preserve"> </w:t>
       </w:r>
-      <w:hyperlink r:id="rId104">
+      <w:hyperlink r:id="rId105">
         <w:r>
           <w:rPr>
             <w:rStyle w:val="VerbatimChar"/>
@@ -54930,7 +55751,7 @@
       <w:r>
         <w:t xml:space="preserve"> </w:t>
       </w:r>
-      <w:hyperlink r:id="rId105">
+      <w:hyperlink r:id="rId106">
         <w:r>
           <w:rPr>
             <w:rStyle w:val="VerbatimChar"/>
@@ -54992,7 +55813,7 @@
       <w:r>
         <w:t xml:space="preserve"> </w:t>
       </w:r>
-      <w:hyperlink r:id="rId106">
+      <w:hyperlink r:id="rId107">
         <w:r>
           <w:rPr>
             <w:rStyle w:val="VerbatimChar"/>
@@ -57937,8 +58758,8 @@
         </w:pict>
       </w:r>
     </w:p>
-    <w:bookmarkEnd w:id="107"/>
-    <w:bookmarkStart w:id="111" w:name="Xb96593a02e959a86ae343ca4fa42e9defb57306"/>
+    <w:bookmarkEnd w:id="108"/>
+    <w:bookmarkStart w:id="112" w:name="Xb96593a02e959a86ae343ca4fa42e9defb57306"/>
     <w:p>
       <w:pPr>
         <w:pStyle w:val="Heading2"/>
@@ -57957,7 +58778,7 @@
       <w:r>
         <w:t xml:space="preserve"> </w:t>
       </w:r>
-      <w:hyperlink r:id="rId108">
+      <w:hyperlink r:id="rId109">
         <w:r>
           <w:rPr>
             <w:rStyle w:val="VerbatimChar"/>
@@ -57971,7 +58792,7 @@
       <w:r>
         <w:t xml:space="preserve"> </w:t>
       </w:r>
-      <w:hyperlink r:id="rId109">
+      <w:hyperlink r:id="rId110">
         <w:r>
           <w:rPr>
             <w:rStyle w:val="VerbatimChar"/>
@@ -58022,7 +58843,7 @@
       <w:r>
         <w:t xml:space="preserve"> </w:t>
       </w:r>
-      <w:hyperlink r:id="rId110">
+      <w:hyperlink r:id="rId111">
         <w:r>
           <w:rPr>
             <w:rStyle w:val="Hyperlink"/>
@@ -59560,8 +60381,8 @@
         <w:t xml:space="preserve">(above).</w:t>
       </w:r>
     </w:p>
-    <w:bookmarkEnd w:id="111"/>
-    <w:bookmarkStart w:id="117" w:name="Xfa019e876c205b51820d387dd2b0ef1f0c66c95"/>
+    <w:bookmarkEnd w:id="112"/>
+    <w:bookmarkStart w:id="118" w:name="Xfa019e876c205b51820d387dd2b0ef1f0c66c95"/>
     <w:p>
       <w:pPr>
         <w:pStyle w:val="Heading2"/>
@@ -59580,7 +60401,7 @@
       <w:r>
         <w:t xml:space="preserve"> </w:t>
       </w:r>
-      <w:hyperlink r:id="rId112">
+      <w:hyperlink r:id="rId113">
         <w:r>
           <w:rPr>
             <w:rStyle w:val="VerbatimChar"/>
@@ -59594,7 +60415,7 @@
       <w:r>
         <w:t xml:space="preserve"> </w:t>
       </w:r>
-      <w:hyperlink r:id="rId113">
+      <w:hyperlink r:id="rId114">
         <w:r>
           <w:rPr>
             <w:rStyle w:val="VerbatimChar"/>
@@ -59936,7 +60757,7 @@
         <w:t xml:space="preserve">contend for the framebuffer.</w:t>
       </w:r>
     </w:p>
-    <w:bookmarkStart w:id="116" w:name="the-crash-record-lastcrashtxt"/>
+    <w:bookmarkStart w:id="117" w:name="the-crash-record-lastcrashtxt"/>
     <w:p>
       <w:pPr>
         <w:pStyle w:val="Heading3"/>
@@ -59964,7 +60785,7 @@
       <w:r>
         <w:t xml:space="preserve"> </w:t>
       </w:r>
-      <w:hyperlink r:id="rId114">
+      <w:hyperlink r:id="rId115">
         <w:r>
           <w:rPr>
             <w:rStyle w:val="VerbatimChar"/>
@@ -59978,7 +60799,7 @@
       <w:r>
         <w:t xml:space="preserve"> </w:t>
       </w:r>
-      <w:hyperlink r:id="rId115">
+      <w:hyperlink r:id="rId116">
         <w:r>
           <w:rPr>
             <w:rStyle w:val="VerbatimChar"/>
@@ -61580,9 +62401,9 @@
         </w:pict>
       </w:r>
     </w:p>
-    <w:bookmarkEnd w:id="116"/>
     <w:bookmarkEnd w:id="117"/>
-    <w:bookmarkStart w:id="122" w:name="X0df50f13635c1fcb933e538121f0d903fe1ec80"/>
+    <w:bookmarkEnd w:id="118"/>
+    <w:bookmarkStart w:id="123" w:name="X0df50f13635c1fcb933e538121f0d903fe1ec80"/>
     <w:p>
       <w:pPr>
         <w:pStyle w:val="Heading2"/>
@@ -61601,7 +62422,7 @@
       <w:r>
         <w:t xml:space="preserve"> </w:t>
       </w:r>
-      <w:hyperlink r:id="rId118">
+      <w:hyperlink r:id="rId119">
         <w:r>
           <w:rPr>
             <w:rStyle w:val="VerbatimChar"/>
@@ -61615,7 +62436,7 @@
       <w:r>
         <w:t xml:space="preserve"> </w:t>
       </w:r>
-      <w:hyperlink r:id="rId119">
+      <w:hyperlink r:id="rId120">
         <w:r>
           <w:rPr>
             <w:rStyle w:val="VerbatimChar"/>
@@ -61629,7 +62450,7 @@
       <w:r>
         <w:t xml:space="preserve"> </w:t>
       </w:r>
-      <w:hyperlink r:id="rId120">
+      <w:hyperlink r:id="rId121">
         <w:r>
           <w:rPr>
             <w:rStyle w:val="VerbatimChar"/>
@@ -61643,7 +62464,7 @@
       <w:r>
         <w:t xml:space="preserve"> </w:t>
       </w:r>
-      <w:hyperlink r:id="rId121">
+      <w:hyperlink r:id="rId122">
         <w:r>
           <w:rPr>
             <w:rStyle w:val="VerbatimChar"/>
@@ -63554,8 +64375,8 @@
         <w:t xml:space="preserve">), with its malloc, files and saves.</w:t>
       </w:r>
     </w:p>
-    <w:bookmarkEnd w:id="122"/>
-    <w:bookmarkStart w:id="127" w:name="Xf861c8e521de19b85a9fa568838296e214f81a0"/>
+    <w:bookmarkEnd w:id="123"/>
+    <w:bookmarkStart w:id="128" w:name="Xf861c8e521de19b85a9fa568838296e214f81a0"/>
     <w:p>
       <w:pPr>
         <w:pStyle w:val="Heading2"/>
@@ -63574,7 +64395,7 @@
       <w:r>
         <w:t xml:space="preserve"> </w:t>
       </w:r>
-      <w:hyperlink r:id="rId123">
+      <w:hyperlink r:id="rId124">
         <w:r>
           <w:rPr>
             <w:rStyle w:val="VerbatimChar"/>
@@ -63588,7 +64409,7 @@
       <w:r>
         <w:t xml:space="preserve"> </w:t>
       </w:r>
-      <w:hyperlink r:id="rId124">
+      <w:hyperlink r:id="rId125">
         <w:r>
           <w:rPr>
             <w:rStyle w:val="VerbatimChar"/>
@@ -64757,7 +65578,7 @@
       <w:r>
         <w:t xml:space="preserve"> </w:t>
       </w:r>
-      <w:hyperlink r:id="rId125">
+      <w:hyperlink r:id="rId126">
         <w:r>
           <w:rPr>
             <w:rStyle w:val="VerbatimChar"/>
@@ -66139,7 +66960,7 @@
       <w:r>
         <w:t xml:space="preserve"> </w:t>
       </w:r>
-      <w:hyperlink r:id="rId126">
+      <w:hyperlink r:id="rId127">
         <w:r>
           <w:rPr>
             <w:rStyle w:val="VerbatimChar"/>
@@ -67399,8 +68220,8 @@
         </w:pict>
       </w:r>
     </w:p>
-    <w:bookmarkEnd w:id="127"/>
-    <w:bookmarkStart w:id="132" w:name="Xa7f002f42b8b233630f11dbad8c3740c73af4cd"/>
+    <w:bookmarkEnd w:id="128"/>
+    <w:bookmarkStart w:id="133" w:name="Xa7f002f42b8b233630f11dbad8c3740c73af4cd"/>
     <w:p>
       <w:pPr>
         <w:pStyle w:val="Heading2"/>
@@ -67419,7 +68240,7 @@
       <w:r>
         <w:t xml:space="preserve"> </w:t>
       </w:r>
-      <w:hyperlink r:id="rId128">
+      <w:hyperlink r:id="rId129">
         <w:r>
           <w:rPr>
             <w:rStyle w:val="VerbatimChar"/>
@@ -67433,7 +68254,7 @@
       <w:r>
         <w:t xml:space="preserve"> </w:t>
       </w:r>
-      <w:hyperlink r:id="rId129">
+      <w:hyperlink r:id="rId130">
         <w:r>
           <w:rPr>
             <w:rStyle w:val="VerbatimChar"/>
@@ -67459,7 +68280,7 @@
       <w:r>
         <w:t xml:space="preserve">(</w:t>
       </w:r>
-      <w:hyperlink r:id="rId91">
+      <w:hyperlink r:id="rId92">
         <w:r>
           <w:rPr>
             <w:rStyle w:val="VerbatimChar"/>
@@ -67493,7 +68314,7 @@
       <w:r>
         <w:t xml:space="preserve"> </w:t>
       </w:r>
-      <w:hyperlink r:id="rId130">
+      <w:hyperlink r:id="rId131">
         <w:r>
           <w:rPr>
             <w:rStyle w:val="VerbatimChar"/>
@@ -67507,7 +68328,7 @@
       <w:r>
         <w:t xml:space="preserve"> </w:t>
       </w:r>
-      <w:hyperlink r:id="rId131">
+      <w:hyperlink r:id="rId132">
         <w:r>
           <w:rPr>
             <w:rStyle w:val="VerbatimChar"/>
@@ -69501,8 +70322,8 @@
         </w:pict>
       </w:r>
     </w:p>
-    <w:bookmarkEnd w:id="132"/>
-    <w:bookmarkStart w:id="133" w:name="annex--useful-constants"/>
+    <w:bookmarkEnd w:id="133"/>
+    <w:bookmarkStart w:id="134" w:name="annex--useful-constants"/>
     <w:p>
       <w:pPr>
         <w:pStyle w:val="Heading2"/>
@@ -70409,7 +71230,7 @@
         </w:tc>
       </w:tr>
     </w:tbl>
-    <w:bookmarkEnd w:id="133"/>
+    <w:bookmarkEnd w:id="134"/>
     <w:sectPr>
       <w:footerReference r:id="rId9" w:type="default"/>
       <w:footnotePr>

</xml_diff>

<commit_message>
The network core sleeps when the network is quiet (93 % of the time on an idle Pi; it turned at 100 %)
After 50 ms without a frame or a request, NetCoreMain sleeps a millisecond between two questions to
the Wi-Fi chip (wfe: the timer's event stream, core 0's sev on a request), one whole question between
two sleeps; the first frame or request brings the full pace back. That sleep is taken off the core's
busy time (cpu_stats, the Task Manager). Measured: an idle Pi's pings 4.1 -> 4.4 ms on average; the
bench, the pings during a download and the echoes unchanged. Trial words: netsleep=, netsleepus=.

Co-Authored-By: Claude Opus 5.5 <noreply@anthropic.com>
</commit_message>
<xml_diff>
--- a/docs/exports/02-KERNEL-INTERNALS.docx
+++ b/docs/exports/02-KERNEL-INTERNALS.docx
@@ -50336,7 +50336,38 @@
         <w:t xml:space="preserve"> </w:t>
       </w:r>
       <w:r>
-        <w:t xml:space="preserve">polls the Wi-Fi chip): it never idles and reads 100 % — that is what the core does, not a fault.</w:t>
+        <w:t xml:space="preserve">polls the Wi-Fi chip), so while the network works it reads 100 %; once the network has been quiet</w:t>
+      </w:r>
+      <w:r>
+        <w:t xml:space="preserve"> </w:t>
+      </w:r>
+      <w:r>
+        <w:t xml:space="preserve">for 50 ms it sleeps between two questions to the chip (</w:t>
+      </w:r>
+      <w:r>
+        <w:rPr>
+          <w:i/>
+          <w:iCs/>
+        </w:rPr>
+        <w:t xml:space="preserve">The network core sleeps</w:t>
+      </w:r>
+      <w:r>
+        <w:t xml:space="preserve">, below) and that</w:t>
+      </w:r>
+      <w:r>
+        <w:t xml:space="preserve"> </w:t>
+      </w:r>
+      <w:r>
+        <w:t xml:space="preserve">sleep is taken off its busy time (</w:t>
+      </w:r>
+      <w:r>
+        <w:rPr>
+          <w:rStyle w:val="VerbatimChar"/>
+        </w:rPr>
+        <w:t xml:space="preserve">CScheduler::NoteSleptUs</w:t>
+      </w:r>
+      <w:r>
+        <w:t xml:space="preserve">): a few per cent.</w:t>
       </w:r>
       <w:r>
         <w:t xml:space="preserve"> </w:t>
@@ -56813,6 +56844,30 @@
         <w:rPr>
           <w:rStyle w:val="VerbatimChar"/>
         </w:rPr>
+        <w:t xml:space="preserve">netsleep=</w:t>
+      </w:r>
+      <w:r>
+        <w:t xml:space="preserve">,</w:t>
+      </w:r>
+      <w:r>
+        <w:t xml:space="preserve"> </w:t>
+      </w:r>
+      <w:r>
+        <w:rPr>
+          <w:rStyle w:val="VerbatimChar"/>
+        </w:rPr>
+        <w:t xml:space="preserve">netsleepus=</w:t>
+      </w:r>
+      <w:r>
+        <w:t xml:space="preserve">,</w:t>
+      </w:r>
+      <w:r>
+        <w:t xml:space="preserve"> </w:t>
+      </w:r>
+      <w:r>
+        <w:rPr>
+          <w:rStyle w:val="VerbatimChar"/>
+        </w:rPr>
         <w:t xml:space="preserve">netstat=1</w:t>
       </w:r>
       <w:r>
@@ -56938,6 +56993,232 @@
       </w:r>
       <w:r>
         <w:t xml:space="preserve">added there, tried, and only then made the default.</w:t>
+      </w:r>
+    </w:p>
+    <w:p>
+      <w:pPr>
+        <w:pStyle w:val="Compact"/>
+        <w:numPr>
+          <w:ilvl w:val="1"/>
+          <w:numId w:val="1027"/>
+        </w:numPr>
+      </w:pPr>
+      <w:r>
+        <w:rPr>
+          <w:b/>
+          <w:bCs/>
+        </w:rPr>
+        <w:t xml:space="preserve">The network core sleeps when the network is quiet</w:t>
+      </w:r>
+      <w:r>
+        <w:t xml:space="preserve"> </w:t>
+      </w:r>
+      <w:r>
+        <w:t xml:space="preserve">(2026-10-04). Its tasks wait by</w:t>
+      </w:r>
+      <w:r>
+        <w:t xml:space="preserve"> </w:t>
+      </w:r>
+      <w:r>
+        <w:t xml:space="preserve">yielding, so the core used to turn all the time: 130 000 rounds of its scheduler a second, each</w:t>
+      </w:r>
+      <w:r>
+        <w:t xml:space="preserve"> </w:t>
+      </w:r>
+      <w:r>
+        <w:t xml:space="preserve">asking the chip whether it has a frame. Now</w:t>
+      </w:r>
+      <w:r>
+        <w:t xml:space="preserve"> </w:t>
+      </w:r>
+      <w:r>
+        <w:rPr>
+          <w:rStyle w:val="VerbatimChar"/>
+        </w:rPr>
+        <w:t xml:space="preserve">NetCoreMain</w:t>
+      </w:r>
+      <w:r>
+        <w:t xml:space="preserve">, after each round, sleeps (</w:t>
+      </w:r>
+      <w:r>
+        <w:rPr>
+          <w:rStyle w:val="VerbatimChar"/>
+        </w:rPr>
+        <w:t xml:space="preserve">wfe</w:t>
+      </w:r>
+      <w:r>
+        <w:t xml:space="preserve">)</w:t>
+      </w:r>
+      <w:r>
+        <w:t xml:space="preserve"> </w:t>
+      </w:r>
+      <w:r>
+        <w:t xml:space="preserve">when all of this holds: no frame read from the chip or written to it for 50 ms</w:t>
+      </w:r>
+      <w:r>
+        <w:t xml:space="preserve"> </w:t>
+      </w:r>
+      <w:r>
+        <w:t xml:space="preserve">(</w:t>
+      </w:r>
+      <w:r>
+        <w:rPr>
+          <w:rStyle w:val="VerbatimChar"/>
+        </w:rPr>
+        <w:t xml:space="preserve">onyx_wl_lastact</w:t>
+      </w:r>
+      <w:r>
+        <w:t xml:space="preserve">, the driver's), no request posted by core 0 for 50 ms, none waiting, and the</w:t>
+      </w:r>
+      <w:r>
+        <w:t xml:space="preserve"> </w:t>
+      </w:r>
+      <w:r>
+        <w:t xml:space="preserve">driver has asked the chip once, whole, since the last sleep and it had nothing</w:t>
+      </w:r>
+      <w:r>
+        <w:t xml:space="preserve"> </w:t>
+      </w:r>
+      <w:r>
+        <w:t xml:space="preserve">(</w:t>
+      </w:r>
+      <w:r>
+        <w:rPr>
+          <w:rStyle w:val="VerbatimChar"/>
+        </w:rPr>
+        <w:t xml:space="preserve">onyx_wl_polls</w:t>
+      </w:r>
+      <w:r>
+        <w:t xml:space="preserve">: a question is several SDIO commands and each waits a round — sleeping</w:t>
+      </w:r>
+      <w:r>
+        <w:t xml:space="preserve"> </w:t>
+      </w:r>
+      <w:r>
+        <w:t xml:space="preserve">between the rounds made a ping take six sleeps). The sleep ends after 1 ms — the timer's event</w:t>
+      </w:r>
+      <w:r>
+        <w:t xml:space="preserve"> </w:t>
+      </w:r>
+      <w:r>
+        <w:t xml:space="preserve">stream ends a</w:t>
+      </w:r>
+      <w:r>
+        <w:t xml:space="preserve"> </w:t>
+      </w:r>
+      <w:r>
+        <w:rPr>
+          <w:rStyle w:val="VerbatimChar"/>
+        </w:rPr>
+        <w:t xml:space="preserve">wfe</w:t>
+      </w:r>
+      <w:r>
+        <w:t xml:space="preserve"> </w:t>
+      </w:r>
+      <w:r>
+        <w:t xml:space="preserve">every 1.2 ms at most (</w:t>
+      </w:r>
+      <w:r>
+        <w:rPr>
+          <w:rStyle w:val="VerbatimChar"/>
+        </w:rPr>
+        <w:t xml:space="preserve">CNTKCTL_EL1</w:t>
+      </w:r>
+      <w:r>
+        <w:t xml:space="preserve">, set on that core) — or at once when</w:t>
+      </w:r>
+      <w:r>
+        <w:t xml:space="preserve"> </w:t>
+      </w:r>
+      <w:r>
+        <w:t xml:space="preserve">core 0 posts a request (its</w:t>
+      </w:r>
+      <w:r>
+        <w:t xml:space="preserve"> </w:t>
+      </w:r>
+      <w:r>
+        <w:rPr>
+          <w:rStyle w:val="VerbatimChar"/>
+        </w:rPr>
+        <w:t xml:space="preserve">sev</w:t>
+      </w:r>
+      <w:r>
+        <w:t xml:space="preserve">); a</w:t>
+      </w:r>
+      <w:r>
+        <w:t xml:space="preserve"> </w:t>
+      </w:r>
+      <w:r>
+        <w:rPr>
+          <w:rStyle w:val="VerbatimChar"/>
+        </w:rPr>
+        <w:t xml:space="preserve">wfe</w:t>
+      </w:r>
+      <w:r>
+        <w:t xml:space="preserve"> </w:t>
+      </w:r>
+      <w:r>
+        <w:t xml:space="preserve">also ends at every spin lock released on any core</w:t>
+      </w:r>
+      <w:r>
+        <w:t xml:space="preserve"> </w:t>
+      </w:r>
+      <w:r>
+        <w:t xml:space="preserve">(Circle's unlock sends the event), so it is asked again until the time has passed. The first</w:t>
+      </w:r>
+      <w:r>
+        <w:t xml:space="preserve"> </w:t>
+      </w:r>
+      <w:r>
+        <w:t xml:space="preserve">frame or request brings the full pace back. Measured (Pi 4, 150 pings of a quiet Pi): 4.1 ms</w:t>
+      </w:r>
+      <w:r>
+        <w:t xml:space="preserve"> </w:t>
+      </w:r>
+      <w:r>
+        <w:t xml:space="preserve">on average without the sleep, 4.4 ms with it, the core asleep 93 % of the time; the bench, the</w:t>
+      </w:r>
+      <w:r>
+        <w:t xml:space="preserve"> </w:t>
+      </w:r>
+      <w:r>
+        <w:t xml:space="preserve">pings during a download and the echoes are the same with and without. Trial words:</w:t>
+      </w:r>
+      <w:r>
+        <w:t xml:space="preserve"> </w:t>
+      </w:r>
+      <w:r>
+        <w:rPr>
+          <w:rStyle w:val="VerbatimChar"/>
+        </w:rPr>
+        <w:t xml:space="preserve">netsleep=&lt;ms&gt;</w:t>
+      </w:r>
+      <w:r>
+        <w:t xml:space="preserve"> </w:t>
+      </w:r>
+      <w:r>
+        <w:t xml:space="preserve">(0: never sleep),</w:t>
+      </w:r>
+      <w:r>
+        <w:t xml:space="preserve"> </w:t>
+      </w:r>
+      <w:r>
+        <w:rPr>
+          <w:rStyle w:val="VerbatimChar"/>
+        </w:rPr>
+        <w:t xml:space="preserve">netsleepus=&lt;us&gt;</w:t>
+      </w:r>
+      <w:r>
+        <w:t xml:space="preserve"> </w:t>
+      </w:r>
+      <w:r>
+        <w:t xml:space="preserve">(the sleep's length). The chip's SDIO</w:t>
+      </w:r>
+      <w:r>
+        <w:t xml:space="preserve"> </w:t>
+      </w:r>
+      <w:r>
+        <w:t xml:space="preserve">interrupt is not used yet (it would end the sleep at once: the next step).</w:t>
       </w:r>
     </w:p>
     <w:p>

</xml_diff>

<commit_message>
The network core's sleep ends at the Wi-Fi card's interrupt (asleep 98-99 % of the time on a quiet Pi, a question to the chip a hundred times a second)
Before it sleeps the core asks the controller whether the card's interrupt is pending (a register
read); if not, that interrupt is enabled and its handler, on core 0, sends the event that ends the
sleep. The sleep's own length goes from 1 to 10 ms. Measured: a quiet Pi's pings 4.0 ms on average
(4.1 without any sleep); 500 pings during a download limited to 1 MB/s, none lost. netirq=0 in the
trial file: the time alone, as before.

Co-Authored-By: Claude Opus 5.5 <noreply@anthropic.com>
</commit_message>
<xml_diff>
--- a/docs/exports/02-KERNEL-INTERNALS.docx
+++ b/docs/exports/02-KERNEL-INTERNALS.docx
@@ -56868,6 +56868,18 @@
         <w:rPr>
           <w:rStyle w:val="VerbatimChar"/>
         </w:rPr>
+        <w:t xml:space="preserve">netirq=</w:t>
+      </w:r>
+      <w:r>
+        <w:t xml:space="preserve">,</w:t>
+      </w:r>
+      <w:r>
+        <w:t xml:space="preserve"> </w:t>
+      </w:r>
+      <w:r>
+        <w:rPr>
+          <w:rStyle w:val="VerbatimChar"/>
+        </w:rPr>
         <w:t xml:space="preserve">netstat=1</w:t>
       </w:r>
       <w:r>
@@ -57095,13 +57107,74 @@
         <w:t xml:space="preserve"> </w:t>
       </w:r>
       <w:r>
-        <w:t xml:space="preserve">between the rounds made a ping take six sleeps). The sleep ends after 1 ms — the timer's event</w:t>
-      </w:r>
-      <w:r>
-        <w:t xml:space="preserve"> </w:t>
-      </w:r>
-      <w:r>
-        <w:t xml:space="preserve">stream ends a</w:t>
+        <w:t xml:space="preserve">between the rounds made a ping take six sleeps). The sleep ends after 10 ms, or at once when</w:t>
+      </w:r>
+      <w:r>
+        <w:t xml:space="preserve"> </w:t>
+      </w:r>
+      <w:r>
+        <w:t xml:space="preserve">core 0 posts a request (its</w:t>
+      </w:r>
+      <w:r>
+        <w:t xml:space="preserve"> </w:t>
+      </w:r>
+      <w:r>
+        <w:rPr>
+          <w:rStyle w:val="VerbatimChar"/>
+        </w:rPr>
+        <w:t xml:space="preserve">sev</w:t>
+      </w:r>
+      <w:r>
+        <w:t xml:space="preserve">) or when</w:t>
+      </w:r>
+      <w:r>
+        <w:t xml:space="preserve"> </w:t>
+      </w:r>
+      <w:r>
+        <w:rPr>
+          <w:b/>
+          <w:bCs/>
+        </w:rPr>
+        <w:t xml:space="preserve">the card's interrupt</w:t>
+      </w:r>
+      <w:r>
+        <w:t xml:space="preserve"> </w:t>
+      </w:r>
+      <w:r>
+        <w:t xml:space="preserve">comes: before it sleeps</w:t>
+      </w:r>
+      <w:r>
+        <w:t xml:space="preserve"> </w:t>
+      </w:r>
+      <w:r>
+        <w:t xml:space="preserve">the core asks the controller whether the card's interrupt is pending (</w:t>
+      </w:r>
+      <w:r>
+        <w:rPr>
+          <w:rStyle w:val="VerbatimChar"/>
+        </w:rPr>
+        <w:t xml:space="preserve">sdiocardintrpending</w:t>
+      </w:r>
+      <w:r>
+        <w:t xml:space="preserve">,</w:t>
+      </w:r>
+      <w:r>
+        <w:t xml:space="preserve"> </w:t>
+      </w:r>
+      <w:r>
+        <w:rPr>
+          <w:rStyle w:val="VerbatimChar"/>
+        </w:rPr>
+        <w:t xml:space="preserve">emmc.c</w:t>
+      </w:r>
+      <w:r>
+        <w:t xml:space="preserve">: a register read, no SDIO command) — pending: no sleep; else that interrupt is</w:t>
+      </w:r>
+      <w:r>
+        <w:t xml:space="preserve"> </w:t>
+      </w:r>
+      <w:r>
+        <w:t xml:space="preserve">enabled, and its handler, on core 0, sends the event. A</w:t>
       </w:r>
       <w:r>
         <w:t xml:space="preserve"> </w:t>
@@ -57116,7 +57189,16 @@
         <w:t xml:space="preserve"> </w:t>
       </w:r>
       <w:r>
-        <w:t xml:space="preserve">every 1.2 ms at most (</w:t>
+        <w:t xml:space="preserve">also ends every 1.2 ms (the</w:t>
+      </w:r>
+      <w:r>
+        <w:t xml:space="preserve"> </w:t>
+      </w:r>
+      <w:r>
+        <w:t xml:space="preserve">timer's event stream,</w:t>
+      </w:r>
+      <w:r>
+        <w:t xml:space="preserve"> </w:t>
       </w:r>
       <w:r>
         <w:rPr>
@@ -57125,64 +57207,37 @@
         <w:t xml:space="preserve">CNTKCTL_EL1</w:t>
       </w:r>
       <w:r>
-        <w:t xml:space="preserve">, set on that core) — or at once when</w:t>
-      </w:r>
-      <w:r>
-        <w:t xml:space="preserve"> </w:t>
-      </w:r>
-      <w:r>
-        <w:t xml:space="preserve">core 0 posts a request (its</w:t>
-      </w:r>
-      <w:r>
-        <w:t xml:space="preserve"> </w:t>
-      </w:r>
-      <w:r>
-        <w:rPr>
-          <w:rStyle w:val="VerbatimChar"/>
-        </w:rPr>
-        <w:t xml:space="preserve">sev</w:t>
-      </w:r>
-      <w:r>
-        <w:t xml:space="preserve">); a</w:t>
-      </w:r>
-      <w:r>
-        <w:t xml:space="preserve"> </w:t>
-      </w:r>
-      <w:r>
-        <w:rPr>
-          <w:rStyle w:val="VerbatimChar"/>
-        </w:rPr>
-        <w:t xml:space="preserve">wfe</w:t>
-      </w:r>
-      <w:r>
-        <w:t xml:space="preserve"> </w:t>
-      </w:r>
-      <w:r>
-        <w:t xml:space="preserve">also ends at every spin lock released on any core</w:t>
-      </w:r>
-      <w:r>
-        <w:t xml:space="preserve"> </w:t>
-      </w:r>
-      <w:r>
-        <w:t xml:space="preserve">(Circle's unlock sends the event), so it is asked again until the time has passed. The first</w:t>
-      </w:r>
-      <w:r>
-        <w:t xml:space="preserve"> </w:t>
-      </w:r>
-      <w:r>
-        <w:t xml:space="preserve">frame or request brings the full pace back. Measured (Pi 4, 150 pings of a quiet Pi): 4.1 ms</w:t>
-      </w:r>
-      <w:r>
-        <w:t xml:space="preserve"> </w:t>
-      </w:r>
-      <w:r>
-        <w:t xml:space="preserve">on average without the sleep, 4.4 ms with it, the core asleep 93 % of the time; the bench, the</w:t>
-      </w:r>
-      <w:r>
-        <w:t xml:space="preserve"> </w:t>
-      </w:r>
-      <w:r>
-        <w:t xml:space="preserve">pings during a download and the echoes are the same with and without. Trial words:</w:t>
+        <w:t xml:space="preserve">, set on that core) and at every spin lock released on any</w:t>
+      </w:r>
+      <w:r>
+        <w:t xml:space="preserve"> </w:t>
+      </w:r>
+      <w:r>
+        <w:t xml:space="preserve">core (Circle's unlock sends the event): the conditions are looked at again each time. The</w:t>
+      </w:r>
+      <w:r>
+        <w:t xml:space="preserve"> </w:t>
+      </w:r>
+      <w:r>
+        <w:t xml:space="preserve">first frame or request brings the full pace back. Measured (Pi 4, a quiet Pi pinged 150</w:t>
+      </w:r>
+      <w:r>
+        <w:t xml:space="preserve"> </w:t>
+      </w:r>
+      <w:r>
+        <w:t xml:space="preserve">times): 4.1 ms on average without any sleep; 4.4 ms with a sleep of 1 ms and no interrupt (the</w:t>
+      </w:r>
+      <w:r>
+        <w:t xml:space="preserve"> </w:t>
+      </w:r>
+      <w:r>
+        <w:t xml:space="preserve">core asleep 93 % of the time); 4.0 ms with the interrupt and a sleep of 10 ms (asleep</w:t>
+      </w:r>
+      <w:r>
+        <w:t xml:space="preserve"> </w:t>
+      </w:r>
+      <w:r>
+        <w:t xml:space="preserve">98–99 %); 500 pings during a download limited to 1 MB/s: none lost. Trial words:</w:t>
       </w:r>
       <w:r>
         <w:t xml:space="preserve"> </w:t>
@@ -57212,13 +57267,28 @@
         <w:t xml:space="preserve"> </w:t>
       </w:r>
       <w:r>
-        <w:t xml:space="preserve">(the sleep's length). The chip's SDIO</w:t>
-      </w:r>
-      <w:r>
-        <w:t xml:space="preserve"> </w:t>
-      </w:r>
-      <w:r>
-        <w:t xml:space="preserve">interrupt is not used yet (it would end the sleep at once: the next step).</w:t>
+        <w:t xml:space="preserve">(the sleep's length),</w:t>
+      </w:r>
+      <w:r>
+        <w:t xml:space="preserve"> </w:t>
+      </w:r>
+      <w:r>
+        <w:rPr>
+          <w:rStyle w:val="VerbatimChar"/>
+        </w:rPr>
+        <w:t xml:space="preserve">netirq=0</w:t>
+      </w:r>
+      <w:r>
+        <w:t xml:space="preserve"> </w:t>
+      </w:r>
+      <w:r>
+        <w:t xml:space="preserve">(the</w:t>
+      </w:r>
+      <w:r>
+        <w:t xml:space="preserve"> </w:t>
+      </w:r>
+      <w:r>
+        <w:t xml:space="preserve">time alone ends the sleep).</w:t>
       </w:r>
     </w:p>
     <w:p>

</xml_diff>

<commit_message>
The apps on the merged sources, the docs' exports (windows resized by their frame)
Co-Authored-By: Claude Opus 5.5 <noreply@anthropic.com>
</commit_message>
<xml_diff>
--- a/docs/exports/02-KERNEL-INTERNALS.docx
+++ b/docs/exports/02-KERNEL-INTERNALS.docx
@@ -21715,7 +21715,7 @@
     </w:p>
     <w:bookmarkEnd w:id="74"/>
     <w:bookmarkEnd w:id="75"/>
-    <w:bookmarkStart w:id="92" w:name="X277d88280f3f4acecd0386230c1d60a44106d3c"/>
+    <w:bookmarkStart w:id="93" w:name="X277d88280f3f4acecd0386230c1d60a44106d3c"/>
     <w:p>
       <w:pPr>
         <w:pStyle w:val="Heading2"/>
@@ -25493,6 +25493,68 @@
           <w:iCs/>
         </w:rPr>
         <w:t xml:space="preserve">v81: set_cursor</w:t>
+      </w:r>
+      <w:r>
+        <w:t xml:space="preserve"> </w:t>
+      </w:r>
+      <w:r>
+        <w:t xml:space="preserve">below),</w:t>
+      </w:r>
+      <w:r>
+        <w:t xml:space="preserve"> </w:t>
+      </w:r>
+      <w:r>
+        <w:t xml:space="preserve">v82 =</w:t>
+      </w:r>
+      <w:r>
+        <w:t xml:space="preserve"> </w:t>
+      </w:r>
+      <w:r>
+        <w:rPr>
+          <w:b/>
+          <w:bCs/>
+        </w:rPr>
+        <w:t xml:space="preserve">a window resized by its frame</w:t>
+      </w:r>
+      <w:r>
+        <w:t xml:space="preserve">:</w:t>
+      </w:r>
+      <w:r>
+        <w:t xml:space="preserve"> </w:t>
+      </w:r>
+      <w:r>
+        <w:rPr>
+          <w:rStyle w:val="VerbatimChar"/>
+        </w:rPr>
+        <w:t xml:space="preserve">win_resizable</w:t>
+      </w:r>
+      <w:r>
+        <w:t xml:space="preserve"> </w:t>
+      </w:r>
+      <w:r>
+        <w:t xml:space="preserve">(slot 260),</w:t>
+      </w:r>
+      <w:r>
+        <w:t xml:space="preserve"> </w:t>
+      </w:r>
+      <w:r>
+        <w:rPr>
+          <w:rStyle w:val="VerbatimChar"/>
+        </w:rPr>
+        <w:t xml:space="preserve">GUI_EVENT_WINRESIZE</w:t>
+      </w:r>
+      <w:r>
+        <w:t xml:space="preserve"> </w:t>
+      </w:r>
+      <w:r>
+        <w:t xml:space="preserve">(</w:t>
+      </w:r>
+      <w:r>
+        <w:rPr>
+          <w:i/>
+          <w:iCs/>
+        </w:rPr>
+        <w:t xml:space="preserve">v82: win_resizable</w:t>
       </w:r>
       <w:r>
         <w:t xml:space="preserve"> </w:t>
@@ -49842,13 +49904,13 @@
       </w:r>
     </w:p>
     <w:bookmarkEnd w:id="88"/>
-    <w:bookmarkStart w:id="89" w:name="v81-set_cursor"/>
+    <w:bookmarkStart w:id="89" w:name="v82-win_resizable"/>
     <w:p>
       <w:pPr>
         <w:pStyle w:val="Heading3"/>
       </w:pPr>
       <w:r>
-        <w:t xml:space="preserve">v81: set_cursor</w:t>
+        <w:t xml:space="preserve">v82: win_resizable</w:t>
       </w:r>
     </w:p>
     <w:tbl>
@@ -49908,7 +49970,7 @@
               <w:pStyle w:val="Compact"/>
             </w:pPr>
             <w:r>
-              <w:t xml:space="preserve">259</w:t>
+              <w:t xml:space="preserve">260</w:t>
             </w:r>
           </w:p>
         </w:tc>
@@ -49922,7 +49984,7 @@
               <w:rPr>
                 <w:rStyle w:val="VerbatimChar"/>
               </w:rPr>
-              <w:t xml:space="preserve">set_cursor (shape)</w:t>
+              <w:t xml:space="preserve">win_resizable (on, min_w, min_h)</w:t>
             </w:r>
           </w:p>
         </w:tc>
@@ -49933,187 +49995,49 @@
               <w:pStyle w:val="Compact"/>
             </w:pPr>
             <w:r>
-              <w:t xml:space="preserve">the pointer's shape while it is over the caller's window's client area, or while that window holds the pointer (a button down):</w:t>
-            </w:r>
-            <w:r>
-              <w:t xml:space="preserve"> </w:t>
-            </w:r>
-            <w:r>
-              <w:rPr>
-                <w:rStyle w:val="VerbatimChar"/>
-              </w:rPr>
-              <w:t xml:space="preserve">KAPI_CURSOR_ARROW</w:t>
-            </w:r>
-            <w:r>
-              <w:t xml:space="preserve"> </w:t>
-            </w:r>
-            <w:r>
-              <w:t xml:space="preserve">0,</w:t>
-            </w:r>
-            <w:r>
-              <w:t xml:space="preserve"> </w:t>
-            </w:r>
-            <w:r>
-              <w:rPr>
-                <w:rStyle w:val="VerbatimChar"/>
-              </w:rPr>
-              <w:t xml:space="preserve">_HAND</w:t>
-            </w:r>
-            <w:r>
-              <w:t xml:space="preserve"> </w:t>
-            </w:r>
-            <w:r>
-              <w:t xml:space="preserve">1 (a link),</w:t>
-            </w:r>
-            <w:r>
-              <w:t xml:space="preserve"> </w:t>
-            </w:r>
-            <w:r>
-              <w:rPr>
-                <w:rStyle w:val="VerbatimChar"/>
-              </w:rPr>
-              <w:t xml:space="preserve">_TEXT</w:t>
-            </w:r>
-            <w:r>
-              <w:t xml:space="preserve"> </w:t>
-            </w:r>
-            <w:r>
-              <w:t xml:space="preserve">2 (the I bar),</w:t>
-            </w:r>
-            <w:r>
-              <w:t xml:space="preserve"> </w:t>
-            </w:r>
-            <w:r>
-              <w:rPr>
-                <w:rStyle w:val="VerbatimChar"/>
-              </w:rPr>
-              <w:t xml:space="preserve">_MOVE</w:t>
-            </w:r>
-            <w:r>
-              <w:t xml:space="preserve"> </w:t>
-            </w:r>
-            <w:r>
-              <w:t xml:space="preserve">3 (four arrows),</w:t>
-            </w:r>
-            <w:r>
-              <w:t xml:space="preserve"> </w:t>
-            </w:r>
-            <w:r>
-              <w:rPr>
-                <w:rStyle w:val="VerbatimChar"/>
-              </w:rPr>
-              <w:t xml:space="preserve">_SIZE_H</w:t>
-            </w:r>
-            <w:r>
-              <w:t xml:space="preserve"> </w:t>
-            </w:r>
-            <w:r>
-              <w:t xml:space="preserve">4,</w:t>
-            </w:r>
-            <w:r>
-              <w:t xml:space="preserve"> </w:t>
-            </w:r>
-            <w:r>
-              <w:rPr>
-                <w:rStyle w:val="VerbatimChar"/>
-              </w:rPr>
-              <w:t xml:space="preserve">_SIZE_V</w:t>
-            </w:r>
-            <w:r>
-              <w:t xml:space="preserve"> </w:t>
-            </w:r>
-            <w:r>
-              <w:t xml:space="preserve">5,</w:t>
-            </w:r>
-            <w:r>
-              <w:t xml:space="preserve"> </w:t>
-            </w:r>
-            <w:r>
-              <w:rPr>
-                <w:rStyle w:val="VerbatimChar"/>
-              </w:rPr>
-              <w:t xml:space="preserve">_SIZE_NWSE</w:t>
-            </w:r>
-            <w:r>
-              <w:t xml:space="preserve"> </w:t>
-            </w:r>
-            <w:r>
-              <w:t xml:space="preserve">6,</w:t>
-            </w:r>
-            <w:r>
-              <w:t xml:space="preserve"> </w:t>
-            </w:r>
-            <w:r>
-              <w:rPr>
-                <w:rStyle w:val="VerbatimChar"/>
-              </w:rPr>
-              <w:t xml:space="preserve">_SIZE_NESW</w:t>
-            </w:r>
-            <w:r>
-              <w:t xml:space="preserve"> </w:t>
-            </w:r>
-            <w:r>
-              <w:t xml:space="preserve">7 (two arrows: an edge, a corner dragged),</w:t>
-            </w:r>
-            <w:r>
-              <w:t xml:space="preserve"> </w:t>
-            </w:r>
-            <w:r>
-              <w:rPr>
-                <w:rStyle w:val="VerbatimChar"/>
-              </w:rPr>
-              <w:t xml:space="preserve">_CELL</w:t>
-            </w:r>
-            <w:r>
-              <w:t xml:space="preserve"> </w:t>
-            </w:r>
-            <w:r>
-              <w:t xml:space="preserve">8 (a thick cross: a spreadsheet's cells),</w:t>
-            </w:r>
-            <w:r>
-              <w:t xml:space="preserve"> </w:t>
-            </w:r>
-            <w:r>
-              <w:rPr>
-                <w:rStyle w:val="VerbatimChar"/>
-              </w:rPr>
-              <w:t xml:space="preserve">_CROSSHAIR</w:t>
-            </w:r>
-            <w:r>
-              <w:t xml:space="preserve"> </w:t>
-            </w:r>
-            <w:r>
-              <w:t xml:space="preserve">9,</w:t>
-            </w:r>
-            <w:r>
-              <w:t xml:space="preserve"> </w:t>
-            </w:r>
-            <w:r>
-              <w:rPr>
-                <w:rStyle w:val="VerbatimChar"/>
-              </w:rPr>
-              <w:t xml:space="preserve">_WAIT</w:t>
-            </w:r>
-            <w:r>
-              <w:t xml:space="preserve"> </w:t>
-            </w:r>
-            <w:r>
-              <w:t xml:space="preserve">10 (an hourglass),</w:t>
-            </w:r>
-            <w:r>
-              <w:t xml:space="preserve"> </w:t>
-            </w:r>
-            <w:r>
-              <w:rPr>
-                <w:rStyle w:val="VerbatimChar"/>
-              </w:rPr>
-              <w:t xml:space="preserve">_NO</w:t>
-            </w:r>
-            <w:r>
-              <w:t xml:space="preserve"> </w:t>
-            </w:r>
-            <w:r>
-              <w:t xml:space="preserve">11 (a barred circle) → the shape it had / -1 (no window, an unknown shape).</w:t>
+              <w:t xml:space="preserve">the caller's window's edges and corners can be dragged (</w:t>
+            </w:r>
+            <w:r>
+              <w:rPr>
+                <w:rStyle w:val="VerbatimChar"/>
+              </w:rPr>
+              <w:t xml:space="preserve">on</w:t>
+            </w:r>
+            <w:r>
+              <w:t xml:space="preserve"> </w:t>
+            </w:r>
+            <w:r>
+              <w:t xml:space="preserve">0: no longer); its client area is never made smaller than</w:t>
+            </w:r>
+            <w:r>
+              <w:t xml:space="preserve"> </w:t>
+            </w:r>
+            <w:r>
+              <w:rPr>
+                <w:rStyle w:val="VerbatimChar"/>
+              </w:rPr>
+              <w:t xml:space="preserve">min_w</w:t>
+            </w:r>
+            <w:r>
+              <w:t xml:space="preserve"> </w:t>
+            </w:r>
+            <w:r>
+              <w:t xml:space="preserve">x</w:t>
+            </w:r>
+            <w:r>
+              <w:t xml:space="preserve"> </w:t>
+            </w:r>
+            <w:r>
+              <w:rPr>
+                <w:rStyle w:val="VerbatimChar"/>
+              </w:rPr>
+              <w:t xml:space="preserve">min_h</w:t>
+            </w:r>
+            <w:r>
+              <w:t xml:space="preserve"> </w:t>
+            </w:r>
+            <w:r>
+              <w:t xml:space="preserve">(64 x 32 at least) → 0 / -1 (no window, a borderless or fixed one).</w:t>
             </w:r>
           </w:p>
         </w:tc>
@@ -50124,31 +50048,152 @@
         <w:pStyle w:val="BodyText"/>
       </w:pPr>
       <w:r>
-        <w:t xml:space="preserve">The shape is the window's (</w:t>
-      </w:r>
-      <w:r>
-        <w:rPr>
-          <w:rStyle w:val="VerbatimChar"/>
-        </w:rPr>
-        <w:t xml:space="preserve">CWindow::CursorShape</w:t>
-      </w:r>
-      <w:r>
-        <w:t xml:space="preserve">), kept until changed. The window manager picks</w:t>
-      </w:r>
-      <w:r>
-        <w:t xml:space="preserve"> </w:t>
-      </w:r>
-      <w:r>
-        <w:t xml:space="preserve">what it shows after each pointer event and each</w:t>
-      </w:r>
-      <w:r>
-        <w:t xml:space="preserve"> </w:t>
-      </w:r>
-      <w:r>
-        <w:rPr>
-          <w:rStyle w:val="VerbatimChar"/>
-        </w:rPr>
-        <w:t xml:space="preserve">set_cursor</w:t>
+        <w:t xml:space="preserve">The kernel does not resize the window: it shows where its frame would be, and the app applies it.</w:t>
+      </w:r>
+      <w:r>
+        <w:t xml:space="preserve"> </w:t>
+      </w:r>
+      <w:r>
+        <w:t xml:space="preserve">An edge is the 6 pixels inside the frame's outer edge (</w:t>
+      </w:r>
+      <w:r>
+        <w:rPr>
+          <w:rStyle w:val="VerbatimChar"/>
+        </w:rPr>
+        <w:t xml:space="preserve">WIN_EDGE_BAND</w:t>
+      </w:r>
+      <w:r>
+        <w:t xml:space="preserve">), a corner reaches 18 along</w:t>
+      </w:r>
+      <w:r>
+        <w:t xml:space="preserve"> </w:t>
+      </w:r>
+      <w:r>
+        <w:t xml:space="preserve">it (</w:t>
+      </w:r>
+      <w:r>
+        <w:rPr>
+          <w:rStyle w:val="VerbatimChar"/>
+        </w:rPr>
+        <w:t xml:space="preserve">WIN_EDGE_CORNER</w:t>
+      </w:r>
+      <w:r>
+        <w:t xml:space="preserve">); a title button under the pointer wins (</w:t>
+      </w:r>
+      <w:r>
+        <w:rPr>
+          <w:rStyle w:val="VerbatimChar"/>
+        </w:rPr>
+        <w:t xml:space="preserve">CWindow::HitResizeEdge</w:t>
+      </w:r>
+      <w:r>
+        <w:t xml:space="preserve">). On an</w:t>
+      </w:r>
+      <w:r>
+        <w:t xml:space="preserve"> </w:t>
+      </w:r>
+      <w:r>
+        <w:t xml:space="preserve">edge the pointer shows the two arrows (v81's shapes:</w:t>
+      </w:r>
+      <w:r>
+        <w:t xml:space="preserve"> </w:t>
+      </w:r>
+      <w:r>
+        <w:rPr>
+          <w:rStyle w:val="VerbatimChar"/>
+        </w:rPr>
+        <w:t xml:space="preserve">_SIZE_H</w:t>
+      </w:r>
+      <w:r>
+        <w:t xml:space="preserve">,</w:t>
+      </w:r>
+      <w:r>
+        <w:t xml:space="preserve"> </w:t>
+      </w:r>
+      <w:r>
+        <w:rPr>
+          <w:rStyle w:val="VerbatimChar"/>
+        </w:rPr>
+        <w:t xml:space="preserve">_SIZE_V</w:t>
+      </w:r>
+      <w:r>
+        <w:t xml:space="preserve">,</w:t>
+      </w:r>
+      <w:r>
+        <w:t xml:space="preserve"> </w:t>
+      </w:r>
+      <w:r>
+        <w:rPr>
+          <w:rStyle w:val="VerbatimChar"/>
+        </w:rPr>
+        <w:t xml:space="preserve">_SIZE_NWSE</w:t>
+      </w:r>
+      <w:r>
+        <w:t xml:space="preserve">,</w:t>
+      </w:r>
+      <w:r>
+        <w:t xml:space="preserve"> </w:t>
+      </w:r>
+      <w:r>
+        <w:rPr>
+          <w:rStyle w:val="VerbatimChar"/>
+        </w:rPr>
+        <w:t xml:space="preserve">_SIZE_NESW</w:t>
+      </w:r>
+      <w:r>
+        <w:t xml:space="preserve">). A press there starts a resize (</w:t>
+      </w:r>
+      <w:r>
+        <w:rPr>
+          <w:rStyle w:val="VerbatimChar"/>
+        </w:rPr>
+        <w:t xml:space="preserve">m_pSizeWindow</w:t>
+      </w:r>
+      <w:r>
+        <w:t xml:space="preserve">): the window gets no pointer event</w:t>
+      </w:r>
+      <w:r>
+        <w:t xml:space="preserve"> </w:t>
+      </w:r>
+      <w:r>
+        <w:t xml:space="preserve">meanwhile, and each move draws the</w:t>
+      </w:r>
+      <w:r>
+        <w:t xml:space="preserve"> </w:t>
+      </w:r>
+      <w:r>
+        <w:rPr>
+          <w:b/>
+          <w:bCs/>
+        </w:rPr>
+        <w:t xml:space="preserve">outline</w:t>
+      </w:r>
+      <w:r>
+        <w:t xml:space="preserve"> </w:t>
+      </w:r>
+      <w:r>
+        <w:t xml:space="preserve">of the frame to be — three lines, black, white,</w:t>
+      </w:r>
+      <w:r>
+        <w:t xml:space="preserve"> </w:t>
+      </w:r>
+      <w:r>
+        <w:t xml:space="preserve">black, drawn by</w:t>
+      </w:r>
+      <w:r>
+        <w:t xml:space="preserve"> </w:t>
+      </w:r>
+      <w:r>
+        <w:rPr>
+          <w:rStyle w:val="VerbatimChar"/>
+        </w:rPr>
+        <w:t xml:space="preserve">Composite</w:t>
+      </w:r>
+      <w:r>
+        <w:t xml:space="preserve"> </w:t>
+      </w:r>
+      <w:r>
+        <w:t xml:space="preserve">over the windows, only its four sides made dirty</w:t>
       </w:r>
       <w:r>
         <w:t xml:space="preserve"> </w:t>
@@ -50160,173 +50205,136 @@
         <w:rPr>
           <w:rStyle w:val="VerbatimChar"/>
         </w:rPr>
-        <w:t xml:space="preserve">CWindowManager::PickShapeLocked</w:t>
-      </w:r>
-      <w:r>
-        <w:t xml:space="preserve">):</w:t>
-      </w:r>
-      <w:r>
-        <w:t xml:space="preserve"> </w:t>
-      </w:r>
-      <w:r>
-        <w:t xml:space="preserve">the four arrows while a window is dragged by its title; else the shape of the window that holds</w:t>
-      </w:r>
-      <w:r>
-        <w:t xml:space="preserve"> </w:t>
-      </w:r>
-      <w:r>
-        <w:t xml:space="preserve">the pointer, or of the one whose client area it is over; the arrow on a frame, a title bar, the</w:t>
-      </w:r>
-      <w:r>
-        <w:t xml:space="preserve"> </w:t>
-      </w:r>
-      <w:r>
-        <w:t xml:space="preserve">desktop, a window that never asked, and during a drag &amp; drop. The shapes are images built at boot</w:t>
-      </w:r>
-      <w:r>
-        <w:t xml:space="preserve"> </w:t>
-      </w:r>
-      <w:r>
-        <w:t xml:space="preserve">(</w:t>
-      </w:r>
-      <w:r>
-        <w:rPr>
-          <w:rStyle w:val="VerbatimChar"/>
-        </w:rPr>
-        <w:t xml:space="preserve">kernel.cpp</w:t>
-      </w:r>
-      <w:r>
-        <w:t xml:space="preserve">,</w:t>
-      </w:r>
-      <w:r>
-        <w:t xml:space="preserve"> </w:t>
-      </w:r>
-      <w:r>
-        <w:rPr>
-          <w:rStyle w:val="VerbatimChar"/>
-        </w:rPr>
-        <w:t xml:space="preserve">BuiltinCursorShapes</w:t>
-      </w:r>
-      <w:r>
-        <w:t xml:space="preserve">) from</w:t>
-      </w:r>
-      <w:r>
-        <w:t xml:space="preserve"> </w:t>
-      </w:r>
-      <w:r>
-        <w:rPr>
-          <w:rStyle w:val="VerbatimChar"/>
-        </w:rPr>
-        <w:t xml:space="preserve">kernel/gui/cursors.inc</w:t>
-      </w:r>
-      <w:r>
-        <w:t xml:space="preserve">, which</w:t>
-      </w:r>
-      <w:r>
-        <w:t xml:space="preserve"> </w:t>
-      </w:r>
-      <w:r>
-        <w:rPr>
-          <w:rStyle w:val="VerbatimChar"/>
-        </w:rPr>
-        <w:t xml:space="preserve">tools/gui/gen_cursors.py</w:t>
-      </w:r>
-      <w:r>
-        <w:t xml:space="preserve"> </w:t>
-      </w:r>
-      <w:r>
-        <w:t xml:space="preserve">writes: each shape is drawn there as a set of black pixels, its white</w:t>
-      </w:r>
-      <w:r>
-        <w:t xml:space="preserve"> </w:t>
-      </w:r>
-      <w:r>
-        <w:t xml:space="preserve">edge added around, its hot spot given (</w:t>
-      </w:r>
-      <w:r>
-        <w:rPr>
-          <w:rStyle w:val="VerbatimChar"/>
-        </w:rPr>
-        <w:t xml:space="preserve">--show</w:t>
-      </w:r>
-      <w:r>
-        <w:t xml:space="preserve"> </w:t>
-      </w:r>
-      <w:r>
-        <w:t xml:space="preserve">prints them). Black with a white edge, as the</w:t>
-      </w:r>
-      <w:r>
-        <w:t xml:space="preserve"> </w:t>
-      </w:r>
-      <w:r>
-        <w:t xml:space="preserve">arrow, which stays</w:t>
-      </w:r>
-      <w:r>
-        <w:t xml:space="preserve"> </w:t>
-      </w:r>
-      <w:r>
-        <w:rPr>
-          <w:rStyle w:val="VerbatimChar"/>
-        </w:rPr>
-        <w:t xml:space="preserve">kernel.cpp</w:t>
-      </w:r>
-      <w:r>
-        <w:t xml:space="preserve">'s own. A shape is at most 24 x 24 with its hot spot within 12 of</w:t>
-      </w:r>
-      <w:r>
-        <w:t xml:space="preserve"> </w:t>
-      </w:r>
-      <w:r>
-        <w:t xml:space="preserve">its top left (</w:t>
-      </w:r>
-      <w:r>
-        <w:rPr>
-          <w:rStyle w:val="VerbatimChar"/>
-        </w:rPr>
-        <w:t xml:space="preserve">WM_CURSOR_BOX</w:t>
-      </w:r>
-      <w:r>
-        <w:t xml:space="preserve">,</w:t>
-      </w:r>
-      <w:r>
-        <w:t xml:space="preserve"> </w:t>
-      </w:r>
-      <w:r>
-        <w:rPr>
-          <w:rStyle w:val="VerbatimChar"/>
-        </w:rPr>
-        <w:t xml:space="preserve">WM_CURSOR_REACH</w:t>
-      </w:r>
-      <w:r>
-        <w:t xml:space="preserve">): the screen's part made dirty when the pointer</w:t>
-      </w:r>
-      <w:r>
-        <w:t xml:space="preserve"> </w:t>
-      </w:r>
-      <w:r>
-        <w:t xml:space="preserve">moves or changes is that box around it. Apps do not call this themselves: wtk does (docs/03,</w:t>
-      </w:r>
-      <w:r>
-        <w:t xml:space="preserve"> </w:t>
-      </w:r>
-      <w:r>
-        <w:rPr>
-          <w:rStyle w:val="VerbatimChar"/>
-        </w:rPr>
-        <w:t xml:space="preserve">wk_cursor</w:t>
-      </w:r>
-      <w:r>
-        <w:t xml:space="preserve">).</w:t>
+        <w:t xml:space="preserve">SizeOutlineDirty</w:t>
+      </w:r>
+      <w:r>
+        <w:t xml:space="preserve">) — kept above the menu bar and never smaller than the smallest client area</w:t>
+      </w:r>
+      <w:r>
+        <w:t xml:space="preserve"> </w:t>
+      </w:r>
+      <w:r>
+        <w:t xml:space="preserve">plus the frame (</w:t>
+      </w:r>
+      <w:r>
+        <w:rPr>
+          <w:rStyle w:val="VerbatimChar"/>
+        </w:rPr>
+        <w:t xml:space="preserve">SizeDragLocked</w:t>
+      </w:r>
+      <w:r>
+        <w:t xml:space="preserve">). At the release (</w:t>
+      </w:r>
+      <w:r>
+        <w:rPr>
+          <w:rStyle w:val="VerbatimChar"/>
+        </w:rPr>
+        <w:t xml:space="preserve">SizeEndLocked</w:t>
+      </w:r>
+      <w:r>
+        <w:t xml:space="preserve">) the window's pointer handler</w:t>
+      </w:r>
+      <w:r>
+        <w:t xml:space="preserve"> </w:t>
+      </w:r>
+      <w:r>
+        <w:t xml:space="preserve">gets</w:t>
+      </w:r>
+      <w:r>
+        <w:t xml:space="preserve"> </w:t>
+      </w:r>
+      <w:r>
+        <w:rPr>
+          <w:rStyle w:val="VerbatimChar"/>
+          <w:b/>
+          <w:bCs/>
+        </w:rPr>
+        <w:t xml:space="preserve">GUI_EVENT_WINRESIZE</w:t>
+      </w:r>
+      <w:r>
+        <w:t xml:space="preserve"> </w:t>
+      </w:r>
+      <w:r>
+        <w:t xml:space="preserve">(20):</w:t>
+      </w:r>
+      <w:r>
+        <w:t xml:space="preserve"> </w:t>
+      </w:r>
+      <w:r>
+        <w:rPr>
+          <w:rStyle w:val="VerbatimChar"/>
+        </w:rPr>
+        <w:t xml:space="preserve">lValue = (x &lt;&lt; 48) | (y &lt;&lt; 32) | (client_w &lt;&lt; 16) | client_h</w:t>
+      </w:r>
+      <w:r>
+        <w:t xml:space="preserve">, x and y the frame's new top left on the screen (16 bits signed). The app then calls</w:t>
+      </w:r>
+      <w:r>
+        <w:t xml:space="preserve"> </w:t>
+      </w:r>
+      <w:r>
+        <w:rPr>
+          <w:rStyle w:val="VerbatimChar"/>
+        </w:rPr>
+        <w:t xml:space="preserve">resize_window2</w:t>
+      </w:r>
+      <w:r>
+        <w:t xml:space="preserve"> </w:t>
+      </w:r>
+      <w:r>
+        <w:t xml:space="preserve">and</w:t>
+      </w:r>
+      <w:r>
+        <w:t xml:space="preserve"> </w:t>
+      </w:r>
+      <w:r>
+        <w:rPr>
+          <w:rStyle w:val="VerbatimChar"/>
+        </w:rPr>
+        <w:t xml:space="preserve">move_window</w:t>
+      </w:r>
+      <w:r>
+        <w:t xml:space="preserve"> </w:t>
+      </w:r>
+      <w:r>
+        <w:t xml:space="preserve">— what</w:t>
+      </w:r>
+      <w:r>
+        <w:t xml:space="preserve"> </w:t>
+      </w:r>
+      <w:r>
+        <w:rPr>
+          <w:rStyle w:val="VerbatimChar"/>
+        </w:rPr>
+        <w:t xml:space="preserve">Root::frameResize</w:t>
+      </w:r>
+      <w:r>
+        <w:t xml:space="preserve"> </w:t>
+      </w:r>
+      <w:r>
+        <w:t xml:space="preserve">does (docs/03). An outline rather</w:t>
+      </w:r>
+      <w:r>
+        <w:t xml:space="preserve"> </w:t>
+      </w:r>
+      <w:r>
+        <w:t xml:space="preserve">than a live resize: the window's canvas is made again once, not at every move (a page of Jet</w:t>
+      </w:r>
+      <w:r>
+        <w:t xml:space="preserve"> </w:t>
+      </w:r>
+      <w:r>
+        <w:t xml:space="preserve">would be laid out again each time).</w:t>
       </w:r>
     </w:p>
     <w:bookmarkEnd w:id="89"/>
-    <w:bookmarkStart w:id="90" w:name="v80-cpu_stats-net_stats"/>
+    <w:bookmarkStart w:id="90" w:name="v81-set_cursor"/>
     <w:p>
       <w:pPr>
         <w:pStyle w:val="Heading3"/>
       </w:pPr>
       <w:r>
-        <w:t xml:space="preserve">v80: cpu_stats, net_stats</w:t>
+        <w:t xml:space="preserve">v81: set_cursor</w:t>
       </w:r>
     </w:p>
     <w:tbl>
@@ -50386,7 +50394,7 @@
               <w:pStyle w:val="Compact"/>
             </w:pPr>
             <w:r>
-              <w:t xml:space="preserve">257</w:t>
+              <w:t xml:space="preserve">259</w:t>
             </w:r>
           </w:p>
         </w:tc>
@@ -50400,7 +50408,7 @@
               <w:rPr>
                 <w:rStyle w:val="VerbatimChar"/>
               </w:rPr>
-              <w:t xml:space="preserve">cpu_stats (out)</w:t>
+              <w:t xml:space="preserve">set_cursor (shape)</w:t>
             </w:r>
           </w:p>
         </w:tc>
@@ -50411,94 +50419,16 @@
               <w:pStyle w:val="Compact"/>
             </w:pPr>
             <w:r>
-              <w:rPr>
-                <w:rStyle w:val="VerbatimChar"/>
-              </w:rPr>
-              <w:t xml:space="preserve">struct kapi_cpu_stats</w:t>
-            </w:r>
-            <w:r>
-              <w:t xml:space="preserve"> </w:t>
-            </w:r>
-            <w:r>
-              <w:t xml:space="preserve">(144 bytes):</w:t>
-            </w:r>
-            <w:r>
-              <w:t xml:space="preserve"> </w:t>
-            </w:r>
-            <w:r>
-              <w:rPr>
-                <w:rStyle w:val="VerbatimChar"/>
-              </w:rPr>
-              <w:t xml:space="preserve">now_us</w:t>
-            </w:r>
-            <w:r>
-              <w:t xml:space="preserve"> </w:t>
-            </w:r>
-            <w:r>
-              <w:t xml:space="preserve">(the clock of the read),</w:t>
-            </w:r>
-            <w:r>
-              <w:t xml:space="preserve"> </w:t>
-            </w:r>
-            <w:r>
-              <w:rPr>
-                <w:rStyle w:val="VerbatimChar"/>
-              </w:rPr>
-              <w:t xml:space="preserve">cores</w:t>
-            </w:r>
-            <w:r>
-              <w:t xml:space="preserve">, then a</w:t>
-            </w:r>
-            <w:r>
-              <w:t xml:space="preserve"> </w:t>
-            </w:r>
-            <w:r>
-              <w:rPr>
-                <w:rStyle w:val="VerbatimChar"/>
-              </w:rPr>
-              <w:t xml:space="preserve">kapi_cpu_core</w:t>
-            </w:r>
-            <w:r>
-              <w:t xml:space="preserve"> </w:t>
-            </w:r>
-            <w:r>
-              <w:t xml:space="preserve">a core —</w:t>
-            </w:r>
-            <w:r>
-              <w:t xml:space="preserve"> </w:t>
-            </w:r>
-            <w:r>
-              <w:rPr>
-                <w:rStyle w:val="VerbatimChar"/>
-              </w:rPr>
-              <w:t xml:space="preserve">busy_us</w:t>
-            </w:r>
-            <w:r>
-              <w:t xml:space="preserve"> </w:t>
-            </w:r>
-            <w:r>
-              <w:t xml:space="preserve">(the microseconds it was busy since the boot),</w:t>
-            </w:r>
-            <w:r>
-              <w:t xml:space="preserve"> </w:t>
-            </w:r>
-            <w:r>
-              <w:rPr>
-                <w:rStyle w:val="VerbatimChar"/>
-              </w:rPr>
-              <w:t xml:space="preserve">role</w:t>
-            </w:r>
-            <w:r>
-              <w:t xml:space="preserve"> </w:t>
-            </w:r>
-            <w:r>
-              <w:t xml:space="preserve">(</w:t>
-            </w:r>
-            <w:r>
-              <w:rPr>
-                <w:rStyle w:val="VerbatimChar"/>
-              </w:rPr>
-              <w:t xml:space="preserve">KAPI_CORE_SYSTEM</w:t>
+              <w:t xml:space="preserve">the pointer's shape while it is over the caller's window's client area, or while that window holds the pointer (a button down):</w:t>
+            </w:r>
+            <w:r>
+              <w:t xml:space="preserve"> </w:t>
+            </w:r>
+            <w:r>
+              <w:rPr>
+                <w:rStyle w:val="VerbatimChar"/>
+              </w:rPr>
+              <w:t xml:space="preserve">KAPI_CURSOR_ARROW</w:t>
             </w:r>
             <w:r>
               <w:t xml:space="preserve"> </w:t>
@@ -50513,219 +50443,163 @@
               <w:rPr>
                 <w:rStyle w:val="VerbatimChar"/>
               </w:rPr>
-              <w:t xml:space="preserve">KAPI_CORE_SOUND</w:t>
-            </w:r>
-            <w:r>
-              <w:t xml:space="preserve"> </w:t>
-            </w:r>
-            <w:r>
-              <w:t xml:space="preserve">1,</w:t>
-            </w:r>
-            <w:r>
-              <w:t xml:space="preserve"> </w:t>
-            </w:r>
-            <w:r>
-              <w:rPr>
-                <w:rStyle w:val="VerbatimChar"/>
-              </w:rPr>
-              <w:t xml:space="preserve">KAPI_CORE_APP</w:t>
-            </w:r>
-            <w:r>
-              <w:t xml:space="preserve"> </w:t>
-            </w:r>
-            <w:r>
-              <w:t xml:space="preserve">2,</w:t>
-            </w:r>
-            <w:r>
-              <w:t xml:space="preserve"> </w:t>
-            </w:r>
-            <w:r>
-              <w:rPr>
-                <w:rStyle w:val="VerbatimChar"/>
-              </w:rPr>
-              <w:t xml:space="preserve">KAPI_CORE_NETWORK</w:t>
-            </w:r>
-            <w:r>
-              <w:t xml:space="preserve"> </w:t>
-            </w:r>
-            <w:r>
-              <w:t xml:space="preserve">3),</w:t>
-            </w:r>
-            <w:r>
-              <w:t xml:space="preserve"> </w:t>
-            </w:r>
-            <w:r>
-              <w:rPr>
-                <w:rStyle w:val="VerbatimChar"/>
-              </w:rPr>
-              <w:t xml:space="preserve">pid</w:t>
-            </w:r>
-            <w:r>
-              <w:t xml:space="preserve"> </w:t>
-            </w:r>
-            <w:r>
-              <w:t xml:space="preserve">(an app core's owner, 0 when free) → 0 /</w:t>
-            </w:r>
-            <w:r>
-              <w:t xml:space="preserve"> </w:t>
-            </w:r>
-            <w:r>
-              <w:rPr>
-                <w:rStyle w:val="VerbatimChar"/>
-              </w:rPr>
-              <w:t xml:space="preserve">-EFAULT</w:t>
-            </w:r>
-            <w:r>
-              <w:t xml:space="preserve">. Two reads make a load:</w:t>
-            </w:r>
-            <w:r>
-              <w:t xml:space="preserve"> </w:t>
-            </w:r>
-            <w:r>
-              <w:rPr>
-                <w:rStyle w:val="VerbatimChar"/>
-              </w:rPr>
-              <w:t xml:space="preserve">(busy_us' - busy_us) / (now_us' - now_us)</w:t>
-            </w:r>
-            <w:r>
-              <w:t xml:space="preserve">.</w:t>
-            </w:r>
-          </w:p>
-        </w:tc>
-      </w:tr>
-      <w:tr>
-        <w:tc>
-          <w:tcPr/>
-          <w:p>
-            <w:pPr>
-              <w:pStyle w:val="Compact"/>
-            </w:pPr>
-            <w:r>
-              <w:t xml:space="preserve">258</w:t>
-            </w:r>
-          </w:p>
-        </w:tc>
-        <w:tc>
-          <w:tcPr/>
-          <w:p>
-            <w:pPr>
-              <w:pStyle w:val="Compact"/>
-            </w:pPr>
-            <w:r>
-              <w:rPr>
-                <w:rStyle w:val="VerbatimChar"/>
-              </w:rPr>
-              <w:t xml:space="preserve">net_stats (pid, out)</w:t>
-            </w:r>
-          </w:p>
-        </w:tc>
-        <w:tc>
-          <w:tcPr/>
-          <w:p>
-            <w:pPr>
-              <w:pStyle w:val="Compact"/>
-            </w:pPr>
-            <w:r>
-              <w:rPr>
-                <w:rStyle w:val="VerbatimChar"/>
-              </w:rPr>
-              <w:t xml:space="preserve">struct kapi_net_stats</w:t>
-            </w:r>
-            <w:r>
-              <w:t xml:space="preserve"> </w:t>
-            </w:r>
-            <w:r>
-              <w:t xml:space="preserve">(24 bytes): the payload bytes</w:t>
-            </w:r>
-            <w:r>
-              <w:t xml:space="preserve"> </w:t>
-            </w:r>
-            <w:r>
-              <w:rPr>
-                <w:rStyle w:val="VerbatimChar"/>
-              </w:rPr>
-              <w:t xml:space="preserve">pid</w:t>
-            </w:r>
-            <w:r>
-              <w:t xml:space="preserve">'s sockets received and sent (</w:t>
-            </w:r>
-            <w:r>
-              <w:rPr>
-                <w:rStyle w:val="VerbatimChar"/>
-              </w:rPr>
-              <w:t xml:space="preserve">rx_bytes</w:t>
-            </w:r>
-            <w:r>
-              <w:t xml:space="preserve">,</w:t>
-            </w:r>
-            <w:r>
-              <w:t xml:space="preserve"> </w:t>
-            </w:r>
-            <w:r>
-              <w:rPr>
-                <w:rStyle w:val="VerbatimChar"/>
-              </w:rPr>
-              <w:t xml:space="preserve">tx_bytes</w:t>
-            </w:r>
-            <w:r>
-              <w:t xml:space="preserve">: TCP and UDP, the old</w:t>
-            </w:r>
-            <w:r>
-              <w:t xml:space="preserve"> </w:t>
-            </w:r>
-            <w:r>
-              <w:rPr>
-                <w:rStyle w:val="VerbatimChar"/>
-              </w:rPr>
-              <w:t xml:space="preserve">tcp_*</w:t>
-            </w:r>
-            <w:r>
-              <w:t xml:space="preserve"> </w:t>
-            </w:r>
-            <w:r>
-              <w:t xml:space="preserve">calls and the BSD sockets) since it started, its</w:t>
-            </w:r>
-            <w:r>
-              <w:t xml:space="preserve"> </w:t>
-            </w:r>
-            <w:r>
-              <w:rPr>
-                <w:rStyle w:val="VerbatimChar"/>
-              </w:rPr>
-              <w:t xml:space="preserve">sockets</w:t>
-            </w:r>
-            <w:r>
-              <w:t xml:space="preserve"> </w:t>
-            </w:r>
-            <w:r>
-              <w:t xml:space="preserve">open now;</w:t>
-            </w:r>
-            <w:r>
-              <w:t xml:space="preserve"> </w:t>
-            </w:r>
-            <w:r>
-              <w:rPr>
-                <w:rStyle w:val="VerbatimChar"/>
-              </w:rPr>
-              <w:t xml:space="preserve">pid</w:t>
-            </w:r>
-            <w:r>
-              <w:t xml:space="preserve"> </w:t>
-            </w:r>
-            <w:r>
-              <w:t xml:space="preserve">0: every process's since the boot → 0 /</w:t>
-            </w:r>
-            <w:r>
-              <w:t xml:space="preserve"> </w:t>
-            </w:r>
-            <w:r>
-              <w:rPr>
-                <w:rStyle w:val="VerbatimChar"/>
-              </w:rPr>
-              <w:t xml:space="preserve">-EFAULT</w:t>
-            </w:r>
-            <w:r>
-              <w:t xml:space="preserve">. A process that used no socket: zeros.</w:t>
+              <w:t xml:space="preserve">_HAND</w:t>
+            </w:r>
+            <w:r>
+              <w:t xml:space="preserve"> </w:t>
+            </w:r>
+            <w:r>
+              <w:t xml:space="preserve">1 (a link),</w:t>
+            </w:r>
+            <w:r>
+              <w:t xml:space="preserve"> </w:t>
+            </w:r>
+            <w:r>
+              <w:rPr>
+                <w:rStyle w:val="VerbatimChar"/>
+              </w:rPr>
+              <w:t xml:space="preserve">_TEXT</w:t>
+            </w:r>
+            <w:r>
+              <w:t xml:space="preserve"> </w:t>
+            </w:r>
+            <w:r>
+              <w:t xml:space="preserve">2 (the I bar),</w:t>
+            </w:r>
+            <w:r>
+              <w:t xml:space="preserve"> </w:t>
+            </w:r>
+            <w:r>
+              <w:rPr>
+                <w:rStyle w:val="VerbatimChar"/>
+              </w:rPr>
+              <w:t xml:space="preserve">_MOVE</w:t>
+            </w:r>
+            <w:r>
+              <w:t xml:space="preserve"> </w:t>
+            </w:r>
+            <w:r>
+              <w:t xml:space="preserve">3 (four arrows),</w:t>
+            </w:r>
+            <w:r>
+              <w:t xml:space="preserve"> </w:t>
+            </w:r>
+            <w:r>
+              <w:rPr>
+                <w:rStyle w:val="VerbatimChar"/>
+              </w:rPr>
+              <w:t xml:space="preserve">_SIZE_H</w:t>
+            </w:r>
+            <w:r>
+              <w:t xml:space="preserve"> </w:t>
+            </w:r>
+            <w:r>
+              <w:t xml:space="preserve">4,</w:t>
+            </w:r>
+            <w:r>
+              <w:t xml:space="preserve"> </w:t>
+            </w:r>
+            <w:r>
+              <w:rPr>
+                <w:rStyle w:val="VerbatimChar"/>
+              </w:rPr>
+              <w:t xml:space="preserve">_SIZE_V</w:t>
+            </w:r>
+            <w:r>
+              <w:t xml:space="preserve"> </w:t>
+            </w:r>
+            <w:r>
+              <w:t xml:space="preserve">5,</w:t>
+            </w:r>
+            <w:r>
+              <w:t xml:space="preserve"> </w:t>
+            </w:r>
+            <w:r>
+              <w:rPr>
+                <w:rStyle w:val="VerbatimChar"/>
+              </w:rPr>
+              <w:t xml:space="preserve">_SIZE_NWSE</w:t>
+            </w:r>
+            <w:r>
+              <w:t xml:space="preserve"> </w:t>
+            </w:r>
+            <w:r>
+              <w:t xml:space="preserve">6,</w:t>
+            </w:r>
+            <w:r>
+              <w:t xml:space="preserve"> </w:t>
+            </w:r>
+            <w:r>
+              <w:rPr>
+                <w:rStyle w:val="VerbatimChar"/>
+              </w:rPr>
+              <w:t xml:space="preserve">_SIZE_NESW</w:t>
+            </w:r>
+            <w:r>
+              <w:t xml:space="preserve"> </w:t>
+            </w:r>
+            <w:r>
+              <w:t xml:space="preserve">7 (two arrows: an edge, a corner dragged),</w:t>
+            </w:r>
+            <w:r>
+              <w:t xml:space="preserve"> </w:t>
+            </w:r>
+            <w:r>
+              <w:rPr>
+                <w:rStyle w:val="VerbatimChar"/>
+              </w:rPr>
+              <w:t xml:space="preserve">_CELL</w:t>
+            </w:r>
+            <w:r>
+              <w:t xml:space="preserve"> </w:t>
+            </w:r>
+            <w:r>
+              <w:t xml:space="preserve">8 (a thick cross: a spreadsheet's cells),</w:t>
+            </w:r>
+            <w:r>
+              <w:t xml:space="preserve"> </w:t>
+            </w:r>
+            <w:r>
+              <w:rPr>
+                <w:rStyle w:val="VerbatimChar"/>
+              </w:rPr>
+              <w:t xml:space="preserve">_CROSSHAIR</w:t>
+            </w:r>
+            <w:r>
+              <w:t xml:space="preserve"> </w:t>
+            </w:r>
+            <w:r>
+              <w:t xml:space="preserve">9,</w:t>
+            </w:r>
+            <w:r>
+              <w:t xml:space="preserve"> </w:t>
+            </w:r>
+            <w:r>
+              <w:rPr>
+                <w:rStyle w:val="VerbatimChar"/>
+              </w:rPr>
+              <w:t xml:space="preserve">_WAIT</w:t>
+            </w:r>
+            <w:r>
+              <w:t xml:space="preserve"> </w:t>
+            </w:r>
+            <w:r>
+              <w:t xml:space="preserve">10 (an hourglass),</w:t>
+            </w:r>
+            <w:r>
+              <w:t xml:space="preserve"> </w:t>
+            </w:r>
+            <w:r>
+              <w:rPr>
+                <w:rStyle w:val="VerbatimChar"/>
+              </w:rPr>
+              <w:t xml:space="preserve">_NO</w:t>
+            </w:r>
+            <w:r>
+              <w:t xml:space="preserve"> </w:t>
+            </w:r>
+            <w:r>
+              <w:t xml:space="preserve">11 (a barred circle) → the shape it had / -1 (no window, an unknown shape).</w:t>
             </w:r>
           </w:p>
         </w:tc>
@@ -50736,281 +50610,76 @@
         <w:pStyle w:val="BodyText"/>
       </w:pPr>
       <w:r>
-        <w:t xml:space="preserve">What "busy" is, core by core. A core with a</w:t>
-      </w:r>
-      <w:r>
-        <w:t xml:space="preserve"> </w:t>
-      </w:r>
-      <w:r>
-        <w:rPr>
-          <w:b/>
-          <w:bCs/>
-        </w:rPr>
-        <w:t xml:space="preserve">scheduler</w:t>
-      </w:r>
-      <w:r>
-        <w:t xml:space="preserve"> </w:t>
-      </w:r>
-      <w:r>
-        <w:t xml:space="preserve">— core 0, and core 3 with</w:t>
-      </w:r>
-      <w:r>
-        <w:t xml:space="preserve"> </w:t>
-      </w:r>
-      <w:r>
-        <w:rPr>
-          <w:rStyle w:val="VerbatimChar"/>
-        </w:rPr>
-        <w:t xml:space="preserve">netcore=1</w:t>
-      </w:r>
-      <w:r>
-        <w:t xml:space="preserve"> </w:t>
-      </w:r>
-      <w:r>
-        <w:t xml:space="preserve">—</w:t>
-      </w:r>
-      <w:r>
-        <w:t xml:space="preserve"> </w:t>
-      </w:r>
-      <w:r>
-        <w:t xml:space="preserve">counts the time its tasks ran, the idle task apart:</w:t>
-      </w:r>
-      <w:r>
-        <w:t xml:space="preserve"> </w:t>
-      </w:r>
-      <w:r>
-        <w:rPr>
-          <w:rStyle w:val="VerbatimChar"/>
-        </w:rPr>
-        <w:t xml:space="preserve">CScheduler::Yield</w:t>
-      </w:r>
-      <w:r>
-        <w:t xml:space="preserve"> </w:t>
-      </w:r>
-      <w:r>
-        <w:t xml:space="preserve">adds what the leaving task</w:t>
-      </w:r>
-      <w:r>
-        <w:t xml:space="preserve"> </w:t>
-      </w:r>
-      <w:r>
-        <w:t xml:space="preserve">ran (</w:t>
-      </w:r>
-      <w:r>
-        <w:rPr>
-          <w:rStyle w:val="VerbatimChar"/>
-        </w:rPr>
-        <w:t xml:space="preserve">m_nBusyUs</w:t>
-      </w:r>
-      <w:r>
-        <w:t xml:space="preserve">;</w:t>
-      </w:r>
-      <w:r>
-        <w:t xml:space="preserve"> </w:t>
-      </w:r>
-      <w:r>
-        <w:rPr>
-          <w:rStyle w:val="VerbatimChar"/>
-        </w:rPr>
-        <w:t xml:space="preserve">GetBusyUs</w:t>
-      </w:r>
-      <w:r>
-        <w:t xml:space="preserve"> </w:t>
-      </w:r>
-      <w:r>
-        <w:t xml:space="preserve">adds the running task's time so far, so a read from another core is</w:t>
-      </w:r>
-      <w:r>
-        <w:t xml:space="preserve"> </w:t>
-      </w:r>
-      <w:r>
-        <w:t xml:space="preserve">live). Core 0's idle task sleeps in</w:t>
-      </w:r>
-      <w:r>
-        <w:t xml:space="preserve"> </w:t>
-      </w:r>
-      <w:r>
-        <w:rPr>
-          <w:rStyle w:val="VerbatimChar"/>
-        </w:rPr>
-        <w:t xml:space="preserve">wfi</w:t>
-      </w:r>
-      <w:r>
-        <w:t xml:space="preserve">, so its figure is the machine's real load; the interrupt</w:t>
-      </w:r>
-      <w:r>
-        <w:t xml:space="preserve"> </w:t>
-      </w:r>
-      <w:r>
-        <w:t xml:space="preserve">handlers that wake it are counted as idle. The</w:t>
-      </w:r>
-      <w:r>
-        <w:t xml:space="preserve"> </w:t>
-      </w:r>
-      <w:r>
-        <w:rPr>
-          <w:b/>
-          <w:bCs/>
-        </w:rPr>
-        <w:t xml:space="preserve">network core</w:t>
-      </w:r>
-      <w:r>
-        <w:t xml:space="preserve">'s tasks all wait by yielding (it</w:t>
-      </w:r>
-      <w:r>
-        <w:t xml:space="preserve"> </w:t>
-      </w:r>
-      <w:r>
-        <w:t xml:space="preserve">polls the Wi-Fi chip), so while the network works it reads 100 %; once the network has been quiet</w:t>
-      </w:r>
-      <w:r>
-        <w:t xml:space="preserve"> </w:t>
-      </w:r>
-      <w:r>
-        <w:t xml:space="preserve">for 50 ms it sleeps between two questions to the chip (</w:t>
-      </w:r>
-      <w:r>
-        <w:rPr>
-          <w:i/>
-          <w:iCs/>
-        </w:rPr>
-        <w:t xml:space="preserve">The network core sleeps</w:t>
-      </w:r>
-      <w:r>
-        <w:t xml:space="preserve">, below) and that</w:t>
-      </w:r>
-      <w:r>
-        <w:t xml:space="preserve"> </w:t>
-      </w:r>
-      <w:r>
-        <w:t xml:space="preserve">sleep is taken off its busy time (</w:t>
-      </w:r>
-      <w:r>
-        <w:rPr>
-          <w:rStyle w:val="VerbatimChar"/>
-        </w:rPr>
-        <w:t xml:space="preserve">CScheduler::NoteSleptUs</w:t>
-      </w:r>
-      <w:r>
-        <w:t xml:space="preserve">): a few per cent.</w:t>
-      </w:r>
-      <w:r>
-        <w:t xml:space="preserve"> </w:t>
-      </w:r>
-      <w:r>
-        <w:rPr>
-          <w:b/>
-          <w:bCs/>
-        </w:rPr>
-        <w:t xml:space="preserve">Core 1</w:t>
-      </w:r>
-      <w:r>
-        <w:t xml:space="preserve"> </w:t>
-      </w:r>
-      <w:r>
-        <w:t xml:space="preserve">counts the time it renders sound (</w:t>
-      </w:r>
-      <w:r>
-        <w:rPr>
-          <w:rStyle w:val="VerbatimChar"/>
-        </w:rPr>
-        <w:t xml:space="preserve">sys/sound.cpp</w:t>
-      </w:r>
-      <w:r>
-        <w:t xml:space="preserve">, around</w:t>
-      </w:r>
-      <w:r>
-        <w:t xml:space="preserve"> </w:t>
-      </w:r>
-      <w:r>
-        <w:rPr>
-          <w:rStyle w:val="VerbatimChar"/>
-        </w:rPr>
-        <w:t xml:space="preserve">Render</w:t>
-      </w:r>
-      <w:r>
-        <w:t xml:space="preserve">); an</w:t>
-      </w:r>
-      <w:r>
-        <w:t xml:space="preserve"> </w:t>
-      </w:r>
-      <w:r>
-        <w:rPr>
-          <w:b/>
-          <w:bCs/>
-        </w:rPr>
-        <w:t xml:space="preserve">app core</w:t>
-      </w:r>
-      <w:r>
-        <w:t xml:space="preserve"> </w:t>
-      </w:r>
-      <w:r>
-        <w:t xml:space="preserve">the</w:t>
-      </w:r>
-      <w:r>
-        <w:t xml:space="preserve"> </w:t>
-      </w:r>
-      <w:r>
-        <w:t xml:space="preserve">time its jobs ran, from the entry at EL0 to the job's end or drop (</w:t>
-      </w:r>
-      <w:r>
-        <w:rPr>
-          <w:rStyle w:val="VerbatimChar"/>
-        </w:rPr>
-        <w:t xml:space="preserve">sys/appcore.cpp</w:t>
-      </w:r>
-      <w:r>
-        <w:t xml:space="preserve">; a job that</w:t>
-      </w:r>
-      <w:r>
-        <w:t xml:space="preserve"> </w:t>
-      </w:r>
-      <w:r>
-        <w:t xml:space="preserve">waits in</w:t>
-      </w:r>
-      <w:r>
-        <w:t xml:space="preserve"> </w:t>
-      </w:r>
-      <w:r>
-        <w:rPr>
-          <w:rStyle w:val="VerbatimChar"/>
-        </w:rPr>
-        <w:t xml:space="preserve">wfe</w:t>
-      </w:r>
-      <w:r>
-        <w:t xml:space="preserve"> </w:t>
-      </w:r>
-      <w:r>
-        <w:t xml:space="preserve">still counts).</w:t>
-      </w:r>
-    </w:p>
-    <w:p>
-      <w:pPr>
-        <w:pStyle w:val="BodyText"/>
-      </w:pPr>
-      <w:r>
-        <w:t xml:space="preserve">The network's bytes are counted where the calls return, on core 0 (</w:t>
-      </w:r>
-      <w:r>
-        <w:rPr>
-          <w:rStyle w:val="VerbatimChar"/>
-        </w:rPr>
-        <w:t xml:space="preserve">NetTcpSend</w:t>
-      </w:r>
-      <w:r>
-        <w:t xml:space="preserve"> </w:t>
-      </w:r>
-      <w:r>
-        <w:t xml:space="preserve">/</w:t>
-      </w:r>
-      <w:r>
-        <w:t xml:space="preserve"> </w:t>
-      </w:r>
-      <w:r>
-        <w:rPr>
-          <w:rStyle w:val="VerbatimChar"/>
-        </w:rPr>
-        <w:t xml:space="preserve">NetTcpRecv</w:t>
+        <w:t xml:space="preserve">The shape is the window's (</w:t>
+      </w:r>
+      <w:r>
+        <w:rPr>
+          <w:rStyle w:val="VerbatimChar"/>
+        </w:rPr>
+        <w:t xml:space="preserve">CWindow::CursorShape</w:t>
+      </w:r>
+      <w:r>
+        <w:t xml:space="preserve">), kept until changed. The window manager picks</w:t>
+      </w:r>
+      <w:r>
+        <w:t xml:space="preserve"> </w:t>
+      </w:r>
+      <w:r>
+        <w:t xml:space="preserve">what it shows after each pointer event and each</w:t>
+      </w:r>
+      <w:r>
+        <w:t xml:space="preserve"> </w:t>
+      </w:r>
+      <w:r>
+        <w:rPr>
+          <w:rStyle w:val="VerbatimChar"/>
+        </w:rPr>
+        <w:t xml:space="preserve">set_cursor</w:t>
+      </w:r>
+      <w:r>
+        <w:t xml:space="preserve"> </w:t>
+      </w:r>
+      <w:r>
+        <w:t xml:space="preserve">(</w:t>
+      </w:r>
+      <w:r>
+        <w:rPr>
+          <w:rStyle w:val="VerbatimChar"/>
+        </w:rPr>
+        <w:t xml:space="preserve">CWindowManager::PickShapeLocked</w:t>
+      </w:r>
+      <w:r>
+        <w:t xml:space="preserve">):</w:t>
+      </w:r>
+      <w:r>
+        <w:t xml:space="preserve"> </w:t>
+      </w:r>
+      <w:r>
+        <w:t xml:space="preserve">the four arrows while a window is dragged by its title; else the shape of the window that holds</w:t>
+      </w:r>
+      <w:r>
+        <w:t xml:space="preserve"> </w:t>
+      </w:r>
+      <w:r>
+        <w:t xml:space="preserve">the pointer, or of the one whose client area it is over; the arrow on a frame, a title bar, the</w:t>
+      </w:r>
+      <w:r>
+        <w:t xml:space="preserve"> </w:t>
+      </w:r>
+      <w:r>
+        <w:t xml:space="preserve">desktop, a window that never asked, and during a drag &amp; drop. The shapes are images built at boot</w:t>
+      </w:r>
+      <w:r>
+        <w:t xml:space="preserve"> </w:t>
+      </w:r>
+      <w:r>
+        <w:t xml:space="preserve">(</w:t>
+      </w:r>
+      <w:r>
+        <w:rPr>
+          <w:rStyle w:val="VerbatimChar"/>
+        </w:rPr>
+        <w:t xml:space="preserve">kernel.cpp</w:t>
       </w:r>
       <w:r>
         <w:t xml:space="preserve">,</w:t>
@@ -51022,98 +50691,128 @@
         <w:rPr>
           <w:rStyle w:val="VerbatimChar"/>
         </w:rPr>
-        <w:t xml:space="preserve">NetSockSend</w:t>
-      </w:r>
-      <w:r>
-        <w:t xml:space="preserve"> </w:t>
-      </w:r>
-      <w:r>
-        <w:t xml:space="preserve">/</w:t>
-      </w:r>
-      <w:r>
-        <w:t xml:space="preserve"> </w:t>
-      </w:r>
-      <w:r>
-        <w:rPr>
-          <w:rStyle w:val="VerbatimChar"/>
-        </w:rPr>
-        <w:t xml:space="preserve">NetSockRecv</w:t>
-      </w:r>
-      <w:r>
-        <w:t xml:space="preserve"> </w:t>
-      </w:r>
-      <w:r>
-        <w:t xml:space="preserve">in</w:t>
-      </w:r>
-      <w:r>
-        <w:t xml:space="preserve"> </w:t>
-      </w:r>
-      <w:r>
-        <w:rPr>
-          <w:rStyle w:val="VerbatimChar"/>
-        </w:rPr>
-        <w:t xml:space="preserve">sys/net.cpp</w:t>
-      </w:r>
-      <w:r>
-        <w:t xml:space="preserve">: a process's tasks all run there, so the table needs</w:t>
-      </w:r>
-      <w:r>
-        <w:t xml:space="preserve"> </w:t>
-      </w:r>
-      <w:r>
-        <w:t xml:space="preserve">no lock): one line a process (64 at most; beyond, the totals only), freed when the process ends</w:t>
-      </w:r>
-      <w:r>
-        <w:t xml:space="preserve"> </w:t>
-      </w:r>
-      <w:r>
-        <w:t xml:space="preserve">(</w:t>
-      </w:r>
-      <w:r>
-        <w:rPr>
-          <w:rStyle w:val="VerbatimChar"/>
-        </w:rPr>
-        <w:t xml:space="preserve">NetCloseByPid</w:t>
-      </w:r>
-      <w:r>
-        <w:t xml:space="preserve">). A byte read with</w:t>
-      </w:r>
-      <w:r>
-        <w:t xml:space="preserve"> </w:t>
-      </w:r>
-      <w:r>
-        <w:rPr>
-          <w:rStyle w:val="VerbatimChar"/>
-        </w:rPr>
-        <w:t xml:space="preserve">MSG_PEEK</w:t>
-      </w:r>
-      <w:r>
-        <w:t xml:space="preserve"> </w:t>
-      </w:r>
-      <w:r>
-        <w:t xml:space="preserve">is counted when it is really read. They are the</w:t>
-      </w:r>
-      <w:r>
-        <w:t xml:space="preserve"> </w:t>
-      </w:r>
-      <w:r>
-        <w:t xml:space="preserve">sockets' payload, not the frames on the air: no header, no retransmission, nothing of the kernel's</w:t>
-      </w:r>
-      <w:r>
-        <w:t xml:space="preserve"> </w:t>
-      </w:r>
-      <w:r>
-        <w:t xml:space="preserve">own traffic (DHCP, DNS, NTP).</w:t>
+        <w:t xml:space="preserve">BuiltinCursorShapes</w:t>
+      </w:r>
+      <w:r>
+        <w:t xml:space="preserve">) from</w:t>
+      </w:r>
+      <w:r>
+        <w:t xml:space="preserve"> </w:t>
+      </w:r>
+      <w:r>
+        <w:rPr>
+          <w:rStyle w:val="VerbatimChar"/>
+        </w:rPr>
+        <w:t xml:space="preserve">kernel/gui/cursors.inc</w:t>
+      </w:r>
+      <w:r>
+        <w:t xml:space="preserve">, which</w:t>
+      </w:r>
+      <w:r>
+        <w:t xml:space="preserve"> </w:t>
+      </w:r>
+      <w:r>
+        <w:rPr>
+          <w:rStyle w:val="VerbatimChar"/>
+        </w:rPr>
+        <w:t xml:space="preserve">tools/gui/gen_cursors.py</w:t>
+      </w:r>
+      <w:r>
+        <w:t xml:space="preserve"> </w:t>
+      </w:r>
+      <w:r>
+        <w:t xml:space="preserve">writes: each shape is drawn there as a set of black pixels, its white</w:t>
+      </w:r>
+      <w:r>
+        <w:t xml:space="preserve"> </w:t>
+      </w:r>
+      <w:r>
+        <w:t xml:space="preserve">edge added around, its hot spot given (</w:t>
+      </w:r>
+      <w:r>
+        <w:rPr>
+          <w:rStyle w:val="VerbatimChar"/>
+        </w:rPr>
+        <w:t xml:space="preserve">--show</w:t>
+      </w:r>
+      <w:r>
+        <w:t xml:space="preserve"> </w:t>
+      </w:r>
+      <w:r>
+        <w:t xml:space="preserve">prints them). Black with a white edge, as the</w:t>
+      </w:r>
+      <w:r>
+        <w:t xml:space="preserve"> </w:t>
+      </w:r>
+      <w:r>
+        <w:t xml:space="preserve">arrow, which stays</w:t>
+      </w:r>
+      <w:r>
+        <w:t xml:space="preserve"> </w:t>
+      </w:r>
+      <w:r>
+        <w:rPr>
+          <w:rStyle w:val="VerbatimChar"/>
+        </w:rPr>
+        <w:t xml:space="preserve">kernel.cpp</w:t>
+      </w:r>
+      <w:r>
+        <w:t xml:space="preserve">'s own. A shape is at most 24 x 24 with its hot spot within 12 of</w:t>
+      </w:r>
+      <w:r>
+        <w:t xml:space="preserve"> </w:t>
+      </w:r>
+      <w:r>
+        <w:t xml:space="preserve">its top left (</w:t>
+      </w:r>
+      <w:r>
+        <w:rPr>
+          <w:rStyle w:val="VerbatimChar"/>
+        </w:rPr>
+        <w:t xml:space="preserve">WM_CURSOR_BOX</w:t>
+      </w:r>
+      <w:r>
+        <w:t xml:space="preserve">,</w:t>
+      </w:r>
+      <w:r>
+        <w:t xml:space="preserve"> </w:t>
+      </w:r>
+      <w:r>
+        <w:rPr>
+          <w:rStyle w:val="VerbatimChar"/>
+        </w:rPr>
+        <w:t xml:space="preserve">WM_CURSOR_REACH</w:t>
+      </w:r>
+      <w:r>
+        <w:t xml:space="preserve">): the screen's part made dirty when the pointer</w:t>
+      </w:r>
+      <w:r>
+        <w:t xml:space="preserve"> </w:t>
+      </w:r>
+      <w:r>
+        <w:t xml:space="preserve">moves or changes is that box around it. Apps do not call this themselves: wtk does (docs/03,</w:t>
+      </w:r>
+      <w:r>
+        <w:t xml:space="preserve"> </w:t>
+      </w:r>
+      <w:r>
+        <w:rPr>
+          <w:rStyle w:val="VerbatimChar"/>
+        </w:rPr>
+        <w:t xml:space="preserve">wk_cursor</w:t>
+      </w:r>
+      <w:r>
+        <w:t xml:space="preserve">).</w:t>
       </w:r>
     </w:p>
     <w:bookmarkEnd w:id="90"/>
-    <w:bookmarkStart w:id="91" w:name="v79-kernel_info"/>
+    <w:bookmarkStart w:id="91" w:name="v80-cpu_stats-net_stats"/>
     <w:p>
       <w:pPr>
         <w:pStyle w:val="Heading3"/>
       </w:pPr>
       <w:r>
-        <w:t xml:space="preserve">v79: kernel_info</w:t>
+        <w:t xml:space="preserve">v80: cpu_stats, net_stats</w:t>
       </w:r>
     </w:p>
     <w:tbl>
@@ -51173,7 +50872,7 @@
               <w:pStyle w:val="Compact"/>
             </w:pPr>
             <w:r>
-              <w:t xml:space="preserve">256</w:t>
+              <w:t xml:space="preserve">257</w:t>
             </w:r>
           </w:p>
         </w:tc>
@@ -51187,7 +50886,7 @@
               <w:rPr>
                 <w:rStyle w:val="VerbatimChar"/>
               </w:rPr>
-              <w:t xml:space="preserve">kernel_info (buf, cap)</w:t>
+              <w:t xml:space="preserve">cpu_stats (out)</w:t>
             </w:r>
           </w:p>
         </w:tc>
@@ -51198,46 +50897,82 @@
               <w:pStyle w:val="Compact"/>
             </w:pPr>
             <w:r>
-              <w:t xml:space="preserve">what the running kernel is, as</w:t>
-            </w:r>
-            <w:r>
-              <w:t xml:space="preserve"> </w:t>
-            </w:r>
-            <w:r>
-              <w:rPr>
-                <w:rStyle w:val="VerbatimChar"/>
-              </w:rPr>
-              <w:t xml:space="preserve">key value</w:t>
-            </w:r>
-            <w:r>
-              <w:t xml:space="preserve"> </w:t>
-            </w:r>
-            <w:r>
-              <w:t xml:space="preserve">lines:</w:t>
-            </w:r>
-            <w:r>
-              <w:t xml:space="preserve"> </w:t>
-            </w:r>
-            <w:r>
-              <w:rPr>
-                <w:rStyle w:val="VerbatimChar"/>
-              </w:rPr>
-              <w:t xml:space="preserve">name</w:t>
-            </w:r>
-            <w:r>
-              <w:t xml:space="preserve"> </w:t>
-            </w:r>
-            <w:r>
-              <w:t xml:space="preserve">(Onyx),</w:t>
-            </w:r>
-            <w:r>
-              <w:t xml:space="preserve"> </w:t>
-            </w:r>
-            <w:r>
-              <w:rPr>
-                <w:rStyle w:val="VerbatimChar"/>
-              </w:rPr>
-              <w:t xml:space="preserve">abi</w:t>
+              <w:rPr>
+                <w:rStyle w:val="VerbatimChar"/>
+              </w:rPr>
+              <w:t xml:space="preserve">struct kapi_cpu_stats</w:t>
+            </w:r>
+            <w:r>
+              <w:t xml:space="preserve"> </w:t>
+            </w:r>
+            <w:r>
+              <w:t xml:space="preserve">(144 bytes):</w:t>
+            </w:r>
+            <w:r>
+              <w:t xml:space="preserve"> </w:t>
+            </w:r>
+            <w:r>
+              <w:rPr>
+                <w:rStyle w:val="VerbatimChar"/>
+              </w:rPr>
+              <w:t xml:space="preserve">now_us</w:t>
+            </w:r>
+            <w:r>
+              <w:t xml:space="preserve"> </w:t>
+            </w:r>
+            <w:r>
+              <w:t xml:space="preserve">(the clock of the read),</w:t>
+            </w:r>
+            <w:r>
+              <w:t xml:space="preserve"> </w:t>
+            </w:r>
+            <w:r>
+              <w:rPr>
+                <w:rStyle w:val="VerbatimChar"/>
+              </w:rPr>
+              <w:t xml:space="preserve">cores</w:t>
+            </w:r>
+            <w:r>
+              <w:t xml:space="preserve">, then a</w:t>
+            </w:r>
+            <w:r>
+              <w:t xml:space="preserve"> </w:t>
+            </w:r>
+            <w:r>
+              <w:rPr>
+                <w:rStyle w:val="VerbatimChar"/>
+              </w:rPr>
+              <w:t xml:space="preserve">kapi_cpu_core</w:t>
+            </w:r>
+            <w:r>
+              <w:t xml:space="preserve"> </w:t>
+            </w:r>
+            <w:r>
+              <w:t xml:space="preserve">a core —</w:t>
+            </w:r>
+            <w:r>
+              <w:t xml:space="preserve"> </w:t>
+            </w:r>
+            <w:r>
+              <w:rPr>
+                <w:rStyle w:val="VerbatimChar"/>
+              </w:rPr>
+              <w:t xml:space="preserve">busy_us</w:t>
+            </w:r>
+            <w:r>
+              <w:t xml:space="preserve"> </w:t>
+            </w:r>
+            <w:r>
+              <w:t xml:space="preserve">(the microseconds it was busy since the boot),</w:t>
+            </w:r>
+            <w:r>
+              <w:t xml:space="preserve"> </w:t>
+            </w:r>
+            <w:r>
+              <w:rPr>
+                <w:rStyle w:val="VerbatimChar"/>
+              </w:rPr>
+              <w:t xml:space="preserve">role</w:t>
             </w:r>
             <w:r>
               <w:t xml:space="preserve"> </w:t>
@@ -51249,124 +50984,234 @@
               <w:rPr>
                 <w:rStyle w:val="VerbatimChar"/>
               </w:rPr>
-              <w:t xml:space="preserve">KAPI_ABI_VERSION</w:t>
-            </w:r>
-            <w:r>
-              <w:t xml:space="preserve">),</w:t>
-            </w:r>
-            <w:r>
-              <w:t xml:space="preserve"> </w:t>
-            </w:r>
-            <w:r>
-              <w:rPr>
-                <w:rStyle w:val="VerbatimChar"/>
-              </w:rPr>
-              <w:t xml:space="preserve">built</w:t>
-            </w:r>
-            <w:r>
-              <w:t xml:space="preserve"> </w:t>
-            </w:r>
-            <w:r>
-              <w:t xml:space="preserve">(the date and time of the image's link),</w:t>
-            </w:r>
-            <w:r>
-              <w:t xml:space="preserve"> </w:t>
-            </w:r>
-            <w:r>
-              <w:rPr>
-                <w:rStyle w:val="VerbatimChar"/>
-              </w:rPr>
-              <w:t xml:space="preserve">rev</w:t>
-            </w:r>
-            <w:r>
-              <w:t xml:space="preserve"> </w:t>
-            </w:r>
-            <w:r>
-              <w:t xml:space="preserve">(the source's git revision;</w:t>
-            </w:r>
-            <w:r>
-              <w:t xml:space="preserve"> </w:t>
-            </w:r>
-            <w:r>
-              <w:rPr>
-                <w:rStyle w:val="VerbatimChar"/>
-              </w:rPr>
-              <w:t xml:space="preserve">+</w:t>
-            </w:r>
-            <w:r>
-              <w:t xml:space="preserve">: built from changed sources),</w:t>
-            </w:r>
-            <w:r>
-              <w:t xml:space="preserve"> </w:t>
-            </w:r>
-            <w:r>
-              <w:rPr>
-                <w:rStyle w:val="VerbatimChar"/>
-              </w:rPr>
-              <w:t xml:space="preserve">machine</w:t>
-            </w:r>
-            <w:r>
-              <w:t xml:space="preserve"> </w:t>
-            </w:r>
-            <w:r>
-              <w:t xml:space="preserve">(aarch64),</w:t>
-            </w:r>
-            <w:r>
-              <w:t xml:space="preserve"> </w:t>
-            </w:r>
-            <w:r>
-              <w:rPr>
-                <w:rStyle w:val="VerbatimChar"/>
-              </w:rPr>
-              <w:t xml:space="preserve">model</w:t>
-            </w:r>
-            <w:r>
-              <w:t xml:space="preserve"> </w:t>
-            </w:r>
-            <w:r>
-              <w:t xml:space="preserve">(the board's name),</w:t>
-            </w:r>
-            <w:r>
-              <w:t xml:space="preserve"> </w:t>
-            </w:r>
-            <w:r>
-              <w:rPr>
-                <w:rStyle w:val="VerbatimChar"/>
-              </w:rPr>
-              <w:t xml:space="preserve">ram</w:t>
-            </w:r>
-            <w:r>
-              <w:t xml:space="preserve"> </w:t>
-            </w:r>
-            <w:r>
-              <w:t xml:space="preserve">(MB). Up to</w:t>
-            </w:r>
-            <w:r>
-              <w:t xml:space="preserve"> </w:t>
-            </w:r>
-            <w:r>
-              <w:rPr>
-                <w:rStyle w:val="VerbatimChar"/>
-              </w:rPr>
-              <w:t xml:space="preserve">cap</w:t>
-            </w:r>
-            <w:r>
-              <w:t xml:space="preserve"> </w:t>
-            </w:r>
-            <w:r>
-              <w:t xml:space="preserve">− 1 bytes and a NUL → the text's whole length;</w:t>
-            </w:r>
-            <w:r>
-              <w:t xml:space="preserve"> </w:t>
-            </w:r>
-            <w:r>
-              <w:rPr>
-                <w:rStyle w:val="VerbatimChar"/>
-              </w:rPr>
-              <w:t xml:space="preserve">EFAULT</w:t>
-            </w:r>
-            <w:r>
-              <w:t xml:space="preserve">. Keys may be added: a reader looks its keys up.</w:t>
+              <w:t xml:space="preserve">KAPI_CORE_SYSTEM</w:t>
+            </w:r>
+            <w:r>
+              <w:t xml:space="preserve"> </w:t>
+            </w:r>
+            <w:r>
+              <w:t xml:space="preserve">0,</w:t>
+            </w:r>
+            <w:r>
+              <w:t xml:space="preserve"> </w:t>
+            </w:r>
+            <w:r>
+              <w:rPr>
+                <w:rStyle w:val="VerbatimChar"/>
+              </w:rPr>
+              <w:t xml:space="preserve">KAPI_CORE_SOUND</w:t>
+            </w:r>
+            <w:r>
+              <w:t xml:space="preserve"> </w:t>
+            </w:r>
+            <w:r>
+              <w:t xml:space="preserve">1,</w:t>
+            </w:r>
+            <w:r>
+              <w:t xml:space="preserve"> </w:t>
+            </w:r>
+            <w:r>
+              <w:rPr>
+                <w:rStyle w:val="VerbatimChar"/>
+              </w:rPr>
+              <w:t xml:space="preserve">KAPI_CORE_APP</w:t>
+            </w:r>
+            <w:r>
+              <w:t xml:space="preserve"> </w:t>
+            </w:r>
+            <w:r>
+              <w:t xml:space="preserve">2,</w:t>
+            </w:r>
+            <w:r>
+              <w:t xml:space="preserve"> </w:t>
+            </w:r>
+            <w:r>
+              <w:rPr>
+                <w:rStyle w:val="VerbatimChar"/>
+              </w:rPr>
+              <w:t xml:space="preserve">KAPI_CORE_NETWORK</w:t>
+            </w:r>
+            <w:r>
+              <w:t xml:space="preserve"> </w:t>
+            </w:r>
+            <w:r>
+              <w:t xml:space="preserve">3),</w:t>
+            </w:r>
+            <w:r>
+              <w:t xml:space="preserve"> </w:t>
+            </w:r>
+            <w:r>
+              <w:rPr>
+                <w:rStyle w:val="VerbatimChar"/>
+              </w:rPr>
+              <w:t xml:space="preserve">pid</w:t>
+            </w:r>
+            <w:r>
+              <w:t xml:space="preserve"> </w:t>
+            </w:r>
+            <w:r>
+              <w:t xml:space="preserve">(an app core's owner, 0 when free) → 0 /</w:t>
+            </w:r>
+            <w:r>
+              <w:t xml:space="preserve"> </w:t>
+            </w:r>
+            <w:r>
+              <w:rPr>
+                <w:rStyle w:val="VerbatimChar"/>
+              </w:rPr>
+              <w:t xml:space="preserve">-EFAULT</w:t>
+            </w:r>
+            <w:r>
+              <w:t xml:space="preserve">. Two reads make a load:</w:t>
+            </w:r>
+            <w:r>
+              <w:t xml:space="preserve"> </w:t>
+            </w:r>
+            <w:r>
+              <w:rPr>
+                <w:rStyle w:val="VerbatimChar"/>
+              </w:rPr>
+              <w:t xml:space="preserve">(busy_us' - busy_us) / (now_us' - now_us)</w:t>
+            </w:r>
+            <w:r>
+              <w:t xml:space="preserve">.</w:t>
+            </w:r>
+          </w:p>
+        </w:tc>
+      </w:tr>
+      <w:tr>
+        <w:tc>
+          <w:tcPr/>
+          <w:p>
+            <w:pPr>
+              <w:pStyle w:val="Compact"/>
+            </w:pPr>
+            <w:r>
+              <w:t xml:space="preserve">258</w:t>
+            </w:r>
+          </w:p>
+        </w:tc>
+        <w:tc>
+          <w:tcPr/>
+          <w:p>
+            <w:pPr>
+              <w:pStyle w:val="Compact"/>
+            </w:pPr>
+            <w:r>
+              <w:rPr>
+                <w:rStyle w:val="VerbatimChar"/>
+              </w:rPr>
+              <w:t xml:space="preserve">net_stats (pid, out)</w:t>
+            </w:r>
+          </w:p>
+        </w:tc>
+        <w:tc>
+          <w:tcPr/>
+          <w:p>
+            <w:pPr>
+              <w:pStyle w:val="Compact"/>
+            </w:pPr>
+            <w:r>
+              <w:rPr>
+                <w:rStyle w:val="VerbatimChar"/>
+              </w:rPr>
+              <w:t xml:space="preserve">struct kapi_net_stats</w:t>
+            </w:r>
+            <w:r>
+              <w:t xml:space="preserve"> </w:t>
+            </w:r>
+            <w:r>
+              <w:t xml:space="preserve">(24 bytes): the payload bytes</w:t>
+            </w:r>
+            <w:r>
+              <w:t xml:space="preserve"> </w:t>
+            </w:r>
+            <w:r>
+              <w:rPr>
+                <w:rStyle w:val="VerbatimChar"/>
+              </w:rPr>
+              <w:t xml:space="preserve">pid</w:t>
+            </w:r>
+            <w:r>
+              <w:t xml:space="preserve">'s sockets received and sent (</w:t>
+            </w:r>
+            <w:r>
+              <w:rPr>
+                <w:rStyle w:val="VerbatimChar"/>
+              </w:rPr>
+              <w:t xml:space="preserve">rx_bytes</w:t>
+            </w:r>
+            <w:r>
+              <w:t xml:space="preserve">,</w:t>
+            </w:r>
+            <w:r>
+              <w:t xml:space="preserve"> </w:t>
+            </w:r>
+            <w:r>
+              <w:rPr>
+                <w:rStyle w:val="VerbatimChar"/>
+              </w:rPr>
+              <w:t xml:space="preserve">tx_bytes</w:t>
+            </w:r>
+            <w:r>
+              <w:t xml:space="preserve">: TCP and UDP, the old</w:t>
+            </w:r>
+            <w:r>
+              <w:t xml:space="preserve"> </w:t>
+            </w:r>
+            <w:r>
+              <w:rPr>
+                <w:rStyle w:val="VerbatimChar"/>
+              </w:rPr>
+              <w:t xml:space="preserve">tcp_*</w:t>
+            </w:r>
+            <w:r>
+              <w:t xml:space="preserve"> </w:t>
+            </w:r>
+            <w:r>
+              <w:t xml:space="preserve">calls and the BSD sockets) since it started, its</w:t>
+            </w:r>
+            <w:r>
+              <w:t xml:space="preserve"> </w:t>
+            </w:r>
+            <w:r>
+              <w:rPr>
+                <w:rStyle w:val="VerbatimChar"/>
+              </w:rPr>
+              <w:t xml:space="preserve">sockets</w:t>
+            </w:r>
+            <w:r>
+              <w:t xml:space="preserve"> </w:t>
+            </w:r>
+            <w:r>
+              <w:t xml:space="preserve">open now;</w:t>
+            </w:r>
+            <w:r>
+              <w:t xml:space="preserve"> </w:t>
+            </w:r>
+            <w:r>
+              <w:rPr>
+                <w:rStyle w:val="VerbatimChar"/>
+              </w:rPr>
+              <w:t xml:space="preserve">pid</w:t>
+            </w:r>
+            <w:r>
+              <w:t xml:space="preserve"> </w:t>
+            </w:r>
+            <w:r>
+              <w:t xml:space="preserve">0: every process's since the boot → 0 /</w:t>
+            </w:r>
+            <w:r>
+              <w:t xml:space="preserve"> </w:t>
+            </w:r>
+            <w:r>
+              <w:rPr>
+                <w:rStyle w:val="VerbatimChar"/>
+              </w:rPr>
+              <w:t xml:space="preserve">-EFAULT</w:t>
+            </w:r>
+            <w:r>
+              <w:t xml:space="preserve">. A process that used no socket: zeros.</w:t>
             </w:r>
           </w:p>
         </w:tc>
@@ -51377,6 +51222,647 @@
         <w:pStyle w:val="BodyText"/>
       </w:pPr>
       <w:r>
+        <w:t xml:space="preserve">What "busy" is, core by core. A core with a</w:t>
+      </w:r>
+      <w:r>
+        <w:t xml:space="preserve"> </w:t>
+      </w:r>
+      <w:r>
+        <w:rPr>
+          <w:b/>
+          <w:bCs/>
+        </w:rPr>
+        <w:t xml:space="preserve">scheduler</w:t>
+      </w:r>
+      <w:r>
+        <w:t xml:space="preserve"> </w:t>
+      </w:r>
+      <w:r>
+        <w:t xml:space="preserve">— core 0, and core 3 with</w:t>
+      </w:r>
+      <w:r>
+        <w:t xml:space="preserve"> </w:t>
+      </w:r>
+      <w:r>
+        <w:rPr>
+          <w:rStyle w:val="VerbatimChar"/>
+        </w:rPr>
+        <w:t xml:space="preserve">netcore=1</w:t>
+      </w:r>
+      <w:r>
+        <w:t xml:space="preserve"> </w:t>
+      </w:r>
+      <w:r>
+        <w:t xml:space="preserve">—</w:t>
+      </w:r>
+      <w:r>
+        <w:t xml:space="preserve"> </w:t>
+      </w:r>
+      <w:r>
+        <w:t xml:space="preserve">counts the time its tasks ran, the idle task apart:</w:t>
+      </w:r>
+      <w:r>
+        <w:t xml:space="preserve"> </w:t>
+      </w:r>
+      <w:r>
+        <w:rPr>
+          <w:rStyle w:val="VerbatimChar"/>
+        </w:rPr>
+        <w:t xml:space="preserve">CScheduler::Yield</w:t>
+      </w:r>
+      <w:r>
+        <w:t xml:space="preserve"> </w:t>
+      </w:r>
+      <w:r>
+        <w:t xml:space="preserve">adds what the leaving task</w:t>
+      </w:r>
+      <w:r>
+        <w:t xml:space="preserve"> </w:t>
+      </w:r>
+      <w:r>
+        <w:t xml:space="preserve">ran (</w:t>
+      </w:r>
+      <w:r>
+        <w:rPr>
+          <w:rStyle w:val="VerbatimChar"/>
+        </w:rPr>
+        <w:t xml:space="preserve">m_nBusyUs</w:t>
+      </w:r>
+      <w:r>
+        <w:t xml:space="preserve">;</w:t>
+      </w:r>
+      <w:r>
+        <w:t xml:space="preserve"> </w:t>
+      </w:r>
+      <w:r>
+        <w:rPr>
+          <w:rStyle w:val="VerbatimChar"/>
+        </w:rPr>
+        <w:t xml:space="preserve">GetBusyUs</w:t>
+      </w:r>
+      <w:r>
+        <w:t xml:space="preserve"> </w:t>
+      </w:r>
+      <w:r>
+        <w:t xml:space="preserve">adds the running task's time so far, so a read from another core is</w:t>
+      </w:r>
+      <w:r>
+        <w:t xml:space="preserve"> </w:t>
+      </w:r>
+      <w:r>
+        <w:t xml:space="preserve">live). Core 0's idle task sleeps in</w:t>
+      </w:r>
+      <w:r>
+        <w:t xml:space="preserve"> </w:t>
+      </w:r>
+      <w:r>
+        <w:rPr>
+          <w:rStyle w:val="VerbatimChar"/>
+        </w:rPr>
+        <w:t xml:space="preserve">wfi</w:t>
+      </w:r>
+      <w:r>
+        <w:t xml:space="preserve">, so its figure is the machine's real load; the interrupt</w:t>
+      </w:r>
+      <w:r>
+        <w:t xml:space="preserve"> </w:t>
+      </w:r>
+      <w:r>
+        <w:t xml:space="preserve">handlers that wake it are counted as idle. The</w:t>
+      </w:r>
+      <w:r>
+        <w:t xml:space="preserve"> </w:t>
+      </w:r>
+      <w:r>
+        <w:rPr>
+          <w:b/>
+          <w:bCs/>
+        </w:rPr>
+        <w:t xml:space="preserve">network core</w:t>
+      </w:r>
+      <w:r>
+        <w:t xml:space="preserve">'s tasks all wait by yielding (it</w:t>
+      </w:r>
+      <w:r>
+        <w:t xml:space="preserve"> </w:t>
+      </w:r>
+      <w:r>
+        <w:t xml:space="preserve">polls the Wi-Fi chip), so while the network works it reads 100 %; once the network has been quiet</w:t>
+      </w:r>
+      <w:r>
+        <w:t xml:space="preserve"> </w:t>
+      </w:r>
+      <w:r>
+        <w:t xml:space="preserve">for 50 ms it sleeps between two questions to the chip (</w:t>
+      </w:r>
+      <w:r>
+        <w:rPr>
+          <w:i/>
+          <w:iCs/>
+        </w:rPr>
+        <w:t xml:space="preserve">The network core sleeps</w:t>
+      </w:r>
+      <w:r>
+        <w:t xml:space="preserve">, below) and that</w:t>
+      </w:r>
+      <w:r>
+        <w:t xml:space="preserve"> </w:t>
+      </w:r>
+      <w:r>
+        <w:t xml:space="preserve">sleep is taken off its busy time (</w:t>
+      </w:r>
+      <w:r>
+        <w:rPr>
+          <w:rStyle w:val="VerbatimChar"/>
+        </w:rPr>
+        <w:t xml:space="preserve">CScheduler::NoteSleptUs</w:t>
+      </w:r>
+      <w:r>
+        <w:t xml:space="preserve">): a few per cent.</w:t>
+      </w:r>
+      <w:r>
+        <w:t xml:space="preserve"> </w:t>
+      </w:r>
+      <w:r>
+        <w:rPr>
+          <w:b/>
+          <w:bCs/>
+        </w:rPr>
+        <w:t xml:space="preserve">Core 1</w:t>
+      </w:r>
+      <w:r>
+        <w:t xml:space="preserve"> </w:t>
+      </w:r>
+      <w:r>
+        <w:t xml:space="preserve">counts the time it renders sound (</w:t>
+      </w:r>
+      <w:r>
+        <w:rPr>
+          <w:rStyle w:val="VerbatimChar"/>
+        </w:rPr>
+        <w:t xml:space="preserve">sys/sound.cpp</w:t>
+      </w:r>
+      <w:r>
+        <w:t xml:space="preserve">, around</w:t>
+      </w:r>
+      <w:r>
+        <w:t xml:space="preserve"> </w:t>
+      </w:r>
+      <w:r>
+        <w:rPr>
+          <w:rStyle w:val="VerbatimChar"/>
+        </w:rPr>
+        <w:t xml:space="preserve">Render</w:t>
+      </w:r>
+      <w:r>
+        <w:t xml:space="preserve">); an</w:t>
+      </w:r>
+      <w:r>
+        <w:t xml:space="preserve"> </w:t>
+      </w:r>
+      <w:r>
+        <w:rPr>
+          <w:b/>
+          <w:bCs/>
+        </w:rPr>
+        <w:t xml:space="preserve">app core</w:t>
+      </w:r>
+      <w:r>
+        <w:t xml:space="preserve"> </w:t>
+      </w:r>
+      <w:r>
+        <w:t xml:space="preserve">the</w:t>
+      </w:r>
+      <w:r>
+        <w:t xml:space="preserve"> </w:t>
+      </w:r>
+      <w:r>
+        <w:t xml:space="preserve">time its jobs ran, from the entry at EL0 to the job's end or drop (</w:t>
+      </w:r>
+      <w:r>
+        <w:rPr>
+          <w:rStyle w:val="VerbatimChar"/>
+        </w:rPr>
+        <w:t xml:space="preserve">sys/appcore.cpp</w:t>
+      </w:r>
+      <w:r>
+        <w:t xml:space="preserve">; a job that</w:t>
+      </w:r>
+      <w:r>
+        <w:t xml:space="preserve"> </w:t>
+      </w:r>
+      <w:r>
+        <w:t xml:space="preserve">waits in</w:t>
+      </w:r>
+      <w:r>
+        <w:t xml:space="preserve"> </w:t>
+      </w:r>
+      <w:r>
+        <w:rPr>
+          <w:rStyle w:val="VerbatimChar"/>
+        </w:rPr>
+        <w:t xml:space="preserve">wfe</w:t>
+      </w:r>
+      <w:r>
+        <w:t xml:space="preserve"> </w:t>
+      </w:r>
+      <w:r>
+        <w:t xml:space="preserve">still counts).</w:t>
+      </w:r>
+    </w:p>
+    <w:p>
+      <w:pPr>
+        <w:pStyle w:val="BodyText"/>
+      </w:pPr>
+      <w:r>
+        <w:t xml:space="preserve">The network's bytes are counted where the calls return, on core 0 (</w:t>
+      </w:r>
+      <w:r>
+        <w:rPr>
+          <w:rStyle w:val="VerbatimChar"/>
+        </w:rPr>
+        <w:t xml:space="preserve">NetTcpSend</w:t>
+      </w:r>
+      <w:r>
+        <w:t xml:space="preserve"> </w:t>
+      </w:r>
+      <w:r>
+        <w:t xml:space="preserve">/</w:t>
+      </w:r>
+      <w:r>
+        <w:t xml:space="preserve"> </w:t>
+      </w:r>
+      <w:r>
+        <w:rPr>
+          <w:rStyle w:val="VerbatimChar"/>
+        </w:rPr>
+        <w:t xml:space="preserve">NetTcpRecv</w:t>
+      </w:r>
+      <w:r>
+        <w:t xml:space="preserve">,</w:t>
+      </w:r>
+      <w:r>
+        <w:t xml:space="preserve"> </w:t>
+      </w:r>
+      <w:r>
+        <w:rPr>
+          <w:rStyle w:val="VerbatimChar"/>
+        </w:rPr>
+        <w:t xml:space="preserve">NetSockSend</w:t>
+      </w:r>
+      <w:r>
+        <w:t xml:space="preserve"> </w:t>
+      </w:r>
+      <w:r>
+        <w:t xml:space="preserve">/</w:t>
+      </w:r>
+      <w:r>
+        <w:t xml:space="preserve"> </w:t>
+      </w:r>
+      <w:r>
+        <w:rPr>
+          <w:rStyle w:val="VerbatimChar"/>
+        </w:rPr>
+        <w:t xml:space="preserve">NetSockRecv</w:t>
+      </w:r>
+      <w:r>
+        <w:t xml:space="preserve"> </w:t>
+      </w:r>
+      <w:r>
+        <w:t xml:space="preserve">in</w:t>
+      </w:r>
+      <w:r>
+        <w:t xml:space="preserve"> </w:t>
+      </w:r>
+      <w:r>
+        <w:rPr>
+          <w:rStyle w:val="VerbatimChar"/>
+        </w:rPr>
+        <w:t xml:space="preserve">sys/net.cpp</w:t>
+      </w:r>
+      <w:r>
+        <w:t xml:space="preserve">: a process's tasks all run there, so the table needs</w:t>
+      </w:r>
+      <w:r>
+        <w:t xml:space="preserve"> </w:t>
+      </w:r>
+      <w:r>
+        <w:t xml:space="preserve">no lock): one line a process (64 at most; beyond, the totals only), freed when the process ends</w:t>
+      </w:r>
+      <w:r>
+        <w:t xml:space="preserve"> </w:t>
+      </w:r>
+      <w:r>
+        <w:t xml:space="preserve">(</w:t>
+      </w:r>
+      <w:r>
+        <w:rPr>
+          <w:rStyle w:val="VerbatimChar"/>
+        </w:rPr>
+        <w:t xml:space="preserve">NetCloseByPid</w:t>
+      </w:r>
+      <w:r>
+        <w:t xml:space="preserve">). A byte read with</w:t>
+      </w:r>
+      <w:r>
+        <w:t xml:space="preserve"> </w:t>
+      </w:r>
+      <w:r>
+        <w:rPr>
+          <w:rStyle w:val="VerbatimChar"/>
+        </w:rPr>
+        <w:t xml:space="preserve">MSG_PEEK</w:t>
+      </w:r>
+      <w:r>
+        <w:t xml:space="preserve"> </w:t>
+      </w:r>
+      <w:r>
+        <w:t xml:space="preserve">is counted when it is really read. They are the</w:t>
+      </w:r>
+      <w:r>
+        <w:t xml:space="preserve"> </w:t>
+      </w:r>
+      <w:r>
+        <w:t xml:space="preserve">sockets' payload, not the frames on the air: no header, no retransmission, nothing of the kernel's</w:t>
+      </w:r>
+      <w:r>
+        <w:t xml:space="preserve"> </w:t>
+      </w:r>
+      <w:r>
+        <w:t xml:space="preserve">own traffic (DHCP, DNS, NTP).</w:t>
+      </w:r>
+    </w:p>
+    <w:bookmarkEnd w:id="91"/>
+    <w:bookmarkStart w:id="92" w:name="v79-kernel_info"/>
+    <w:p>
+      <w:pPr>
+        <w:pStyle w:val="Heading3"/>
+      </w:pPr>
+      <w:r>
+        <w:t xml:space="preserve">v79: kernel_info</w:t>
+      </w:r>
+    </w:p>
+    <w:tbl>
+      <w:tblPr>
+        <w:tblStyle w:val="Table"/>
+        <w:tblW w:type="auto" w:w="0"/>
+        <w:tblLook w:firstRow="1" w:lastRow="0" w:firstColumn="0" w:lastColumn="0" w:noHBand="0" w:noVBand="0" w:val="0020"/>
+      </w:tblPr>
+      <w:tblGrid>
+        <w:gridCol w:w="2640"/>
+        <w:gridCol w:w="2640"/>
+        <w:gridCol w:w="2640"/>
+      </w:tblGrid>
+      <w:tr>
+        <w:trPr>
+          <w:tblHeader w:val="on"/>
+        </w:trPr>
+        <w:tc>
+          <w:tcPr/>
+          <w:p>
+            <w:pPr>
+              <w:pStyle w:val="Compact"/>
+            </w:pPr>
+            <w:r>
+              <w:t xml:space="preserve">Slot</w:t>
+            </w:r>
+          </w:p>
+        </w:tc>
+        <w:tc>
+          <w:tcPr/>
+          <w:p>
+            <w:pPr>
+              <w:pStyle w:val="Compact"/>
+            </w:pPr>
+            <w:r>
+              <w:t xml:space="preserve">Entry</w:t>
+            </w:r>
+          </w:p>
+        </w:tc>
+        <w:tc>
+          <w:tcPr/>
+          <w:p>
+            <w:pPr>
+              <w:pStyle w:val="Compact"/>
+            </w:pPr>
+            <w:r>
+              <w:t xml:space="preserve">What it does</w:t>
+            </w:r>
+          </w:p>
+        </w:tc>
+      </w:tr>
+      <w:tr>
+        <w:tc>
+          <w:tcPr/>
+          <w:p>
+            <w:pPr>
+              <w:pStyle w:val="Compact"/>
+            </w:pPr>
+            <w:r>
+              <w:t xml:space="preserve">256</w:t>
+            </w:r>
+          </w:p>
+        </w:tc>
+        <w:tc>
+          <w:tcPr/>
+          <w:p>
+            <w:pPr>
+              <w:pStyle w:val="Compact"/>
+            </w:pPr>
+            <w:r>
+              <w:rPr>
+                <w:rStyle w:val="VerbatimChar"/>
+              </w:rPr>
+              <w:t xml:space="preserve">kernel_info (buf, cap)</w:t>
+            </w:r>
+          </w:p>
+        </w:tc>
+        <w:tc>
+          <w:tcPr/>
+          <w:p>
+            <w:pPr>
+              <w:pStyle w:val="Compact"/>
+            </w:pPr>
+            <w:r>
+              <w:t xml:space="preserve">what the running kernel is, as</w:t>
+            </w:r>
+            <w:r>
+              <w:t xml:space="preserve"> </w:t>
+            </w:r>
+            <w:r>
+              <w:rPr>
+                <w:rStyle w:val="VerbatimChar"/>
+              </w:rPr>
+              <w:t xml:space="preserve">key value</w:t>
+            </w:r>
+            <w:r>
+              <w:t xml:space="preserve"> </w:t>
+            </w:r>
+            <w:r>
+              <w:t xml:space="preserve">lines:</w:t>
+            </w:r>
+            <w:r>
+              <w:t xml:space="preserve"> </w:t>
+            </w:r>
+            <w:r>
+              <w:rPr>
+                <w:rStyle w:val="VerbatimChar"/>
+              </w:rPr>
+              <w:t xml:space="preserve">name</w:t>
+            </w:r>
+            <w:r>
+              <w:t xml:space="preserve"> </w:t>
+            </w:r>
+            <w:r>
+              <w:t xml:space="preserve">(Onyx),</w:t>
+            </w:r>
+            <w:r>
+              <w:t xml:space="preserve"> </w:t>
+            </w:r>
+            <w:r>
+              <w:rPr>
+                <w:rStyle w:val="VerbatimChar"/>
+              </w:rPr>
+              <w:t xml:space="preserve">abi</w:t>
+            </w:r>
+            <w:r>
+              <w:t xml:space="preserve"> </w:t>
+            </w:r>
+            <w:r>
+              <w:t xml:space="preserve">(</w:t>
+            </w:r>
+            <w:r>
+              <w:rPr>
+                <w:rStyle w:val="VerbatimChar"/>
+              </w:rPr>
+              <w:t xml:space="preserve">KAPI_ABI_VERSION</w:t>
+            </w:r>
+            <w:r>
+              <w:t xml:space="preserve">),</w:t>
+            </w:r>
+            <w:r>
+              <w:t xml:space="preserve"> </w:t>
+            </w:r>
+            <w:r>
+              <w:rPr>
+                <w:rStyle w:val="VerbatimChar"/>
+              </w:rPr>
+              <w:t xml:space="preserve">built</w:t>
+            </w:r>
+            <w:r>
+              <w:t xml:space="preserve"> </w:t>
+            </w:r>
+            <w:r>
+              <w:t xml:space="preserve">(the date and time of the image's link),</w:t>
+            </w:r>
+            <w:r>
+              <w:t xml:space="preserve"> </w:t>
+            </w:r>
+            <w:r>
+              <w:rPr>
+                <w:rStyle w:val="VerbatimChar"/>
+              </w:rPr>
+              <w:t xml:space="preserve">rev</w:t>
+            </w:r>
+            <w:r>
+              <w:t xml:space="preserve"> </w:t>
+            </w:r>
+            <w:r>
+              <w:t xml:space="preserve">(the source's git revision;</w:t>
+            </w:r>
+            <w:r>
+              <w:t xml:space="preserve"> </w:t>
+            </w:r>
+            <w:r>
+              <w:rPr>
+                <w:rStyle w:val="VerbatimChar"/>
+              </w:rPr>
+              <w:t xml:space="preserve">+</w:t>
+            </w:r>
+            <w:r>
+              <w:t xml:space="preserve">: built from changed sources),</w:t>
+            </w:r>
+            <w:r>
+              <w:t xml:space="preserve"> </w:t>
+            </w:r>
+            <w:r>
+              <w:rPr>
+                <w:rStyle w:val="VerbatimChar"/>
+              </w:rPr>
+              <w:t xml:space="preserve">machine</w:t>
+            </w:r>
+            <w:r>
+              <w:t xml:space="preserve"> </w:t>
+            </w:r>
+            <w:r>
+              <w:t xml:space="preserve">(aarch64),</w:t>
+            </w:r>
+            <w:r>
+              <w:t xml:space="preserve"> </w:t>
+            </w:r>
+            <w:r>
+              <w:rPr>
+                <w:rStyle w:val="VerbatimChar"/>
+              </w:rPr>
+              <w:t xml:space="preserve">model</w:t>
+            </w:r>
+            <w:r>
+              <w:t xml:space="preserve"> </w:t>
+            </w:r>
+            <w:r>
+              <w:t xml:space="preserve">(the board's name),</w:t>
+            </w:r>
+            <w:r>
+              <w:t xml:space="preserve"> </w:t>
+            </w:r>
+            <w:r>
+              <w:rPr>
+                <w:rStyle w:val="VerbatimChar"/>
+              </w:rPr>
+              <w:t xml:space="preserve">ram</w:t>
+            </w:r>
+            <w:r>
+              <w:t xml:space="preserve"> </w:t>
+            </w:r>
+            <w:r>
+              <w:t xml:space="preserve">(MB). Up to</w:t>
+            </w:r>
+            <w:r>
+              <w:t xml:space="preserve"> </w:t>
+            </w:r>
+            <w:r>
+              <w:rPr>
+                <w:rStyle w:val="VerbatimChar"/>
+              </w:rPr>
+              <w:t xml:space="preserve">cap</w:t>
+            </w:r>
+            <w:r>
+              <w:t xml:space="preserve"> </w:t>
+            </w:r>
+            <w:r>
+              <w:t xml:space="preserve">− 1 bytes and a NUL → the text's whole length;</w:t>
+            </w:r>
+            <w:r>
+              <w:t xml:space="preserve"> </w:t>
+            </w:r>
+            <w:r>
+              <w:rPr>
+                <w:rStyle w:val="VerbatimChar"/>
+              </w:rPr>
+              <w:t xml:space="preserve">EFAULT</w:t>
+            </w:r>
+            <w:r>
+              <w:t xml:space="preserve">. Keys may be added: a reader looks its keys up.</w:t>
+            </w:r>
+          </w:p>
+        </w:tc>
+      </w:tr>
+    </w:tbl>
+    <w:p>
+      <w:pPr>
+        <w:pStyle w:val="BodyText"/>
+      </w:pPr>
+      <w:r>
         <w:t xml:space="preserve">The date and the revision are</w:t>
       </w:r>
       <w:r>
@@ -51610,9 +52096,9 @@
         </w:pict>
       </w:r>
     </w:p>
-    <w:bookmarkEnd w:id="91"/>
     <w:bookmarkEnd w:id="92"/>
-    <w:bookmarkStart w:id="99" w:name="X0388453af32aee5299c424f16ffba6153d0b61c"/>
+    <w:bookmarkEnd w:id="93"/>
+    <w:bookmarkStart w:id="100" w:name="X0388453af32aee5299c424f16ffba6153d0b61c"/>
     <w:p>
       <w:pPr>
         <w:pStyle w:val="Heading2"/>
@@ -51631,7 +52117,7 @@
       <w:r>
         <w:t xml:space="preserve"> </w:t>
       </w:r>
-      <w:hyperlink r:id="rId93">
+      <w:hyperlink r:id="rId94">
         <w:r>
           <w:rPr>
             <w:rStyle w:val="VerbatimChar"/>
@@ -51645,7 +52131,7 @@
       <w:r>
         <w:t xml:space="preserve"> </w:t>
       </w:r>
-      <w:hyperlink r:id="rId94">
+      <w:hyperlink r:id="rId95">
         <w:r>
           <w:rPr>
             <w:rStyle w:val="VerbatimChar"/>
@@ -51687,7 +52173,7 @@
         <w:t xml:space="preserve">communication possible.</w:t>
       </w:r>
     </w:p>
-    <w:bookmarkStart w:id="95" w:name="object-model"/>
+    <w:bookmarkStart w:id="96" w:name="object-model"/>
     <w:p>
       <w:pPr>
         <w:pStyle w:val="Heading3"/>
@@ -52217,8 +52703,8 @@
         <w:t xml:space="preserve">2=append.</w:t>
       </w:r>
     </w:p>
-    <w:bookmarkEnd w:id="95"/>
-    <w:bookmarkStart w:id="98" w:name="processes-and-stdio"/>
+    <w:bookmarkEnd w:id="96"/>
+    <w:bookmarkStart w:id="99" w:name="processes-and-stdio"/>
     <w:p>
       <w:pPr>
         <w:pStyle w:val="Heading3"/>
@@ -52519,7 +53005,7 @@
       <w:r>
         <w:t xml:space="preserve"> </w:t>
       </w:r>
-      <w:hyperlink r:id="rId96">
+      <w:hyperlink r:id="rId97">
         <w:r>
           <w:rPr>
             <w:rStyle w:val="Hyperlink"/>
@@ -52536,7 +53022,7 @@
       <w:r>
         <w:t xml:space="preserve"> </w:t>
       </w:r>
-      <w:hyperlink r:id="rId97">
+      <w:hyperlink r:id="rId98">
         <w:r>
           <w:rPr>
             <w:rStyle w:val="Hyperlink"/>
@@ -52555,9 +53041,9 @@
         </w:pict>
       </w:r>
     </w:p>
-    <w:bookmarkEnd w:id="98"/>
     <w:bookmarkEnd w:id="99"/>
-    <w:bookmarkStart w:id="105" w:name="X10f951303a3d0a8705d0a81fe10314bb6a2b0a6"/>
+    <w:bookmarkEnd w:id="100"/>
+    <w:bookmarkStart w:id="106" w:name="X10f951303a3d0a8705d0a81fe10314bb6a2b0a6"/>
     <w:p>
       <w:pPr>
         <w:pStyle w:val="Heading2"/>
@@ -52616,7 +53102,7 @@
         <w:t xml:space="preserve">.</w:t>
       </w:r>
     </w:p>
-    <w:bookmarkStart w:id="100" w:name="Xe3f01c5ed286023176949c9775dce5e3838ffd1"/>
+    <w:bookmarkStart w:id="101" w:name="Xe3f01c5ed286023176949c9775dce5e3838ffd1"/>
     <w:p>
       <w:pPr>
         <w:pStyle w:val="Heading3"/>
@@ -53011,8 +53497,8 @@
         <w:t xml:space="preserve">(24 bpp uncompressed, BGR→RGB, handles top-down/bottom-up).</w:t>
       </w:r>
     </w:p>
-    <w:bookmarkEnd w:id="100"/>
-    <w:bookmarkStart w:id="101" w:name="X1859393a8c4bed58a127080085004380601403d"/>
+    <w:bookmarkEnd w:id="101"/>
+    <w:bookmarkStart w:id="102" w:name="X1859393a8c4bed58a127080085004380601403d"/>
     <w:p>
       <w:pPr>
         <w:pStyle w:val="Heading3"/>
@@ -55099,8 +55585,8 @@
         <w:t xml:space="preserve">the see-through windows' clicks, the work area, a canvas growing, the workspaces).</w:t>
       </w:r>
     </w:p>
-    <w:bookmarkEnd w:id="101"/>
-    <w:bookmarkStart w:id="102" w:name="Xe463e9388c9d5d5a717f5346252214435818497"/>
+    <w:bookmarkEnd w:id="102"/>
+    <w:bookmarkStart w:id="103" w:name="Xe463e9388c9d5d5a717f5346252214435818497"/>
     <w:p>
       <w:pPr>
         <w:pStyle w:val="Heading3"/>
@@ -55722,8 +56208,8 @@
         <w:t xml:space="preserve">dialog, otherwise to the app's keyboard handler.</w:t>
       </w:r>
     </w:p>
-    <w:bookmarkEnd w:id="102"/>
-    <w:bookmarkStart w:id="103" w:name="X24691d09f8e27f776afb60dd70127328157f6db"/>
+    <w:bookmarkEnd w:id="103"/>
+    <w:bookmarkStart w:id="104" w:name="X24691d09f8e27f776afb60dd70127328157f6db"/>
     <w:p>
       <w:pPr>
         <w:pStyle w:val="Heading3"/>
@@ -56137,8 +56623,8 @@
         <w:t xml:space="preserve">case). The agenda widget reads it to choose its ink.</w:t>
       </w:r>
     </w:p>
-    <w:bookmarkEnd w:id="103"/>
-    <w:bookmarkStart w:id="104" w:name="X200f8f15df38f42e5aa69d22a02b60b447a05e0"/>
+    <w:bookmarkEnd w:id="104"/>
+    <w:bookmarkStart w:id="105" w:name="X200f8f15df38f42e5aa69d22a02b60b447a05e0"/>
     <w:p>
       <w:pPr>
         <w:pStyle w:val="Heading3"/>
@@ -56243,9 +56729,9 @@
         </w:pict>
       </w:r>
     </w:p>
-    <w:bookmarkEnd w:id="104"/>
     <w:bookmarkEnd w:id="105"/>
-    <w:bookmarkStart w:id="109" w:name="X39e469d88a0d3c41ac3b8087ce6a04a805edad1"/>
+    <w:bookmarkEnd w:id="106"/>
+    <w:bookmarkStart w:id="110" w:name="X39e469d88a0d3c41ac3b8087ce6a04a805edad1"/>
     <w:p>
       <w:pPr>
         <w:pStyle w:val="Heading2"/>
@@ -56290,7 +56776,7 @@
       <w:r>
         <w:t xml:space="preserve"> </w:t>
       </w:r>
-      <w:hyperlink r:id="rId106">
+      <w:hyperlink r:id="rId107">
         <w:r>
           <w:rPr>
             <w:rStyle w:val="VerbatimChar"/>
@@ -56307,7 +56793,7 @@
       <w:r>
         <w:t xml:space="preserve"> </w:t>
       </w:r>
-      <w:hyperlink r:id="rId107">
+      <w:hyperlink r:id="rId108">
         <w:r>
           <w:rPr>
             <w:rStyle w:val="VerbatimChar"/>
@@ -56369,7 +56855,7 @@
       <w:r>
         <w:t xml:space="preserve"> </w:t>
       </w:r>
-      <w:hyperlink r:id="rId108">
+      <w:hyperlink r:id="rId109">
         <w:r>
           <w:rPr>
             <w:rStyle w:val="VerbatimChar"/>
@@ -59634,8 +60120,8 @@
         </w:pict>
       </w:r>
     </w:p>
-    <w:bookmarkEnd w:id="109"/>
-    <w:bookmarkStart w:id="113" w:name="Xb96593a02e959a86ae343ca4fa42e9defb57306"/>
+    <w:bookmarkEnd w:id="110"/>
+    <w:bookmarkStart w:id="114" w:name="Xb96593a02e959a86ae343ca4fa42e9defb57306"/>
     <w:p>
       <w:pPr>
         <w:pStyle w:val="Heading2"/>
@@ -59654,7 +60140,7 @@
       <w:r>
         <w:t xml:space="preserve"> </w:t>
       </w:r>
-      <w:hyperlink r:id="rId110">
+      <w:hyperlink r:id="rId111">
         <w:r>
           <w:rPr>
             <w:rStyle w:val="VerbatimChar"/>
@@ -59668,7 +60154,7 @@
       <w:r>
         <w:t xml:space="preserve"> </w:t>
       </w:r>
-      <w:hyperlink r:id="rId111">
+      <w:hyperlink r:id="rId112">
         <w:r>
           <w:rPr>
             <w:rStyle w:val="VerbatimChar"/>
@@ -59719,7 +60205,7 @@
       <w:r>
         <w:t xml:space="preserve"> </w:t>
       </w:r>
-      <w:hyperlink r:id="rId112">
+      <w:hyperlink r:id="rId113">
         <w:r>
           <w:rPr>
             <w:rStyle w:val="Hyperlink"/>
@@ -61257,8 +61743,8 @@
         <w:t xml:space="preserve">(above).</w:t>
       </w:r>
     </w:p>
-    <w:bookmarkEnd w:id="113"/>
-    <w:bookmarkStart w:id="119" w:name="Xfa019e876c205b51820d387dd2b0ef1f0c66c95"/>
+    <w:bookmarkEnd w:id="114"/>
+    <w:bookmarkStart w:id="120" w:name="Xfa019e876c205b51820d387dd2b0ef1f0c66c95"/>
     <w:p>
       <w:pPr>
         <w:pStyle w:val="Heading2"/>
@@ -61277,7 +61763,7 @@
       <w:r>
         <w:t xml:space="preserve"> </w:t>
       </w:r>
-      <w:hyperlink r:id="rId114">
+      <w:hyperlink r:id="rId115">
         <w:r>
           <w:rPr>
             <w:rStyle w:val="VerbatimChar"/>
@@ -61291,7 +61777,7 @@
       <w:r>
         <w:t xml:space="preserve"> </w:t>
       </w:r>
-      <w:hyperlink r:id="rId115">
+      <w:hyperlink r:id="rId116">
         <w:r>
           <w:rPr>
             <w:rStyle w:val="VerbatimChar"/>
@@ -61633,7 +62119,7 @@
         <w:t xml:space="preserve">contend for the framebuffer.</w:t>
       </w:r>
     </w:p>
-    <w:bookmarkStart w:id="118" w:name="the-crash-record-lastcrashtxt"/>
+    <w:bookmarkStart w:id="119" w:name="the-crash-record-lastcrashtxt"/>
     <w:p>
       <w:pPr>
         <w:pStyle w:val="Heading3"/>
@@ -61661,7 +62147,7 @@
       <w:r>
         <w:t xml:space="preserve"> </w:t>
       </w:r>
-      <w:hyperlink r:id="rId116">
+      <w:hyperlink r:id="rId117">
         <w:r>
           <w:rPr>
             <w:rStyle w:val="VerbatimChar"/>
@@ -61675,7 +62161,7 @@
       <w:r>
         <w:t xml:space="preserve"> </w:t>
       </w:r>
-      <w:hyperlink r:id="rId117">
+      <w:hyperlink r:id="rId118">
         <w:r>
           <w:rPr>
             <w:rStyle w:val="VerbatimChar"/>
@@ -63277,9 +63763,9 @@
         </w:pict>
       </w:r>
     </w:p>
-    <w:bookmarkEnd w:id="118"/>
     <w:bookmarkEnd w:id="119"/>
-    <w:bookmarkStart w:id="124" w:name="X0df50f13635c1fcb933e538121f0d903fe1ec80"/>
+    <w:bookmarkEnd w:id="120"/>
+    <w:bookmarkStart w:id="125" w:name="X0df50f13635c1fcb933e538121f0d903fe1ec80"/>
     <w:p>
       <w:pPr>
         <w:pStyle w:val="Heading2"/>
@@ -63298,7 +63784,7 @@
       <w:r>
         <w:t xml:space="preserve"> </w:t>
       </w:r>
-      <w:hyperlink r:id="rId120">
+      <w:hyperlink r:id="rId121">
         <w:r>
           <w:rPr>
             <w:rStyle w:val="VerbatimChar"/>
@@ -63312,7 +63798,7 @@
       <w:r>
         <w:t xml:space="preserve"> </w:t>
       </w:r>
-      <w:hyperlink r:id="rId121">
+      <w:hyperlink r:id="rId122">
         <w:r>
           <w:rPr>
             <w:rStyle w:val="VerbatimChar"/>
@@ -63326,7 +63812,7 @@
       <w:r>
         <w:t xml:space="preserve"> </w:t>
       </w:r>
-      <w:hyperlink r:id="rId122">
+      <w:hyperlink r:id="rId123">
         <w:r>
           <w:rPr>
             <w:rStyle w:val="VerbatimChar"/>
@@ -63340,7 +63826,7 @@
       <w:r>
         <w:t xml:space="preserve"> </w:t>
       </w:r>
-      <w:hyperlink r:id="rId123">
+      <w:hyperlink r:id="rId124">
         <w:r>
           <w:rPr>
             <w:rStyle w:val="VerbatimChar"/>
@@ -65251,8 +65737,8 @@
         <w:t xml:space="preserve">), with its malloc, files and saves.</w:t>
       </w:r>
     </w:p>
-    <w:bookmarkEnd w:id="124"/>
-    <w:bookmarkStart w:id="129" w:name="Xf861c8e521de19b85a9fa568838296e214f81a0"/>
+    <w:bookmarkEnd w:id="125"/>
+    <w:bookmarkStart w:id="130" w:name="Xf861c8e521de19b85a9fa568838296e214f81a0"/>
     <w:p>
       <w:pPr>
         <w:pStyle w:val="Heading2"/>
@@ -65271,7 +65757,7 @@
       <w:r>
         <w:t xml:space="preserve"> </w:t>
       </w:r>
-      <w:hyperlink r:id="rId125">
+      <w:hyperlink r:id="rId126">
         <w:r>
           <w:rPr>
             <w:rStyle w:val="VerbatimChar"/>
@@ -65285,7 +65771,7 @@
       <w:r>
         <w:t xml:space="preserve"> </w:t>
       </w:r>
-      <w:hyperlink r:id="rId126">
+      <w:hyperlink r:id="rId127">
         <w:r>
           <w:rPr>
             <w:rStyle w:val="VerbatimChar"/>
@@ -66454,7 +66940,7 @@
       <w:r>
         <w:t xml:space="preserve"> </w:t>
       </w:r>
-      <w:hyperlink r:id="rId127">
+      <w:hyperlink r:id="rId128">
         <w:r>
           <w:rPr>
             <w:rStyle w:val="VerbatimChar"/>
@@ -67836,7 +68322,7 @@
       <w:r>
         <w:t xml:space="preserve"> </w:t>
       </w:r>
-      <w:hyperlink r:id="rId128">
+      <w:hyperlink r:id="rId129">
         <w:r>
           <w:rPr>
             <w:rStyle w:val="VerbatimChar"/>
@@ -69096,8 +69582,8 @@
         </w:pict>
       </w:r>
     </w:p>
-    <w:bookmarkEnd w:id="129"/>
-    <w:bookmarkStart w:id="134" w:name="Xa7f002f42b8b233630f11dbad8c3740c73af4cd"/>
+    <w:bookmarkEnd w:id="130"/>
+    <w:bookmarkStart w:id="135" w:name="Xa7f002f42b8b233630f11dbad8c3740c73af4cd"/>
     <w:p>
       <w:pPr>
         <w:pStyle w:val="Heading2"/>
@@ -69116,7 +69602,7 @@
       <w:r>
         <w:t xml:space="preserve"> </w:t>
       </w:r>
-      <w:hyperlink r:id="rId130">
+      <w:hyperlink r:id="rId131">
         <w:r>
           <w:rPr>
             <w:rStyle w:val="VerbatimChar"/>
@@ -69130,7 +69616,7 @@
       <w:r>
         <w:t xml:space="preserve"> </w:t>
       </w:r>
-      <w:hyperlink r:id="rId131">
+      <w:hyperlink r:id="rId132">
         <w:r>
           <w:rPr>
             <w:rStyle w:val="VerbatimChar"/>
@@ -69156,7 +69642,7 @@
       <w:r>
         <w:t xml:space="preserve">(</w:t>
       </w:r>
-      <w:hyperlink r:id="rId93">
+      <w:hyperlink r:id="rId94">
         <w:r>
           <w:rPr>
             <w:rStyle w:val="VerbatimChar"/>
@@ -69190,7 +69676,7 @@
       <w:r>
         <w:t xml:space="preserve"> </w:t>
       </w:r>
-      <w:hyperlink r:id="rId132">
+      <w:hyperlink r:id="rId133">
         <w:r>
           <w:rPr>
             <w:rStyle w:val="VerbatimChar"/>
@@ -69204,7 +69690,7 @@
       <w:r>
         <w:t xml:space="preserve"> </w:t>
       </w:r>
-      <w:hyperlink r:id="rId133">
+      <w:hyperlink r:id="rId134">
         <w:r>
           <w:rPr>
             <w:rStyle w:val="VerbatimChar"/>
@@ -71198,8 +71684,8 @@
         </w:pict>
       </w:r>
     </w:p>
-    <w:bookmarkEnd w:id="134"/>
-    <w:bookmarkStart w:id="135" w:name="annex--useful-constants"/>
+    <w:bookmarkEnd w:id="135"/>
+    <w:bookmarkStart w:id="136" w:name="annex--useful-constants"/>
     <w:p>
       <w:pPr>
         <w:pStyle w:val="Heading2"/>
@@ -72106,7 +72592,7 @@
         </w:tc>
       </w:tr>
     </w:tbl>
-    <w:bookmarkEnd w:id="135"/>
+    <w:bookmarkEnd w:id="136"/>
     <w:sectPr>
       <w:footerReference r:id="rId9" w:type="default"/>
       <w:footnotePr>

</xml_diff>